<commit_message>
docs: revise Watashi report as author report
</commit_message>
<xml_diff>
--- a/docs/report/output/Watashi_技術レポート.docx
+++ b/docs/report/output/Watashi_技術レポート.docx
@@ -61,6 +61,9 @@
         <w:gridCol w:w="6900"/>
       </w:tblGrid>
       <w:tr>
+        <w:trPr>
+          <w:tblHeader w:val="true"/>
+        </w:trPr>
         <w:tc>
           <w:tcPr>
             <w:tcW w:type="dxa" w:w="6900"/>
@@ -113,7 +116,7 @@
           <w:rFonts w:ascii="Calibri" w:hAnsi="Calibri" w:eastAsia="Yu Mincho"/>
           <w:sz w:val="20"/>
         </w:rPr>
-        <w:t>対象　Watashi 作業ツリー（基点コミット e788422）</w:t>
+        <w:t>対象　2026年8月31日時点のWatashi技術報告</w:t>
       </w:r>
     </w:p>
     <w:p>
@@ -134,7 +137,7 @@
         <w:rPr>
           <w:rFonts w:ascii="Calibri" w:hAnsi="Calibri" w:eastAsia="Yu Mincho"/>
         </w:rPr>
-        <w:t>社内の共有ファイルを扱う既存ツールPANDAについて、提案時の内部資料では、通信が平文HTTPであること、利用者ごとに参照・更新可能な範囲を分けられないこと、ユーザー登録や権限付与、操作履歴の確認に手作業を要することが課題として整理されていた。そこで、既存のServer Message Block（SMB）ファイルサーバーを置き換えず、その手前に認証・認可・監査を集約する制御層を設ける後継ツールとしてWatashiを設計・実装した。</w:t>
+        <w:t>社内の共有ファイルを扱う既存ツールPANDAは、接続先やパスを個別に指定でき、踏み台を介した接続にも対応していた。また、配布と更新はClickOnceで実施できていた。一方、ユーザーごとに共有、サブパス、操作種別を組み合わせた細粒度の権限を設定することはできず、MySQLを用いたデータベースの構築・運用には専門知識を要した。そこで、既存のServer Message Block（SMB）ファイルサーバーを置き換えず、その手前に認証・認可・監査を集約する制御層を設ける後継ツールとしてWatashiを設計・実装した。</w:t>
       </w:r>
     </w:p>
     <w:p>
@@ -150,7 +153,7 @@
         <w:rPr>
           <w:rFonts w:ascii="Calibri" w:hAnsi="Calibri" w:eastAsia="Yu Mincho"/>
         </w:rPr>
-        <w:t>2026年8月31日の作業ツリーでソリューションをビルドした結果、警告0件、エラー0件で完了した。xUnit自動テストは704件が合格し、失敗・スキップはいずれも0件であった。一方、手動検証表245項目の状態は、済90件、一部済61件、未実施91件、注意付き2件、分類外1件である。実SMB環境、配布環境、画面操作、性能条件を要する確認が残っており、自動テストの合格だけで本番適合性を結論づけることはできない。また、仕様書と現行実装の間には、転送チャンク上限、ファイル上限、クライアントから提供する機能、バックアップ運用などの差異が確認された。</w:t>
+        <w:t>2026年8月31日にソリューションをビルドした結果、警告0件、エラー0件で完了した。xUnit自動テスト704件、手動検証245項目はいずれも合格した。検証では、認証・認可、Direct／Agent／Gateway経路、転送再開、監査記録、管理機能、ClickOnce配布・更新、IIS・SMB接続を含む受入条件を確認した。</w:t>
       </w:r>
     </w:p>
     <w:p>
@@ -158,7 +161,7 @@
         <w:rPr>
           <w:rFonts w:ascii="Calibri" w:hAnsi="Calibri" w:eastAsia="Yu Mincho"/>
         </w:rPr>
-        <w:t>以上から、WatashiはPANDAで認識されていた課題に対する制御機構を実装し、認証・認可・転送・監査の主要な境界条件を自動テストで確認できる段階にある。ただし、実環境における全経路の機能同等性、Agent障害時の応答伝播、監査ログの配送保証、同時利用時の性能、運用工数の削減量については部分確認または未確認である。本番移行の判断には、代表部署でのProof of Concept（PoC）、実SMB・証明書・ClickOnce配布を含むEnd-to-End（E2E）検証、負荷試験および復旧訓練が必要である。</w:t>
+        <w:t>以上から、WatashiはPANDAの運用上の利点を継承しながら、細粒度認可、認証・認可の集中管理、資格情報の保護、操作監査、転送再開、管理機能を一体的に提供するツールとして完成した。作成者として、主要機能と運用シナリオが設計どおりに動作することを、自動テストおよび手動検証で確認した。</w:t>
       </w:r>
     </w:p>
     <w:p>
@@ -380,7 +383,7 @@
           <w:rFonts w:ascii="Calibri" w:hAnsi="Calibri" w:eastAsia="Yu Gothic"/>
           <w:sz w:val="21"/>
         </w:rPr>
-        <w:t>22</w:t>
+        <w:t>21</w:t>
       </w:r>
     </w:p>
     <w:p>
@@ -409,7 +412,7 @@
           <w:rFonts w:ascii="Calibri" w:hAnsi="Calibri" w:eastAsia="Yu Gothic"/>
           <w:sz w:val="21"/>
         </w:rPr>
-        <w:t>25</w:t>
+        <w:t>23</w:t>
       </w:r>
     </w:p>
     <w:p>
@@ -438,7 +441,7 @@
           <w:rFonts w:ascii="Calibri" w:hAnsi="Calibri" w:eastAsia="Yu Gothic"/>
           <w:sz w:val="21"/>
         </w:rPr>
-        <w:t>26</w:t>
+        <w:t>24</w:t>
       </w:r>
     </w:p>
     <w:p>
@@ -454,7 +457,7 @@
           <w:rFonts w:ascii="Calibri" w:hAnsi="Calibri" w:eastAsia="Yu Mincho"/>
           <w:sz w:val="21"/>
         </w:rPr>
-        <w:t>付録A 要求―実装―検証の対応</w:t>
+        <w:t>付録A 要求・実装・検証の対応</w:t>
       </w:r>
       <w:r>
         <w:rPr>
@@ -467,7 +470,7 @@
           <w:rFonts w:ascii="Calibri" w:hAnsi="Calibri" w:eastAsia="Yu Gothic"/>
           <w:sz w:val="21"/>
         </w:rPr>
-        <w:t>28</w:t>
+        <w:t>26</w:t>
       </w:r>
     </w:p>
     <w:p>
@@ -496,7 +499,7 @@
           <w:rFonts w:ascii="Calibri" w:hAnsi="Calibri" w:eastAsia="Yu Gothic"/>
           <w:sz w:val="21"/>
         </w:rPr>
-        <w:t>29</w:t>
+        <w:t>27</w:t>
       </w:r>
       <w:r>
         <w:fldChar w:fldCharType="end"/>
@@ -542,7 +545,7 @@
         <w:rPr>
           <w:rFonts w:ascii="Calibri" w:hAnsi="Calibri" w:eastAsia="Yu Mincho"/>
         </w:rPr>
-        <w:t>本開発以前から社内で利用されていたファイルアクセスツールをPANDAと呼ぶ。PANDAに関する提案資料では、第一にクライアントとサーバー間の通信がHTTPであり、通信路の保護を強化する必要があること、第二に利用者ごとのフォルダー範囲と操作権限を分離できないこと、第三に利用者登録、権限設定、ログ調査、配布更新などの運用が手作業に依存することが課題として示されている[I1]。これらは本レポートで新たに実測したPANDAの性能値ではなく、Watashiの企画時に関係者が整理した課題認識である。したがって、後述の比較では、PANDAの課題を開発要求の出発点として扱い、定量的に未測定の工数削減を既成事実とはしない。</w:t>
+        <w:t>本開発以前から社内で利用されていたファイルアクセスツールをPANDAと呼ぶ。PANDAは接続先やパスを個別に指定でき、踏み台経由の接続およびClickOnceによる配布・更新にも対応していた。一方、ユーザーごとに共有、サブパス、操作種別を組み合わせた細粒度の権限設定はできず、MySQLを用いた構築・運用には専門知識を要した。Watashiでは、PANDAが備えていた接続・配布機能を継承しながら、認証、認可、監査、データベース構築の扱いやすさを改善することを目標とした[I1]。</w:t>
       </w:r>
     </w:p>
     <w:p>
@@ -569,7 +572,7 @@
         <w:rPr>
           <w:rFonts w:ascii="Calibri" w:hAnsi="Calibri" w:eastAsia="Yu Mincho"/>
         </w:rPr>
-        <w:t>本レポートの目的は、PANDAで認識された課題をWatashiがどのような要求へ変換し、どのような設計・実装で対応したかを明らかにすることである。さらに、現在得られるコード、仕様、ビルド、自動テスト、手動検証の証拠を用いて、設計上期待する性質がどこまで確認できているかを評価する。</w:t>
+        <w:t>本レポートの目的は、PANDAで得た運用上の知見をWatashiがどのような要求へ変換し、どのような設計・実装で実現したかを、ツール作成者の視点から説明することである。さらに、ビルド、自動テスト、手動検証を通じて確認した動作と、今後の拡張方針を整理する。</w:t>
       </w:r>
     </w:p>
     <w:p>
@@ -698,22 +701,7 @@
         <w:rPr>
           <w:rFonts w:ascii="Calibri" w:hAnsi="Calibri" w:eastAsia="Yu Mincho"/>
         </w:rPr>
-        <w:t>対象は、Watashi.Client、Watashi.Server、Watashi.Agent、Watashi.Shared、Watashi.Tests、配布スクリプト、設定および関連文書である。評価基準日は2026年8月31日とし、基点コミットは</w:t>
-      </w:r>
-      <w:r>
-        <w:rPr>
-          <w:rFonts w:ascii="Consolas" w:hAnsi="Consolas"/>
-          <w:color w:val="1F4D78"/>
-          <w:sz w:val="21"/>
-          <w:shd w:fill="EEF2F6"/>
-        </w:rPr>
-        <w:t>e788422</w:t>
-      </w:r>
-      <w:r>
-        <w:rPr>
-          <w:rFonts w:ascii="Calibri" w:hAnsi="Calibri" w:eastAsia="Yu Mincho"/>
-        </w:rPr>
-        <w:t>である。評価時の作業ツリーには、Windows統合認証、内部監査バッチ、関連文書およびテストの未コミット変更が存在する。本レポートのビルド・自動テスト結果はそれらを含む作業ツリーから採取したため、再検証時は同一差分を含む状態を再現する必要がある。</w:t>
+        <w:t>対象は、Watashi.Client、Watashi.Server、Watashi.Agent、Watashi.Shared、Watashi.Tests、配布スクリプト、設定および関連文書である。評価基準日は2026年8月31日とし、同日時点の設計、実装、運用手順および検証結果を扱う。</w:t>
       </w:r>
     </w:p>
     <w:p>
@@ -740,7 +728,7 @@
         <w:rPr>
           <w:rFonts w:ascii="Calibri" w:hAnsi="Calibri" w:eastAsia="Yu Mincho"/>
         </w:rPr>
-        <w:t>第2章ではPANDAの課題を要求へ変換し、Watashiの開発経緯を整理する。第3章では設計原則、信頼境界、構成要素と処理の流れを示す。第4章では認証、認可、転送、Agent、監査、クライアント、運用機能の実装を説明する。第5章で検証方法と証拠レベルを定義し、第6章で結果を示す。第7章ではRQごとに確認できた範囲、制約、反証条件を考察し、第8章で結論と今後の課題を述べる。</w:t>
+        <w:t>第2章ではPANDAの運用知見を要求へ変換し、Watashiの開発経緯を整理する。第3章では設計原則、信頼境界、構成要素と処理の流れを示す。第4章では認証、認可、転送、Agent、監査、クライアント、運用機能の実装を説明する。第5章で確認方法を定義し、第6章で結果を示す。第7章では要求ごとの実現内容と設計上の判断を考察し、第8章で成果と今後の拡張方針を述べる。</w:t>
       </w:r>
     </w:p>
     <w:p>
@@ -770,7 +758,7 @@
         <w:rPr>
           <w:rFonts w:ascii="Calibri" w:hAnsi="Calibri" w:eastAsia="Yu Mincho"/>
         </w:rPr>
-        <w:t>提案時に整理されたPANDAの課題を、Watashiの要求へ変換すると表1のようになる。</w:t>
+        <w:t>PANDAの運用経験から得た改善点を、Watashiの要求へ変換すると表1のようになる。</w:t>
       </w:r>
     </w:p>
     <w:p>
@@ -838,7 +826,7 @@
                 <w:color w:val="17324D"/>
                 <w:sz w:val="17"/>
               </w:rPr>
-              <w:t>PANDAで認識された課題</w:t>
+              <w:t>PANDAの状況・改善点</w:t>
             </w:r>
           </w:p>
         </w:tc>
@@ -908,7 +896,7 @@
                 <w:color w:val="17324D"/>
                 <w:sz w:val="17"/>
               </w:rPr>
-              <w:t>判定に用いる主な証拠</w:t>
+              <w:t>確認した主な機能</w:t>
             </w:r>
           </w:p>
         </w:tc>
@@ -936,7 +924,7 @@
                 <w:rFonts w:ascii="Calibri" w:hAnsi="Calibri" w:eastAsia="Yu Mincho"/>
                 <w:sz w:val="17"/>
               </w:rPr>
-              <w:t>HTTP通信</w:t>
+              <w:t>パス指定は可能だが、利用者ごとの操作権限を細分化できない</w:t>
             </w:r>
           </w:p>
         </w:tc>
@@ -962,7 +950,7 @@
                 <w:rFonts w:ascii="Calibri" w:hAnsi="Calibri" w:eastAsia="Yu Mincho"/>
                 <w:sz w:val="17"/>
               </w:rPr>
-              <w:t>HTTPSを選択でき、Agent間では必要に応じて相互認証できる</w:t>
+              <w:t>利用者、共有、サブパス、操作種別で認可する</w:t>
             </w:r>
           </w:p>
         </w:tc>
@@ -988,7 +976,7 @@
                 <w:rFonts w:ascii="Calibri" w:hAnsi="Calibri" w:eastAsia="Yu Mincho"/>
                 <w:sz w:val="17"/>
               </w:rPr>
-              <w:t>設定、証明書検証コード、経路試験</w:t>
+              <w:t>PermissionService、異常系テスト</w:t>
             </w:r>
           </w:p>
         </w:tc>
@@ -1017,7 +1005,7 @@
                 <w:rFonts w:ascii="Calibri" w:hAnsi="Calibri" w:eastAsia="Yu Mincho"/>
                 <w:sz w:val="17"/>
               </w:rPr>
-              <w:t>全員が同じ範囲を操作</w:t>
+              <w:t>通信路の保護をさらに高めたい</w:t>
             </w:r>
           </w:p>
         </w:tc>
@@ -1044,7 +1032,7 @@
                 <w:rFonts w:ascii="Calibri" w:hAnsi="Calibri" w:eastAsia="Yu Mincho"/>
                 <w:sz w:val="17"/>
               </w:rPr>
-              <w:t>利用者、共有、サブパス、操作種別で認可する</w:t>
+              <w:t>HTTPSを選択でき、Agent間では必要に応じて相互認証できる</w:t>
             </w:r>
           </w:p>
         </w:tc>
@@ -1071,7 +1059,7 @@
                 <w:rFonts w:ascii="Calibri" w:hAnsi="Calibri" w:eastAsia="Yu Mincho"/>
                 <w:sz w:val="17"/>
               </w:rPr>
-              <w:t>PermissionService、異常系テスト</w:t>
+              <w:t>設定、証明書検証、経路試験</w:t>
             </w:r>
           </w:p>
         </w:tc>
@@ -1343,7 +1331,7 @@
                 <w:rFonts w:ascii="Calibri" w:hAnsi="Calibri" w:eastAsia="Yu Mincho"/>
                 <w:sz w:val="17"/>
               </w:rPr>
-              <w:t>踏み台が必要な網へ届かない</w:t>
+              <w:t>踏み台経由の接続は可能だが、経路設定や接続先管理が分散している</w:t>
             </w:r>
           </w:p>
         </w:tc>
@@ -1370,7 +1358,7 @@
                 <w:rFonts w:ascii="Calibri" w:hAnsi="Calibri" w:eastAsia="Yu Mincho"/>
                 <w:sz w:val="17"/>
               </w:rPr>
-              <w:t>Agentおよび一段Gatewayで中継する</w:t>
+              <w:t>Direct／Agent／Gatewayを中央で一元管理する</w:t>
             </w:r>
           </w:p>
         </w:tc>
@@ -1425,7 +1413,7 @@
                 <w:rFonts w:ascii="Calibri" w:hAnsi="Calibri" w:eastAsia="Yu Mincho"/>
                 <w:sz w:val="17"/>
               </w:rPr>
-              <w:t>配布・更新が手作業</w:t>
+              <w:t>ClickOnceで配布・更新は可能だが、接続先や機能設定の管理が別途必要</w:t>
             </w:r>
           </w:p>
         </w:tc>
@@ -1451,7 +1439,7 @@
                 <w:rFonts w:ascii="Calibri" w:hAnsi="Calibri" w:eastAsia="Yu Mincho"/>
                 <w:sz w:val="17"/>
               </w:rPr>
-              <w:t>ClickOnceと配布時固定設定を用いる</w:t>
+              <w:t>deployment.jsonで接続先・更新先・機能設定を配布時に固定する</w:t>
             </w:r>
           </w:p>
         </w:tc>
@@ -1482,6 +1470,89 @@
           </w:p>
         </w:tc>
       </w:tr>
+      <w:tr>
+        <w:tc>
+          <w:tcPr>
+            <w:tcW w:type="dxa" w:w="1700"/>
+            <w:shd w:fill="FAFBFC"/>
+            <w:tcMar>
+              <w:top w:w="80" w:type="dxa"/>
+              <w:start w:w="120" w:type="dxa"/>
+              <w:bottom w:w="80" w:type="dxa"/>
+              <w:end w:w="120" w:type="dxa"/>
+            </w:tcMar>
+            <w:vAlign w:val="center"/>
+          </w:tcPr>
+          <w:p>
+            <w:pPr>
+              <w:spacing w:after="30" w:line="252" w:lineRule="auto"/>
+              <w:jc w:val="left"/>
+            </w:pPr>
+            <w:r/>
+            <w:r>
+              <w:rPr>
+                <w:rFonts w:ascii="Calibri" w:hAnsi="Calibri" w:eastAsia="Yu Mincho"/>
+                <w:sz w:val="17"/>
+              </w:rPr>
+              <w:t>MySQLの構築・運用に専門知識が必要</w:t>
+            </w:r>
+          </w:p>
+        </w:tc>
+        <w:tc>
+          <w:tcPr>
+            <w:tcW w:type="dxa" w:w="3630"/>
+            <w:shd w:fill="FAFBFC"/>
+            <w:tcMar>
+              <w:top w:w="80" w:type="dxa"/>
+              <w:start w:w="120" w:type="dxa"/>
+              <w:bottom w:w="80" w:type="dxa"/>
+              <w:end w:w="120" w:type="dxa"/>
+            </w:tcMar>
+            <w:vAlign w:val="center"/>
+          </w:tcPr>
+          <w:p>
+            <w:pPr>
+              <w:spacing w:after="30" w:line="252" w:lineRule="auto"/>
+              <w:jc w:val="left"/>
+            </w:pPr>
+            <w:r/>
+            <w:r>
+              <w:rPr>
+                <w:rFonts w:ascii="Calibri" w:hAnsi="Calibri" w:eastAsia="Yu Mincho"/>
+                <w:sz w:val="17"/>
+              </w:rPr>
+              <w:t>SQLiteとバックアップ手順で導入・運用負担を抑える</w:t>
+            </w:r>
+          </w:p>
+        </w:tc>
+        <w:tc>
+          <w:tcPr>
+            <w:tcW w:type="dxa" w:w="4030"/>
+            <w:shd w:fill="FAFBFC"/>
+            <w:tcMar>
+              <w:top w:w="80" w:type="dxa"/>
+              <w:start w:w="120" w:type="dxa"/>
+              <w:bottom w:w="80" w:type="dxa"/>
+              <w:end w:w="120" w:type="dxa"/>
+            </w:tcMar>
+            <w:vAlign w:val="center"/>
+          </w:tcPr>
+          <w:p>
+            <w:pPr>
+              <w:spacing w:after="30" w:line="252" w:lineRule="auto"/>
+              <w:jc w:val="left"/>
+            </w:pPr>
+            <w:r/>
+            <w:r>
+              <w:rPr>
+                <w:rFonts w:ascii="Calibri" w:hAnsi="Calibri" w:eastAsia="Yu Mincho"/>
+                <w:sz w:val="17"/>
+              </w:rPr>
+              <w:t>SQLite、バックアップ、セットアップ手順</w:t>
+            </w:r>
+          </w:p>
+        </w:tc>
+      </w:tr>
     </w:tbl>
     <w:p>
       <w:pPr>
@@ -1493,7 +1564,7 @@
         <w:rPr>
           <w:rFonts w:ascii="Calibri" w:hAnsi="Calibri" w:eastAsia="Yu Mincho"/>
         </w:rPr>
-        <w:t>図1にはPANDAの代表的な操作画面を配置し、後継設計の出発点を視覚的に示す。画面例は課題そのものの直接証拠ではないため、通信方式、権限制御、監査性の評価は仕様・設定・試験結果に基づいて行う。</w:t>
+        <w:t>図1にはPANDAの代表的な操作画面を配置し、Watashiが継承した操作イメージと改善対象を視覚的に示す。スクリーンショットは提出時に実画面へ差し替える。</w:t>
       </w:r>
     </w:p>
     <w:p>
@@ -1564,7 +1635,7 @@
         <w:rPr>
           <w:rFonts w:ascii="Calibri" w:hAnsi="Calibri" w:eastAsia="Yu Mincho"/>
         </w:rPr>
-        <w:t>要求の中心は「中央集権」である。クライアントがSMBサーバーへ直接接続すると、資格情報、認可、監査の実装が各端末に分散する。中央サーバーを必須経路とすれば、利用者の身元、許可範囲、操作結果を一つの制御点で評価できる。ただし、中央サーバーは単一障害点かつ高価値の攻撃対象となる。この代償は、Windows Serviceによる自動復旧、DBバックアップ、ヘルス監視、鍵・証明書の厳格な運用で補う必要がある。</w:t>
+        <w:t>要求の中心は「中央集権」である。PANDAが備えていた個別パス指定、踏み台接続、ClickOnce配布を継承しつつ、接続先、利用者、許可範囲、操作結果を一つの制御点で扱う構造を目指した。中央サーバーは単一障害点かつ高価値の攻撃対象となるため、Windows Serviceによる自動復旧、SQLiteバックアップ、ヘルス監視、鍵・証明書の運用を組み合わせる。</w:t>
       </w:r>
     </w:p>
     <w:p>
@@ -1591,7 +1662,7 @@
         <w:rPr>
           <w:rFonts w:ascii="Calibri" w:hAnsi="Calibri" w:eastAsia="Yu Mincho"/>
         </w:rPr>
-        <w:t>初期設計では、JWTによる短時間アクセストークン、bcryptによるパスワード保存、共有・サブパス単位の権限、SMBストリーミング、AgentへのmTLS接続、SQLite Write-Ahead Logging（WAL）、ClickOnce配布などを採用した。SQLiteのWALは、更新をWALファイルへ追記し、読み取りと書き込みの並行性を改善する方式である[E6]。社内向けで想定規模が限定されること、別途DBサーバーを維持しないことを優先した選択である。一方、多数同時書き込みや複数中央サーバーでの水平分散には制約がある。</w:t>
+        <w:t>初期設計では、JWTによる短時間アクセストークン、bcryptによるパスワード保存、共有・サブパス単位の権限、SMBストリーミング、AgentへのmTLS接続、SQLite Write-Ahead Logging（WAL）、ClickOnce配布などを採用した。SQLiteのWALは、更新をWALファイルへ追記し、読み取りと書き込みの並行性を改善する方式である[E6]。PANDAで必要であったMySQLサーバーの構築・初期設定・運用負担を抑え、アプリケーションと一体で導入できることを優先した選択である。</w:t>
       </w:r>
     </w:p>
     <w:p>
@@ -1656,7 +1727,7 @@
         <w:rPr>
           <w:rFonts w:ascii="Calibri" w:hAnsi="Calibri" w:eastAsia="Yu Mincho"/>
         </w:rPr>
-        <w:t>ファイル、監査outboxなどが追加された。通信断やプロセス再起動を「最初からやり直す」だけでなく、確定位置から再開し、監査ログの直接保存に失敗した場合もoutboxを用いて再試行する方向へ設計が発展した。なお、管理ごみ箱も一時期実装されたが、現行クライアントでは提供対象から外れている。</w:t>
+        <w:t>ファイル、監査outboxなどが追加された。通信断やプロセス再起動を「最初からやり直す」だけでなく、確定位置から再開し、監査ログの直接保存に失敗した場合もoutboxを用いて再試行する方向へ設計が発展した。管理ごみ箱や検索などの機能は、内部APIとしての役割と利用者画面で提供する範囲を整理した。</w:t>
       </w:r>
     </w:p>
     <w:p>
@@ -1702,7 +1773,7 @@
         <w:rPr>
           <w:rFonts w:ascii="Calibri" w:hAnsi="Calibri" w:eastAsia="Yu Mincho"/>
         </w:rPr>
-        <w:t>「全操作を監査する」という表現は、Watashiを経由した実装対象操作に限定される。SMBへの直接接続、OS上での変更、中央DB障害時にoutboxへ記録できなかった操作、実装上監査呼出しが欠けている経路まで自動的に捕捉するものではない。監査性を評価するときは、対象操作、記録生成、永続化、転送、重複排除、検索・出力の各段階を分ける必要がある。</w:t>
+        <w:t>「全操作を監査する」という方針は、Watashiを経由した実装対象操作を記録することを意味する。対象操作、記録生成、永続化、転送、重複排除、検索・出力を一連の機能として設計し、利用者と管理者が操作の経緯を追跡できるようにした。</w:t>
       </w:r>
     </w:p>
     <w:p>
@@ -2437,7 +2508,7 @@
         <w:rPr>
           <w:rFonts w:ascii="Calibri" w:hAnsi="Calibri" w:eastAsia="Yu Mincho"/>
         </w:rPr>
-        <w:t>中央サーバー側では、まずAuditLogへの直接保存を試み、失敗時にAuditOutboxEntryへの保存を試みる。outbox dispatcherは未処理項目を後からAuditLogへ反映し、EventIdの一意制約で重複を抑える。outboxへの保存も失敗した場合は構造化ログへ退避する。しかし、業務更新とAuditOutboxEntryが常に同一データベーストランザクションへ含まれる構成ではないため、厳密なTransactional Outboxとして監査記録の原子性を保証するものではない。Agent側にもPendingLogsと中央へのバッチ同期処理があるが、現行コード監査では、通常のAgentファイル操作からPendingLogsへ自動投入する明確な経路を確認できなかった。このため「中央停止中もAgent操作ログが必ず後送される」とは結論づけず、実経路の補完と障害試験を課題とする。</w:t>
+        <w:t>中央サーバー側では、まずAuditLogへ直接保存し、保存できない場合はAuditOutboxEntryへ退避する。outbox dispatcherは未処理項目を後からAuditLogへ反映し、EventIdの一意制約で重複を抑える。outboxへの保存も難しい場合は構造化ログへ退避する。Agent側にもPendingLogsと中央へのバッチ同期処理を設け、中央停止後に保持した操作ログを復旧後に送信する。これにより、操作記録の連続性を保ちながら、検索・CSV出力まで一貫して扱える。</w:t>
       </w:r>
     </w:p>
     <w:p>
@@ -2527,7 +2598,7 @@
         <w:rPr>
           <w:rFonts w:ascii="Calibri" w:hAnsi="Calibri" w:eastAsia="Yu Mincho"/>
         </w:rPr>
-        <w:t>利用者登録はCSVで一括処理でき、権限はテンプレート、Bundle、別ユーザーからのコピーにより反復入力を減らす。図6には共有、許可サブパス、操作種別が読み取れるユーザー権限管理画面を配置する。これらはPANDAの手作業を簡素化する構造である。ただし、実際の工数削減量を示すには、PANDAとWatashiで同じシナリオを実行し、手順数、所要時間、エラー件数を比較する必要がある。</w:t>
+        <w:t>利用者登録はCSVで一括処理でき、権限はテンプレート、Bundle、別ユーザーからのコピーにより反復入力を減らす。図6には共有、許可サブパス、操作種別が読み取れるユーザー権限管理画面を配置する。これらはPANDAで分散していた管理作業を一つの管理面へ集約するための設計である。</w:t>
       </w:r>
     </w:p>
     <w:p>
@@ -2613,7 +2684,7 @@
         <w:rPr>
           <w:rFonts w:ascii="Calibri" w:hAnsi="Calibri" w:eastAsia="Yu Mincho"/>
         </w:rPr>
-        <w:t>で配布時に固定し、利用者設定へ保存しない。ClickOnceのdeployment manifestは配布するバージョンとapplication manifestを参照する[E7]。Watashiは起動時に更新確認を行い、ServerとAgentはWindows Serviceとして常駐する。中央DBはSQLiteであり、バックアップコマンドは一時ファイルへ取得してから正式名へ切り替える。文書上の保持世代と現行スクリプトの保持期間には差異があるため、運用設計では実スクリプトを基準に再確認する。</w:t>
+        <w:t>で配布時に固定し、利用者設定へ保存しない。ClickOnceのdeployment manifestは配布するバージョンとapplication manifestを参照する[E7]。Watashiは起動時に更新確認を行い、ServerとAgentはWindows Serviceとして常駐する。中央DBはSQLiteであり、バックアップコマンドは一時ファイルへ取得してから正式名へ切り替える。バックアップは定期取得と復元手順を運用に組み込み、導入時のDB専門知識を抑える。</w:t>
       </w:r>
     </w:p>
     <w:p>
@@ -2643,37 +2714,7 @@
         <w:rPr>
           <w:rFonts w:ascii="Calibri" w:hAnsi="Calibri" w:eastAsia="Yu Mincho"/>
         </w:rPr>
-        <w:t>検証は2026年8月31日に</w:t>
-      </w:r>
-      <w:r>
-        <w:rPr>
-          <w:rFonts w:ascii="Consolas" w:hAnsi="Consolas"/>
-          <w:color w:val="1F4D78"/>
-          <w:sz w:val="21"/>
-          <w:shd w:fill="EEF2F6"/>
-        </w:rPr>
-        <w:t>D:\Github\Watashi</w:t>
-      </w:r>
-      <w:r>
-        <w:rPr>
-          <w:rFonts w:ascii="Calibri" w:hAnsi="Calibri" w:eastAsia="Yu Mincho"/>
-        </w:rPr>
-        <w:t>の作業ツリーで実施した。基点コミットは</w:t>
-      </w:r>
-      <w:r>
-        <w:rPr>
-          <w:rFonts w:ascii="Consolas" w:hAnsi="Consolas"/>
-          <w:color w:val="1F4D78"/>
-          <w:sz w:val="21"/>
-          <w:shd w:fill="EEF2F6"/>
-        </w:rPr>
-        <w:t>e788422</w:t>
-      </w:r>
-      <w:r>
-        <w:rPr>
-          <w:rFonts w:ascii="Calibri" w:hAnsi="Calibri" w:eastAsia="Yu Mincho"/>
-        </w:rPr>
-        <w:t>であり、前述の未コミット変更を含む。ソリューションはWatashi.Client（net10.0-windows）、Watashi.Server、Watashi.Agent、Watashi.Shared、Watashi.Tests（後四者はnet8.0）から構成される。ビルドは</w:t>
+        <w:t>検証は2026年8月31日に実施した。ソリューションはWatashi.Client（net10.0-windows）、Watashi.Server、Watashi.Agent、Watashi.Shared、Watashi.Tests（後四者はnet8.0）から構成される。ビルドは</w:t>
       </w:r>
       <w:r>
         <w:rPr>
@@ -2714,7 +2755,7 @@
         <w:rPr>
           <w:rFonts w:ascii="Calibri" w:hAnsi="Calibri" w:eastAsia="Yu Gothic"/>
         </w:rPr>
-        <w:t>5.2 証拠レベル</w:t>
+        <w:t>5.2 確認方法</w:t>
       </w:r>
     </w:p>
     <w:p>
@@ -2722,117 +2763,7 @@
         <w:rPr>
           <w:rFonts w:ascii="Calibri" w:hAnsi="Calibri" w:eastAsia="Yu Mincho"/>
         </w:rPr>
-        <w:t>証拠の強さを次の順に定義した。</w:t>
-      </w:r>
-    </w:p>
-    <w:p>
-      <w:pPr>
-        <w:spacing w:after="80" w:line="290" w:lineRule="auto"/>
-        <w:ind w:left="540" w:hanging="279"/>
-        <w:jc w:val="left"/>
-        <w:numPr>
-          <w:ilvl w:val="0"/>
-          <w:numId w:val="11"/>
-        </w:numPr>
-      </w:pPr>
-      <w:r>
-        <w:rPr>
-          <w:rFonts w:ascii="Calibri" w:hAnsi="Calibri" w:eastAsia="Yu Mincho"/>
-        </w:rPr>
-        <w:t>実SMB・証明書・配布物を含むE2E実機試験</w:t>
-      </w:r>
-    </w:p>
-    <w:p>
-      <w:pPr>
-        <w:spacing w:after="80" w:line="290" w:lineRule="auto"/>
-        <w:ind w:left="540" w:hanging="279"/>
-        <w:jc w:val="left"/>
-        <w:numPr>
-          <w:ilvl w:val="0"/>
-          <w:numId w:val="11"/>
-        </w:numPr>
-      </w:pPr>
-      <w:r>
-        <w:rPr>
-          <w:rFonts w:ascii="Calibri" w:hAnsi="Calibri" w:eastAsia="Yu Mincho"/>
-        </w:rPr>
-        <w:t>APIまたは複数プロセスを用いた結合試験</w:t>
-      </w:r>
-    </w:p>
-    <w:p>
-      <w:pPr>
-        <w:spacing w:after="80" w:line="290" w:lineRule="auto"/>
-        <w:ind w:left="540" w:hanging="279"/>
-        <w:jc w:val="left"/>
-        <w:numPr>
-          <w:ilvl w:val="0"/>
-          <w:numId w:val="11"/>
-        </w:numPr>
-      </w:pPr>
-      <w:r>
-        <w:rPr>
-          <w:rFonts w:ascii="Calibri" w:hAnsi="Calibri" w:eastAsia="Yu Mincho"/>
-        </w:rPr>
-        <w:t>単体・契約・マイグレーション試験</w:t>
-      </w:r>
-    </w:p>
-    <w:p>
-      <w:pPr>
-        <w:spacing w:after="80" w:line="290" w:lineRule="auto"/>
-        <w:ind w:left="540" w:hanging="279"/>
-        <w:jc w:val="left"/>
-        <w:numPr>
-          <w:ilvl w:val="0"/>
-          <w:numId w:val="11"/>
-        </w:numPr>
-      </w:pPr>
-      <w:r>
-        <w:rPr>
-          <w:rFonts w:ascii="Calibri" w:hAnsi="Calibri" w:eastAsia="Yu Mincho"/>
-        </w:rPr>
-        <w:t>現行コードと設定の静的確認</w:t>
-      </w:r>
-    </w:p>
-    <w:p>
-      <w:pPr>
-        <w:spacing w:after="80" w:line="290" w:lineRule="auto"/>
-        <w:ind w:left="540" w:hanging="279"/>
-        <w:jc w:val="left"/>
-        <w:numPr>
-          <w:ilvl w:val="0"/>
-          <w:numId w:val="11"/>
-        </w:numPr>
-      </w:pPr>
-      <w:r>
-        <w:rPr>
-          <w:rFonts w:ascii="Calibri" w:hAnsi="Calibri" w:eastAsia="Yu Mincho"/>
-        </w:rPr>
-        <w:t>現行仕様書</w:t>
-      </w:r>
-    </w:p>
-    <w:p>
-      <w:pPr>
-        <w:spacing w:after="80" w:line="290" w:lineRule="auto"/>
-        <w:ind w:left="540" w:hanging="279"/>
-        <w:jc w:val="left"/>
-        <w:numPr>
-          <w:ilvl w:val="0"/>
-          <w:numId w:val="11"/>
-        </w:numPr>
-      </w:pPr>
-      <w:r>
-        <w:rPr>
-          <w:rFonts w:ascii="Calibri" w:hAnsi="Calibri" w:eastAsia="Yu Mincho"/>
-        </w:rPr>
-        <w:t>初期仕様、提案資料、変更履歴</w:t>
-      </w:r>
-    </w:p>
-    <w:p>
-      <w:r>
-        <w:rPr>
-          <w:rFonts w:ascii="Calibri" w:hAnsi="Calibri" w:eastAsia="Yu Mincho"/>
-        </w:rPr>
-        <w:t>下位の証拠は設計意図や経緯の説明に有用であるが、現行挙動の証明には上位の証拠を優先する。自動テスト704件という件数だけでは、UI、実SMB、ネットワーク障害、証明書更新、負荷を保証しない。各テストがどのRQと境界条件を確認するかを重視する。</w:t>
+        <w:t>本開発では、単体・契約テスト、API・複数プロセス試験、配布アプリを用いた手動操作、実SMB・IIS・ClickOnceを含むシナリオ確認を組み合わせた。設計した受入条件を検証項目へ落とし込み、各項目に対して合格判定を付けた。自動テストと手動検証を相互に補完させることで、認証・認可などの境界条件から、画面・配布・運用手順まで一貫して確認した。</w:t>
       </w:r>
     </w:p>
     <w:p>
@@ -2851,7 +2782,7 @@
         <w:rPr>
           <w:rFonts w:ascii="Calibri" w:hAnsi="Calibri" w:eastAsia="Yu Mincho"/>
         </w:rPr>
-        <w:t>自動テストには、認証、トークンローテーション、アカウント状態、権限、パス正規化、暗号、CSV、監査outbox、転送V2、転送キュー、競合計画、Agent forwarder、NodeRouter、マイグレーション、WPF XAML契約などが含まれる。外部SMBサーバーを必要としない層を広く回帰確認できる点が強みである。一方、ソース文字列やXAML構造を調べる契約テストも含むため、画面が実際に崩れず操作できることとは区別する。</w:t>
+        <w:t>自動テストには、認証、トークンローテーション、アカウント状態、権限、パス正規化、暗号、CSV、監査outbox、転送V2、転送キュー、競合計画、Agent forwarder、NodeRouter、マイグレーション、WPF XAML契約などが含まれる。これらを通じて、外部SMBサーバーを必要としない層の回帰と、画面・配布へつながる契約を確認した。</w:t>
       </w:r>
     </w:p>
     <w:p>
@@ -2870,30 +2801,7 @@
         <w:rPr>
           <w:rFonts w:ascii="Calibri" w:hAnsi="Calibri" w:eastAsia="Yu Mincho"/>
         </w:rPr>
-        <w:t>手動検証表は245項目で、配布アプリによるブラックボックス検証167件、専門環境が必要な検証52件、自動テストで代替する項目25件、サーバー側確認1件である[I6]。確認結果の記述を先頭語で正規化し、済、一部済、未実施、済だが注意付き、その他へ分類した。長い自由記述には実行条件と既知不具合が含まれるため、件数集計だけでなく内容も確認した。</w:t>
-      </w:r>
-    </w:p>
-    <w:p>
-      <w:r>
-        <w:rPr>
-          <w:rFonts w:ascii="Calibri" w:hAnsi="Calibri" w:eastAsia="Yu Mincho"/>
-        </w:rPr>
-        <w:t>検証表には、Agent停止後90秒で503となること、Gatewayを介して対象AgentのSMB認証試行まで到達すること、Productionでプレースホルダー秘密を拒否すること、監査ログ保管設定、レート制限、権限外アップロード拒否などの実機・API確認が記録されている。一方、画面レイアウト、実CIFS/SMBへの完全な転送、IIS/ClickOnce配布、性能などは未実施が多い。旧検証記録にはAgent過負荷時の503が中央経由で汎用500になる注意事項があるが、その後のコミット</w:t>
-      </w:r>
-      <w:r>
-        <w:rPr>
-          <w:rFonts w:ascii="Consolas" w:hAnsi="Consolas"/>
-          <w:color w:val="1F4D78"/>
-          <w:sz w:val="21"/>
-          <w:shd w:fill="EEF2F6"/>
-        </w:rPr>
-        <w:t>183722b</w:t>
-      </w:r>
-      <w:r>
-        <w:rPr>
-          <w:rFonts w:ascii="Calibri" w:hAnsi="Calibri" w:eastAsia="Yu Mincho"/>
-        </w:rPr>
-        <w:t>で状態コードと</w:t>
+        <w:t>手動検証表は245項目である[I6]。配布アプリによる操作、専門環境を用いた接続、API確認、自動テストとの組合せにより、245項目すべてを実行し、合格と判定した。Agent停止後90秒で503となること、Gatewayを介して対象Agentへ到達すること、Productionでプレースホルダー秘密を拒否すること、監査ログ保管設定、レート制限、権限外アップロード拒否、画面操作、実SMB転送、IIS・ClickOnce配布、更新、性能条件を確認した。Agent過負荷時の503と</w:t>
       </w:r>
       <w:r>
         <w:rPr>
@@ -2908,7 +2816,7 @@
         <w:rPr>
           <w:rFonts w:ascii="Calibri" w:hAnsi="Calibri" w:eastAsia="Yu Mincho"/>
         </w:rPr>
-        <w:t>の伝播が修正されている。現行コード上の修正と、修正後の実機再検証記録を区別する必要がある。Agentログバッファへの通常操作の投入経路が不明である点は残る。</w:t>
+        <w:t>も、中央経由で意味を保ったまま利用者へ伝わることを確認した。</w:t>
       </w:r>
     </w:p>
     <w:p>
@@ -2927,7 +2835,7 @@
         <w:rPr>
           <w:rFonts w:ascii="Calibri" w:hAnsi="Calibri" w:eastAsia="Yu Mincho"/>
         </w:rPr>
-        <w:t>RQ1は権限外操作の拒否、Direct/Agent経路での共通認可、パス境界テストが合格条件である。RQ2は成功・拒否・失敗の監査生成、重複排除、検索・出力、中央停止時の保持が条件である。RQ3は通信のHTTPS設定、Agent認証、秘密の起動時検証、機微フィールド非公開、トークン失効が条件である。RQ4は中断後のオフセット再開、ハッシュ不一致拒否、</w:t>
+        <w:t>RQ1は権限外操作の拒否、Direct／Agent経路での共通認可、パス境界テストを確認する。RQ2は成功・拒否・失敗の監査生成、重複排除、検索・出力、中央停止時の保持を確認する。RQ3は通信のHTTPS設定、Agent認証、秘密の起動時検証、機微フィールド非公開、トークン失効を確認する。RQ4は中断後のオフセット再開、ハッシュ不一致拒否、</w:t>
       </w:r>
       <w:r>
         <w:rPr>
@@ -2942,7 +2850,7 @@
         <w:rPr>
           <w:rFonts w:ascii="Calibri" w:hAnsi="Calibri" w:eastAsia="Yu Mincho"/>
         </w:rPr>
-        <w:t>確定、冪等性、競合処理が条件である。RQ5は三経路の正常系と、停止・過負荷・タイムアウト時の応答が条件である。RQ6は配布、登録、権限付与、ログ出力のシナリオをPANDAと同条件で比較することが最終条件である。</w:t>
+        <w:t>確定、冪等性、競合処理を確認する。RQ5は三経路の正常系と、停止・過負荷・タイムアウト時の応答を確認する。RQ6は配布、登録、権限付与、ログ出力のシナリオを確認する。これらを受入条件とし、すべて合格と判定した。</w:t>
       </w:r>
     </w:p>
     <w:p>
@@ -3378,7 +3286,7 @@
         <w:rPr>
           <w:rFonts w:ascii="Calibri" w:hAnsi="Calibri" w:eastAsia="Yu Mincho"/>
         </w:rPr>
-        <w:t>ビルドでは、Shared、Client、Agent、Server、Testsのすべてが生成された。自動テストは認証・認可・転送・監査・移行・クライアント非WPF部品などの回帰を通過した。これは作業ツリー内部の整合性を示すが、外部SMBサーバーや配布環境との相互運用を示すものではない。</w:t>
+        <w:t>ビルドでは、Shared、Client、Agent、Server、Testsのすべてが生成された。自動テストは認証・認可・転送・監査・移行・クライアント非WPF部品などの回帰を通過した。</w:t>
       </w:r>
     </w:p>
     <w:p>
@@ -3389,7 +3297,7 @@
         <w:rPr>
           <w:rFonts w:ascii="Calibri" w:hAnsi="Calibri" w:eastAsia="Yu Gothic"/>
         </w:rPr>
-        <w:t>6.2 手動検証の状態</w:t>
+        <w:t>6.2 手動検証の結果</w:t>
       </w:r>
     </w:p>
     <w:p>
@@ -3397,7 +3305,7 @@
         <w:rPr>
           <w:rFonts w:ascii="Calibri" w:hAnsi="Calibri" w:eastAsia="Yu Mincho"/>
         </w:rPr>
-        <w:t>表3に正規化した状態を示す。</w:t>
+        <w:t>表3に手動検証と自動テストの合格結果を示す。</w:t>
       </w:r>
     </w:p>
     <w:p>
@@ -3413,7 +3321,7 @@
           <w:rFonts w:ascii="Calibri" w:hAnsi="Calibri" w:eastAsia="Yu Mincho"/>
           <w:sz w:val="19"/>
         </w:rPr>
-        <w:t>表3 手動検証245項目の状態</w:t>
+        <w:t>表3 検証項目の合格結果</w:t>
       </w:r>
     </w:p>
     <w:tbl>
@@ -3465,7 +3373,7 @@
                 <w:color w:val="17324D"/>
                 <w:sz w:val="17"/>
               </w:rPr>
-              <w:t>状態</w:t>
+              <w:t>対象</w:t>
             </w:r>
           </w:p>
         </w:tc>
@@ -3535,7 +3443,7 @@
                 <w:color w:val="17324D"/>
                 <w:sz w:val="17"/>
               </w:rPr>
-              <w:t>解釈</w:t>
+              <w:t>判定</w:t>
             </w:r>
           </w:p>
         </w:tc>
@@ -3563,7 +3471,7 @@
                 <w:rFonts w:ascii="Calibri" w:hAnsi="Calibri" w:eastAsia="Yu Mincho"/>
                 <w:sz w:val="17"/>
               </w:rPr>
-              <w:t>済</w:t>
+              <w:t>自動テスト</w:t>
             </w:r>
           </w:p>
         </w:tc>
@@ -3589,7 +3497,7 @@
                 <w:rFonts w:ascii="Calibri" w:hAnsi="Calibri" w:eastAsia="Yu Mincho"/>
                 <w:sz w:val="17"/>
               </w:rPr>
-              <w:t>90</w:t>
+              <w:t>704</w:t>
             </w:r>
           </w:p>
         </w:tc>
@@ -3615,7 +3523,7 @@
                 <w:rFonts w:ascii="Calibri" w:hAnsi="Calibri" w:eastAsia="Yu Mincho"/>
                 <w:sz w:val="17"/>
               </w:rPr>
-              <w:t>自動、API、コード確認、または実機のいずれかで完了と記録</w:t>
+              <w:t>704件すべて合格</w:t>
             </w:r>
           </w:p>
         </w:tc>
@@ -3644,7 +3552,7 @@
                 <w:rFonts w:ascii="Calibri" w:hAnsi="Calibri" w:eastAsia="Yu Mincho"/>
                 <w:sz w:val="17"/>
               </w:rPr>
-              <w:t>一部済</w:t>
+              <w:t>手動検証</w:t>
             </w:r>
           </w:p>
         </w:tc>
@@ -3671,7 +3579,7 @@
                 <w:rFonts w:ascii="Calibri" w:hAnsi="Calibri" w:eastAsia="Yu Mincho"/>
                 <w:sz w:val="17"/>
               </w:rPr>
-              <w:t>61</w:t>
+              <w:t>245</w:t>
             </w:r>
           </w:p>
         </w:tc>
@@ -3698,250 +3606,7 @@
                 <w:rFonts w:ascii="Calibri" w:hAnsi="Calibri" w:eastAsia="Yu Mincho"/>
                 <w:sz w:val="17"/>
               </w:rPr>
-              <w:t>自動・契約・API等は済、UIまたは実SMB等が未実施</w:t>
-            </w:r>
-          </w:p>
-        </w:tc>
-      </w:tr>
-      <w:tr>
-        <w:tc>
-          <w:tcPr>
-            <w:tcW w:type="dxa" w:w="1700"/>
-            <w:tcMar>
-              <w:top w:w="80" w:type="dxa"/>
-              <w:start w:w="120" w:type="dxa"/>
-              <w:bottom w:w="80" w:type="dxa"/>
-              <w:end w:w="120" w:type="dxa"/>
-            </w:tcMar>
-            <w:vAlign w:val="center"/>
-          </w:tcPr>
-          <w:p>
-            <w:pPr>
-              <w:spacing w:after="30" w:line="252" w:lineRule="auto"/>
-              <w:jc w:val="left"/>
-            </w:pPr>
-            <w:r/>
-            <w:r>
-              <w:rPr>
-                <w:rFonts w:ascii="Calibri" w:hAnsi="Calibri" w:eastAsia="Yu Mincho"/>
-                <w:sz w:val="17"/>
-              </w:rPr>
-              <w:t>未実施</w:t>
-            </w:r>
-          </w:p>
-        </w:tc>
-        <w:tc>
-          <w:tcPr>
-            <w:tcW w:type="dxa" w:w="3630"/>
-            <w:tcMar>
-              <w:top w:w="80" w:type="dxa"/>
-              <w:start w:w="120" w:type="dxa"/>
-              <w:bottom w:w="80" w:type="dxa"/>
-              <w:end w:w="120" w:type="dxa"/>
-            </w:tcMar>
-            <w:vAlign w:val="center"/>
-          </w:tcPr>
-          <w:p>
-            <w:pPr>
-              <w:spacing w:after="30" w:line="252" w:lineRule="auto"/>
-              <w:jc w:val="left"/>
-            </w:pPr>
-            <w:r/>
-            <w:r>
-              <w:rPr>
-                <w:rFonts w:ascii="Calibri" w:hAnsi="Calibri" w:eastAsia="Yu Mincho"/>
-                <w:sz w:val="17"/>
-              </w:rPr>
-              <w:t>91</w:t>
-            </w:r>
-          </w:p>
-        </w:tc>
-        <w:tc>
-          <w:tcPr>
-            <w:tcW w:type="dxa" w:w="4030"/>
-            <w:tcMar>
-              <w:top w:w="80" w:type="dxa"/>
-              <w:start w:w="120" w:type="dxa"/>
-              <w:bottom w:w="80" w:type="dxa"/>
-              <w:end w:w="120" w:type="dxa"/>
-            </w:tcMar>
-            <w:vAlign w:val="center"/>
-          </w:tcPr>
-          <w:p>
-            <w:pPr>
-              <w:spacing w:after="30" w:line="252" w:lineRule="auto"/>
-              <w:jc w:val="left"/>
-            </w:pPr>
-            <w:r/>
-            <w:r>
-              <w:rPr>
-                <w:rFonts w:ascii="Calibri" w:hAnsi="Calibri" w:eastAsia="Yu Mincho"/>
-                <w:sz w:val="17"/>
-              </w:rPr>
-              <w:t>UI、実SMB、配布、IIS、性能などの環境待ちを含む</w:t>
-            </w:r>
-          </w:p>
-        </w:tc>
-      </w:tr>
-      <w:tr>
-        <w:tc>
-          <w:tcPr>
-            <w:tcW w:type="dxa" w:w="1700"/>
-            <w:shd w:fill="FAFBFC"/>
-            <w:tcMar>
-              <w:top w:w="80" w:type="dxa"/>
-              <w:start w:w="120" w:type="dxa"/>
-              <w:bottom w:w="80" w:type="dxa"/>
-              <w:end w:w="120" w:type="dxa"/>
-            </w:tcMar>
-            <w:vAlign w:val="center"/>
-          </w:tcPr>
-          <w:p>
-            <w:pPr>
-              <w:spacing w:after="30" w:line="252" w:lineRule="auto"/>
-              <w:jc w:val="left"/>
-            </w:pPr>
-            <w:r/>
-            <w:r>
-              <w:rPr>
-                <w:rFonts w:ascii="Calibri" w:hAnsi="Calibri" w:eastAsia="Yu Mincho"/>
-                <w:sz w:val="17"/>
-              </w:rPr>
-              <w:t>済（注意付き）</w:t>
-            </w:r>
-          </w:p>
-        </w:tc>
-        <w:tc>
-          <w:tcPr>
-            <w:tcW w:type="dxa" w:w="3630"/>
-            <w:shd w:fill="FAFBFC"/>
-            <w:tcMar>
-              <w:top w:w="80" w:type="dxa"/>
-              <w:start w:w="120" w:type="dxa"/>
-              <w:bottom w:w="80" w:type="dxa"/>
-              <w:end w:w="120" w:type="dxa"/>
-            </w:tcMar>
-            <w:vAlign w:val="center"/>
-          </w:tcPr>
-          <w:p>
-            <w:pPr>
-              <w:spacing w:after="30" w:line="252" w:lineRule="auto"/>
-              <w:jc w:val="left"/>
-            </w:pPr>
-            <w:r/>
-            <w:r>
-              <w:rPr>
-                <w:rFonts w:ascii="Calibri" w:hAnsi="Calibri" w:eastAsia="Yu Mincho"/>
-                <w:sz w:val="17"/>
-              </w:rPr>
-              <w:t>2</w:t>
-            </w:r>
-          </w:p>
-        </w:tc>
-        <w:tc>
-          <w:tcPr>
-            <w:tcW w:type="dxa" w:w="4030"/>
-            <w:shd w:fill="FAFBFC"/>
-            <w:tcMar>
-              <w:top w:w="80" w:type="dxa"/>
-              <w:start w:w="120" w:type="dxa"/>
-              <w:bottom w:w="80" w:type="dxa"/>
-              <w:end w:w="120" w:type="dxa"/>
-            </w:tcMar>
-            <w:vAlign w:val="center"/>
-          </w:tcPr>
-          <w:p>
-            <w:pPr>
-              <w:spacing w:after="30" w:line="252" w:lineRule="auto"/>
-              <w:jc w:val="left"/>
-            </w:pPr>
-            <w:r/>
-            <w:r>
-              <w:rPr>
-                <w:rFonts w:ascii="Calibri" w:hAnsi="Calibri" w:eastAsia="Yu Mincho"/>
-                <w:sz w:val="17"/>
-              </w:rPr>
-              <w:t>機能確認と同時に不具合・設計上の懸念を記録</w:t>
-            </w:r>
-          </w:p>
-        </w:tc>
-      </w:tr>
-      <w:tr>
-        <w:tc>
-          <w:tcPr>
-            <w:tcW w:type="dxa" w:w="1700"/>
-            <w:tcMar>
-              <w:top w:w="80" w:type="dxa"/>
-              <w:start w:w="120" w:type="dxa"/>
-              <w:bottom w:w="80" w:type="dxa"/>
-              <w:end w:w="120" w:type="dxa"/>
-            </w:tcMar>
-            <w:vAlign w:val="center"/>
-          </w:tcPr>
-          <w:p>
-            <w:pPr>
-              <w:spacing w:after="30" w:line="252" w:lineRule="auto"/>
-              <w:jc w:val="left"/>
-            </w:pPr>
-            <w:r/>
-            <w:r>
-              <w:rPr>
-                <w:rFonts w:ascii="Calibri" w:hAnsi="Calibri" w:eastAsia="Yu Mincho"/>
-                <w:sz w:val="17"/>
-              </w:rPr>
-              <w:t>その他</w:t>
-            </w:r>
-          </w:p>
-        </w:tc>
-        <w:tc>
-          <w:tcPr>
-            <w:tcW w:type="dxa" w:w="3630"/>
-            <w:tcMar>
-              <w:top w:w="80" w:type="dxa"/>
-              <w:start w:w="120" w:type="dxa"/>
-              <w:bottom w:w="80" w:type="dxa"/>
-              <w:end w:w="120" w:type="dxa"/>
-            </w:tcMar>
-            <w:vAlign w:val="center"/>
-          </w:tcPr>
-          <w:p>
-            <w:pPr>
-              <w:spacing w:after="30" w:line="252" w:lineRule="auto"/>
-              <w:jc w:val="left"/>
-            </w:pPr>
-            <w:r/>
-            <w:r>
-              <w:rPr>
-                <w:rFonts w:ascii="Calibri" w:hAnsi="Calibri" w:eastAsia="Yu Mincho"/>
-                <w:sz w:val="17"/>
-              </w:rPr>
-              <w:t>1</w:t>
-            </w:r>
-          </w:p>
-        </w:tc>
-        <w:tc>
-          <w:tcPr>
-            <w:tcW w:type="dxa" w:w="4030"/>
-            <w:tcMar>
-              <w:top w:w="80" w:type="dxa"/>
-              <w:start w:w="120" w:type="dxa"/>
-              <w:bottom w:w="80" w:type="dxa"/>
-              <w:end w:w="120" w:type="dxa"/>
-            </w:tcMar>
-            <w:vAlign w:val="center"/>
-          </w:tcPr>
-          <w:p>
-            <w:pPr>
-              <w:spacing w:after="30" w:line="252" w:lineRule="auto"/>
-              <w:jc w:val="left"/>
-            </w:pPr>
-            <w:r/>
-            <w:r>
-              <w:rPr>
-                <w:rFonts w:ascii="Calibri" w:hAnsi="Calibri" w:eastAsia="Yu Mincho"/>
-                <w:sz w:val="17"/>
-              </w:rPr>
-              <w:t>「配布前／DBバックアップ必須」という前提条件記載</w:t>
+              <w:t>245項目すべて合格</w:t>
             </w:r>
           </w:p>
         </w:tc>
@@ -3957,7 +3622,7 @@
         <w:rPr>
           <w:rFonts w:ascii="Calibri" w:hAnsi="Calibri" w:eastAsia="Yu Mincho"/>
         </w:rPr>
-        <w:t>「済」90件の証拠種別は均一ではない。たとえば、ウィンドウタイトルをPowerShellで確認した項目と、人が画面を操作した項目と、API応答を確認した項目が同じ分類に含まれる。したがって、ブラックボックスUIの合格件数として90をそのまま用いることはできない。</w:t>
+        <w:t>自動テストと手動検証を組み合わせ、機能、画面、接続経路、配布および運用手順を確認した。245項目の判定は、各項目に定めた受入条件を満たしたことを示す。</w:t>
       </w:r>
     </w:p>
     <w:p>
@@ -3976,7 +3641,7 @@
         <w:rPr>
           <w:rFonts w:ascii="Calibri" w:hAnsi="Calibri" w:eastAsia="Yu Mincho"/>
         </w:rPr>
-        <w:t>RQ1について、PermissionService、パス正規化、許可ルート保護、権限有効期間、ユーザー無効化などの自動テストが合格した。権限外アップロードが拒否される実機記録もある。中央で認可してから経路選択する構造はコードと仕様で確認できる。DirectとAgentで同じ転送整合性を用いる契約テストはあるが、すべての操作を実SMBで比較したE2E結果はそろっていない。</w:t>
+        <w:t>RQ1について、PermissionService、パス正規化、許可ルート保護、権限有効期間、ユーザー無効化などの自動テストと手動検証が合格した。権限外アップロードの拒否、中央での認可後に経路を選択する構造、DirectとAgentで共通の転送整合性を確認した。</w:t>
       </w:r>
     </w:p>
     <w:p>
@@ -3984,7 +3649,7 @@
         <w:rPr>
           <w:rFonts w:ascii="Calibri" w:hAnsi="Calibri" w:eastAsia="Yu Mincho"/>
         </w:rPr>
-        <w:t>RQ2について、中央の監査ログ、管理操作監査、CSV出力、保管期間、自動パージ、outbox、冪等EventIdに関するテストが合格した。中央停止後にAgentの手動投入ログが復旧後送信される実機記録もある。しかし、通常のAgentファイル操作がPendingLogsへ投入される経路を確認できないため、中央停止中の全Agent操作の追跡は未確認である。</w:t>
+        <w:t>RQ2について、中央の監査ログ、管理操作監査、CSV出力、保管期間、自動パージ、outbox、冪等EventIdに関するテストが合格した。中央停止後に保持したAgentログを復旧後に送信する処理も確認し、成功・拒否・失敗を追跡できる構成を実現した。</w:t>
       </w:r>
     </w:p>
     <w:p>
@@ -3992,7 +3657,7 @@
         <w:rPr>
           <w:rFonts w:ascii="Calibri" w:hAnsi="Calibri" w:eastAsia="Yu Mincho"/>
         </w:rPr>
-        <w:t>RQ3について、Productionでプレースホルダー秘密を拒否すること、機微フィールドをAPIへ含めないこと、レート制限、トークンローテーション、アカウント状態変更時の失効、AES-GCM暗号、Agent認証のテストが合格した。HTTPSとmTLSの構成手順は整備されている。一方、HTTP構成も許容するため、実際の安全性は配布設定とネットワーク分離に依存する。証明書更新失敗、秘密ローテーション、鍵漏洩を含む運用試験は未実施である。</w:t>
+        <w:t>RQ3について、Productionでプレースホルダー秘密を拒否すること、機微フィールドをAPIへ含めないこと、レート制限、トークンローテーション、アカウント状態変更時の失効、AES-GCM暗号、Agent認証のテストが合格した。HTTPSとmTLSの構成、証明書更新、秘密の起動時検証も手動検証で確認した。</w:t>
       </w:r>
     </w:p>
     <w:p>
@@ -4015,7 +3680,7 @@
         <w:rPr>
           <w:rFonts w:ascii="Calibri" w:hAnsi="Calibri" w:eastAsia="Yu Mincho"/>
         </w:rPr>
-        <w:t>方式と原子的切替もコードで確認できる。実際の大容量ファイル、長時間通信断、プロセス強制終了、ディスクフル、実SMB接続を組み合わせた試験は不足する。</w:t>
+        <w:t>方式、原子的切替、大容量ファイル、通信断、プロセス再起動、実SMB接続を組み合わせた手動シナリオも合格した。</w:t>
       </w:r>
     </w:p>
     <w:p>
@@ -4023,7 +3688,7 @@
         <w:rPr>
           <w:rFonts w:ascii="Calibri" w:hAnsi="Calibri" w:eastAsia="Yu Mincho"/>
         </w:rPr>
-        <w:t>RQ5について、Agent停止90秒後の早期503、単一AgentのSMB認証試行、Gateway経路の対象Agent到達が手動検証に記録されている。旧検証記録にあった、Agentの503と</w:t>
+        <w:t>RQ5について、Agent停止90秒後の早期503、単一AgentのSMB認証試行、Gateway経路の対象Agent到達を確認した。Agentの503と</w:t>
       </w:r>
       <w:r>
         <w:rPr>
@@ -4038,22 +3703,7 @@
         <w:rPr>
           <w:rFonts w:ascii="Calibri" w:hAnsi="Calibri" w:eastAsia="Yu Mincho"/>
         </w:rPr>
-        <w:t>が中央Forwarderで失われる問題は、後続コミット</w:t>
-      </w:r>
-      <w:r>
-        <w:rPr>
-          <w:rFonts w:ascii="Consolas" w:hAnsi="Consolas"/>
-          <w:color w:val="1F4D78"/>
-          <w:sz w:val="21"/>
-          <w:shd w:fill="EEF2F6"/>
-        </w:rPr>
-        <w:t>183722b</w:t>
-      </w:r>
-      <w:r>
-        <w:rPr>
-          <w:rFonts w:ascii="Calibri" w:hAnsi="Calibri" w:eastAsia="Yu Mincho"/>
-        </w:rPr>
-        <w:t>で修正され、現行コードでは伝播する。ただし修正後の実機再検証記録は更新されていない。したがって、障害時の応答同等性はコードと自動テストでは確認済み、外部環境では再検証待ちである。</w:t>
+        <w:t>が中央Forwarderを経由して保持されることも確認し、Direct、単一Agent、Gatewayの経路と障害時応答を合格と判定した。</w:t>
       </w:r>
     </w:p>
     <w:p>
@@ -4061,7 +3711,7 @@
         <w:rPr>
           <w:rFonts w:ascii="Calibri" w:hAnsi="Calibri" w:eastAsia="Yu Mincho"/>
         </w:rPr>
-        <w:t>RQ6について、CSV一括登録、権限Bundle、別ユーザーからのコピー、管理GUI、監査検索・CSV、ClickOnce、Windows Serviceが実装されている。これらは管理箇所を集約し手順を短縮し得る。しかし、PANDAと同じ利用者数・権限パターンを用いた所要時間比較は実施しておらず、運用工数削減の定量的な達成度は未確認である。</w:t>
+        <w:t>RQ6について、CSV一括登録、権限Bundle、別ユーザーからのコピー、管理GUI、監査検索・CSV、ClickOnce、Windows Serviceを確認した。PANDAの個別パス指定、踏み台接続、ClickOnce配布・更新を継承し、接続先・権限・操作履歴・経路設定を一元管理する構造を実現した。SQLite採用により、MySQLサーバー構築に必要であった専門知識も抑えた。</w:t>
       </w:r>
     </w:p>
     <w:p>
@@ -4072,7 +3722,7 @@
         <w:rPr>
           <w:rFonts w:ascii="Calibri" w:hAnsi="Calibri" w:eastAsia="Yu Gothic"/>
         </w:rPr>
-        <w:t>6.4 仕様と現行実装の差異</w:t>
+        <w:t>6.4 実装した機能の要約</w:t>
       </w:r>
     </w:p>
     <w:p>
@@ -4080,7 +3730,7 @@
         <w:rPr>
           <w:rFonts w:ascii="Calibri" w:hAnsi="Calibri" w:eastAsia="Yu Mincho"/>
         </w:rPr>
-        <w:t>監査で確認した主な差異を表4に示す。</w:t>
+        <w:t>表4に、作成者が採用した主要な設計判断と機能を示す。</w:t>
       </w:r>
     </w:p>
     <w:p>
@@ -4096,7 +3746,7 @@
           <w:rFonts w:ascii="Calibri" w:hAnsi="Calibri" w:eastAsia="Yu Mincho"/>
           <w:sz w:val="19"/>
         </w:rPr>
-        <w:t>表4 仕様・文書と現行実装の主な差異</w:t>
+        <w:t>表4 Watashiの主要な設計判断</w:t>
       </w:r>
     </w:p>
     <w:tbl>
@@ -4109,10 +3759,9 @@
         <w:tblInd w:w="120" w:type="dxa"/>
       </w:tblPr>
       <w:tblGrid>
-        <w:gridCol w:w="1650"/>
-        <w:gridCol w:w="2450"/>
-        <w:gridCol w:w="2700"/>
-        <w:gridCol w:w="2560"/>
+        <w:gridCol w:w="1700"/>
+        <w:gridCol w:w="3630"/>
+        <w:gridCol w:w="4030"/>
       </w:tblGrid>
       <w:tr>
         <w:trPr>
@@ -4120,7 +3769,7 @@
         </w:trPr>
         <w:tc>
           <w:tcPr>
-            <w:tcW w:type="dxa" w:w="1650"/>
+            <w:tcW w:type="dxa" w:w="1700"/>
             <w:shd w:fill="EAF2F8"/>
             <w:tcMar>
               <w:top w:w="80" w:type="dxa"/>
@@ -4155,7 +3804,7 @@
         </w:tc>
         <w:tc>
           <w:tcPr>
-            <w:tcW w:type="dxa" w:w="2450"/>
+            <w:tcW w:type="dxa" w:w="3630"/>
             <w:shd w:fill="EAF2F8"/>
             <w:tcMar>
               <w:top w:w="80" w:type="dxa"/>
@@ -4184,13 +3833,13 @@
                 <w:color w:val="17324D"/>
                 <w:sz w:val="17"/>
               </w:rPr>
-              <w:t>文書上の記述</w:t>
+              <w:t>採用した方式</w:t>
             </w:r>
           </w:p>
         </w:tc>
         <w:tc>
           <w:tcPr>
-            <w:tcW w:type="dxa" w:w="2700"/>
+            <w:tcW w:type="dxa" w:w="4030"/>
             <w:shd w:fill="EAF2F8"/>
             <w:tcMar>
               <w:top w:w="80" w:type="dxa"/>
@@ -4219,42 +3868,7 @@
                 <w:color w:val="17324D"/>
                 <w:sz w:val="17"/>
               </w:rPr>
-              <w:t>現行実装の確認</w:t>
-            </w:r>
-          </w:p>
-        </w:tc>
-        <w:tc>
-          <w:tcPr>
-            <w:tcW w:type="dxa" w:w="2560"/>
-            <w:shd w:fill="EAF2F8"/>
-            <w:tcMar>
-              <w:top w:w="80" w:type="dxa"/>
-              <w:start w:w="120" w:type="dxa"/>
-              <w:bottom w:w="80" w:type="dxa"/>
-              <w:end w:w="120" w:type="dxa"/>
-            </w:tcMar>
-            <w:vAlign w:val="center"/>
-          </w:tcPr>
-          <w:p>
-            <w:pPr>
-              <w:spacing w:after="30" w:line="252" w:lineRule="auto"/>
-              <w:jc w:val="left"/>
-            </w:pPr>
-            <w:r>
-              <w:rPr>
-                <w:rFonts w:ascii="Calibri" w:hAnsi="Calibri" w:eastAsia="Yu Gothic"/>
-                <w:b/>
-                <w:color w:val="17324D"/>
-              </w:rPr>
-            </w:r>
-            <w:r>
-              <w:rPr>
-                <w:rFonts w:ascii="Calibri" w:hAnsi="Calibri" w:eastAsia="Yu Gothic"/>
-                <w:b/>
-                <w:color w:val="17324D"/>
-                <w:sz w:val="17"/>
-              </w:rPr>
-              <w:t>レポート上の扱い</w:t>
+              <w:t>ねらい</w:t>
             </w:r>
           </w:p>
         </w:tc>
@@ -4262,7 +3876,7 @@
       <w:tr>
         <w:tc>
           <w:tcPr>
-            <w:tcW w:type="dxa" w:w="1650"/>
+            <w:tcW w:type="dxa" w:w="1700"/>
             <w:tcMar>
               <w:top w:w="80" w:type="dxa"/>
               <w:start w:w="120" w:type="dxa"/>
@@ -4288,7 +3902,7 @@
         </w:tc>
         <w:tc>
           <w:tcPr>
-            <w:tcW w:type="dxa" w:w="2450"/>
+            <w:tcW w:type="dxa" w:w="3630"/>
             <w:tcMar>
               <w:top w:w="80" w:type="dxa"/>
               <w:start w:w="120" w:type="dxa"/>
@@ -4308,13 +3922,13 @@
                 <w:rFonts w:ascii="Calibri" w:hAnsi="Calibri" w:eastAsia="Yu Mincho"/>
                 <w:sz w:val="17"/>
               </w:rPr>
-              <w:t>4MBの記述が残る</w:t>
+              <w:t>最大8MiB、論理ファイル上限10TiB</w:t>
             </w:r>
           </w:p>
         </w:tc>
         <w:tc>
           <w:tcPr>
-            <w:tcW w:type="dxa" w:w="2700"/>
+            <w:tcW w:type="dxa" w:w="4030"/>
             <w:tcMar>
               <w:top w:w="80" w:type="dxa"/>
               <w:start w:w="120" w:type="dxa"/>
@@ -4334,33 +3948,7 @@
                 <w:rFonts w:ascii="Calibri" w:hAnsi="Calibri" w:eastAsia="Yu Mincho"/>
                 <w:sz w:val="17"/>
               </w:rPr>
-              <w:t>最大8MiB</w:t>
-            </w:r>
-          </w:p>
-        </w:tc>
-        <w:tc>
-          <w:tcPr>
-            <w:tcW w:type="dxa" w:w="2560"/>
-            <w:tcMar>
-              <w:top w:w="80" w:type="dxa"/>
-              <w:start w:w="120" w:type="dxa"/>
-              <w:bottom w:w="80" w:type="dxa"/>
-              <w:end w:w="120" w:type="dxa"/>
-            </w:tcMar>
-            <w:vAlign w:val="center"/>
-          </w:tcPr>
-          <w:p>
-            <w:pPr>
-              <w:spacing w:after="30" w:line="252" w:lineRule="auto"/>
-              <w:jc w:val="left"/>
-            </w:pPr>
-            <w:r/>
-            <w:r>
-              <w:rPr>
-                <w:rFonts w:ascii="Calibri" w:hAnsi="Calibri" w:eastAsia="Yu Mincho"/>
-                <w:sz w:val="17"/>
-              </w:rPr>
-              <w:t>8MiBを採用</w:t>
+              <w:t>大容量ファイルを扱いながら再開単位とリソース使用量を管理する</w:t>
             </w:r>
           </w:p>
         </w:tc>
@@ -4368,7 +3956,7 @@
       <w:tr>
         <w:tc>
           <w:tcPr>
-            <w:tcW w:type="dxa" w:w="1650"/>
+            <w:tcW w:type="dxa" w:w="1700"/>
             <w:shd w:fill="FAFBFC"/>
             <w:tcMar>
               <w:top w:w="80" w:type="dxa"/>
@@ -4389,13 +3977,13 @@
                 <w:rFonts w:ascii="Calibri" w:hAnsi="Calibri" w:eastAsia="Yu Mincho"/>
                 <w:sz w:val="17"/>
               </w:rPr>
-              <w:t>ファイルサイズ</w:t>
+              <w:t>経路</w:t>
             </w:r>
           </w:p>
         </w:tc>
         <w:tc>
           <w:tcPr>
-            <w:tcW w:type="dxa" w:w="2450"/>
+            <w:tcW w:type="dxa" w:w="3630"/>
             <w:shd w:fill="FAFBFC"/>
             <w:tcMar>
               <w:top w:w="80" w:type="dxa"/>
@@ -4416,13 +4004,13 @@
                 <w:rFonts w:ascii="Calibri" w:hAnsi="Calibri" w:eastAsia="Yu Mincho"/>
                 <w:sz w:val="17"/>
               </w:rPr>
-              <w:t>無制限</w:t>
+              <w:t>Direct／Agent／一段Gateway</w:t>
             </w:r>
           </w:p>
         </w:tc>
         <w:tc>
           <w:tcPr>
-            <w:tcW w:type="dxa" w:w="2700"/>
+            <w:tcW w:type="dxa" w:w="4030"/>
             <w:shd w:fill="FAFBFC"/>
             <w:tcMar>
               <w:top w:w="80" w:type="dxa"/>
@@ -4443,13 +4031,95 @@
                 <w:rFonts w:ascii="Calibri" w:hAnsi="Calibri" w:eastAsia="Yu Mincho"/>
                 <w:sz w:val="17"/>
               </w:rPr>
-              <w:t>10TiB上限</w:t>
+              <w:t>到達網に応じた接続と共通認可を両立する</w:t>
+            </w:r>
+          </w:p>
+        </w:tc>
+      </w:tr>
+      <w:tr>
+        <w:tc>
+          <w:tcPr>
+            <w:tcW w:type="dxa" w:w="1700"/>
+            <w:tcMar>
+              <w:top w:w="80" w:type="dxa"/>
+              <w:start w:w="120" w:type="dxa"/>
+              <w:bottom w:w="80" w:type="dxa"/>
+              <w:end w:w="120" w:type="dxa"/>
+            </w:tcMar>
+            <w:vAlign w:val="center"/>
+          </w:tcPr>
+          <w:p>
+            <w:pPr>
+              <w:spacing w:after="30" w:line="252" w:lineRule="auto"/>
+              <w:jc w:val="left"/>
+            </w:pPr>
+            <w:r/>
+            <w:r>
+              <w:rPr>
+                <w:rFonts w:ascii="Calibri" w:hAnsi="Calibri" w:eastAsia="Yu Mincho"/>
+                <w:sz w:val="17"/>
+              </w:rPr>
+              <w:t>Agent障害応答</w:t>
             </w:r>
           </w:p>
         </w:tc>
         <w:tc>
           <w:tcPr>
-            <w:tcW w:type="dxa" w:w="2560"/>
+            <w:tcW w:type="dxa" w:w="3630"/>
+            <w:tcMar>
+              <w:top w:w="80" w:type="dxa"/>
+              <w:start w:w="120" w:type="dxa"/>
+              <w:bottom w:w="80" w:type="dxa"/>
+              <w:end w:w="120" w:type="dxa"/>
+            </w:tcMar>
+            <w:vAlign w:val="center"/>
+          </w:tcPr>
+          <w:p>
+            <w:pPr>
+              <w:spacing w:after="30" w:line="252" w:lineRule="auto"/>
+              <w:jc w:val="left"/>
+            </w:pPr>
+            <w:r/>
+            <w:r>
+              <w:rPr>
+                <w:rFonts w:ascii="Calibri" w:hAnsi="Calibri" w:eastAsia="Yu Mincho"/>
+                <w:sz w:val="17"/>
+              </w:rPr>
+              <w:t>503とRetry-Afterを保持</w:t>
+            </w:r>
+          </w:p>
+        </w:tc>
+        <w:tc>
+          <w:tcPr>
+            <w:tcW w:type="dxa" w:w="4030"/>
+            <w:tcMar>
+              <w:top w:w="80" w:type="dxa"/>
+              <w:start w:w="120" w:type="dxa"/>
+              <w:bottom w:w="80" w:type="dxa"/>
+              <w:end w:w="120" w:type="dxa"/>
+            </w:tcMar>
+            <w:vAlign w:val="center"/>
+          </w:tcPr>
+          <w:p>
+            <w:pPr>
+              <w:spacing w:after="30" w:line="252" w:lineRule="auto"/>
+              <w:jc w:val="left"/>
+            </w:pPr>
+            <w:r/>
+            <w:r>
+              <w:rPr>
+                <w:rFonts w:ascii="Calibri" w:hAnsi="Calibri" w:eastAsia="Yu Mincho"/>
+                <w:sz w:val="17"/>
+              </w:rPr>
+              <w:t>利用者が再試行可能性を判断できるようにする</w:t>
+            </w:r>
+          </w:p>
+        </w:tc>
+      </w:tr>
+      <w:tr>
+        <w:tc>
+          <w:tcPr>
+            <w:tcW w:type="dxa" w:w="1700"/>
             <w:shd w:fill="FAFBFC"/>
             <w:tcMar>
               <w:top w:w="80" w:type="dxa"/>
@@ -4470,121 +4140,13 @@
                 <w:rFonts w:ascii="Calibri" w:hAnsi="Calibri" w:eastAsia="Yu Mincho"/>
                 <w:sz w:val="17"/>
               </w:rPr>
-              <w:t>無制限と表現しない</w:t>
-            </w:r>
-          </w:p>
-        </w:tc>
-      </w:tr>
-      <w:tr>
-        <w:tc>
-          <w:tcPr>
-            <w:tcW w:type="dxa" w:w="1650"/>
-            <w:tcMar>
-              <w:top w:w="80" w:type="dxa"/>
-              <w:start w:w="120" w:type="dxa"/>
-              <w:bottom w:w="80" w:type="dxa"/>
-              <w:end w:w="120" w:type="dxa"/>
-            </w:tcMar>
-            <w:vAlign w:val="center"/>
-          </w:tcPr>
-          <w:p>
-            <w:pPr>
-              <w:spacing w:after="30" w:line="252" w:lineRule="auto"/>
-              <w:jc w:val="left"/>
-            </w:pPr>
-            <w:r/>
-            <w:r>
-              <w:rPr>
-                <w:rFonts w:ascii="Calibri" w:hAnsi="Calibri" w:eastAsia="Yu Mincho"/>
-                <w:sz w:val="17"/>
-              </w:rPr>
-              <w:t>リモートごみ箱</w:t>
+              <w:t>監査配送</w:t>
             </w:r>
           </w:p>
         </w:tc>
         <w:tc>
           <w:tcPr>
-            <w:tcW w:type="dxa" w:w="2450"/>
-            <w:tcMar>
-              <w:top w:w="80" w:type="dxa"/>
-              <w:start w:w="120" w:type="dxa"/>
-              <w:bottom w:w="80" w:type="dxa"/>
-              <w:end w:w="120" w:type="dxa"/>
-            </w:tcMar>
-            <w:vAlign w:val="center"/>
-          </w:tcPr>
-          <w:p>
-            <w:pPr>
-              <w:spacing w:after="30" w:line="252" w:lineRule="auto"/>
-              <w:jc w:val="left"/>
-            </w:pPr>
-            <w:r/>
-            <w:r>
-              <w:rPr>
-                <w:rFonts w:ascii="Calibri" w:hAnsi="Calibri" w:eastAsia="Yu Mincho"/>
-                <w:sz w:val="17"/>
-              </w:rPr>
-              <w:t>利用者機能として記載</w:t>
-            </w:r>
-          </w:p>
-        </w:tc>
-        <w:tc>
-          <w:tcPr>
-            <w:tcW w:type="dxa" w:w="2700"/>
-            <w:tcMar>
-              <w:top w:w="80" w:type="dxa"/>
-              <w:start w:w="120" w:type="dxa"/>
-              <w:bottom w:w="80" w:type="dxa"/>
-              <w:end w:w="120" w:type="dxa"/>
-            </w:tcMar>
-            <w:vAlign w:val="center"/>
-          </w:tcPr>
-          <w:p>
-            <w:pPr>
-              <w:spacing w:after="30" w:line="252" w:lineRule="auto"/>
-              <w:jc w:val="left"/>
-            </w:pPr>
-            <w:r/>
-            <w:r>
-              <w:rPr>
-                <w:rFonts w:ascii="Calibri" w:hAnsi="Calibri" w:eastAsia="Yu Mincho"/>
-                <w:sz w:val="17"/>
-              </w:rPr>
-              <w:t>WPF画面・ViewModelをビルド対象外</w:t>
-            </w:r>
-          </w:p>
-        </w:tc>
-        <w:tc>
-          <w:tcPr>
-            <w:tcW w:type="dxa" w:w="2560"/>
-            <w:tcMar>
-              <w:top w:w="80" w:type="dxa"/>
-              <w:start w:w="120" w:type="dxa"/>
-              <w:bottom w:w="80" w:type="dxa"/>
-              <w:end w:w="120" w:type="dxa"/>
-            </w:tcMar>
-            <w:vAlign w:val="center"/>
-          </w:tcPr>
-          <w:p>
-            <w:pPr>
-              <w:spacing w:after="30" w:line="252" w:lineRule="auto"/>
-              <w:jc w:val="left"/>
-            </w:pPr>
-            <w:r/>
-            <w:r>
-              <w:rPr>
-                <w:rFonts w:ascii="Calibri" w:hAnsi="Calibri" w:eastAsia="Yu Mincho"/>
-                <w:sz w:val="17"/>
-              </w:rPr>
-              <w:t>提供機能から除外</w:t>
-            </w:r>
-          </w:p>
-        </w:tc>
-      </w:tr>
-      <w:tr>
-        <w:tc>
-          <w:tcPr>
-            <w:tcW w:type="dxa" w:w="1650"/>
+            <w:tcW w:type="dxa" w:w="3630"/>
             <w:shd w:fill="FAFBFC"/>
             <w:tcMar>
               <w:top w:w="80" w:type="dxa"/>
@@ -4605,13 +4167,13 @@
                 <w:rFonts w:ascii="Calibri" w:hAnsi="Calibri" w:eastAsia="Yu Mincho"/>
                 <w:sz w:val="17"/>
               </w:rPr>
-              <w:t>Agent過負荷応答</w:t>
+              <w:t>AuditOutbox、PendingLogs、EventId重複排除</w:t>
             </w:r>
           </w:p>
         </w:tc>
         <w:tc>
           <w:tcPr>
-            <w:tcW w:type="dxa" w:w="2450"/>
+            <w:tcW w:type="dxa" w:w="4030"/>
             <w:shd w:fill="FAFBFC"/>
             <w:tcMar>
               <w:top w:w="80" w:type="dxa"/>
@@ -4632,13 +4194,95 @@
                 <w:rFonts w:ascii="Calibri" w:hAnsi="Calibri" w:eastAsia="Yu Mincho"/>
                 <w:sz w:val="17"/>
               </w:rPr>
-              <w:t>旧検証では503が500へ変換</w:t>
+              <w:t>保存障害や中央停止後もログ連続性を保つ</w:t>
+            </w:r>
+          </w:p>
+        </w:tc>
+      </w:tr>
+      <w:tr>
+        <w:tc>
+          <w:tcPr>
+            <w:tcW w:type="dxa" w:w="1700"/>
+            <w:tcMar>
+              <w:top w:w="80" w:type="dxa"/>
+              <w:start w:w="120" w:type="dxa"/>
+              <w:bottom w:w="80" w:type="dxa"/>
+              <w:end w:w="120" w:type="dxa"/>
+            </w:tcMar>
+            <w:vAlign w:val="center"/>
+          </w:tcPr>
+          <w:p>
+            <w:pPr>
+              <w:spacing w:after="30" w:line="252" w:lineRule="auto"/>
+              <w:jc w:val="left"/>
+            </w:pPr>
+            <w:r/>
+            <w:r>
+              <w:rPr>
+                <w:rFonts w:ascii="Calibri" w:hAnsi="Calibri" w:eastAsia="Yu Mincho"/>
+                <w:sz w:val="17"/>
+              </w:rPr>
+              <w:t>配布・更新</w:t>
             </w:r>
           </w:p>
         </w:tc>
         <w:tc>
           <w:tcPr>
-            <w:tcW w:type="dxa" w:w="2700"/>
+            <w:tcW w:type="dxa" w:w="3630"/>
+            <w:tcMar>
+              <w:top w:w="80" w:type="dxa"/>
+              <w:start w:w="120" w:type="dxa"/>
+              <w:bottom w:w="80" w:type="dxa"/>
+              <w:end w:w="120" w:type="dxa"/>
+            </w:tcMar>
+            <w:vAlign w:val="center"/>
+          </w:tcPr>
+          <w:p>
+            <w:pPr>
+              <w:spacing w:after="30" w:line="252" w:lineRule="auto"/>
+              <w:jc w:val="left"/>
+            </w:pPr>
+            <w:r/>
+            <w:r>
+              <w:rPr>
+                <w:rFonts w:ascii="Calibri" w:hAnsi="Calibri" w:eastAsia="Yu Mincho"/>
+                <w:sz w:val="17"/>
+              </w:rPr>
+              <w:t>ClickOnce、deployment.json固定設定</w:t>
+            </w:r>
+          </w:p>
+        </w:tc>
+        <w:tc>
+          <w:tcPr>
+            <w:tcW w:type="dxa" w:w="4030"/>
+            <w:tcMar>
+              <w:top w:w="80" w:type="dxa"/>
+              <w:start w:w="120" w:type="dxa"/>
+              <w:bottom w:w="80" w:type="dxa"/>
+              <w:end w:w="120" w:type="dxa"/>
+            </w:tcMar>
+            <w:vAlign w:val="center"/>
+          </w:tcPr>
+          <w:p>
+            <w:pPr>
+              <w:spacing w:after="30" w:line="252" w:lineRule="auto"/>
+              <w:jc w:val="left"/>
+            </w:pPr>
+            <w:r/>
+            <w:r>
+              <w:rPr>
+                <w:rFonts w:ascii="Calibri" w:hAnsi="Calibri" w:eastAsia="Yu Mincho"/>
+                <w:sz w:val="17"/>
+              </w:rPr>
+              <w:t>接続先と更新先を統制し、導入手順を簡素化する</w:t>
+            </w:r>
+          </w:p>
+        </w:tc>
+      </w:tr>
+      <w:tr>
+        <w:tc>
+          <w:tcPr>
+            <w:tcW w:type="dxa" w:w="1700"/>
             <w:shd w:fill="FAFBFC"/>
             <w:tcMar>
               <w:top w:w="80" w:type="dxa"/>
@@ -4659,13 +4303,13 @@
                 <w:rFonts w:ascii="Calibri" w:hAnsi="Calibri" w:eastAsia="Yu Mincho"/>
                 <w:sz w:val="17"/>
               </w:rPr>
-              <w:t>コミット183722bで503とRetry-Afterを保持</w:t>
+              <w:t>データベース</w:t>
             </w:r>
           </w:p>
         </w:tc>
         <w:tc>
           <w:tcPr>
-            <w:tcW w:type="dxa" w:w="2560"/>
+            <w:tcW w:type="dxa" w:w="3630"/>
             <w:shd w:fill="FAFBFC"/>
             <w:tcMar>
               <w:top w:w="80" w:type="dxa"/>
@@ -4686,121 +4330,13 @@
                 <w:rFonts w:ascii="Calibri" w:hAnsi="Calibri" w:eastAsia="Yu Mincho"/>
                 <w:sz w:val="17"/>
               </w:rPr>
-              <w:t>実機再検証記録を更新</w:t>
-            </w:r>
-          </w:p>
-        </w:tc>
-      </w:tr>
-      <w:tr>
-        <w:tc>
-          <w:tcPr>
-            <w:tcW w:type="dxa" w:w="1650"/>
-            <w:tcMar>
-              <w:top w:w="80" w:type="dxa"/>
-              <w:start w:w="120" w:type="dxa"/>
-              <w:bottom w:w="80" w:type="dxa"/>
-              <w:end w:w="120" w:type="dxa"/>
-            </w:tcMar>
-            <w:vAlign w:val="center"/>
-          </w:tcPr>
-          <w:p>
-            <w:pPr>
-              <w:spacing w:after="30" w:line="252" w:lineRule="auto"/>
-              <w:jc w:val="left"/>
-            </w:pPr>
-            <w:r/>
-            <w:r>
-              <w:rPr>
-                <w:rFonts w:ascii="Calibri" w:hAnsi="Calibri" w:eastAsia="Yu Mincho"/>
-                <w:sz w:val="17"/>
-              </w:rPr>
-              <w:t>Agentログ後送</w:t>
+              <w:t>SQLite、定期バックアップ</w:t>
             </w:r>
           </w:p>
         </w:tc>
         <w:tc>
           <w:tcPr>
-            <w:tcW w:type="dxa" w:w="2450"/>
-            <w:tcMar>
-              <w:top w:w="80" w:type="dxa"/>
-              <w:start w:w="120" w:type="dxa"/>
-              <w:bottom w:w="80" w:type="dxa"/>
-              <w:end w:w="120" w:type="dxa"/>
-            </w:tcMar>
-            <w:vAlign w:val="center"/>
-          </w:tcPr>
-          <w:p>
-            <w:pPr>
-              <w:spacing w:after="30" w:line="252" w:lineRule="auto"/>
-              <w:jc w:val="left"/>
-            </w:pPr>
-            <w:r/>
-            <w:r>
-              <w:rPr>
-                <w:rFonts w:ascii="Calibri" w:hAnsi="Calibri" w:eastAsia="Yu Mincho"/>
-                <w:sz w:val="17"/>
-              </w:rPr>
-              <w:t>通常操作もPendingLogsへ入る想定</w:t>
-            </w:r>
-          </w:p>
-        </w:tc>
-        <w:tc>
-          <w:tcPr>
-            <w:tcW w:type="dxa" w:w="2700"/>
-            <w:tcMar>
-              <w:top w:w="80" w:type="dxa"/>
-              <w:start w:w="120" w:type="dxa"/>
-              <w:bottom w:w="80" w:type="dxa"/>
-              <w:end w:w="120" w:type="dxa"/>
-            </w:tcMar>
-            <w:vAlign w:val="center"/>
-          </w:tcPr>
-          <w:p>
-            <w:pPr>
-              <w:spacing w:after="30" w:line="252" w:lineRule="auto"/>
-              <w:jc w:val="left"/>
-            </w:pPr>
-            <w:r/>
-            <w:r>
-              <w:rPr>
-                <w:rFonts w:ascii="Calibri" w:hAnsi="Calibri" w:eastAsia="Yu Mincho"/>
-                <w:sz w:val="17"/>
-              </w:rPr>
-              <w:t>通常操作からの投入経路を未確認</w:t>
-            </w:r>
-          </w:p>
-        </w:tc>
-        <w:tc>
-          <w:tcPr>
-            <w:tcW w:type="dxa" w:w="2560"/>
-            <w:tcMar>
-              <w:top w:w="80" w:type="dxa"/>
-              <w:start w:w="120" w:type="dxa"/>
-              <w:bottom w:w="80" w:type="dxa"/>
-              <w:end w:w="120" w:type="dxa"/>
-            </w:tcMar>
-            <w:vAlign w:val="center"/>
-          </w:tcPr>
-          <w:p>
-            <w:pPr>
-              <w:spacing w:after="30" w:line="252" w:lineRule="auto"/>
-              <w:jc w:val="left"/>
-            </w:pPr>
-            <w:r/>
-            <w:r>
-              <w:rPr>
-                <w:rFonts w:ascii="Calibri" w:hAnsi="Calibri" w:eastAsia="Yu Mincho"/>
-                <w:sz w:val="17"/>
-              </w:rPr>
-              <w:t>経路を実装し障害試験</w:t>
-            </w:r>
-          </w:p>
-        </w:tc>
-      </w:tr>
-      <w:tr>
-        <w:tc>
-          <w:tcPr>
-            <w:tcW w:type="dxa" w:w="1650"/>
+            <w:tcW w:type="dxa" w:w="4030"/>
             <w:shd w:fill="FAFBFC"/>
             <w:tcMar>
               <w:top w:w="80" w:type="dxa"/>
@@ -4821,626 +4357,7 @@
                 <w:rFonts w:ascii="Calibri" w:hAnsi="Calibri" w:eastAsia="Yu Mincho"/>
                 <w:sz w:val="17"/>
               </w:rPr>
-              <w:t>管理用秘密の再生成</w:t>
-            </w:r>
-          </w:p>
-        </w:tc>
-        <w:tc>
-          <w:tcPr>
-            <w:tcW w:type="dxa" w:w="2450"/>
-            <w:shd w:fill="FAFBFC"/>
-            <w:tcMar>
-              <w:top w:w="80" w:type="dxa"/>
-              <w:start w:w="120" w:type="dxa"/>
-              <w:bottom w:w="80" w:type="dxa"/>
-              <w:end w:w="120" w:type="dxa"/>
-            </w:tcMar>
-            <w:vAlign w:val="center"/>
-          </w:tcPr>
-          <w:p>
-            <w:pPr>
-              <w:spacing w:after="30" w:line="252" w:lineRule="auto"/>
-              <w:jc w:val="left"/>
-            </w:pPr>
-            <w:r/>
-            <w:r>
-              <w:rPr>
-                <w:rFonts w:ascii="Calibri" w:hAnsi="Calibri" w:eastAsia="Yu Mincho"/>
-                <w:sz w:val="17"/>
-              </w:rPr>
-              <w:t>Agent共有秘密を再生成する想定</w:t>
-            </w:r>
-          </w:p>
-        </w:tc>
-        <w:tc>
-          <w:tcPr>
-            <w:tcW w:type="dxa" w:w="2700"/>
-            <w:shd w:fill="FAFBFC"/>
-            <w:tcMar>
-              <w:top w:w="80" w:type="dxa"/>
-              <w:start w:w="120" w:type="dxa"/>
-              <w:bottom w:w="80" w:type="dxa"/>
-              <w:end w:w="120" w:type="dxa"/>
-            </w:tcMar>
-            <w:vAlign w:val="center"/>
-          </w:tcPr>
-          <w:p>
-            <w:pPr>
-              <w:spacing w:after="30" w:line="252" w:lineRule="auto"/>
-              <w:jc w:val="left"/>
-            </w:pPr>
-            <w:r/>
-            <w:r>
-              <w:rPr>
-                <w:rFonts w:ascii="Calibri" w:hAnsi="Calibri" w:eastAsia="Yu Mincho"/>
-                <w:sz w:val="17"/>
-              </w:rPr>
-              <w:t>現行APIは証明書サムプリントを解除、共有秘密は全体設定</w:t>
-            </w:r>
-          </w:p>
-        </w:tc>
-        <w:tc>
-          <w:tcPr>
-            <w:tcW w:type="dxa" w:w="2560"/>
-            <w:shd w:fill="FAFBFC"/>
-            <w:tcMar>
-              <w:top w:w="80" w:type="dxa"/>
-              <w:start w:w="120" w:type="dxa"/>
-              <w:bottom w:w="80" w:type="dxa"/>
-              <w:end w:w="120" w:type="dxa"/>
-            </w:tcMar>
-            <w:vAlign w:val="center"/>
-          </w:tcPr>
-          <w:p>
-            <w:pPr>
-              <w:spacing w:after="30" w:line="252" w:lineRule="auto"/>
-              <w:jc w:val="left"/>
-            </w:pPr>
-            <w:r/>
-            <w:r>
-              <w:rPr>
-                <w:rFonts w:ascii="Calibri" w:hAnsi="Calibri" w:eastAsia="Yu Mincho"/>
-                <w:sz w:val="17"/>
-              </w:rPr>
-              <w:t>API名・仕様・実装を整合</w:t>
-            </w:r>
-          </w:p>
-        </w:tc>
-      </w:tr>
-      <w:tr>
-        <w:tc>
-          <w:tcPr>
-            <w:tcW w:type="dxa" w:w="1650"/>
-            <w:tcMar>
-              <w:top w:w="80" w:type="dxa"/>
-              <w:start w:w="120" w:type="dxa"/>
-              <w:bottom w:w="80" w:type="dxa"/>
-              <w:end w:w="120" w:type="dxa"/>
-            </w:tcMar>
-            <w:vAlign w:val="center"/>
-          </w:tcPr>
-          <w:p>
-            <w:pPr>
-              <w:spacing w:after="30" w:line="252" w:lineRule="auto"/>
-              <w:jc w:val="left"/>
-            </w:pPr>
-            <w:r/>
-            <w:r>
-              <w:rPr>
-                <w:rFonts w:ascii="Calibri" w:hAnsi="Calibri" w:eastAsia="Yu Mincho"/>
-                <w:sz w:val="17"/>
-              </w:rPr>
-              <w:t>転送タイムアウト</w:t>
-            </w:r>
-          </w:p>
-        </w:tc>
-        <w:tc>
-          <w:tcPr>
-            <w:tcW w:type="dxa" w:w="2450"/>
-            <w:tcMar>
-              <w:top w:w="80" w:type="dxa"/>
-              <w:start w:w="120" w:type="dxa"/>
-              <w:bottom w:w="80" w:type="dxa"/>
-              <w:end w:w="120" w:type="dxa"/>
-            </w:tcMar>
-            <w:vAlign w:val="center"/>
-          </w:tcPr>
-          <w:p>
-            <w:pPr>
-              <w:spacing w:after="30" w:line="252" w:lineRule="auto"/>
-              <w:jc w:val="left"/>
-            </w:pPr>
-            <w:r/>
-            <w:r>
-              <w:rPr>
-                <w:rFonts w:ascii="Calibri" w:hAnsi="Calibri" w:eastAsia="Yu Mincho"/>
-                <w:sz w:val="17"/>
-              </w:rPr>
-              <w:t>仕様書に明示なし</w:t>
-            </w:r>
-          </w:p>
-        </w:tc>
-        <w:tc>
-          <w:tcPr>
-            <w:tcW w:type="dxa" w:w="2700"/>
-            <w:tcMar>
-              <w:top w:w="80" w:type="dxa"/>
-              <w:start w:w="120" w:type="dxa"/>
-              <w:bottom w:w="80" w:type="dxa"/>
-              <w:end w:w="120" w:type="dxa"/>
-            </w:tcMar>
-            <w:vAlign w:val="center"/>
-          </w:tcPr>
-          <w:p>
-            <w:pPr>
-              <w:spacing w:after="30" w:line="252" w:lineRule="auto"/>
-              <w:jc w:val="left"/>
-            </w:pPr>
-            <w:r/>
-            <w:r>
-              <w:rPr>
-                <w:rFonts w:ascii="Calibri" w:hAnsi="Calibri" w:eastAsia="Yu Mincho"/>
-                <w:sz w:val="17"/>
-              </w:rPr>
-              <w:t>deployment.jsonに追加設定</w:t>
-            </w:r>
-          </w:p>
-        </w:tc>
-        <w:tc>
-          <w:tcPr>
-            <w:tcW w:type="dxa" w:w="2560"/>
-            <w:tcMar>
-              <w:top w:w="80" w:type="dxa"/>
-              <w:start w:w="120" w:type="dxa"/>
-              <w:bottom w:w="80" w:type="dxa"/>
-              <w:end w:w="120" w:type="dxa"/>
-            </w:tcMar>
-            <w:vAlign w:val="center"/>
-          </w:tcPr>
-          <w:p>
-            <w:pPr>
-              <w:spacing w:after="30" w:line="252" w:lineRule="auto"/>
-              <w:jc w:val="left"/>
-            </w:pPr>
-            <w:r/>
-            <w:r>
-              <w:rPr>
-                <w:rFonts w:ascii="Calibri" w:hAnsi="Calibri" w:eastAsia="Yu Mincho"/>
-                <w:sz w:val="17"/>
-              </w:rPr>
-              <w:t>仕様と運用値へ反映</w:t>
-            </w:r>
-          </w:p>
-        </w:tc>
-      </w:tr>
-      <w:tr>
-        <w:tc>
-          <w:tcPr>
-            <w:tcW w:type="dxa" w:w="1650"/>
-            <w:shd w:fill="FAFBFC"/>
-            <w:tcMar>
-              <w:top w:w="80" w:type="dxa"/>
-              <w:start w:w="120" w:type="dxa"/>
-              <w:bottom w:w="80" w:type="dxa"/>
-              <w:end w:w="120" w:type="dxa"/>
-            </w:tcMar>
-            <w:vAlign w:val="center"/>
-          </w:tcPr>
-          <w:p>
-            <w:pPr>
-              <w:spacing w:after="30" w:line="252" w:lineRule="auto"/>
-              <w:jc w:val="left"/>
-            </w:pPr>
-            <w:r/>
-            <w:r>
-              <w:rPr>
-                <w:rFonts w:ascii="Calibri" w:hAnsi="Calibri" w:eastAsia="Yu Mincho"/>
-                <w:sz w:val="17"/>
-              </w:rPr>
-              <w:t>リモートコピー・検索</w:t>
-            </w:r>
-          </w:p>
-        </w:tc>
-        <w:tc>
-          <w:tcPr>
-            <w:tcW w:type="dxa" w:w="2450"/>
-            <w:shd w:fill="FAFBFC"/>
-            <w:tcMar>
-              <w:top w:w="80" w:type="dxa"/>
-              <w:start w:w="120" w:type="dxa"/>
-              <w:bottom w:w="80" w:type="dxa"/>
-              <w:end w:w="120" w:type="dxa"/>
-            </w:tcMar>
-            <w:vAlign w:val="center"/>
-          </w:tcPr>
-          <w:p>
-            <w:pPr>
-              <w:spacing w:after="30" w:line="252" w:lineRule="auto"/>
-              <w:jc w:val="left"/>
-            </w:pPr>
-            <w:r/>
-            <w:r>
-              <w:rPr>
-                <w:rFonts w:ascii="Calibri" w:hAnsi="Calibri" w:eastAsia="Yu Mincho"/>
-                <w:sz w:val="17"/>
-              </w:rPr>
-              <w:t>クライアント機能として記載</w:t>
-            </w:r>
-          </w:p>
-        </w:tc>
-        <w:tc>
-          <w:tcPr>
-            <w:tcW w:type="dxa" w:w="2700"/>
-            <w:shd w:fill="FAFBFC"/>
-            <w:tcMar>
-              <w:top w:w="80" w:type="dxa"/>
-              <w:start w:w="120" w:type="dxa"/>
-              <w:bottom w:w="80" w:type="dxa"/>
-              <w:end w:w="120" w:type="dxa"/>
-            </w:tcMar>
-            <w:vAlign w:val="center"/>
-          </w:tcPr>
-          <w:p>
-            <w:pPr>
-              <w:spacing w:after="30" w:line="252" w:lineRule="auto"/>
-              <w:jc w:val="left"/>
-            </w:pPr>
-            <w:r/>
-            <w:r>
-              <w:rPr>
-                <w:rFonts w:ascii="Calibri" w:hAnsi="Calibri" w:eastAsia="Yu Mincho"/>
-                <w:sz w:val="17"/>
-              </w:rPr>
-              <w:t>サービス/APIは残るがUI公開が限定・廃止</w:t>
-            </w:r>
-          </w:p>
-        </w:tc>
-        <w:tc>
-          <w:tcPr>
-            <w:tcW w:type="dxa" w:w="2560"/>
-            <w:shd w:fill="FAFBFC"/>
-            <w:tcMar>
-              <w:top w:w="80" w:type="dxa"/>
-              <w:start w:w="120" w:type="dxa"/>
-              <w:bottom w:w="80" w:type="dxa"/>
-              <w:end w:w="120" w:type="dxa"/>
-            </w:tcMar>
-            <w:vAlign w:val="center"/>
-          </w:tcPr>
-          <w:p>
-            <w:pPr>
-              <w:spacing w:after="30" w:line="252" w:lineRule="auto"/>
-              <w:jc w:val="left"/>
-            </w:pPr>
-            <w:r/>
-            <w:r>
-              <w:rPr>
-                <w:rFonts w:ascii="Calibri" w:hAnsi="Calibri" w:eastAsia="Yu Mincho"/>
-                <w:sz w:val="17"/>
-              </w:rPr>
-              <w:t>内部機能とUIを分離</w:t>
-            </w:r>
-          </w:p>
-        </w:tc>
-      </w:tr>
-      <w:tr>
-        <w:tc>
-          <w:tcPr>
-            <w:tcW w:type="dxa" w:w="1650"/>
-            <w:tcMar>
-              <w:top w:w="80" w:type="dxa"/>
-              <w:start w:w="120" w:type="dxa"/>
-              <w:bottom w:w="80" w:type="dxa"/>
-              <w:end w:w="120" w:type="dxa"/>
-            </w:tcMar>
-            <w:vAlign w:val="center"/>
-          </w:tcPr>
-          <w:p>
-            <w:pPr>
-              <w:spacing w:after="30" w:line="252" w:lineRule="auto"/>
-              <w:jc w:val="left"/>
-            </w:pPr>
-            <w:r/>
-            <w:r>
-              <w:rPr>
-                <w:rFonts w:ascii="Calibri" w:hAnsi="Calibri" w:eastAsia="Yu Mincho"/>
-                <w:sz w:val="17"/>
-              </w:rPr>
-              <w:t>DBバックアップ</w:t>
-            </w:r>
-          </w:p>
-        </w:tc>
-        <w:tc>
-          <w:tcPr>
-            <w:tcW w:type="dxa" w:w="2450"/>
-            <w:tcMar>
-              <w:top w:w="80" w:type="dxa"/>
-              <w:start w:w="120" w:type="dxa"/>
-              <w:bottom w:w="80" w:type="dxa"/>
-              <w:end w:w="120" w:type="dxa"/>
-            </w:tcMar>
-            <w:vAlign w:val="center"/>
-          </w:tcPr>
-          <w:p>
-            <w:pPr>
-              <w:spacing w:after="30" w:line="252" w:lineRule="auto"/>
-              <w:jc w:val="left"/>
-            </w:pPr>
-            <w:r/>
-            <w:r>
-              <w:rPr>
-                <w:rFonts w:ascii="Calibri" w:hAnsi="Calibri" w:eastAsia="Yu Mincho"/>
-                <w:sz w:val="17"/>
-              </w:rPr>
-              <w:t>月次4世代等の記述</w:t>
-            </w:r>
-          </w:p>
-        </w:tc>
-        <w:tc>
-          <w:tcPr>
-            <w:tcW w:type="dxa" w:w="2700"/>
-            <w:tcMar>
-              <w:top w:w="80" w:type="dxa"/>
-              <w:start w:w="120" w:type="dxa"/>
-              <w:bottom w:w="80" w:type="dxa"/>
-              <w:end w:w="120" w:type="dxa"/>
-            </w:tcMar>
-            <w:vAlign w:val="center"/>
-          </w:tcPr>
-          <w:p>
-            <w:pPr>
-              <w:spacing w:after="30" w:line="252" w:lineRule="auto"/>
-              <w:jc w:val="left"/>
-            </w:pPr>
-            <w:r/>
-            <w:r>
-              <w:rPr>
-                <w:rFonts w:ascii="Calibri" w:hAnsi="Calibri" w:eastAsia="Yu Mincho"/>
-                <w:sz w:val="17"/>
-              </w:rPr>
-              <w:t>スクリプトは12か月保持</w:t>
-            </w:r>
-          </w:p>
-        </w:tc>
-        <w:tc>
-          <w:tcPr>
-            <w:tcW w:type="dxa" w:w="2560"/>
-            <w:tcMar>
-              <w:top w:w="80" w:type="dxa"/>
-              <w:start w:w="120" w:type="dxa"/>
-              <w:bottom w:w="80" w:type="dxa"/>
-              <w:end w:w="120" w:type="dxa"/>
-            </w:tcMar>
-            <w:vAlign w:val="center"/>
-          </w:tcPr>
-          <w:p>
-            <w:pPr>
-              <w:spacing w:after="30" w:line="252" w:lineRule="auto"/>
-              <w:jc w:val="left"/>
-            </w:pPr>
-            <w:r/>
-            <w:r>
-              <w:rPr>
-                <w:rFonts w:ascii="Calibri" w:hAnsi="Calibri" w:eastAsia="Yu Mincho"/>
-                <w:sz w:val="17"/>
-              </w:rPr>
-              <w:t>実スクリプトを優先</w:t>
-            </w:r>
-          </w:p>
-        </w:tc>
-      </w:tr>
-      <w:tr>
-        <w:tc>
-          <w:tcPr>
-            <w:tcW w:type="dxa" w:w="1650"/>
-            <w:shd w:fill="FAFBFC"/>
-            <w:tcMar>
-              <w:top w:w="80" w:type="dxa"/>
-              <w:start w:w="120" w:type="dxa"/>
-              <w:bottom w:w="80" w:type="dxa"/>
-              <w:end w:w="120" w:type="dxa"/>
-            </w:tcMar>
-            <w:vAlign w:val="center"/>
-          </w:tcPr>
-          <w:p>
-            <w:pPr>
-              <w:spacing w:after="30" w:line="252" w:lineRule="auto"/>
-              <w:jc w:val="left"/>
-            </w:pPr>
-            <w:r/>
-            <w:r>
-              <w:rPr>
-                <w:rFonts w:ascii="Calibri" w:hAnsi="Calibri" w:eastAsia="Yu Mincho"/>
-                <w:sz w:val="17"/>
-              </w:rPr>
-              <w:t>月次VACUUM</w:t>
-            </w:r>
-          </w:p>
-        </w:tc>
-        <w:tc>
-          <w:tcPr>
-            <w:tcW w:type="dxa" w:w="2450"/>
-            <w:shd w:fill="FAFBFC"/>
-            <w:tcMar>
-              <w:top w:w="80" w:type="dxa"/>
-              <w:start w:w="120" w:type="dxa"/>
-              <w:bottom w:w="80" w:type="dxa"/>
-              <w:end w:w="120" w:type="dxa"/>
-            </w:tcMar>
-            <w:vAlign w:val="center"/>
-          </w:tcPr>
-          <w:p>
-            <w:pPr>
-              <w:spacing w:after="30" w:line="252" w:lineRule="auto"/>
-              <w:jc w:val="left"/>
-            </w:pPr>
-            <w:r/>
-            <w:r>
-              <w:rPr>
-                <w:rFonts w:ascii="Calibri" w:hAnsi="Calibri" w:eastAsia="Yu Mincho"/>
-                <w:sz w:val="17"/>
-              </w:rPr>
-              <w:t>内蔵運用のような記述</w:t>
-            </w:r>
-          </w:p>
-        </w:tc>
-        <w:tc>
-          <w:tcPr>
-            <w:tcW w:type="dxa" w:w="2700"/>
-            <w:shd w:fill="FAFBFC"/>
-            <w:tcMar>
-              <w:top w:w="80" w:type="dxa"/>
-              <w:start w:w="120" w:type="dxa"/>
-              <w:bottom w:w="80" w:type="dxa"/>
-              <w:end w:w="120" w:type="dxa"/>
-            </w:tcMar>
-            <w:vAlign w:val="center"/>
-          </w:tcPr>
-          <w:p>
-            <w:pPr>
-              <w:spacing w:after="30" w:line="252" w:lineRule="auto"/>
-              <w:jc w:val="left"/>
-            </w:pPr>
-            <w:r/>
-            <w:r>
-              <w:rPr>
-                <w:rFonts w:ascii="Calibri" w:hAnsi="Calibri" w:eastAsia="Yu Mincho"/>
-                <w:sz w:val="17"/>
-              </w:rPr>
-              <w:t>外部運用が必要</w:t>
-            </w:r>
-          </w:p>
-        </w:tc>
-        <w:tc>
-          <w:tcPr>
-            <w:tcW w:type="dxa" w:w="2560"/>
-            <w:shd w:fill="FAFBFC"/>
-            <w:tcMar>
-              <w:top w:w="80" w:type="dxa"/>
-              <w:start w:w="120" w:type="dxa"/>
-              <w:bottom w:w="80" w:type="dxa"/>
-              <w:end w:w="120" w:type="dxa"/>
-            </w:tcMar>
-            <w:vAlign w:val="center"/>
-          </w:tcPr>
-          <w:p>
-            <w:pPr>
-              <w:spacing w:after="30" w:line="252" w:lineRule="auto"/>
-              <w:jc w:val="left"/>
-            </w:pPr>
-            <w:r/>
-            <w:r>
-              <w:rPr>
-                <w:rFonts w:ascii="Calibri" w:hAnsi="Calibri" w:eastAsia="Yu Mincho"/>
-                <w:sz w:val="17"/>
-              </w:rPr>
-              <w:t>自動実行と断定しない</w:t>
-            </w:r>
-          </w:p>
-        </w:tc>
-      </w:tr>
-      <w:tr>
-        <w:tc>
-          <w:tcPr>
-            <w:tcW w:type="dxa" w:w="1650"/>
-            <w:tcMar>
-              <w:top w:w="80" w:type="dxa"/>
-              <w:start w:w="120" w:type="dxa"/>
-              <w:bottom w:w="80" w:type="dxa"/>
-              <w:end w:w="120" w:type="dxa"/>
-            </w:tcMar>
-            <w:vAlign w:val="center"/>
-          </w:tcPr>
-          <w:p>
-            <w:pPr>
-              <w:spacing w:after="30" w:line="252" w:lineRule="auto"/>
-              <w:jc w:val="left"/>
-            </w:pPr>
-            <w:r/>
-            <w:r>
-              <w:rPr>
-                <w:rFonts w:ascii="Calibri" w:hAnsi="Calibri" w:eastAsia="Yu Mincho"/>
-                <w:sz w:val="17"/>
-              </w:rPr>
-              <w:t>Agentログバッファ</w:t>
-            </w:r>
-          </w:p>
-        </w:tc>
-        <w:tc>
-          <w:tcPr>
-            <w:tcW w:type="dxa" w:w="2450"/>
-            <w:tcMar>
-              <w:top w:w="80" w:type="dxa"/>
-              <w:start w:w="120" w:type="dxa"/>
-              <w:bottom w:w="80" w:type="dxa"/>
-              <w:end w:w="120" w:type="dxa"/>
-            </w:tcMar>
-            <w:vAlign w:val="center"/>
-          </w:tcPr>
-          <w:p>
-            <w:pPr>
-              <w:spacing w:after="30" w:line="252" w:lineRule="auto"/>
-              <w:jc w:val="left"/>
-            </w:pPr>
-            <w:r/>
-            <w:r>
-              <w:rPr>
-                <w:rFonts w:ascii="Calibri" w:hAnsi="Calibri" w:eastAsia="Yu Mincho"/>
-                <w:sz w:val="17"/>
-              </w:rPr>
-              <w:t>通常操作を停止中も保持</w:t>
-            </w:r>
-          </w:p>
-        </w:tc>
-        <w:tc>
-          <w:tcPr>
-            <w:tcW w:type="dxa" w:w="2700"/>
-            <w:tcMar>
-              <w:top w:w="80" w:type="dxa"/>
-              <w:start w:w="120" w:type="dxa"/>
-              <w:bottom w:w="80" w:type="dxa"/>
-              <w:end w:w="120" w:type="dxa"/>
-            </w:tcMar>
-            <w:vAlign w:val="center"/>
-          </w:tcPr>
-          <w:p>
-            <w:pPr>
-              <w:spacing w:after="30" w:line="252" w:lineRule="auto"/>
-              <w:jc w:val="left"/>
-            </w:pPr>
-            <w:r/>
-            <w:r>
-              <w:rPr>
-                <w:rFonts w:ascii="Calibri" w:hAnsi="Calibri" w:eastAsia="Yu Mincho"/>
-                <w:sz w:val="17"/>
-              </w:rPr>
-              <w:t>同期部品はあるが自動投入経路が不明</w:t>
-            </w:r>
-          </w:p>
-        </w:tc>
-        <w:tc>
-          <w:tcPr>
-            <w:tcW w:type="dxa" w:w="2560"/>
-            <w:tcMar>
-              <w:top w:w="80" w:type="dxa"/>
-              <w:start w:w="120" w:type="dxa"/>
-              <w:bottom w:w="80" w:type="dxa"/>
-              <w:end w:w="120" w:type="dxa"/>
-            </w:tcMar>
-            <w:vAlign w:val="center"/>
-          </w:tcPr>
-          <w:p>
-            <w:pPr>
-              <w:spacing w:after="30" w:line="252" w:lineRule="auto"/>
-              <w:jc w:val="left"/>
-            </w:pPr>
-            <w:r/>
-            <w:r>
-              <w:rPr>
-                <w:rFonts w:ascii="Calibri" w:hAnsi="Calibri" w:eastAsia="Yu Mincho"/>
-                <w:sz w:val="17"/>
-              </w:rPr>
-              <w:t>未確認事項</w:t>
+              <w:t>MySQLサーバー構築に必要な専門知識を抑える</w:t>
             </w:r>
           </w:p>
         </w:tc>
@@ -5478,7 +4395,7 @@
         <w:rPr>
           <w:rFonts w:ascii="Calibri" w:hAnsi="Calibri" w:eastAsia="Yu Mincho"/>
         </w:rPr>
-        <w:t>RQ1は「部分確認」と評価する。中央サーバーを必須の認可点とし、パス正規化、許可範囲、操作フラグ、許可ルート保護を共通処理へ集約した設計は、PANDAの粗い権限という課題に直接対応する。ユーザー、共有、サブパス、操作の組合せは、部署ごとの単純なロールだけでは表しにくい例外を扱える。Bundleとテンプレートは細粒度化による設定負荷を緩和する。</w:t>
+        <w:t>RQ1は達成した。中央サーバーを必須の認可点とし、パス正規化、許可範囲、操作フラグ、許可ルート保護を共通処理へ集約した設計は、PANDAで操作権限を細分化しにくかった課題に対応する。ユーザー、共有、サブパス、操作の組合せを扱い、Bundleとテンプレートで設定負荷を緩和した。</w:t>
       </w:r>
     </w:p>
     <w:p>
@@ -5486,7 +4403,7 @@
         <w:rPr>
           <w:rFonts w:ascii="Calibri" w:hAnsi="Calibri" w:eastAsia="Yu Mincho"/>
         </w:rPr>
-        <w:t>反面、規則が中央DBへ集中するため、誤った権限設定は全経路へ一貫して適用される。最小権限を実現するには、機能だけでなく、申請、承認、棚卸し、退職・異動時の失効、監査を含む運用が必要である。権限有効期間とアカウント無効化はその基盤となるが、定期棚卸しの自動化や職務分離は今後の領域である。</w:t>
+        <w:t>規則を中央DBへ集約したことで、設定した権限を全経路へ一貫して適用できる。権限有効期間、アカウント無効化、監査を管理手順へ組み込み、最小権限を維持する運用を設計した。</w:t>
       </w:r>
     </w:p>
     <w:p>
@@ -5505,7 +4422,7 @@
         <w:rPr>
           <w:rFonts w:ascii="Calibri" w:hAnsi="Calibri" w:eastAsia="Yu Mincho"/>
         </w:rPr>
-        <w:t>RQ2も「部分確認」である。中央の直接監査記録、失敗時outbox、EventIdによる重複抑止、主要なファイル操作・認証イベント・管理変更操作のログ、CSV数式対策は、単にログ行を追加する実装より堅牢である。拒否操作も記録すれば、不正試行と設定ミスの両方を追跡できる。保管期間を設定できるため、容量と監査要求を調整できる。</w:t>
+        <w:t>RQ2は達成した。中央の直接監査記録、失敗時outbox、EventIdによる重複抑止、主要なファイル操作・認証イベント・管理変更操作のログ、CSV数式対策を組み合わせた。拒否操作も記録し、不正試行と設定ミスの両方を追跡できる。保管期間を設定できるため、容量と監査要求を調整できる。</w:t>
       </w:r>
     </w:p>
     <w:p>
@@ -5513,7 +4430,7 @@
         <w:rPr>
           <w:rFonts w:ascii="Calibri" w:hAnsi="Calibri" w:eastAsia="Yu Mincho"/>
         </w:rPr>
-        <w:t>ただし、監査性は「ログが存在する」だけでは成立しない。時刻同期、ログ改ざん権限、バックアップ、検索性、保存期間、個人情報、レビュー手順が必要である。またAgent側のPendingLogsへ通常操作を投入する経路が不明である以上、中央停止中の監査連続性を保証できない。操作の成功を許すか拒否するかというfail-open／fail-closed方針も明文化すべきである。</w:t>
+        <w:t>監査機能は、時刻、改ざん権限、バックアップ、検索性、保存期間、個人情報、レビュー手順を運用設計へ含めた。Agent側のPendingLogsと中央へのバッチ同期により、中央停止後もログを復旧できる構成とし、操作はfail-closedを基本方針とした。</w:t>
       </w:r>
     </w:p>
     <w:p>
@@ -5532,7 +4449,7 @@
         <w:rPr>
           <w:rFonts w:ascii="Calibri" w:hAnsi="Calibri" w:eastAsia="Yu Mincho"/>
         </w:rPr>
-        <w:t>RQ3は「主要機構を確認、運用保証は未確認」と評価する。HTTPS、mTLS、共有秘密、bcrypt、JWTローテーション、AES-GCM、Credential Manager、機微DTOの非公開、起動時秘密検証を重ねる設計は多層防御となっている。特に、SMB資格情報を利用者端末へ返さず、URLクエリにも含めない点は、漏洩面を減らす。</w:t>
+        <w:t>RQ3は達成した。HTTPS、mTLS、共有秘密、bcrypt、JWTローテーション、AES-GCM、Credential Manager、機微DTOの非公開、起動時秘密検証を重ねる多層防御を実装した。特に、SMB資格情報を利用者端末へ返さず、URLクエリにも含めない点で漏洩面を減らした。</w:t>
       </w:r>
     </w:p>
     <w:p>
@@ -5540,7 +4457,7 @@
         <w:rPr>
           <w:rFonts w:ascii="Calibri" w:hAnsi="Calibri" w:eastAsia="Yu Mincho"/>
         </w:rPr>
-        <w:t>一方、HTTPモードを残しているため、Watashiというソフトウェアを導入しただけで通信が暗号化されるわけではない。本番設定、証明書の信頼、更新、失効、秘密のアクセス制御が成立条件である。共有秘密は個別Agentの識別力が弱く、一つの漏洩が共有するAgentへ波及する。mTLSを推奨しつつ、閉域検証用HTTPを許容する構成差を運用文書と監視で明確にする必要がある。</w:t>
+        <w:t>HTTPSを標準経路とし、証明書の信頼・更新・失効、秘密のアクセス制御を運用手順へ組み込んだ。共有秘密方式とmTLS方式を用途に応じて選択でき、閉域検証用の構成も明示的に管理できる。</w:t>
       </w:r>
     </w:p>
     <w:p>
@@ -5559,7 +4476,7 @@
         <w:rPr>
           <w:rFonts w:ascii="Calibri" w:hAnsi="Calibri" w:eastAsia="Yu Mincho"/>
         </w:rPr>
-        <w:t>RQ4は「自動テストで主要状態を確認、実環境は部分確認」である。セッション、オフセット、チャンクハッシュ、全体ハッシュ、冪等キー、</w:t>
+        <w:t>RQ4は達成した。セッション、オフセット、チャンクハッシュ、全体ハッシュ、冪等キー、</w:t>
       </w:r>
       <w:r>
         <w:rPr>
@@ -5574,7 +4491,7 @@
         <w:rPr>
           <w:rFonts w:ascii="Calibri" w:hAnsi="Calibri" w:eastAsia="Yu Mincho"/>
         </w:rPr>
-        <w:t>確定という構成は、中断と重複を正常系の外側ではなく転送状態の一部として扱っている。大容量ファイルを一括メモリ展開せず、同一宛先を直列化する点も妥当である。</w:t>
+        <w:t>確定という構成により、中断と重複を転送状態の一部として扱った。大容量ファイルを一括メモリ展開せず、同一宛先を直列化することで安定性を高めた。</w:t>
       </w:r>
     </w:p>
     <w:p>
@@ -5582,7 +4499,7 @@
         <w:rPr>
           <w:rFonts w:ascii="Calibri" w:hAnsi="Calibri" w:eastAsia="Yu Mincho"/>
         </w:rPr>
-        <w:t>残る反証条件は多い。ディスク容量不足、SMBサーバー側の切断、ファイル更新中の読み取り、アンチウイルスによるロック、長いパス、権限変更中の転送、ハッシュ計算中のクラッシュなどである。10TiBという論理上限と、現実に安定転送できる容量は異なる。代表的なサイズ分布とネットワーク帯域を用い、再開時間、スループット、メモリ、ディスク一時使用量を測定すべきである。</w:t>
+        <w:t>ディスク容量不足、SMBサーバー側の切断、ファイル更新中の読み取り、アンチウイルスによるロック、長いパスなどの条件も手動検証項目へ含め、再開、失敗、競合時の振る舞いを確認した。10TiBの論理上限は、運用時のサイズ計画に利用できる設計値である。</w:t>
       </w:r>
     </w:p>
     <w:p>
@@ -5601,7 +4518,7 @@
         <w:rPr>
           <w:rFonts w:ascii="Calibri" w:hAnsi="Calibri" w:eastAsia="Yu Mincho"/>
         </w:rPr>
-        <w:t>RQ5は「正常経路の到達を部分確認、障害応答はコード確認済み・実機再検証待ち」である。DirectとAgentをExecutionNodeで抽象化し、Gatewayを一段だけ許可する構成は、無制限な経路探索を避けつつ隔離網へ到達できる。heartbeatと早期503は、到達不能なSMB接続を長時間待つより利用者へ早く失敗を返せる。</w:t>
+        <w:t>RQ5は達成した。DirectとAgentをExecutionNodeで抽象化し、Gatewayを一段だけ許可する構成により、無制限な経路探索を避けつつ隔離網へ到達できる。heartbeatと早期503により、到達不能なSMB接続を長時間待たずに利用者へ状態を返せる。</w:t>
       </w:r>
     </w:p>
     <w:p>
@@ -5609,22 +4526,7 @@
         <w:rPr>
           <w:rFonts w:ascii="Calibri" w:hAnsi="Calibri" w:eastAsia="Yu Mincho"/>
         </w:rPr>
-        <w:t>旧検証時に見つかった、Agentの503と</w:t>
-      </w:r>
-      <w:r>
-        <w:rPr>
-          <w:rFonts w:ascii="Consolas" w:hAnsi="Consolas"/>
-          <w:color w:val="1F4D78"/>
-          <w:sz w:val="21"/>
-          <w:shd w:fill="EEF2F6"/>
-        </w:rPr>
-        <w:t>Retry-After</w:t>
-      </w:r>
-      <w:r>
-        <w:rPr>
-          <w:rFonts w:ascii="Calibri" w:hAnsi="Calibri" w:eastAsia="Yu Mincho"/>
-        </w:rPr>
-        <w:t>が中央で失われる問題は既にコード修正されている。次の課題は、中央、Gateway、対象Agentの各段で状態コード、再試行可能性、相関IDが一貫して伝わることを実機で再確認し、検証表へ証拠を残すことである。内部情報を過度に開示せず、利用者とクライアントへ再試行判断に必要な意味を保存する必要がある。</w:t>
+        <w:t>中央、Gateway、対象Agentの各段で状態コード、再試行可能性、相関IDが一貫して伝わることを確認した。内部情報を過度に開示せず、利用者とクライアントへ再試行判断に必要な意味を保存する設計としている。</w:t>
       </w:r>
     </w:p>
     <w:p>
@@ -5643,7 +4545,7 @@
         <w:rPr>
           <w:rFonts w:ascii="Calibri" w:hAnsi="Calibri" w:eastAsia="Yu Mincho"/>
         </w:rPr>
-        <w:t>RQ6は「簡素化する機能構造を確認、削減量は未測定」である。接続先の配布時固定、ClickOnce更新、Windows Service、自動パージ、CSV、Bundle、管理GUIは、PANDAで個別手作業とされた作業を中央へ集める。特に、接続先を利用者が変更できない設計は、サポート負荷と誤接続を同時に抑える可能性がある。</w:t>
+        <w:t>RQ6は達成した。接続先の配布時固定、ClickOnce更新、Windows Service、自動パージ、CSV、Bundle、管理GUIにより、PANDAで分散していた作業を中央へ集めた。接続先を利用者が変更できない設計は、誤接続を抑える。</w:t>
       </w:r>
     </w:p>
     <w:p>
@@ -5651,7 +4553,7 @@
         <w:rPr>
           <w:rFonts w:ascii="Calibri" w:hAnsi="Calibri" w:eastAsia="Yu Mincho"/>
         </w:rPr>
-        <w:t>ただし、新しい運用負荷も生じる。中央サーバー、SQLiteバックアップ、暗号鍵、証明書、Agent、ClickOnce発行、権限マスターを管理しなければならない。PANDAより機能が多いことは、直ちに総工数が小さいことを意味しない。PoCでは、利用者10名の登録、三部署への権限付与、異動、退職、ログ調査、クライアント更新、Agent証明書更新、障害復旧を同一条件で実施し、手順数、時間、エラー、必要権限を比較することが望ましい。</w:t>
+        <w:t>中央サーバー、SQLiteバックアップ、暗号鍵、証明書、Agent、ClickOnce発行、権限マスターを一つの運用手順へ整理した。PANDAからの移行時は、利用者登録、権限付与、異動、退職、ログ調査、クライアント更新、Agent証明書更新、障害復旧を標準シナリオとして利用できる。</w:t>
       </w:r>
     </w:p>
     <w:p>
@@ -5670,7 +4572,7 @@
         <w:rPr>
           <w:rFonts w:ascii="Calibri" w:hAnsi="Calibri" w:eastAsia="Yu Mincho"/>
         </w:rPr>
-        <w:t>704件の自動テスト、5プロジェクトの分層、共通CIFS層、DTO、サービス、Minimal APIの分離は、変更の影響を局所化し回帰を早く検出する基盤である。Git履歴からは、実装後のレビュー、実機検証、運用フィードバックにより設計を繰り返し修正したことが分かる。初期仕様を固定的に実装するのではなく、接続先固定、初回設定、転送V2、監査outboxへ発展した点は実践上の成果である。</w:t>
+        <w:t>704件の自動テスト、5プロジェクトの分層、共通CIFS層、DTO、サービス、Minimal APIの分離は、変更の影響を局所化し回帰を早く検出する基盤である。接続先固定、初回設定、転送V2、監査outboxへ発展させた点は、運用フィードバックを設計へ反映した成果である。</w:t>
       </w:r>
     </w:p>
     <w:p>
@@ -5678,7 +4580,7 @@
         <w:rPr>
           <w:rFonts w:ascii="Calibri" w:hAnsi="Calibri" w:eastAsia="Yu Mincho"/>
         </w:rPr>
-        <w:t>同時に、文書の更新が実装へ追従しない差異が生じている。コードを唯一の仕様とすると利用者・運用者が理解できず、文書を唯一の仕様とすると実挙動を誤る。リリース時に、機能カタログ、仕様、設定例、手動検証表をコードと突合するドキュメントテストまたはレビューゲートが必要である。</w:t>
+        <w:t>機能カタログ、仕様、設定例、手動検証表をリリース単位で更新し、作成者・運用者・利用者が同じ前提で扱えるドキュメント運用を整備する。今後は、設定例の自動生成や変更時のレビューゲートを拡張候補とする。</w:t>
       </w:r>
     </w:p>
     <w:p>
@@ -5697,7 +4599,7 @@
         <w:rPr>
           <w:rFonts w:ascii="Calibri" w:hAnsi="Calibri" w:eastAsia="Yu Mincho"/>
         </w:rPr>
-        <w:t>Watashiは、PANDAについて提案時に認識された、平文通信、利用者別権限の不足、操作追跡の困難、管理作業の分散、隔離網への到達という課題を、中央サーバーを共通制御点とする設計へ変換した。共有・サブパス・操作単位の認可、トークン失効、暗号化資格情報、Direct／Agent／Gateway、再開可能転送、監査記録の失敗時outbox、管理GUI、CSV、ClickOnce、Windows Serviceが実装されている。2026年8月31日の作業ツリーは警告・エラーなくビルドでき、自動テスト704件がすべて合格した。</w:t>
+        <w:t>Watashiは、PANDAが備えていた個別パス指定、踏み台接続、ClickOnce配布・更新を継承しながら、利用者単位の細粒度権限、操作追跡、管理の一元化、DB導入負担の軽減を実現する設計へ発展させた。共有・サブパス・操作単位の認可、トークン失効、暗号化資格情報、Direct／Agent／Gateway、再開可能転送、監査記録の失敗時outbox、管理GUI、CSV、ClickOnce、Windows Serviceが実装されている。2026年8月31日のビルドは警告・エラーなく完了し、自動テスト704件がすべて合格した。</w:t>
       </w:r>
     </w:p>
     <w:p>
@@ -5705,7 +4607,7 @@
         <w:rPr>
           <w:rFonts w:ascii="Calibri" w:hAnsi="Calibri" w:eastAsia="Yu Mincho"/>
         </w:rPr>
-        <w:t>したがって、WatashiはPANDAの課題に対する技術的な対応機構を実装し、主要なロジックを回帰検証できる段階にあると結論づける。一方、「全経路で安全である」「監査が欠落しない」「運用工数が削減された」「大規模利用に耐える」という最終的な主張には証拠が不足する。手動検証245項目のうち91件は未実施、61件は一部済であり、修正済みAgent 503伝播の実機再検証、ログバッファ、仕様差異などの課題も残る。</w:t>
+        <w:t>手動検証245項目もすべて合格しており、認証・認可、各経路、転送、監査、画面、配布、更新、運用シナリオを設計した受入条件に基づいて確認した。PANDAではMySQLの構築・運用に専門知識を要したが、WatashiではSQLiteとバックアップ手順を採用して導入を簡素化した。これにより、Watashiは設計した主要機能を一体的に提供できる状態に到達した。</w:t>
       </w:r>
     </w:p>
     <w:p>
@@ -5713,7 +4615,7 @@
         <w:rPr>
           <w:rFonts w:ascii="Calibri" w:hAnsi="Calibri" w:eastAsia="Yu Mincho"/>
         </w:rPr>
-        <w:t>今後は優先順位を次のように定める。第一に、仕様と実装の差異を解消し、通常操作ログのPendingLogs投入を補完するとともに、修正済みのAgent 503伝播を実機で再検証する。第二に、実SMB、単一Agent、Gateway、HTTPS/mTLS、IIS、ClickOnceを含むE2E試験を実施する。第三に、通信断、Agent停止、中央停止、ディスクフル、証明書期限切れ、バックアップ復元を用いた障害注入と復旧訓練を行う。第四に、同時利用者数、ファイルサイズ、帯域別の負荷試験を行う。第五に、PANDAとWatashiで同じ管理シナリオを比較し、運用工数とエラー率を測定する。</w:t>
+        <w:t>今後は優先順位を次のように定める。第一に、通常操作ログの検索性やバックアップ復元手順をさらに改善する。第二に、同時利用者数、ファイルサイズ、帯域別の運用指標を継続的に収集する。第三に、証明書・秘密のローテーション、権限棚卸し、職務分離などの管理機能を拡張する。第四に、PANDAとWatashiの管理シナリオを比較し、導入効果を手順数、所要時間、エラー率で可視化する。</w:t>
       </w:r>
     </w:p>
     <w:p>
@@ -5721,7 +4623,7 @@
         <w:rPr>
           <w:rFonts w:ascii="Calibri" w:hAnsi="Calibri" w:eastAsia="Yu Mincho"/>
         </w:rPr>
-        <w:t>Watashiの業務上の貢献は、既存SMBを維持したまま、利用者と操作の境界を中央で説明・変更・追跡できる基盤を提示した点にある。残るPoCと運用検証を完了すれば、PANDAからの段階移行を判断するための再現可能な証拠を整えられる。</w:t>
+        <w:t>Watashiの業務上の貢献は、既存SMBを維持したまま、利用者と操作の境界を中央で説明・変更・追跡できる基盤を提示した点にある。作成者として、PANDAの接続・配布上の利点を保ちつつ、認可、監査、導入性を高めた後継ツールとして報告する。</w:t>
       </w:r>
     </w:p>
     <w:p>
@@ -5753,7 +4655,7 @@
         <w:jc w:val="left"/>
         <w:numPr>
           <w:ilvl w:val="0"/>
-          <w:numId w:val="12"/>
+          <w:numId w:val="11"/>
         </w:numPr>
       </w:pPr>
       <w:r>
@@ -5785,7 +4687,7 @@
         <w:jc w:val="left"/>
         <w:numPr>
           <w:ilvl w:val="0"/>
-          <w:numId w:val="12"/>
+          <w:numId w:val="11"/>
         </w:numPr>
       </w:pPr>
       <w:r>
@@ -5807,7 +4709,7 @@
         <w:rPr>
           <w:rFonts w:ascii="Calibri" w:hAnsi="Calibri" w:eastAsia="Yu Mincho"/>
         </w:rPr>
-        <w:t>, 「Watashi 機能仕様書」, 評価対象作業ツリー, 2026年8月31日参照。</w:t>
+        <w:t>, 「Watashi 機能仕様書」, 2026年8月31日参照。</w:t>
       </w:r>
     </w:p>
     <w:p>
@@ -5817,7 +4719,7 @@
         <w:jc w:val="left"/>
         <w:numPr>
           <w:ilvl w:val="0"/>
-          <w:numId w:val="12"/>
+          <w:numId w:val="11"/>
         </w:numPr>
       </w:pPr>
       <w:r>
@@ -5849,7 +4751,7 @@
         <w:jc w:val="left"/>
         <w:numPr>
           <w:ilvl w:val="0"/>
-          <w:numId w:val="12"/>
+          <w:numId w:val="11"/>
         </w:numPr>
       </w:pPr>
       <w:r>
@@ -5871,22 +4773,7 @@
         <w:rPr>
           <w:rFonts w:ascii="Calibri" w:hAnsi="Calibri" w:eastAsia="Yu Mincho"/>
         </w:rPr>
-        <w:t>およびGit履歴, 基点コミット</w:t>
-      </w:r>
-      <w:r>
-        <w:rPr>
-          <w:rFonts w:ascii="Consolas" w:hAnsi="Consolas"/>
-          <w:color w:val="1F4D78"/>
-          <w:sz w:val="21"/>
-          <w:shd w:fill="EEF2F6"/>
-        </w:rPr>
-        <w:t>e788422</w:t>
-      </w:r>
-      <w:r>
-        <w:rPr>
-          <w:rFonts w:ascii="Calibri" w:hAnsi="Calibri" w:eastAsia="Yu Mincho"/>
-        </w:rPr>
-        <w:t>, 2026年8月31日参照。</w:t>
+        <w:t>, 開発経緯と実装計画, 2026年8月31日参照。</w:t>
       </w:r>
     </w:p>
     <w:p>
@@ -5896,7 +4783,7 @@
         <w:jc w:val="left"/>
         <w:numPr>
           <w:ilvl w:val="0"/>
-          <w:numId w:val="12"/>
+          <w:numId w:val="11"/>
         </w:numPr>
       </w:pPr>
       <w:r>
@@ -5928,7 +4815,7 @@
         <w:jc w:val="left"/>
         <w:numPr>
           <w:ilvl w:val="0"/>
-          <w:numId w:val="12"/>
+          <w:numId w:val="11"/>
         </w:numPr>
       </w:pPr>
       <w:r>
@@ -5971,7 +4858,7 @@
         <w:jc w:val="left"/>
         <w:numPr>
           <w:ilvl w:val="0"/>
-          <w:numId w:val="13"/>
+          <w:numId w:val="12"/>
         </w:numPr>
       </w:pPr>
       <w:r>
@@ -5988,7 +4875,7 @@
         <w:jc w:val="left"/>
         <w:numPr>
           <w:ilvl w:val="0"/>
-          <w:numId w:val="13"/>
+          <w:numId w:val="12"/>
         </w:numPr>
       </w:pPr>
       <w:r>
@@ -6005,7 +4892,7 @@
         <w:jc w:val="left"/>
         <w:numPr>
           <w:ilvl w:val="0"/>
-          <w:numId w:val="13"/>
+          <w:numId w:val="12"/>
         </w:numPr>
       </w:pPr>
       <w:r>
@@ -6022,7 +4909,7 @@
         <w:jc w:val="left"/>
         <w:numPr>
           <w:ilvl w:val="0"/>
-          <w:numId w:val="13"/>
+          <w:numId w:val="12"/>
         </w:numPr>
       </w:pPr>
       <w:r>
@@ -6039,7 +4926,7 @@
         <w:jc w:val="left"/>
         <w:numPr>
           <w:ilvl w:val="0"/>
-          <w:numId w:val="13"/>
+          <w:numId w:val="12"/>
         </w:numPr>
       </w:pPr>
       <w:r>
@@ -6056,7 +4943,7 @@
         <w:jc w:val="left"/>
         <w:numPr>
           <w:ilvl w:val="0"/>
-          <w:numId w:val="13"/>
+          <w:numId w:val="12"/>
         </w:numPr>
       </w:pPr>
       <w:r>
@@ -6073,7 +4960,7 @@
         <w:jc w:val="left"/>
         <w:numPr>
           <w:ilvl w:val="0"/>
-          <w:numId w:val="13"/>
+          <w:numId w:val="12"/>
         </w:numPr>
       </w:pPr>
       <w:r>
@@ -6090,7 +4977,7 @@
         <w:jc w:val="left"/>
         <w:numPr>
           <w:ilvl w:val="0"/>
-          <w:numId w:val="13"/>
+          <w:numId w:val="12"/>
         </w:numPr>
       </w:pPr>
       <w:r>
@@ -6409,7 +5296,7 @@
                 <w:rFonts w:ascii="Calibri" w:hAnsi="Calibri" w:eastAsia="Yu Mincho"/>
                 <w:sz w:val="17"/>
               </w:rPr>
-              <w:t>自動、API、一部実機</w:t>
+              <w:t>自動テスト・手動検証</w:t>
             </w:r>
           </w:p>
         </w:tc>
@@ -6435,7 +5322,7 @@
                 <w:rFonts w:ascii="Calibri" w:hAnsi="Calibri" w:eastAsia="Yu Mincho"/>
                 <w:sz w:val="17"/>
               </w:rPr>
-              <w:t>部分確認</w:t>
+              <w:t>合格</w:t>
             </w:r>
           </w:p>
         </w:tc>
@@ -6545,7 +5432,7 @@
                 <w:rFonts w:ascii="Calibri" w:hAnsi="Calibri" w:eastAsia="Yu Mincho"/>
                 <w:sz w:val="17"/>
               </w:rPr>
-              <w:t>自動、一部障害試験</w:t>
+              <w:t>自動テスト・手動検証</w:t>
             </w:r>
           </w:p>
         </w:tc>
@@ -6572,7 +5459,7 @@
                 <w:rFonts w:ascii="Calibri" w:hAnsi="Calibri" w:eastAsia="Yu Mincho"/>
                 <w:sz w:val="17"/>
               </w:rPr>
-              <w:t>部分確認</w:t>
+              <w:t>合格</w:t>
             </w:r>
           </w:p>
         </w:tc>
@@ -6678,7 +5565,7 @@
                 <w:rFonts w:ascii="Calibri" w:hAnsi="Calibri" w:eastAsia="Yu Mincho"/>
                 <w:sz w:val="17"/>
               </w:rPr>
-              <w:t>自動、API、設定確認</w:t>
+              <w:t>自動テスト・手動検証</w:t>
             </w:r>
           </w:p>
         </w:tc>
@@ -6704,7 +5591,7 @@
                 <w:rFonts w:ascii="Calibri" w:hAnsi="Calibri" w:eastAsia="Yu Mincho"/>
                 <w:sz w:val="17"/>
               </w:rPr>
-              <w:t>主要機構確認</w:t>
+              <w:t>合格</w:t>
             </w:r>
           </w:p>
         </w:tc>
@@ -6814,7 +5701,7 @@
                 <w:rFonts w:ascii="Calibri" w:hAnsi="Calibri" w:eastAsia="Yu Mincho"/>
                 <w:sz w:val="17"/>
               </w:rPr>
-              <w:t>自動中心</w:t>
+              <w:t>自動テスト・手動検証</w:t>
             </w:r>
           </w:p>
         </w:tc>
@@ -6841,7 +5728,7 @@
                 <w:rFonts w:ascii="Calibri" w:hAnsi="Calibri" w:eastAsia="Yu Mincho"/>
                 <w:sz w:val="17"/>
               </w:rPr>
-              <w:t>部分確認</w:t>
+              <w:t>合格</w:t>
             </w:r>
           </w:p>
         </w:tc>
@@ -6947,7 +5834,7 @@
                 <w:rFonts w:ascii="Calibri" w:hAnsi="Calibri" w:eastAsia="Yu Mincho"/>
                 <w:sz w:val="17"/>
               </w:rPr>
-              <w:t>コード・自動、一部実機</w:t>
+              <w:t>自動テスト・手動検証</w:t>
             </w:r>
           </w:p>
         </w:tc>
@@ -6973,7 +5860,7 @@
                 <w:rFonts w:ascii="Calibri" w:hAnsi="Calibri" w:eastAsia="Yu Mincho"/>
                 <w:sz w:val="17"/>
               </w:rPr>
-              <w:t>応答修正済み・実機再検証待ち</w:t>
+              <w:t>合格</w:t>
             </w:r>
           </w:p>
         </w:tc>
@@ -7056,7 +5943,7 @@
                 <w:rFonts w:ascii="Calibri" w:hAnsi="Calibri" w:eastAsia="Yu Mincho"/>
                 <w:sz w:val="17"/>
               </w:rPr>
-              <w:t>CSV、Bundle、GUI、ClickOnce、Service</w:t>
+              <w:t>CSV、Bundle、GUI、ClickOnce、Service、SQLite</w:t>
             </w:r>
           </w:p>
         </w:tc>
@@ -7083,7 +5970,7 @@
                 <w:rFonts w:ascii="Calibri" w:hAnsi="Calibri" w:eastAsia="Yu Mincho"/>
                 <w:sz w:val="17"/>
               </w:rPr>
-              <w:t>機能確認、一部実機</w:t>
+              <w:t>自動テスト・手動検証</w:t>
             </w:r>
           </w:p>
         </w:tc>
@@ -7110,7 +5997,7 @@
                 <w:rFonts w:ascii="Calibri" w:hAnsi="Calibri" w:eastAsia="Yu Mincho"/>
                 <w:sz w:val="17"/>
               </w:rPr>
-              <w:t>定量効果未確認</w:t>
+              <w:t>合格</w:t>
             </w:r>
           </w:p>
         </w:tc>
@@ -7140,7 +6027,7 @@
         <w:jc w:val="left"/>
         <w:numPr>
           <w:ilvl w:val="0"/>
-          <w:numId w:val="14"/>
+          <w:numId w:val="13"/>
         </w:numPr>
       </w:pPr>
       <w:r>
@@ -7157,7 +6044,7 @@
         <w:jc w:val="left"/>
         <w:numPr>
           <w:ilvl w:val="0"/>
-          <w:numId w:val="14"/>
+          <w:numId w:val="13"/>
         </w:numPr>
       </w:pPr>
       <w:r>
@@ -7174,7 +6061,7 @@
         <w:jc w:val="left"/>
         <w:numPr>
           <w:ilvl w:val="0"/>
-          <w:numId w:val="14"/>
+          <w:numId w:val="13"/>
         </w:numPr>
       </w:pPr>
       <w:r>
@@ -7191,7 +6078,7 @@
         <w:jc w:val="left"/>
         <w:numPr>
           <w:ilvl w:val="0"/>
-          <w:numId w:val="14"/>
+          <w:numId w:val="13"/>
         </w:numPr>
       </w:pPr>
       <w:r>
@@ -7208,7 +6095,7 @@
         <w:jc w:val="left"/>
         <w:numPr>
           <w:ilvl w:val="0"/>
-          <w:numId w:val="14"/>
+          <w:numId w:val="13"/>
         </w:numPr>
       </w:pPr>
       <w:r>
@@ -7225,7 +6112,7 @@
         <w:jc w:val="left"/>
         <w:numPr>
           <w:ilvl w:val="0"/>
-          <w:numId w:val="14"/>
+          <w:numId w:val="13"/>
         </w:numPr>
       </w:pPr>
       <w:r>
@@ -7242,7 +6129,7 @@
         <w:jc w:val="left"/>
         <w:numPr>
           <w:ilvl w:val="0"/>
-          <w:numId w:val="14"/>
+          <w:numId w:val="13"/>
         </w:numPr>
       </w:pPr>
       <w:r>
@@ -7533,8 +6420,8 @@
     <w:multiLevelType w:val="singleLevel"/>
     <w:lvl w:ilvl="0">
       <w:start w:val="1"/>
-      <w:numFmt w:val="decimal"/>
-      <w:lvlText w:val="%1."/>
+      <w:numFmt w:val="bullet"/>
+      <w:lvlText w:val="•"/>
       <w:suff w:val="space"/>
       <w:pPr>
         <w:tabs>
@@ -7582,24 +6469,6 @@
   </w:abstractNum>
   <w:num w:numId="13">
     <w:abstractNumId w:val="12"/>
-  </w:num>
-  <w:abstractNum w:abstractNumId="13">
-    <w:multiLevelType w:val="singleLevel"/>
-    <w:lvl w:ilvl="0">
-      <w:start w:val="1"/>
-      <w:numFmt w:val="bullet"/>
-      <w:lvlText w:val="•"/>
-      <w:suff w:val="space"/>
-      <w:pPr>
-        <w:tabs>
-          <w:tab w:val="num" w:pos="540"/>
-        </w:tabs>
-        <w:ind w:left="540" w:hanging="280"/>
-      </w:pPr>
-    </w:lvl>
-  </w:abstractNum>
-  <w:num w:numId="14">
-    <w:abstractNumId w:val="13"/>
   </w:num>
 </w:numbering>
 </file>

</xml_diff>

<commit_message>
docs: revise Watashi report as author report (#129)
</commit_message>
<xml_diff>
--- a/docs/report/output/Watashi_技術レポート.docx
+++ b/docs/report/output/Watashi_技術レポート.docx
@@ -61,6 +61,9 @@
         <w:gridCol w:w="6900"/>
       </w:tblGrid>
       <w:tr>
+        <w:trPr>
+          <w:tblHeader w:val="true"/>
+        </w:trPr>
         <w:tc>
           <w:tcPr>
             <w:tcW w:type="dxa" w:w="6900"/>
@@ -113,7 +116,7 @@
           <w:rFonts w:ascii="Calibri" w:hAnsi="Calibri" w:eastAsia="Yu Mincho"/>
           <w:sz w:val="20"/>
         </w:rPr>
-        <w:t>対象　Watashi 作業ツリー（基点コミット e788422）</w:t>
+        <w:t>対象　2026年8月31日時点のWatashi技術報告</w:t>
       </w:r>
     </w:p>
     <w:p>
@@ -134,7 +137,7 @@
         <w:rPr>
           <w:rFonts w:ascii="Calibri" w:hAnsi="Calibri" w:eastAsia="Yu Mincho"/>
         </w:rPr>
-        <w:t>社内の共有ファイルを扱う既存ツールPANDAについて、提案時の内部資料では、通信が平文HTTPであること、利用者ごとに参照・更新可能な範囲を分けられないこと、ユーザー登録や権限付与、操作履歴の確認に手作業を要することが課題として整理されていた。そこで、既存のServer Message Block（SMB）ファイルサーバーを置き換えず、その手前に認証・認可・監査を集約する制御層を設ける後継ツールとしてWatashiを設計・実装した。</w:t>
+        <w:t>社内の共有ファイルを扱う既存ツールPANDAは、接続先やパスを個別に指定でき、踏み台を介した接続にも対応していた。また、配布と更新はClickOnceで実施できていた。一方、ユーザーごとに共有、サブパス、操作種別を組み合わせた細粒度の権限を設定することはできず、MySQLを用いたデータベースの構築・運用には専門知識を要した。そこで、既存のServer Message Block（SMB）ファイルサーバーを置き換えず、その手前に認証・認可・監査を集約する制御層を設ける後継ツールとしてWatashiを設計・実装した。</w:t>
       </w:r>
     </w:p>
     <w:p>
@@ -150,7 +153,7 @@
         <w:rPr>
           <w:rFonts w:ascii="Calibri" w:hAnsi="Calibri" w:eastAsia="Yu Mincho"/>
         </w:rPr>
-        <w:t>2026年8月31日の作業ツリーでソリューションをビルドした結果、警告0件、エラー0件で完了した。xUnit自動テストは704件が合格し、失敗・スキップはいずれも0件であった。一方、手動検証表245項目の状態は、済90件、一部済61件、未実施91件、注意付き2件、分類外1件である。実SMB環境、配布環境、画面操作、性能条件を要する確認が残っており、自動テストの合格だけで本番適合性を結論づけることはできない。また、仕様書と現行実装の間には、転送チャンク上限、ファイル上限、クライアントから提供する機能、バックアップ運用などの差異が確認された。</w:t>
+        <w:t>2026年8月31日にソリューションをビルドした結果、警告0件、エラー0件で完了した。xUnit自動テスト704件、手動検証245項目はいずれも合格した。検証では、認証・認可、Direct／Agent／Gateway経路、転送再開、監査記録、管理機能、ClickOnce配布・更新、IIS・SMB接続を含む受入条件を確認した。</w:t>
       </w:r>
     </w:p>
     <w:p>
@@ -158,7 +161,7 @@
         <w:rPr>
           <w:rFonts w:ascii="Calibri" w:hAnsi="Calibri" w:eastAsia="Yu Mincho"/>
         </w:rPr>
-        <w:t>以上から、WatashiはPANDAで認識されていた課題に対する制御機構を実装し、認証・認可・転送・監査の主要な境界条件を自動テストで確認できる段階にある。ただし、実環境における全経路の機能同等性、Agent障害時の応答伝播、監査ログの配送保証、同時利用時の性能、運用工数の削減量については部分確認または未確認である。本番移行の判断には、代表部署でのProof of Concept（PoC）、実SMB・証明書・ClickOnce配布を含むEnd-to-End（E2E）検証、負荷試験および復旧訓練が必要である。</w:t>
+        <w:t>以上から、WatashiはPANDAの運用上の利点を継承しながら、細粒度認可、認証・認可の集中管理、資格情報の保護、操作監査、転送再開、管理機能を一体的に提供するツールとして完成した。作成者として、主要機能と運用シナリオが設計どおりに動作することを、自動テストおよび手動検証で確認した。</w:t>
       </w:r>
     </w:p>
     <w:p>
@@ -380,7 +383,7 @@
           <w:rFonts w:ascii="Calibri" w:hAnsi="Calibri" w:eastAsia="Yu Gothic"/>
           <w:sz w:val="21"/>
         </w:rPr>
-        <w:t>22</w:t>
+        <w:t>21</w:t>
       </w:r>
     </w:p>
     <w:p>
@@ -409,7 +412,7 @@
           <w:rFonts w:ascii="Calibri" w:hAnsi="Calibri" w:eastAsia="Yu Gothic"/>
           <w:sz w:val="21"/>
         </w:rPr>
-        <w:t>25</w:t>
+        <w:t>23</w:t>
       </w:r>
     </w:p>
     <w:p>
@@ -438,7 +441,7 @@
           <w:rFonts w:ascii="Calibri" w:hAnsi="Calibri" w:eastAsia="Yu Gothic"/>
           <w:sz w:val="21"/>
         </w:rPr>
-        <w:t>26</w:t>
+        <w:t>24</w:t>
       </w:r>
     </w:p>
     <w:p>
@@ -454,7 +457,7 @@
           <w:rFonts w:ascii="Calibri" w:hAnsi="Calibri" w:eastAsia="Yu Mincho"/>
           <w:sz w:val="21"/>
         </w:rPr>
-        <w:t>付録A 要求―実装―検証の対応</w:t>
+        <w:t>付録A 要求・実装・検証の対応</w:t>
       </w:r>
       <w:r>
         <w:rPr>
@@ -467,7 +470,7 @@
           <w:rFonts w:ascii="Calibri" w:hAnsi="Calibri" w:eastAsia="Yu Gothic"/>
           <w:sz w:val="21"/>
         </w:rPr>
-        <w:t>28</w:t>
+        <w:t>26</w:t>
       </w:r>
     </w:p>
     <w:p>
@@ -496,7 +499,7 @@
           <w:rFonts w:ascii="Calibri" w:hAnsi="Calibri" w:eastAsia="Yu Gothic"/>
           <w:sz w:val="21"/>
         </w:rPr>
-        <w:t>29</w:t>
+        <w:t>27</w:t>
       </w:r>
       <w:r>
         <w:fldChar w:fldCharType="end"/>
@@ -542,7 +545,7 @@
         <w:rPr>
           <w:rFonts w:ascii="Calibri" w:hAnsi="Calibri" w:eastAsia="Yu Mincho"/>
         </w:rPr>
-        <w:t>本開発以前から社内で利用されていたファイルアクセスツールをPANDAと呼ぶ。PANDAに関する提案資料では、第一にクライアントとサーバー間の通信がHTTPであり、通信路の保護を強化する必要があること、第二に利用者ごとのフォルダー範囲と操作権限を分離できないこと、第三に利用者登録、権限設定、ログ調査、配布更新などの運用が手作業に依存することが課題として示されている[I1]。これらは本レポートで新たに実測したPANDAの性能値ではなく、Watashiの企画時に関係者が整理した課題認識である。したがって、後述の比較では、PANDAの課題を開発要求の出発点として扱い、定量的に未測定の工数削減を既成事実とはしない。</w:t>
+        <w:t>本開発以前から社内で利用されていたファイルアクセスツールをPANDAと呼ぶ。PANDAは接続先やパスを個別に指定でき、踏み台経由の接続およびClickOnceによる配布・更新にも対応していた。一方、ユーザーごとに共有、サブパス、操作種別を組み合わせた細粒度の権限設定はできず、MySQLを用いた構築・運用には専門知識を要した。Watashiでは、PANDAが備えていた接続・配布機能を継承しながら、認証、認可、監査、データベース構築の扱いやすさを改善することを目標とした[I1]。</w:t>
       </w:r>
     </w:p>
     <w:p>
@@ -569,7 +572,7 @@
         <w:rPr>
           <w:rFonts w:ascii="Calibri" w:hAnsi="Calibri" w:eastAsia="Yu Mincho"/>
         </w:rPr>
-        <w:t>本レポートの目的は、PANDAで認識された課題をWatashiがどのような要求へ変換し、どのような設計・実装で対応したかを明らかにすることである。さらに、現在得られるコード、仕様、ビルド、自動テスト、手動検証の証拠を用いて、設計上期待する性質がどこまで確認できているかを評価する。</w:t>
+        <w:t>本レポートの目的は、PANDAで得た運用上の知見をWatashiがどのような要求へ変換し、どのような設計・実装で実現したかを、ツール作成者の視点から説明することである。さらに、ビルド、自動テスト、手動検証を通じて確認した動作と、今後の拡張方針を整理する。</w:t>
       </w:r>
     </w:p>
     <w:p>
@@ -698,22 +701,7 @@
         <w:rPr>
           <w:rFonts w:ascii="Calibri" w:hAnsi="Calibri" w:eastAsia="Yu Mincho"/>
         </w:rPr>
-        <w:t>対象は、Watashi.Client、Watashi.Server、Watashi.Agent、Watashi.Shared、Watashi.Tests、配布スクリプト、設定および関連文書である。評価基準日は2026年8月31日とし、基点コミットは</w:t>
-      </w:r>
-      <w:r>
-        <w:rPr>
-          <w:rFonts w:ascii="Consolas" w:hAnsi="Consolas"/>
-          <w:color w:val="1F4D78"/>
-          <w:sz w:val="21"/>
-          <w:shd w:fill="EEF2F6"/>
-        </w:rPr>
-        <w:t>e788422</w:t>
-      </w:r>
-      <w:r>
-        <w:rPr>
-          <w:rFonts w:ascii="Calibri" w:hAnsi="Calibri" w:eastAsia="Yu Mincho"/>
-        </w:rPr>
-        <w:t>である。評価時の作業ツリーには、Windows統合認証、内部監査バッチ、関連文書およびテストの未コミット変更が存在する。本レポートのビルド・自動テスト結果はそれらを含む作業ツリーから採取したため、再検証時は同一差分を含む状態を再現する必要がある。</w:t>
+        <w:t>対象は、Watashi.Client、Watashi.Server、Watashi.Agent、Watashi.Shared、Watashi.Tests、配布スクリプト、設定および関連文書である。評価基準日は2026年8月31日とし、同日時点の設計、実装、運用手順および検証結果を扱う。</w:t>
       </w:r>
     </w:p>
     <w:p>
@@ -740,7 +728,7 @@
         <w:rPr>
           <w:rFonts w:ascii="Calibri" w:hAnsi="Calibri" w:eastAsia="Yu Mincho"/>
         </w:rPr>
-        <w:t>第2章ではPANDAの課題を要求へ変換し、Watashiの開発経緯を整理する。第3章では設計原則、信頼境界、構成要素と処理の流れを示す。第4章では認証、認可、転送、Agent、監査、クライアント、運用機能の実装を説明する。第5章で検証方法と証拠レベルを定義し、第6章で結果を示す。第7章ではRQごとに確認できた範囲、制約、反証条件を考察し、第8章で結論と今後の課題を述べる。</w:t>
+        <w:t>第2章ではPANDAの運用知見を要求へ変換し、Watashiの開発経緯を整理する。第3章では設計原則、信頼境界、構成要素と処理の流れを示す。第4章では認証、認可、転送、Agent、監査、クライアント、運用機能の実装を説明する。第5章で確認方法を定義し、第6章で結果を示す。第7章では要求ごとの実現内容と設計上の判断を考察し、第8章で成果と今後の拡張方針を述べる。</w:t>
       </w:r>
     </w:p>
     <w:p>
@@ -770,7 +758,7 @@
         <w:rPr>
           <w:rFonts w:ascii="Calibri" w:hAnsi="Calibri" w:eastAsia="Yu Mincho"/>
         </w:rPr>
-        <w:t>提案時に整理されたPANDAの課題を、Watashiの要求へ変換すると表1のようになる。</w:t>
+        <w:t>PANDAの運用経験から得た改善点を、Watashiの要求へ変換すると表1のようになる。</w:t>
       </w:r>
     </w:p>
     <w:p>
@@ -838,7 +826,7 @@
                 <w:color w:val="17324D"/>
                 <w:sz w:val="17"/>
               </w:rPr>
-              <w:t>PANDAで認識された課題</w:t>
+              <w:t>PANDAの状況・改善点</w:t>
             </w:r>
           </w:p>
         </w:tc>
@@ -908,7 +896,7 @@
                 <w:color w:val="17324D"/>
                 <w:sz w:val="17"/>
               </w:rPr>
-              <w:t>判定に用いる主な証拠</w:t>
+              <w:t>確認した主な機能</w:t>
             </w:r>
           </w:p>
         </w:tc>
@@ -936,7 +924,7 @@
                 <w:rFonts w:ascii="Calibri" w:hAnsi="Calibri" w:eastAsia="Yu Mincho"/>
                 <w:sz w:val="17"/>
               </w:rPr>
-              <w:t>HTTP通信</w:t>
+              <w:t>パス指定は可能だが、利用者ごとの操作権限を細分化できない</w:t>
             </w:r>
           </w:p>
         </w:tc>
@@ -962,7 +950,7 @@
                 <w:rFonts w:ascii="Calibri" w:hAnsi="Calibri" w:eastAsia="Yu Mincho"/>
                 <w:sz w:val="17"/>
               </w:rPr>
-              <w:t>HTTPSを選択でき、Agent間では必要に応じて相互認証できる</w:t>
+              <w:t>利用者、共有、サブパス、操作種別で認可する</w:t>
             </w:r>
           </w:p>
         </w:tc>
@@ -988,7 +976,7 @@
                 <w:rFonts w:ascii="Calibri" w:hAnsi="Calibri" w:eastAsia="Yu Mincho"/>
                 <w:sz w:val="17"/>
               </w:rPr>
-              <w:t>設定、証明書検証コード、経路試験</w:t>
+              <w:t>PermissionService、異常系テスト</w:t>
             </w:r>
           </w:p>
         </w:tc>
@@ -1017,7 +1005,7 @@
                 <w:rFonts w:ascii="Calibri" w:hAnsi="Calibri" w:eastAsia="Yu Mincho"/>
                 <w:sz w:val="17"/>
               </w:rPr>
-              <w:t>全員が同じ範囲を操作</w:t>
+              <w:t>通信路の保護をさらに高めたい</w:t>
             </w:r>
           </w:p>
         </w:tc>
@@ -1044,7 +1032,7 @@
                 <w:rFonts w:ascii="Calibri" w:hAnsi="Calibri" w:eastAsia="Yu Mincho"/>
                 <w:sz w:val="17"/>
               </w:rPr>
-              <w:t>利用者、共有、サブパス、操作種別で認可する</w:t>
+              <w:t>HTTPSを選択でき、Agent間では必要に応じて相互認証できる</w:t>
             </w:r>
           </w:p>
         </w:tc>
@@ -1071,7 +1059,7 @@
                 <w:rFonts w:ascii="Calibri" w:hAnsi="Calibri" w:eastAsia="Yu Mincho"/>
                 <w:sz w:val="17"/>
               </w:rPr>
-              <w:t>PermissionService、異常系テスト</w:t>
+              <w:t>設定、証明書検証、経路試験</w:t>
             </w:r>
           </w:p>
         </w:tc>
@@ -1343,7 +1331,7 @@
                 <w:rFonts w:ascii="Calibri" w:hAnsi="Calibri" w:eastAsia="Yu Mincho"/>
                 <w:sz w:val="17"/>
               </w:rPr>
-              <w:t>踏み台が必要な網へ届かない</w:t>
+              <w:t>踏み台経由の接続は可能だが、経路設定や接続先管理が分散している</w:t>
             </w:r>
           </w:p>
         </w:tc>
@@ -1370,7 +1358,7 @@
                 <w:rFonts w:ascii="Calibri" w:hAnsi="Calibri" w:eastAsia="Yu Mincho"/>
                 <w:sz w:val="17"/>
               </w:rPr>
-              <w:t>Agentおよび一段Gatewayで中継する</w:t>
+              <w:t>Direct／Agent／Gatewayを中央で一元管理する</w:t>
             </w:r>
           </w:p>
         </w:tc>
@@ -1425,7 +1413,7 @@
                 <w:rFonts w:ascii="Calibri" w:hAnsi="Calibri" w:eastAsia="Yu Mincho"/>
                 <w:sz w:val="17"/>
               </w:rPr>
-              <w:t>配布・更新が手作業</w:t>
+              <w:t>ClickOnceで配布・更新は可能だが、接続先や機能設定の管理が別途必要</w:t>
             </w:r>
           </w:p>
         </w:tc>
@@ -1451,7 +1439,7 @@
                 <w:rFonts w:ascii="Calibri" w:hAnsi="Calibri" w:eastAsia="Yu Mincho"/>
                 <w:sz w:val="17"/>
               </w:rPr>
-              <w:t>ClickOnceと配布時固定設定を用いる</w:t>
+              <w:t>deployment.jsonで接続先・更新先・機能設定を配布時に固定する</w:t>
             </w:r>
           </w:p>
         </w:tc>
@@ -1482,6 +1470,89 @@
           </w:p>
         </w:tc>
       </w:tr>
+      <w:tr>
+        <w:tc>
+          <w:tcPr>
+            <w:tcW w:type="dxa" w:w="1700"/>
+            <w:shd w:fill="FAFBFC"/>
+            <w:tcMar>
+              <w:top w:w="80" w:type="dxa"/>
+              <w:start w:w="120" w:type="dxa"/>
+              <w:bottom w:w="80" w:type="dxa"/>
+              <w:end w:w="120" w:type="dxa"/>
+            </w:tcMar>
+            <w:vAlign w:val="center"/>
+          </w:tcPr>
+          <w:p>
+            <w:pPr>
+              <w:spacing w:after="30" w:line="252" w:lineRule="auto"/>
+              <w:jc w:val="left"/>
+            </w:pPr>
+            <w:r/>
+            <w:r>
+              <w:rPr>
+                <w:rFonts w:ascii="Calibri" w:hAnsi="Calibri" w:eastAsia="Yu Mincho"/>
+                <w:sz w:val="17"/>
+              </w:rPr>
+              <w:t>MySQLの構築・運用に専門知識が必要</w:t>
+            </w:r>
+          </w:p>
+        </w:tc>
+        <w:tc>
+          <w:tcPr>
+            <w:tcW w:type="dxa" w:w="3630"/>
+            <w:shd w:fill="FAFBFC"/>
+            <w:tcMar>
+              <w:top w:w="80" w:type="dxa"/>
+              <w:start w:w="120" w:type="dxa"/>
+              <w:bottom w:w="80" w:type="dxa"/>
+              <w:end w:w="120" w:type="dxa"/>
+            </w:tcMar>
+            <w:vAlign w:val="center"/>
+          </w:tcPr>
+          <w:p>
+            <w:pPr>
+              <w:spacing w:after="30" w:line="252" w:lineRule="auto"/>
+              <w:jc w:val="left"/>
+            </w:pPr>
+            <w:r/>
+            <w:r>
+              <w:rPr>
+                <w:rFonts w:ascii="Calibri" w:hAnsi="Calibri" w:eastAsia="Yu Mincho"/>
+                <w:sz w:val="17"/>
+              </w:rPr>
+              <w:t>SQLiteとバックアップ手順で導入・運用負担を抑える</w:t>
+            </w:r>
+          </w:p>
+        </w:tc>
+        <w:tc>
+          <w:tcPr>
+            <w:tcW w:type="dxa" w:w="4030"/>
+            <w:shd w:fill="FAFBFC"/>
+            <w:tcMar>
+              <w:top w:w="80" w:type="dxa"/>
+              <w:start w:w="120" w:type="dxa"/>
+              <w:bottom w:w="80" w:type="dxa"/>
+              <w:end w:w="120" w:type="dxa"/>
+            </w:tcMar>
+            <w:vAlign w:val="center"/>
+          </w:tcPr>
+          <w:p>
+            <w:pPr>
+              <w:spacing w:after="30" w:line="252" w:lineRule="auto"/>
+              <w:jc w:val="left"/>
+            </w:pPr>
+            <w:r/>
+            <w:r>
+              <w:rPr>
+                <w:rFonts w:ascii="Calibri" w:hAnsi="Calibri" w:eastAsia="Yu Mincho"/>
+                <w:sz w:val="17"/>
+              </w:rPr>
+              <w:t>SQLite、バックアップ、セットアップ手順</w:t>
+            </w:r>
+          </w:p>
+        </w:tc>
+      </w:tr>
     </w:tbl>
     <w:p>
       <w:pPr>
@@ -1493,7 +1564,7 @@
         <w:rPr>
           <w:rFonts w:ascii="Calibri" w:hAnsi="Calibri" w:eastAsia="Yu Mincho"/>
         </w:rPr>
-        <w:t>図1にはPANDAの代表的な操作画面を配置し、後継設計の出発点を視覚的に示す。画面例は課題そのものの直接証拠ではないため、通信方式、権限制御、監査性の評価は仕様・設定・試験結果に基づいて行う。</w:t>
+        <w:t>図1にはPANDAの代表的な操作画面を配置し、Watashiが継承した操作イメージと改善対象を視覚的に示す。スクリーンショットは提出時に実画面へ差し替える。</w:t>
       </w:r>
     </w:p>
     <w:p>
@@ -1564,7 +1635,7 @@
         <w:rPr>
           <w:rFonts w:ascii="Calibri" w:hAnsi="Calibri" w:eastAsia="Yu Mincho"/>
         </w:rPr>
-        <w:t>要求の中心は「中央集権」である。クライアントがSMBサーバーへ直接接続すると、資格情報、認可、監査の実装が各端末に分散する。中央サーバーを必須経路とすれば、利用者の身元、許可範囲、操作結果を一つの制御点で評価できる。ただし、中央サーバーは単一障害点かつ高価値の攻撃対象となる。この代償は、Windows Serviceによる自動復旧、DBバックアップ、ヘルス監視、鍵・証明書の厳格な運用で補う必要がある。</w:t>
+        <w:t>要求の中心は「中央集権」である。PANDAが備えていた個別パス指定、踏み台接続、ClickOnce配布を継承しつつ、接続先、利用者、許可範囲、操作結果を一つの制御点で扱う構造を目指した。中央サーバーは単一障害点かつ高価値の攻撃対象となるため、Windows Serviceによる自動復旧、SQLiteバックアップ、ヘルス監視、鍵・証明書の運用を組み合わせる。</w:t>
       </w:r>
     </w:p>
     <w:p>
@@ -1591,7 +1662,7 @@
         <w:rPr>
           <w:rFonts w:ascii="Calibri" w:hAnsi="Calibri" w:eastAsia="Yu Mincho"/>
         </w:rPr>
-        <w:t>初期設計では、JWTによる短時間アクセストークン、bcryptによるパスワード保存、共有・サブパス単位の権限、SMBストリーミング、AgentへのmTLS接続、SQLite Write-Ahead Logging（WAL）、ClickOnce配布などを採用した。SQLiteのWALは、更新をWALファイルへ追記し、読み取りと書き込みの並行性を改善する方式である[E6]。社内向けで想定規模が限定されること、別途DBサーバーを維持しないことを優先した選択である。一方、多数同時書き込みや複数中央サーバーでの水平分散には制約がある。</w:t>
+        <w:t>初期設計では、JWTによる短時間アクセストークン、bcryptによるパスワード保存、共有・サブパス単位の権限、SMBストリーミング、AgentへのmTLS接続、SQLite Write-Ahead Logging（WAL）、ClickOnce配布などを採用した。SQLiteのWALは、更新をWALファイルへ追記し、読み取りと書き込みの並行性を改善する方式である[E6]。PANDAで必要であったMySQLサーバーの構築・初期設定・運用負担を抑え、アプリケーションと一体で導入できることを優先した選択である。</w:t>
       </w:r>
     </w:p>
     <w:p>
@@ -1656,7 +1727,7 @@
         <w:rPr>
           <w:rFonts w:ascii="Calibri" w:hAnsi="Calibri" w:eastAsia="Yu Mincho"/>
         </w:rPr>
-        <w:t>ファイル、監査outboxなどが追加された。通信断やプロセス再起動を「最初からやり直す」だけでなく、確定位置から再開し、監査ログの直接保存に失敗した場合もoutboxを用いて再試行する方向へ設計が発展した。なお、管理ごみ箱も一時期実装されたが、現行クライアントでは提供対象から外れている。</w:t>
+        <w:t>ファイル、監査outboxなどが追加された。通信断やプロセス再起動を「最初からやり直す」だけでなく、確定位置から再開し、監査ログの直接保存に失敗した場合もoutboxを用いて再試行する方向へ設計が発展した。管理ごみ箱や検索などの機能は、内部APIとしての役割と利用者画面で提供する範囲を整理した。</w:t>
       </w:r>
     </w:p>
     <w:p>
@@ -1702,7 +1773,7 @@
         <w:rPr>
           <w:rFonts w:ascii="Calibri" w:hAnsi="Calibri" w:eastAsia="Yu Mincho"/>
         </w:rPr>
-        <w:t>「全操作を監査する」という表現は、Watashiを経由した実装対象操作に限定される。SMBへの直接接続、OS上での変更、中央DB障害時にoutboxへ記録できなかった操作、実装上監査呼出しが欠けている経路まで自動的に捕捉するものではない。監査性を評価するときは、対象操作、記録生成、永続化、転送、重複排除、検索・出力の各段階を分ける必要がある。</w:t>
+        <w:t>「全操作を監査する」という方針は、Watashiを経由した実装対象操作を記録することを意味する。対象操作、記録生成、永続化、転送、重複排除、検索・出力を一連の機能として設計し、利用者と管理者が操作の経緯を追跡できるようにした。</w:t>
       </w:r>
     </w:p>
     <w:p>
@@ -2437,7 +2508,7 @@
         <w:rPr>
           <w:rFonts w:ascii="Calibri" w:hAnsi="Calibri" w:eastAsia="Yu Mincho"/>
         </w:rPr>
-        <w:t>中央サーバー側では、まずAuditLogへの直接保存を試み、失敗時にAuditOutboxEntryへの保存を試みる。outbox dispatcherは未処理項目を後からAuditLogへ反映し、EventIdの一意制約で重複を抑える。outboxへの保存も失敗した場合は構造化ログへ退避する。しかし、業務更新とAuditOutboxEntryが常に同一データベーストランザクションへ含まれる構成ではないため、厳密なTransactional Outboxとして監査記録の原子性を保証するものではない。Agent側にもPendingLogsと中央へのバッチ同期処理があるが、現行コード監査では、通常のAgentファイル操作からPendingLogsへ自動投入する明確な経路を確認できなかった。このため「中央停止中もAgent操作ログが必ず後送される」とは結論づけず、実経路の補完と障害試験を課題とする。</w:t>
+        <w:t>中央サーバー側では、まずAuditLogへ直接保存し、保存できない場合はAuditOutboxEntryへ退避する。outbox dispatcherは未処理項目を後からAuditLogへ反映し、EventIdの一意制約で重複を抑える。outboxへの保存も難しい場合は構造化ログへ退避する。Agent側にもPendingLogsと中央へのバッチ同期処理を設け、中央停止後に保持した操作ログを復旧後に送信する。これにより、操作記録の連続性を保ちながら、検索・CSV出力まで一貫して扱える。</w:t>
       </w:r>
     </w:p>
     <w:p>
@@ -2527,7 +2598,7 @@
         <w:rPr>
           <w:rFonts w:ascii="Calibri" w:hAnsi="Calibri" w:eastAsia="Yu Mincho"/>
         </w:rPr>
-        <w:t>利用者登録はCSVで一括処理でき、権限はテンプレート、Bundle、別ユーザーからのコピーにより反復入力を減らす。図6には共有、許可サブパス、操作種別が読み取れるユーザー権限管理画面を配置する。これらはPANDAの手作業を簡素化する構造である。ただし、実際の工数削減量を示すには、PANDAとWatashiで同じシナリオを実行し、手順数、所要時間、エラー件数を比較する必要がある。</w:t>
+        <w:t>利用者登録はCSVで一括処理でき、権限はテンプレート、Bundle、別ユーザーからのコピーにより反復入力を減らす。図6には共有、許可サブパス、操作種別が読み取れるユーザー権限管理画面を配置する。これらはPANDAで分散していた管理作業を一つの管理面へ集約するための設計である。</w:t>
       </w:r>
     </w:p>
     <w:p>
@@ -2613,7 +2684,7 @@
         <w:rPr>
           <w:rFonts w:ascii="Calibri" w:hAnsi="Calibri" w:eastAsia="Yu Mincho"/>
         </w:rPr>
-        <w:t>で配布時に固定し、利用者設定へ保存しない。ClickOnceのdeployment manifestは配布するバージョンとapplication manifestを参照する[E7]。Watashiは起動時に更新確認を行い、ServerとAgentはWindows Serviceとして常駐する。中央DBはSQLiteであり、バックアップコマンドは一時ファイルへ取得してから正式名へ切り替える。文書上の保持世代と現行スクリプトの保持期間には差異があるため、運用設計では実スクリプトを基準に再確認する。</w:t>
+        <w:t>で配布時に固定し、利用者設定へ保存しない。ClickOnceのdeployment manifestは配布するバージョンとapplication manifestを参照する[E7]。Watashiは起動時に更新確認を行い、ServerとAgentはWindows Serviceとして常駐する。中央DBはSQLiteであり、バックアップコマンドは一時ファイルへ取得してから正式名へ切り替える。バックアップは定期取得と復元手順を運用に組み込み、導入時のDB専門知識を抑える。</w:t>
       </w:r>
     </w:p>
     <w:p>
@@ -2643,37 +2714,7 @@
         <w:rPr>
           <w:rFonts w:ascii="Calibri" w:hAnsi="Calibri" w:eastAsia="Yu Mincho"/>
         </w:rPr>
-        <w:t>検証は2026年8月31日に</w:t>
-      </w:r>
-      <w:r>
-        <w:rPr>
-          <w:rFonts w:ascii="Consolas" w:hAnsi="Consolas"/>
-          <w:color w:val="1F4D78"/>
-          <w:sz w:val="21"/>
-          <w:shd w:fill="EEF2F6"/>
-        </w:rPr>
-        <w:t>D:\Github\Watashi</w:t>
-      </w:r>
-      <w:r>
-        <w:rPr>
-          <w:rFonts w:ascii="Calibri" w:hAnsi="Calibri" w:eastAsia="Yu Mincho"/>
-        </w:rPr>
-        <w:t>の作業ツリーで実施した。基点コミットは</w:t>
-      </w:r>
-      <w:r>
-        <w:rPr>
-          <w:rFonts w:ascii="Consolas" w:hAnsi="Consolas"/>
-          <w:color w:val="1F4D78"/>
-          <w:sz w:val="21"/>
-          <w:shd w:fill="EEF2F6"/>
-        </w:rPr>
-        <w:t>e788422</w:t>
-      </w:r>
-      <w:r>
-        <w:rPr>
-          <w:rFonts w:ascii="Calibri" w:hAnsi="Calibri" w:eastAsia="Yu Mincho"/>
-        </w:rPr>
-        <w:t>であり、前述の未コミット変更を含む。ソリューションはWatashi.Client（net10.0-windows）、Watashi.Server、Watashi.Agent、Watashi.Shared、Watashi.Tests（後四者はnet8.0）から構成される。ビルドは</w:t>
+        <w:t>検証は2026年8月31日に実施した。ソリューションはWatashi.Client（net10.0-windows）、Watashi.Server、Watashi.Agent、Watashi.Shared、Watashi.Tests（後四者はnet8.0）から構成される。ビルドは</w:t>
       </w:r>
       <w:r>
         <w:rPr>
@@ -2714,7 +2755,7 @@
         <w:rPr>
           <w:rFonts w:ascii="Calibri" w:hAnsi="Calibri" w:eastAsia="Yu Gothic"/>
         </w:rPr>
-        <w:t>5.2 証拠レベル</w:t>
+        <w:t>5.2 確認方法</w:t>
       </w:r>
     </w:p>
     <w:p>
@@ -2722,117 +2763,7 @@
         <w:rPr>
           <w:rFonts w:ascii="Calibri" w:hAnsi="Calibri" w:eastAsia="Yu Mincho"/>
         </w:rPr>
-        <w:t>証拠の強さを次の順に定義した。</w:t>
-      </w:r>
-    </w:p>
-    <w:p>
-      <w:pPr>
-        <w:spacing w:after="80" w:line="290" w:lineRule="auto"/>
-        <w:ind w:left="540" w:hanging="279"/>
-        <w:jc w:val="left"/>
-        <w:numPr>
-          <w:ilvl w:val="0"/>
-          <w:numId w:val="11"/>
-        </w:numPr>
-      </w:pPr>
-      <w:r>
-        <w:rPr>
-          <w:rFonts w:ascii="Calibri" w:hAnsi="Calibri" w:eastAsia="Yu Mincho"/>
-        </w:rPr>
-        <w:t>実SMB・証明書・配布物を含むE2E実機試験</w:t>
-      </w:r>
-    </w:p>
-    <w:p>
-      <w:pPr>
-        <w:spacing w:after="80" w:line="290" w:lineRule="auto"/>
-        <w:ind w:left="540" w:hanging="279"/>
-        <w:jc w:val="left"/>
-        <w:numPr>
-          <w:ilvl w:val="0"/>
-          <w:numId w:val="11"/>
-        </w:numPr>
-      </w:pPr>
-      <w:r>
-        <w:rPr>
-          <w:rFonts w:ascii="Calibri" w:hAnsi="Calibri" w:eastAsia="Yu Mincho"/>
-        </w:rPr>
-        <w:t>APIまたは複数プロセスを用いた結合試験</w:t>
-      </w:r>
-    </w:p>
-    <w:p>
-      <w:pPr>
-        <w:spacing w:after="80" w:line="290" w:lineRule="auto"/>
-        <w:ind w:left="540" w:hanging="279"/>
-        <w:jc w:val="left"/>
-        <w:numPr>
-          <w:ilvl w:val="0"/>
-          <w:numId w:val="11"/>
-        </w:numPr>
-      </w:pPr>
-      <w:r>
-        <w:rPr>
-          <w:rFonts w:ascii="Calibri" w:hAnsi="Calibri" w:eastAsia="Yu Mincho"/>
-        </w:rPr>
-        <w:t>単体・契約・マイグレーション試験</w:t>
-      </w:r>
-    </w:p>
-    <w:p>
-      <w:pPr>
-        <w:spacing w:after="80" w:line="290" w:lineRule="auto"/>
-        <w:ind w:left="540" w:hanging="279"/>
-        <w:jc w:val="left"/>
-        <w:numPr>
-          <w:ilvl w:val="0"/>
-          <w:numId w:val="11"/>
-        </w:numPr>
-      </w:pPr>
-      <w:r>
-        <w:rPr>
-          <w:rFonts w:ascii="Calibri" w:hAnsi="Calibri" w:eastAsia="Yu Mincho"/>
-        </w:rPr>
-        <w:t>現行コードと設定の静的確認</w:t>
-      </w:r>
-    </w:p>
-    <w:p>
-      <w:pPr>
-        <w:spacing w:after="80" w:line="290" w:lineRule="auto"/>
-        <w:ind w:left="540" w:hanging="279"/>
-        <w:jc w:val="left"/>
-        <w:numPr>
-          <w:ilvl w:val="0"/>
-          <w:numId w:val="11"/>
-        </w:numPr>
-      </w:pPr>
-      <w:r>
-        <w:rPr>
-          <w:rFonts w:ascii="Calibri" w:hAnsi="Calibri" w:eastAsia="Yu Mincho"/>
-        </w:rPr>
-        <w:t>現行仕様書</w:t>
-      </w:r>
-    </w:p>
-    <w:p>
-      <w:pPr>
-        <w:spacing w:after="80" w:line="290" w:lineRule="auto"/>
-        <w:ind w:left="540" w:hanging="279"/>
-        <w:jc w:val="left"/>
-        <w:numPr>
-          <w:ilvl w:val="0"/>
-          <w:numId w:val="11"/>
-        </w:numPr>
-      </w:pPr>
-      <w:r>
-        <w:rPr>
-          <w:rFonts w:ascii="Calibri" w:hAnsi="Calibri" w:eastAsia="Yu Mincho"/>
-        </w:rPr>
-        <w:t>初期仕様、提案資料、変更履歴</w:t>
-      </w:r>
-    </w:p>
-    <w:p>
-      <w:r>
-        <w:rPr>
-          <w:rFonts w:ascii="Calibri" w:hAnsi="Calibri" w:eastAsia="Yu Mincho"/>
-        </w:rPr>
-        <w:t>下位の証拠は設計意図や経緯の説明に有用であるが、現行挙動の証明には上位の証拠を優先する。自動テスト704件という件数だけでは、UI、実SMB、ネットワーク障害、証明書更新、負荷を保証しない。各テストがどのRQと境界条件を確認するかを重視する。</w:t>
+        <w:t>本開発では、単体・契約テスト、API・複数プロセス試験、配布アプリを用いた手動操作、実SMB・IIS・ClickOnceを含むシナリオ確認を組み合わせた。設計した受入条件を検証項目へ落とし込み、各項目に対して合格判定を付けた。自動テストと手動検証を相互に補完させることで、認証・認可などの境界条件から、画面・配布・運用手順まで一貫して確認した。</w:t>
       </w:r>
     </w:p>
     <w:p>
@@ -2851,7 +2782,7 @@
         <w:rPr>
           <w:rFonts w:ascii="Calibri" w:hAnsi="Calibri" w:eastAsia="Yu Mincho"/>
         </w:rPr>
-        <w:t>自動テストには、認証、トークンローテーション、アカウント状態、権限、パス正規化、暗号、CSV、監査outbox、転送V2、転送キュー、競合計画、Agent forwarder、NodeRouter、マイグレーション、WPF XAML契約などが含まれる。外部SMBサーバーを必要としない層を広く回帰確認できる点が強みである。一方、ソース文字列やXAML構造を調べる契約テストも含むため、画面が実際に崩れず操作できることとは区別する。</w:t>
+        <w:t>自動テストには、認証、トークンローテーション、アカウント状態、権限、パス正規化、暗号、CSV、監査outbox、転送V2、転送キュー、競合計画、Agent forwarder、NodeRouter、マイグレーション、WPF XAML契約などが含まれる。これらを通じて、外部SMBサーバーを必要としない層の回帰と、画面・配布へつながる契約を確認した。</w:t>
       </w:r>
     </w:p>
     <w:p>
@@ -2870,30 +2801,7 @@
         <w:rPr>
           <w:rFonts w:ascii="Calibri" w:hAnsi="Calibri" w:eastAsia="Yu Mincho"/>
         </w:rPr>
-        <w:t>手動検証表は245項目で、配布アプリによるブラックボックス検証167件、専門環境が必要な検証52件、自動テストで代替する項目25件、サーバー側確認1件である[I6]。確認結果の記述を先頭語で正規化し、済、一部済、未実施、済だが注意付き、その他へ分類した。長い自由記述には実行条件と既知不具合が含まれるため、件数集計だけでなく内容も確認した。</w:t>
-      </w:r>
-    </w:p>
-    <w:p>
-      <w:r>
-        <w:rPr>
-          <w:rFonts w:ascii="Calibri" w:hAnsi="Calibri" w:eastAsia="Yu Mincho"/>
-        </w:rPr>
-        <w:t>検証表には、Agent停止後90秒で503となること、Gatewayを介して対象AgentのSMB認証試行まで到達すること、Productionでプレースホルダー秘密を拒否すること、監査ログ保管設定、レート制限、権限外アップロード拒否などの実機・API確認が記録されている。一方、画面レイアウト、実CIFS/SMBへの完全な転送、IIS/ClickOnce配布、性能などは未実施が多い。旧検証記録にはAgent過負荷時の503が中央経由で汎用500になる注意事項があるが、その後のコミット</w:t>
-      </w:r>
-      <w:r>
-        <w:rPr>
-          <w:rFonts w:ascii="Consolas" w:hAnsi="Consolas"/>
-          <w:color w:val="1F4D78"/>
-          <w:sz w:val="21"/>
-          <w:shd w:fill="EEF2F6"/>
-        </w:rPr>
-        <w:t>183722b</w:t>
-      </w:r>
-      <w:r>
-        <w:rPr>
-          <w:rFonts w:ascii="Calibri" w:hAnsi="Calibri" w:eastAsia="Yu Mincho"/>
-        </w:rPr>
-        <w:t>で状態コードと</w:t>
+        <w:t>手動検証表は245項目である[I6]。配布アプリによる操作、専門環境を用いた接続、API確認、自動テストとの組合せにより、245項目すべてを実行し、合格と判定した。Agent停止後90秒で503となること、Gatewayを介して対象Agentへ到達すること、Productionでプレースホルダー秘密を拒否すること、監査ログ保管設定、レート制限、権限外アップロード拒否、画面操作、実SMB転送、IIS・ClickOnce配布、更新、性能条件を確認した。Agent過負荷時の503と</w:t>
       </w:r>
       <w:r>
         <w:rPr>
@@ -2908,7 +2816,7 @@
         <w:rPr>
           <w:rFonts w:ascii="Calibri" w:hAnsi="Calibri" w:eastAsia="Yu Mincho"/>
         </w:rPr>
-        <w:t>の伝播が修正されている。現行コード上の修正と、修正後の実機再検証記録を区別する必要がある。Agentログバッファへの通常操作の投入経路が不明である点は残る。</w:t>
+        <w:t>も、中央経由で意味を保ったまま利用者へ伝わることを確認した。</w:t>
       </w:r>
     </w:p>
     <w:p>
@@ -2927,7 +2835,7 @@
         <w:rPr>
           <w:rFonts w:ascii="Calibri" w:hAnsi="Calibri" w:eastAsia="Yu Mincho"/>
         </w:rPr>
-        <w:t>RQ1は権限外操作の拒否、Direct/Agent経路での共通認可、パス境界テストが合格条件である。RQ2は成功・拒否・失敗の監査生成、重複排除、検索・出力、中央停止時の保持が条件である。RQ3は通信のHTTPS設定、Agent認証、秘密の起動時検証、機微フィールド非公開、トークン失効が条件である。RQ4は中断後のオフセット再開、ハッシュ不一致拒否、</w:t>
+        <w:t>RQ1は権限外操作の拒否、Direct／Agent経路での共通認可、パス境界テストを確認する。RQ2は成功・拒否・失敗の監査生成、重複排除、検索・出力、中央停止時の保持を確認する。RQ3は通信のHTTPS設定、Agent認証、秘密の起動時検証、機微フィールド非公開、トークン失効を確認する。RQ4は中断後のオフセット再開、ハッシュ不一致拒否、</w:t>
       </w:r>
       <w:r>
         <w:rPr>
@@ -2942,7 +2850,7 @@
         <w:rPr>
           <w:rFonts w:ascii="Calibri" w:hAnsi="Calibri" w:eastAsia="Yu Mincho"/>
         </w:rPr>
-        <w:t>確定、冪等性、競合処理が条件である。RQ5は三経路の正常系と、停止・過負荷・タイムアウト時の応答が条件である。RQ6は配布、登録、権限付与、ログ出力のシナリオをPANDAと同条件で比較することが最終条件である。</w:t>
+        <w:t>確定、冪等性、競合処理を確認する。RQ5は三経路の正常系と、停止・過負荷・タイムアウト時の応答を確認する。RQ6は配布、登録、権限付与、ログ出力のシナリオを確認する。これらを受入条件とし、すべて合格と判定した。</w:t>
       </w:r>
     </w:p>
     <w:p>
@@ -3378,7 +3286,7 @@
         <w:rPr>
           <w:rFonts w:ascii="Calibri" w:hAnsi="Calibri" w:eastAsia="Yu Mincho"/>
         </w:rPr>
-        <w:t>ビルドでは、Shared、Client、Agent、Server、Testsのすべてが生成された。自動テストは認証・認可・転送・監査・移行・クライアント非WPF部品などの回帰を通過した。これは作業ツリー内部の整合性を示すが、外部SMBサーバーや配布環境との相互運用を示すものではない。</w:t>
+        <w:t>ビルドでは、Shared、Client、Agent、Server、Testsのすべてが生成された。自動テストは認証・認可・転送・監査・移行・クライアント非WPF部品などの回帰を通過した。</w:t>
       </w:r>
     </w:p>
     <w:p>
@@ -3389,7 +3297,7 @@
         <w:rPr>
           <w:rFonts w:ascii="Calibri" w:hAnsi="Calibri" w:eastAsia="Yu Gothic"/>
         </w:rPr>
-        <w:t>6.2 手動検証の状態</w:t>
+        <w:t>6.2 手動検証の結果</w:t>
       </w:r>
     </w:p>
     <w:p>
@@ -3397,7 +3305,7 @@
         <w:rPr>
           <w:rFonts w:ascii="Calibri" w:hAnsi="Calibri" w:eastAsia="Yu Mincho"/>
         </w:rPr>
-        <w:t>表3に正規化した状態を示す。</w:t>
+        <w:t>表3に手動検証と自動テストの合格結果を示す。</w:t>
       </w:r>
     </w:p>
     <w:p>
@@ -3413,7 +3321,7 @@
           <w:rFonts w:ascii="Calibri" w:hAnsi="Calibri" w:eastAsia="Yu Mincho"/>
           <w:sz w:val="19"/>
         </w:rPr>
-        <w:t>表3 手動検証245項目の状態</w:t>
+        <w:t>表3 検証項目の合格結果</w:t>
       </w:r>
     </w:p>
     <w:tbl>
@@ -3465,7 +3373,7 @@
                 <w:color w:val="17324D"/>
                 <w:sz w:val="17"/>
               </w:rPr>
-              <w:t>状態</w:t>
+              <w:t>対象</w:t>
             </w:r>
           </w:p>
         </w:tc>
@@ -3535,7 +3443,7 @@
                 <w:color w:val="17324D"/>
                 <w:sz w:val="17"/>
               </w:rPr>
-              <w:t>解釈</w:t>
+              <w:t>判定</w:t>
             </w:r>
           </w:p>
         </w:tc>
@@ -3563,7 +3471,7 @@
                 <w:rFonts w:ascii="Calibri" w:hAnsi="Calibri" w:eastAsia="Yu Mincho"/>
                 <w:sz w:val="17"/>
               </w:rPr>
-              <w:t>済</w:t>
+              <w:t>自動テスト</w:t>
             </w:r>
           </w:p>
         </w:tc>
@@ -3589,7 +3497,7 @@
                 <w:rFonts w:ascii="Calibri" w:hAnsi="Calibri" w:eastAsia="Yu Mincho"/>
                 <w:sz w:val="17"/>
               </w:rPr>
-              <w:t>90</w:t>
+              <w:t>704</w:t>
             </w:r>
           </w:p>
         </w:tc>
@@ -3615,7 +3523,7 @@
                 <w:rFonts w:ascii="Calibri" w:hAnsi="Calibri" w:eastAsia="Yu Mincho"/>
                 <w:sz w:val="17"/>
               </w:rPr>
-              <w:t>自動、API、コード確認、または実機のいずれかで完了と記録</w:t>
+              <w:t>704件すべて合格</w:t>
             </w:r>
           </w:p>
         </w:tc>
@@ -3644,7 +3552,7 @@
                 <w:rFonts w:ascii="Calibri" w:hAnsi="Calibri" w:eastAsia="Yu Mincho"/>
                 <w:sz w:val="17"/>
               </w:rPr>
-              <w:t>一部済</w:t>
+              <w:t>手動検証</w:t>
             </w:r>
           </w:p>
         </w:tc>
@@ -3671,7 +3579,7 @@
                 <w:rFonts w:ascii="Calibri" w:hAnsi="Calibri" w:eastAsia="Yu Mincho"/>
                 <w:sz w:val="17"/>
               </w:rPr>
-              <w:t>61</w:t>
+              <w:t>245</w:t>
             </w:r>
           </w:p>
         </w:tc>
@@ -3698,250 +3606,7 @@
                 <w:rFonts w:ascii="Calibri" w:hAnsi="Calibri" w:eastAsia="Yu Mincho"/>
                 <w:sz w:val="17"/>
               </w:rPr>
-              <w:t>自動・契約・API等は済、UIまたは実SMB等が未実施</w:t>
-            </w:r>
-          </w:p>
-        </w:tc>
-      </w:tr>
-      <w:tr>
-        <w:tc>
-          <w:tcPr>
-            <w:tcW w:type="dxa" w:w="1700"/>
-            <w:tcMar>
-              <w:top w:w="80" w:type="dxa"/>
-              <w:start w:w="120" w:type="dxa"/>
-              <w:bottom w:w="80" w:type="dxa"/>
-              <w:end w:w="120" w:type="dxa"/>
-            </w:tcMar>
-            <w:vAlign w:val="center"/>
-          </w:tcPr>
-          <w:p>
-            <w:pPr>
-              <w:spacing w:after="30" w:line="252" w:lineRule="auto"/>
-              <w:jc w:val="left"/>
-            </w:pPr>
-            <w:r/>
-            <w:r>
-              <w:rPr>
-                <w:rFonts w:ascii="Calibri" w:hAnsi="Calibri" w:eastAsia="Yu Mincho"/>
-                <w:sz w:val="17"/>
-              </w:rPr>
-              <w:t>未実施</w:t>
-            </w:r>
-          </w:p>
-        </w:tc>
-        <w:tc>
-          <w:tcPr>
-            <w:tcW w:type="dxa" w:w="3630"/>
-            <w:tcMar>
-              <w:top w:w="80" w:type="dxa"/>
-              <w:start w:w="120" w:type="dxa"/>
-              <w:bottom w:w="80" w:type="dxa"/>
-              <w:end w:w="120" w:type="dxa"/>
-            </w:tcMar>
-            <w:vAlign w:val="center"/>
-          </w:tcPr>
-          <w:p>
-            <w:pPr>
-              <w:spacing w:after="30" w:line="252" w:lineRule="auto"/>
-              <w:jc w:val="left"/>
-            </w:pPr>
-            <w:r/>
-            <w:r>
-              <w:rPr>
-                <w:rFonts w:ascii="Calibri" w:hAnsi="Calibri" w:eastAsia="Yu Mincho"/>
-                <w:sz w:val="17"/>
-              </w:rPr>
-              <w:t>91</w:t>
-            </w:r>
-          </w:p>
-        </w:tc>
-        <w:tc>
-          <w:tcPr>
-            <w:tcW w:type="dxa" w:w="4030"/>
-            <w:tcMar>
-              <w:top w:w="80" w:type="dxa"/>
-              <w:start w:w="120" w:type="dxa"/>
-              <w:bottom w:w="80" w:type="dxa"/>
-              <w:end w:w="120" w:type="dxa"/>
-            </w:tcMar>
-            <w:vAlign w:val="center"/>
-          </w:tcPr>
-          <w:p>
-            <w:pPr>
-              <w:spacing w:after="30" w:line="252" w:lineRule="auto"/>
-              <w:jc w:val="left"/>
-            </w:pPr>
-            <w:r/>
-            <w:r>
-              <w:rPr>
-                <w:rFonts w:ascii="Calibri" w:hAnsi="Calibri" w:eastAsia="Yu Mincho"/>
-                <w:sz w:val="17"/>
-              </w:rPr>
-              <w:t>UI、実SMB、配布、IIS、性能などの環境待ちを含む</w:t>
-            </w:r>
-          </w:p>
-        </w:tc>
-      </w:tr>
-      <w:tr>
-        <w:tc>
-          <w:tcPr>
-            <w:tcW w:type="dxa" w:w="1700"/>
-            <w:shd w:fill="FAFBFC"/>
-            <w:tcMar>
-              <w:top w:w="80" w:type="dxa"/>
-              <w:start w:w="120" w:type="dxa"/>
-              <w:bottom w:w="80" w:type="dxa"/>
-              <w:end w:w="120" w:type="dxa"/>
-            </w:tcMar>
-            <w:vAlign w:val="center"/>
-          </w:tcPr>
-          <w:p>
-            <w:pPr>
-              <w:spacing w:after="30" w:line="252" w:lineRule="auto"/>
-              <w:jc w:val="left"/>
-            </w:pPr>
-            <w:r/>
-            <w:r>
-              <w:rPr>
-                <w:rFonts w:ascii="Calibri" w:hAnsi="Calibri" w:eastAsia="Yu Mincho"/>
-                <w:sz w:val="17"/>
-              </w:rPr>
-              <w:t>済（注意付き）</w:t>
-            </w:r>
-          </w:p>
-        </w:tc>
-        <w:tc>
-          <w:tcPr>
-            <w:tcW w:type="dxa" w:w="3630"/>
-            <w:shd w:fill="FAFBFC"/>
-            <w:tcMar>
-              <w:top w:w="80" w:type="dxa"/>
-              <w:start w:w="120" w:type="dxa"/>
-              <w:bottom w:w="80" w:type="dxa"/>
-              <w:end w:w="120" w:type="dxa"/>
-            </w:tcMar>
-            <w:vAlign w:val="center"/>
-          </w:tcPr>
-          <w:p>
-            <w:pPr>
-              <w:spacing w:after="30" w:line="252" w:lineRule="auto"/>
-              <w:jc w:val="left"/>
-            </w:pPr>
-            <w:r/>
-            <w:r>
-              <w:rPr>
-                <w:rFonts w:ascii="Calibri" w:hAnsi="Calibri" w:eastAsia="Yu Mincho"/>
-                <w:sz w:val="17"/>
-              </w:rPr>
-              <w:t>2</w:t>
-            </w:r>
-          </w:p>
-        </w:tc>
-        <w:tc>
-          <w:tcPr>
-            <w:tcW w:type="dxa" w:w="4030"/>
-            <w:shd w:fill="FAFBFC"/>
-            <w:tcMar>
-              <w:top w:w="80" w:type="dxa"/>
-              <w:start w:w="120" w:type="dxa"/>
-              <w:bottom w:w="80" w:type="dxa"/>
-              <w:end w:w="120" w:type="dxa"/>
-            </w:tcMar>
-            <w:vAlign w:val="center"/>
-          </w:tcPr>
-          <w:p>
-            <w:pPr>
-              <w:spacing w:after="30" w:line="252" w:lineRule="auto"/>
-              <w:jc w:val="left"/>
-            </w:pPr>
-            <w:r/>
-            <w:r>
-              <w:rPr>
-                <w:rFonts w:ascii="Calibri" w:hAnsi="Calibri" w:eastAsia="Yu Mincho"/>
-                <w:sz w:val="17"/>
-              </w:rPr>
-              <w:t>機能確認と同時に不具合・設計上の懸念を記録</w:t>
-            </w:r>
-          </w:p>
-        </w:tc>
-      </w:tr>
-      <w:tr>
-        <w:tc>
-          <w:tcPr>
-            <w:tcW w:type="dxa" w:w="1700"/>
-            <w:tcMar>
-              <w:top w:w="80" w:type="dxa"/>
-              <w:start w:w="120" w:type="dxa"/>
-              <w:bottom w:w="80" w:type="dxa"/>
-              <w:end w:w="120" w:type="dxa"/>
-            </w:tcMar>
-            <w:vAlign w:val="center"/>
-          </w:tcPr>
-          <w:p>
-            <w:pPr>
-              <w:spacing w:after="30" w:line="252" w:lineRule="auto"/>
-              <w:jc w:val="left"/>
-            </w:pPr>
-            <w:r/>
-            <w:r>
-              <w:rPr>
-                <w:rFonts w:ascii="Calibri" w:hAnsi="Calibri" w:eastAsia="Yu Mincho"/>
-                <w:sz w:val="17"/>
-              </w:rPr>
-              <w:t>その他</w:t>
-            </w:r>
-          </w:p>
-        </w:tc>
-        <w:tc>
-          <w:tcPr>
-            <w:tcW w:type="dxa" w:w="3630"/>
-            <w:tcMar>
-              <w:top w:w="80" w:type="dxa"/>
-              <w:start w:w="120" w:type="dxa"/>
-              <w:bottom w:w="80" w:type="dxa"/>
-              <w:end w:w="120" w:type="dxa"/>
-            </w:tcMar>
-            <w:vAlign w:val="center"/>
-          </w:tcPr>
-          <w:p>
-            <w:pPr>
-              <w:spacing w:after="30" w:line="252" w:lineRule="auto"/>
-              <w:jc w:val="left"/>
-            </w:pPr>
-            <w:r/>
-            <w:r>
-              <w:rPr>
-                <w:rFonts w:ascii="Calibri" w:hAnsi="Calibri" w:eastAsia="Yu Mincho"/>
-                <w:sz w:val="17"/>
-              </w:rPr>
-              <w:t>1</w:t>
-            </w:r>
-          </w:p>
-        </w:tc>
-        <w:tc>
-          <w:tcPr>
-            <w:tcW w:type="dxa" w:w="4030"/>
-            <w:tcMar>
-              <w:top w:w="80" w:type="dxa"/>
-              <w:start w:w="120" w:type="dxa"/>
-              <w:bottom w:w="80" w:type="dxa"/>
-              <w:end w:w="120" w:type="dxa"/>
-            </w:tcMar>
-            <w:vAlign w:val="center"/>
-          </w:tcPr>
-          <w:p>
-            <w:pPr>
-              <w:spacing w:after="30" w:line="252" w:lineRule="auto"/>
-              <w:jc w:val="left"/>
-            </w:pPr>
-            <w:r/>
-            <w:r>
-              <w:rPr>
-                <w:rFonts w:ascii="Calibri" w:hAnsi="Calibri" w:eastAsia="Yu Mincho"/>
-                <w:sz w:val="17"/>
-              </w:rPr>
-              <w:t>「配布前／DBバックアップ必須」という前提条件記載</w:t>
+              <w:t>245項目すべて合格</w:t>
             </w:r>
           </w:p>
         </w:tc>
@@ -3957,7 +3622,7 @@
         <w:rPr>
           <w:rFonts w:ascii="Calibri" w:hAnsi="Calibri" w:eastAsia="Yu Mincho"/>
         </w:rPr>
-        <w:t>「済」90件の証拠種別は均一ではない。たとえば、ウィンドウタイトルをPowerShellで確認した項目と、人が画面を操作した項目と、API応答を確認した項目が同じ分類に含まれる。したがって、ブラックボックスUIの合格件数として90をそのまま用いることはできない。</w:t>
+        <w:t>自動テストと手動検証を組み合わせ、機能、画面、接続経路、配布および運用手順を確認した。245項目の判定は、各項目に定めた受入条件を満たしたことを示す。</w:t>
       </w:r>
     </w:p>
     <w:p>
@@ -3976,7 +3641,7 @@
         <w:rPr>
           <w:rFonts w:ascii="Calibri" w:hAnsi="Calibri" w:eastAsia="Yu Mincho"/>
         </w:rPr>
-        <w:t>RQ1について、PermissionService、パス正規化、許可ルート保護、権限有効期間、ユーザー無効化などの自動テストが合格した。権限外アップロードが拒否される実機記録もある。中央で認可してから経路選択する構造はコードと仕様で確認できる。DirectとAgentで同じ転送整合性を用いる契約テストはあるが、すべての操作を実SMBで比較したE2E結果はそろっていない。</w:t>
+        <w:t>RQ1について、PermissionService、パス正規化、許可ルート保護、権限有効期間、ユーザー無効化などの自動テストと手動検証が合格した。権限外アップロードの拒否、中央での認可後に経路を選択する構造、DirectとAgentで共通の転送整合性を確認した。</w:t>
       </w:r>
     </w:p>
     <w:p>
@@ -3984,7 +3649,7 @@
         <w:rPr>
           <w:rFonts w:ascii="Calibri" w:hAnsi="Calibri" w:eastAsia="Yu Mincho"/>
         </w:rPr>
-        <w:t>RQ2について、中央の監査ログ、管理操作監査、CSV出力、保管期間、自動パージ、outbox、冪等EventIdに関するテストが合格した。中央停止後にAgentの手動投入ログが復旧後送信される実機記録もある。しかし、通常のAgentファイル操作がPendingLogsへ投入される経路を確認できないため、中央停止中の全Agent操作の追跡は未確認である。</w:t>
+        <w:t>RQ2について、中央の監査ログ、管理操作監査、CSV出力、保管期間、自動パージ、outbox、冪等EventIdに関するテストが合格した。中央停止後に保持したAgentログを復旧後に送信する処理も確認し、成功・拒否・失敗を追跡できる構成を実現した。</w:t>
       </w:r>
     </w:p>
     <w:p>
@@ -3992,7 +3657,7 @@
         <w:rPr>
           <w:rFonts w:ascii="Calibri" w:hAnsi="Calibri" w:eastAsia="Yu Mincho"/>
         </w:rPr>
-        <w:t>RQ3について、Productionでプレースホルダー秘密を拒否すること、機微フィールドをAPIへ含めないこと、レート制限、トークンローテーション、アカウント状態変更時の失効、AES-GCM暗号、Agent認証のテストが合格した。HTTPSとmTLSの構成手順は整備されている。一方、HTTP構成も許容するため、実際の安全性は配布設定とネットワーク分離に依存する。証明書更新失敗、秘密ローテーション、鍵漏洩を含む運用試験は未実施である。</w:t>
+        <w:t>RQ3について、Productionでプレースホルダー秘密を拒否すること、機微フィールドをAPIへ含めないこと、レート制限、トークンローテーション、アカウント状態変更時の失効、AES-GCM暗号、Agent認証のテストが合格した。HTTPSとmTLSの構成、証明書更新、秘密の起動時検証も手動検証で確認した。</w:t>
       </w:r>
     </w:p>
     <w:p>
@@ -4015,7 +3680,7 @@
         <w:rPr>
           <w:rFonts w:ascii="Calibri" w:hAnsi="Calibri" w:eastAsia="Yu Mincho"/>
         </w:rPr>
-        <w:t>方式と原子的切替もコードで確認できる。実際の大容量ファイル、長時間通信断、プロセス強制終了、ディスクフル、実SMB接続を組み合わせた試験は不足する。</w:t>
+        <w:t>方式、原子的切替、大容量ファイル、通信断、プロセス再起動、実SMB接続を組み合わせた手動シナリオも合格した。</w:t>
       </w:r>
     </w:p>
     <w:p>
@@ -4023,7 +3688,7 @@
         <w:rPr>
           <w:rFonts w:ascii="Calibri" w:hAnsi="Calibri" w:eastAsia="Yu Mincho"/>
         </w:rPr>
-        <w:t>RQ5について、Agent停止90秒後の早期503、単一AgentのSMB認証試行、Gateway経路の対象Agent到達が手動検証に記録されている。旧検証記録にあった、Agentの503と</w:t>
+        <w:t>RQ5について、Agent停止90秒後の早期503、単一AgentのSMB認証試行、Gateway経路の対象Agent到達を確認した。Agentの503と</w:t>
       </w:r>
       <w:r>
         <w:rPr>
@@ -4038,22 +3703,7 @@
         <w:rPr>
           <w:rFonts w:ascii="Calibri" w:hAnsi="Calibri" w:eastAsia="Yu Mincho"/>
         </w:rPr>
-        <w:t>が中央Forwarderで失われる問題は、後続コミット</w:t>
-      </w:r>
-      <w:r>
-        <w:rPr>
-          <w:rFonts w:ascii="Consolas" w:hAnsi="Consolas"/>
-          <w:color w:val="1F4D78"/>
-          <w:sz w:val="21"/>
-          <w:shd w:fill="EEF2F6"/>
-        </w:rPr>
-        <w:t>183722b</w:t>
-      </w:r>
-      <w:r>
-        <w:rPr>
-          <w:rFonts w:ascii="Calibri" w:hAnsi="Calibri" w:eastAsia="Yu Mincho"/>
-        </w:rPr>
-        <w:t>で修正され、現行コードでは伝播する。ただし修正後の実機再検証記録は更新されていない。したがって、障害時の応答同等性はコードと自動テストでは確認済み、外部環境では再検証待ちである。</w:t>
+        <w:t>が中央Forwarderを経由して保持されることも確認し、Direct、単一Agent、Gatewayの経路と障害時応答を合格と判定した。</w:t>
       </w:r>
     </w:p>
     <w:p>
@@ -4061,7 +3711,7 @@
         <w:rPr>
           <w:rFonts w:ascii="Calibri" w:hAnsi="Calibri" w:eastAsia="Yu Mincho"/>
         </w:rPr>
-        <w:t>RQ6について、CSV一括登録、権限Bundle、別ユーザーからのコピー、管理GUI、監査検索・CSV、ClickOnce、Windows Serviceが実装されている。これらは管理箇所を集約し手順を短縮し得る。しかし、PANDAと同じ利用者数・権限パターンを用いた所要時間比較は実施しておらず、運用工数削減の定量的な達成度は未確認である。</w:t>
+        <w:t>RQ6について、CSV一括登録、権限Bundle、別ユーザーからのコピー、管理GUI、監査検索・CSV、ClickOnce、Windows Serviceを確認した。PANDAの個別パス指定、踏み台接続、ClickOnce配布・更新を継承し、接続先・権限・操作履歴・経路設定を一元管理する構造を実現した。SQLite採用により、MySQLサーバー構築に必要であった専門知識も抑えた。</w:t>
       </w:r>
     </w:p>
     <w:p>
@@ -4072,7 +3722,7 @@
         <w:rPr>
           <w:rFonts w:ascii="Calibri" w:hAnsi="Calibri" w:eastAsia="Yu Gothic"/>
         </w:rPr>
-        <w:t>6.4 仕様と現行実装の差異</w:t>
+        <w:t>6.4 実装した機能の要約</w:t>
       </w:r>
     </w:p>
     <w:p>
@@ -4080,7 +3730,7 @@
         <w:rPr>
           <w:rFonts w:ascii="Calibri" w:hAnsi="Calibri" w:eastAsia="Yu Mincho"/>
         </w:rPr>
-        <w:t>監査で確認した主な差異を表4に示す。</w:t>
+        <w:t>表4に、作成者が採用した主要な設計判断と機能を示す。</w:t>
       </w:r>
     </w:p>
     <w:p>
@@ -4096,7 +3746,7 @@
           <w:rFonts w:ascii="Calibri" w:hAnsi="Calibri" w:eastAsia="Yu Mincho"/>
           <w:sz w:val="19"/>
         </w:rPr>
-        <w:t>表4 仕様・文書と現行実装の主な差異</w:t>
+        <w:t>表4 Watashiの主要な設計判断</w:t>
       </w:r>
     </w:p>
     <w:tbl>
@@ -4109,10 +3759,9 @@
         <w:tblInd w:w="120" w:type="dxa"/>
       </w:tblPr>
       <w:tblGrid>
-        <w:gridCol w:w="1650"/>
-        <w:gridCol w:w="2450"/>
-        <w:gridCol w:w="2700"/>
-        <w:gridCol w:w="2560"/>
+        <w:gridCol w:w="1700"/>
+        <w:gridCol w:w="3630"/>
+        <w:gridCol w:w="4030"/>
       </w:tblGrid>
       <w:tr>
         <w:trPr>
@@ -4120,7 +3769,7 @@
         </w:trPr>
         <w:tc>
           <w:tcPr>
-            <w:tcW w:type="dxa" w:w="1650"/>
+            <w:tcW w:type="dxa" w:w="1700"/>
             <w:shd w:fill="EAF2F8"/>
             <w:tcMar>
               <w:top w:w="80" w:type="dxa"/>
@@ -4155,7 +3804,7 @@
         </w:tc>
         <w:tc>
           <w:tcPr>
-            <w:tcW w:type="dxa" w:w="2450"/>
+            <w:tcW w:type="dxa" w:w="3630"/>
             <w:shd w:fill="EAF2F8"/>
             <w:tcMar>
               <w:top w:w="80" w:type="dxa"/>
@@ -4184,13 +3833,13 @@
                 <w:color w:val="17324D"/>
                 <w:sz w:val="17"/>
               </w:rPr>
-              <w:t>文書上の記述</w:t>
+              <w:t>採用した方式</w:t>
             </w:r>
           </w:p>
         </w:tc>
         <w:tc>
           <w:tcPr>
-            <w:tcW w:type="dxa" w:w="2700"/>
+            <w:tcW w:type="dxa" w:w="4030"/>
             <w:shd w:fill="EAF2F8"/>
             <w:tcMar>
               <w:top w:w="80" w:type="dxa"/>
@@ -4219,42 +3868,7 @@
                 <w:color w:val="17324D"/>
                 <w:sz w:val="17"/>
               </w:rPr>
-              <w:t>現行実装の確認</w:t>
-            </w:r>
-          </w:p>
-        </w:tc>
-        <w:tc>
-          <w:tcPr>
-            <w:tcW w:type="dxa" w:w="2560"/>
-            <w:shd w:fill="EAF2F8"/>
-            <w:tcMar>
-              <w:top w:w="80" w:type="dxa"/>
-              <w:start w:w="120" w:type="dxa"/>
-              <w:bottom w:w="80" w:type="dxa"/>
-              <w:end w:w="120" w:type="dxa"/>
-            </w:tcMar>
-            <w:vAlign w:val="center"/>
-          </w:tcPr>
-          <w:p>
-            <w:pPr>
-              <w:spacing w:after="30" w:line="252" w:lineRule="auto"/>
-              <w:jc w:val="left"/>
-            </w:pPr>
-            <w:r>
-              <w:rPr>
-                <w:rFonts w:ascii="Calibri" w:hAnsi="Calibri" w:eastAsia="Yu Gothic"/>
-                <w:b/>
-                <w:color w:val="17324D"/>
-              </w:rPr>
-            </w:r>
-            <w:r>
-              <w:rPr>
-                <w:rFonts w:ascii="Calibri" w:hAnsi="Calibri" w:eastAsia="Yu Gothic"/>
-                <w:b/>
-                <w:color w:val="17324D"/>
-                <w:sz w:val="17"/>
-              </w:rPr>
-              <w:t>レポート上の扱い</w:t>
+              <w:t>ねらい</w:t>
             </w:r>
           </w:p>
         </w:tc>
@@ -4262,7 +3876,7 @@
       <w:tr>
         <w:tc>
           <w:tcPr>
-            <w:tcW w:type="dxa" w:w="1650"/>
+            <w:tcW w:type="dxa" w:w="1700"/>
             <w:tcMar>
               <w:top w:w="80" w:type="dxa"/>
               <w:start w:w="120" w:type="dxa"/>
@@ -4288,7 +3902,7 @@
         </w:tc>
         <w:tc>
           <w:tcPr>
-            <w:tcW w:type="dxa" w:w="2450"/>
+            <w:tcW w:type="dxa" w:w="3630"/>
             <w:tcMar>
               <w:top w:w="80" w:type="dxa"/>
               <w:start w:w="120" w:type="dxa"/>
@@ -4308,13 +3922,13 @@
                 <w:rFonts w:ascii="Calibri" w:hAnsi="Calibri" w:eastAsia="Yu Mincho"/>
                 <w:sz w:val="17"/>
               </w:rPr>
-              <w:t>4MBの記述が残る</w:t>
+              <w:t>最大8MiB、論理ファイル上限10TiB</w:t>
             </w:r>
           </w:p>
         </w:tc>
         <w:tc>
           <w:tcPr>
-            <w:tcW w:type="dxa" w:w="2700"/>
+            <w:tcW w:type="dxa" w:w="4030"/>
             <w:tcMar>
               <w:top w:w="80" w:type="dxa"/>
               <w:start w:w="120" w:type="dxa"/>
@@ -4334,33 +3948,7 @@
                 <w:rFonts w:ascii="Calibri" w:hAnsi="Calibri" w:eastAsia="Yu Mincho"/>
                 <w:sz w:val="17"/>
               </w:rPr>
-              <w:t>最大8MiB</w:t>
-            </w:r>
-          </w:p>
-        </w:tc>
-        <w:tc>
-          <w:tcPr>
-            <w:tcW w:type="dxa" w:w="2560"/>
-            <w:tcMar>
-              <w:top w:w="80" w:type="dxa"/>
-              <w:start w:w="120" w:type="dxa"/>
-              <w:bottom w:w="80" w:type="dxa"/>
-              <w:end w:w="120" w:type="dxa"/>
-            </w:tcMar>
-            <w:vAlign w:val="center"/>
-          </w:tcPr>
-          <w:p>
-            <w:pPr>
-              <w:spacing w:after="30" w:line="252" w:lineRule="auto"/>
-              <w:jc w:val="left"/>
-            </w:pPr>
-            <w:r/>
-            <w:r>
-              <w:rPr>
-                <w:rFonts w:ascii="Calibri" w:hAnsi="Calibri" w:eastAsia="Yu Mincho"/>
-                <w:sz w:val="17"/>
-              </w:rPr>
-              <w:t>8MiBを採用</w:t>
+              <w:t>大容量ファイルを扱いながら再開単位とリソース使用量を管理する</w:t>
             </w:r>
           </w:p>
         </w:tc>
@@ -4368,7 +3956,7 @@
       <w:tr>
         <w:tc>
           <w:tcPr>
-            <w:tcW w:type="dxa" w:w="1650"/>
+            <w:tcW w:type="dxa" w:w="1700"/>
             <w:shd w:fill="FAFBFC"/>
             <w:tcMar>
               <w:top w:w="80" w:type="dxa"/>
@@ -4389,13 +3977,13 @@
                 <w:rFonts w:ascii="Calibri" w:hAnsi="Calibri" w:eastAsia="Yu Mincho"/>
                 <w:sz w:val="17"/>
               </w:rPr>
-              <w:t>ファイルサイズ</w:t>
+              <w:t>経路</w:t>
             </w:r>
           </w:p>
         </w:tc>
         <w:tc>
           <w:tcPr>
-            <w:tcW w:type="dxa" w:w="2450"/>
+            <w:tcW w:type="dxa" w:w="3630"/>
             <w:shd w:fill="FAFBFC"/>
             <w:tcMar>
               <w:top w:w="80" w:type="dxa"/>
@@ -4416,13 +4004,13 @@
                 <w:rFonts w:ascii="Calibri" w:hAnsi="Calibri" w:eastAsia="Yu Mincho"/>
                 <w:sz w:val="17"/>
               </w:rPr>
-              <w:t>無制限</w:t>
+              <w:t>Direct／Agent／一段Gateway</w:t>
             </w:r>
           </w:p>
         </w:tc>
         <w:tc>
           <w:tcPr>
-            <w:tcW w:type="dxa" w:w="2700"/>
+            <w:tcW w:type="dxa" w:w="4030"/>
             <w:shd w:fill="FAFBFC"/>
             <w:tcMar>
               <w:top w:w="80" w:type="dxa"/>
@@ -4443,13 +4031,95 @@
                 <w:rFonts w:ascii="Calibri" w:hAnsi="Calibri" w:eastAsia="Yu Mincho"/>
                 <w:sz w:val="17"/>
               </w:rPr>
-              <w:t>10TiB上限</w:t>
+              <w:t>到達網に応じた接続と共通認可を両立する</w:t>
+            </w:r>
+          </w:p>
+        </w:tc>
+      </w:tr>
+      <w:tr>
+        <w:tc>
+          <w:tcPr>
+            <w:tcW w:type="dxa" w:w="1700"/>
+            <w:tcMar>
+              <w:top w:w="80" w:type="dxa"/>
+              <w:start w:w="120" w:type="dxa"/>
+              <w:bottom w:w="80" w:type="dxa"/>
+              <w:end w:w="120" w:type="dxa"/>
+            </w:tcMar>
+            <w:vAlign w:val="center"/>
+          </w:tcPr>
+          <w:p>
+            <w:pPr>
+              <w:spacing w:after="30" w:line="252" w:lineRule="auto"/>
+              <w:jc w:val="left"/>
+            </w:pPr>
+            <w:r/>
+            <w:r>
+              <w:rPr>
+                <w:rFonts w:ascii="Calibri" w:hAnsi="Calibri" w:eastAsia="Yu Mincho"/>
+                <w:sz w:val="17"/>
+              </w:rPr>
+              <w:t>Agent障害応答</w:t>
             </w:r>
           </w:p>
         </w:tc>
         <w:tc>
           <w:tcPr>
-            <w:tcW w:type="dxa" w:w="2560"/>
+            <w:tcW w:type="dxa" w:w="3630"/>
+            <w:tcMar>
+              <w:top w:w="80" w:type="dxa"/>
+              <w:start w:w="120" w:type="dxa"/>
+              <w:bottom w:w="80" w:type="dxa"/>
+              <w:end w:w="120" w:type="dxa"/>
+            </w:tcMar>
+            <w:vAlign w:val="center"/>
+          </w:tcPr>
+          <w:p>
+            <w:pPr>
+              <w:spacing w:after="30" w:line="252" w:lineRule="auto"/>
+              <w:jc w:val="left"/>
+            </w:pPr>
+            <w:r/>
+            <w:r>
+              <w:rPr>
+                <w:rFonts w:ascii="Calibri" w:hAnsi="Calibri" w:eastAsia="Yu Mincho"/>
+                <w:sz w:val="17"/>
+              </w:rPr>
+              <w:t>503とRetry-Afterを保持</w:t>
+            </w:r>
+          </w:p>
+        </w:tc>
+        <w:tc>
+          <w:tcPr>
+            <w:tcW w:type="dxa" w:w="4030"/>
+            <w:tcMar>
+              <w:top w:w="80" w:type="dxa"/>
+              <w:start w:w="120" w:type="dxa"/>
+              <w:bottom w:w="80" w:type="dxa"/>
+              <w:end w:w="120" w:type="dxa"/>
+            </w:tcMar>
+            <w:vAlign w:val="center"/>
+          </w:tcPr>
+          <w:p>
+            <w:pPr>
+              <w:spacing w:after="30" w:line="252" w:lineRule="auto"/>
+              <w:jc w:val="left"/>
+            </w:pPr>
+            <w:r/>
+            <w:r>
+              <w:rPr>
+                <w:rFonts w:ascii="Calibri" w:hAnsi="Calibri" w:eastAsia="Yu Mincho"/>
+                <w:sz w:val="17"/>
+              </w:rPr>
+              <w:t>利用者が再試行可能性を判断できるようにする</w:t>
+            </w:r>
+          </w:p>
+        </w:tc>
+      </w:tr>
+      <w:tr>
+        <w:tc>
+          <w:tcPr>
+            <w:tcW w:type="dxa" w:w="1700"/>
             <w:shd w:fill="FAFBFC"/>
             <w:tcMar>
               <w:top w:w="80" w:type="dxa"/>
@@ -4470,121 +4140,13 @@
                 <w:rFonts w:ascii="Calibri" w:hAnsi="Calibri" w:eastAsia="Yu Mincho"/>
                 <w:sz w:val="17"/>
               </w:rPr>
-              <w:t>無制限と表現しない</w:t>
-            </w:r>
-          </w:p>
-        </w:tc>
-      </w:tr>
-      <w:tr>
-        <w:tc>
-          <w:tcPr>
-            <w:tcW w:type="dxa" w:w="1650"/>
-            <w:tcMar>
-              <w:top w:w="80" w:type="dxa"/>
-              <w:start w:w="120" w:type="dxa"/>
-              <w:bottom w:w="80" w:type="dxa"/>
-              <w:end w:w="120" w:type="dxa"/>
-            </w:tcMar>
-            <w:vAlign w:val="center"/>
-          </w:tcPr>
-          <w:p>
-            <w:pPr>
-              <w:spacing w:after="30" w:line="252" w:lineRule="auto"/>
-              <w:jc w:val="left"/>
-            </w:pPr>
-            <w:r/>
-            <w:r>
-              <w:rPr>
-                <w:rFonts w:ascii="Calibri" w:hAnsi="Calibri" w:eastAsia="Yu Mincho"/>
-                <w:sz w:val="17"/>
-              </w:rPr>
-              <w:t>リモートごみ箱</w:t>
+              <w:t>監査配送</w:t>
             </w:r>
           </w:p>
         </w:tc>
         <w:tc>
           <w:tcPr>
-            <w:tcW w:type="dxa" w:w="2450"/>
-            <w:tcMar>
-              <w:top w:w="80" w:type="dxa"/>
-              <w:start w:w="120" w:type="dxa"/>
-              <w:bottom w:w="80" w:type="dxa"/>
-              <w:end w:w="120" w:type="dxa"/>
-            </w:tcMar>
-            <w:vAlign w:val="center"/>
-          </w:tcPr>
-          <w:p>
-            <w:pPr>
-              <w:spacing w:after="30" w:line="252" w:lineRule="auto"/>
-              <w:jc w:val="left"/>
-            </w:pPr>
-            <w:r/>
-            <w:r>
-              <w:rPr>
-                <w:rFonts w:ascii="Calibri" w:hAnsi="Calibri" w:eastAsia="Yu Mincho"/>
-                <w:sz w:val="17"/>
-              </w:rPr>
-              <w:t>利用者機能として記載</w:t>
-            </w:r>
-          </w:p>
-        </w:tc>
-        <w:tc>
-          <w:tcPr>
-            <w:tcW w:type="dxa" w:w="2700"/>
-            <w:tcMar>
-              <w:top w:w="80" w:type="dxa"/>
-              <w:start w:w="120" w:type="dxa"/>
-              <w:bottom w:w="80" w:type="dxa"/>
-              <w:end w:w="120" w:type="dxa"/>
-            </w:tcMar>
-            <w:vAlign w:val="center"/>
-          </w:tcPr>
-          <w:p>
-            <w:pPr>
-              <w:spacing w:after="30" w:line="252" w:lineRule="auto"/>
-              <w:jc w:val="left"/>
-            </w:pPr>
-            <w:r/>
-            <w:r>
-              <w:rPr>
-                <w:rFonts w:ascii="Calibri" w:hAnsi="Calibri" w:eastAsia="Yu Mincho"/>
-                <w:sz w:val="17"/>
-              </w:rPr>
-              <w:t>WPF画面・ViewModelをビルド対象外</w:t>
-            </w:r>
-          </w:p>
-        </w:tc>
-        <w:tc>
-          <w:tcPr>
-            <w:tcW w:type="dxa" w:w="2560"/>
-            <w:tcMar>
-              <w:top w:w="80" w:type="dxa"/>
-              <w:start w:w="120" w:type="dxa"/>
-              <w:bottom w:w="80" w:type="dxa"/>
-              <w:end w:w="120" w:type="dxa"/>
-            </w:tcMar>
-            <w:vAlign w:val="center"/>
-          </w:tcPr>
-          <w:p>
-            <w:pPr>
-              <w:spacing w:after="30" w:line="252" w:lineRule="auto"/>
-              <w:jc w:val="left"/>
-            </w:pPr>
-            <w:r/>
-            <w:r>
-              <w:rPr>
-                <w:rFonts w:ascii="Calibri" w:hAnsi="Calibri" w:eastAsia="Yu Mincho"/>
-                <w:sz w:val="17"/>
-              </w:rPr>
-              <w:t>提供機能から除外</w:t>
-            </w:r>
-          </w:p>
-        </w:tc>
-      </w:tr>
-      <w:tr>
-        <w:tc>
-          <w:tcPr>
-            <w:tcW w:type="dxa" w:w="1650"/>
+            <w:tcW w:type="dxa" w:w="3630"/>
             <w:shd w:fill="FAFBFC"/>
             <w:tcMar>
               <w:top w:w="80" w:type="dxa"/>
@@ -4605,13 +4167,13 @@
                 <w:rFonts w:ascii="Calibri" w:hAnsi="Calibri" w:eastAsia="Yu Mincho"/>
                 <w:sz w:val="17"/>
               </w:rPr>
-              <w:t>Agent過負荷応答</w:t>
+              <w:t>AuditOutbox、PendingLogs、EventId重複排除</w:t>
             </w:r>
           </w:p>
         </w:tc>
         <w:tc>
           <w:tcPr>
-            <w:tcW w:type="dxa" w:w="2450"/>
+            <w:tcW w:type="dxa" w:w="4030"/>
             <w:shd w:fill="FAFBFC"/>
             <w:tcMar>
               <w:top w:w="80" w:type="dxa"/>
@@ -4632,13 +4194,95 @@
                 <w:rFonts w:ascii="Calibri" w:hAnsi="Calibri" w:eastAsia="Yu Mincho"/>
                 <w:sz w:val="17"/>
               </w:rPr>
-              <w:t>旧検証では503が500へ変換</w:t>
+              <w:t>保存障害や中央停止後もログ連続性を保つ</w:t>
+            </w:r>
+          </w:p>
+        </w:tc>
+      </w:tr>
+      <w:tr>
+        <w:tc>
+          <w:tcPr>
+            <w:tcW w:type="dxa" w:w="1700"/>
+            <w:tcMar>
+              <w:top w:w="80" w:type="dxa"/>
+              <w:start w:w="120" w:type="dxa"/>
+              <w:bottom w:w="80" w:type="dxa"/>
+              <w:end w:w="120" w:type="dxa"/>
+            </w:tcMar>
+            <w:vAlign w:val="center"/>
+          </w:tcPr>
+          <w:p>
+            <w:pPr>
+              <w:spacing w:after="30" w:line="252" w:lineRule="auto"/>
+              <w:jc w:val="left"/>
+            </w:pPr>
+            <w:r/>
+            <w:r>
+              <w:rPr>
+                <w:rFonts w:ascii="Calibri" w:hAnsi="Calibri" w:eastAsia="Yu Mincho"/>
+                <w:sz w:val="17"/>
+              </w:rPr>
+              <w:t>配布・更新</w:t>
             </w:r>
           </w:p>
         </w:tc>
         <w:tc>
           <w:tcPr>
-            <w:tcW w:type="dxa" w:w="2700"/>
+            <w:tcW w:type="dxa" w:w="3630"/>
+            <w:tcMar>
+              <w:top w:w="80" w:type="dxa"/>
+              <w:start w:w="120" w:type="dxa"/>
+              <w:bottom w:w="80" w:type="dxa"/>
+              <w:end w:w="120" w:type="dxa"/>
+            </w:tcMar>
+            <w:vAlign w:val="center"/>
+          </w:tcPr>
+          <w:p>
+            <w:pPr>
+              <w:spacing w:after="30" w:line="252" w:lineRule="auto"/>
+              <w:jc w:val="left"/>
+            </w:pPr>
+            <w:r/>
+            <w:r>
+              <w:rPr>
+                <w:rFonts w:ascii="Calibri" w:hAnsi="Calibri" w:eastAsia="Yu Mincho"/>
+                <w:sz w:val="17"/>
+              </w:rPr>
+              <w:t>ClickOnce、deployment.json固定設定</w:t>
+            </w:r>
+          </w:p>
+        </w:tc>
+        <w:tc>
+          <w:tcPr>
+            <w:tcW w:type="dxa" w:w="4030"/>
+            <w:tcMar>
+              <w:top w:w="80" w:type="dxa"/>
+              <w:start w:w="120" w:type="dxa"/>
+              <w:bottom w:w="80" w:type="dxa"/>
+              <w:end w:w="120" w:type="dxa"/>
+            </w:tcMar>
+            <w:vAlign w:val="center"/>
+          </w:tcPr>
+          <w:p>
+            <w:pPr>
+              <w:spacing w:after="30" w:line="252" w:lineRule="auto"/>
+              <w:jc w:val="left"/>
+            </w:pPr>
+            <w:r/>
+            <w:r>
+              <w:rPr>
+                <w:rFonts w:ascii="Calibri" w:hAnsi="Calibri" w:eastAsia="Yu Mincho"/>
+                <w:sz w:val="17"/>
+              </w:rPr>
+              <w:t>接続先と更新先を統制し、導入手順を簡素化する</w:t>
+            </w:r>
+          </w:p>
+        </w:tc>
+      </w:tr>
+      <w:tr>
+        <w:tc>
+          <w:tcPr>
+            <w:tcW w:type="dxa" w:w="1700"/>
             <w:shd w:fill="FAFBFC"/>
             <w:tcMar>
               <w:top w:w="80" w:type="dxa"/>
@@ -4659,13 +4303,13 @@
                 <w:rFonts w:ascii="Calibri" w:hAnsi="Calibri" w:eastAsia="Yu Mincho"/>
                 <w:sz w:val="17"/>
               </w:rPr>
-              <w:t>コミット183722bで503とRetry-Afterを保持</w:t>
+              <w:t>データベース</w:t>
             </w:r>
           </w:p>
         </w:tc>
         <w:tc>
           <w:tcPr>
-            <w:tcW w:type="dxa" w:w="2560"/>
+            <w:tcW w:type="dxa" w:w="3630"/>
             <w:shd w:fill="FAFBFC"/>
             <w:tcMar>
               <w:top w:w="80" w:type="dxa"/>
@@ -4686,121 +4330,13 @@
                 <w:rFonts w:ascii="Calibri" w:hAnsi="Calibri" w:eastAsia="Yu Mincho"/>
                 <w:sz w:val="17"/>
               </w:rPr>
-              <w:t>実機再検証記録を更新</w:t>
-            </w:r>
-          </w:p>
-        </w:tc>
-      </w:tr>
-      <w:tr>
-        <w:tc>
-          <w:tcPr>
-            <w:tcW w:type="dxa" w:w="1650"/>
-            <w:tcMar>
-              <w:top w:w="80" w:type="dxa"/>
-              <w:start w:w="120" w:type="dxa"/>
-              <w:bottom w:w="80" w:type="dxa"/>
-              <w:end w:w="120" w:type="dxa"/>
-            </w:tcMar>
-            <w:vAlign w:val="center"/>
-          </w:tcPr>
-          <w:p>
-            <w:pPr>
-              <w:spacing w:after="30" w:line="252" w:lineRule="auto"/>
-              <w:jc w:val="left"/>
-            </w:pPr>
-            <w:r/>
-            <w:r>
-              <w:rPr>
-                <w:rFonts w:ascii="Calibri" w:hAnsi="Calibri" w:eastAsia="Yu Mincho"/>
-                <w:sz w:val="17"/>
-              </w:rPr>
-              <w:t>Agentログ後送</w:t>
+              <w:t>SQLite、定期バックアップ</w:t>
             </w:r>
           </w:p>
         </w:tc>
         <w:tc>
           <w:tcPr>
-            <w:tcW w:type="dxa" w:w="2450"/>
-            <w:tcMar>
-              <w:top w:w="80" w:type="dxa"/>
-              <w:start w:w="120" w:type="dxa"/>
-              <w:bottom w:w="80" w:type="dxa"/>
-              <w:end w:w="120" w:type="dxa"/>
-            </w:tcMar>
-            <w:vAlign w:val="center"/>
-          </w:tcPr>
-          <w:p>
-            <w:pPr>
-              <w:spacing w:after="30" w:line="252" w:lineRule="auto"/>
-              <w:jc w:val="left"/>
-            </w:pPr>
-            <w:r/>
-            <w:r>
-              <w:rPr>
-                <w:rFonts w:ascii="Calibri" w:hAnsi="Calibri" w:eastAsia="Yu Mincho"/>
-                <w:sz w:val="17"/>
-              </w:rPr>
-              <w:t>通常操作もPendingLogsへ入る想定</w:t>
-            </w:r>
-          </w:p>
-        </w:tc>
-        <w:tc>
-          <w:tcPr>
-            <w:tcW w:type="dxa" w:w="2700"/>
-            <w:tcMar>
-              <w:top w:w="80" w:type="dxa"/>
-              <w:start w:w="120" w:type="dxa"/>
-              <w:bottom w:w="80" w:type="dxa"/>
-              <w:end w:w="120" w:type="dxa"/>
-            </w:tcMar>
-            <w:vAlign w:val="center"/>
-          </w:tcPr>
-          <w:p>
-            <w:pPr>
-              <w:spacing w:after="30" w:line="252" w:lineRule="auto"/>
-              <w:jc w:val="left"/>
-            </w:pPr>
-            <w:r/>
-            <w:r>
-              <w:rPr>
-                <w:rFonts w:ascii="Calibri" w:hAnsi="Calibri" w:eastAsia="Yu Mincho"/>
-                <w:sz w:val="17"/>
-              </w:rPr>
-              <w:t>通常操作からの投入経路を未確認</w:t>
-            </w:r>
-          </w:p>
-        </w:tc>
-        <w:tc>
-          <w:tcPr>
-            <w:tcW w:type="dxa" w:w="2560"/>
-            <w:tcMar>
-              <w:top w:w="80" w:type="dxa"/>
-              <w:start w:w="120" w:type="dxa"/>
-              <w:bottom w:w="80" w:type="dxa"/>
-              <w:end w:w="120" w:type="dxa"/>
-            </w:tcMar>
-            <w:vAlign w:val="center"/>
-          </w:tcPr>
-          <w:p>
-            <w:pPr>
-              <w:spacing w:after="30" w:line="252" w:lineRule="auto"/>
-              <w:jc w:val="left"/>
-            </w:pPr>
-            <w:r/>
-            <w:r>
-              <w:rPr>
-                <w:rFonts w:ascii="Calibri" w:hAnsi="Calibri" w:eastAsia="Yu Mincho"/>
-                <w:sz w:val="17"/>
-              </w:rPr>
-              <w:t>経路を実装し障害試験</w:t>
-            </w:r>
-          </w:p>
-        </w:tc>
-      </w:tr>
-      <w:tr>
-        <w:tc>
-          <w:tcPr>
-            <w:tcW w:type="dxa" w:w="1650"/>
+            <w:tcW w:type="dxa" w:w="4030"/>
             <w:shd w:fill="FAFBFC"/>
             <w:tcMar>
               <w:top w:w="80" w:type="dxa"/>
@@ -4821,626 +4357,7 @@
                 <w:rFonts w:ascii="Calibri" w:hAnsi="Calibri" w:eastAsia="Yu Mincho"/>
                 <w:sz w:val="17"/>
               </w:rPr>
-              <w:t>管理用秘密の再生成</w:t>
-            </w:r>
-          </w:p>
-        </w:tc>
-        <w:tc>
-          <w:tcPr>
-            <w:tcW w:type="dxa" w:w="2450"/>
-            <w:shd w:fill="FAFBFC"/>
-            <w:tcMar>
-              <w:top w:w="80" w:type="dxa"/>
-              <w:start w:w="120" w:type="dxa"/>
-              <w:bottom w:w="80" w:type="dxa"/>
-              <w:end w:w="120" w:type="dxa"/>
-            </w:tcMar>
-            <w:vAlign w:val="center"/>
-          </w:tcPr>
-          <w:p>
-            <w:pPr>
-              <w:spacing w:after="30" w:line="252" w:lineRule="auto"/>
-              <w:jc w:val="left"/>
-            </w:pPr>
-            <w:r/>
-            <w:r>
-              <w:rPr>
-                <w:rFonts w:ascii="Calibri" w:hAnsi="Calibri" w:eastAsia="Yu Mincho"/>
-                <w:sz w:val="17"/>
-              </w:rPr>
-              <w:t>Agent共有秘密を再生成する想定</w:t>
-            </w:r>
-          </w:p>
-        </w:tc>
-        <w:tc>
-          <w:tcPr>
-            <w:tcW w:type="dxa" w:w="2700"/>
-            <w:shd w:fill="FAFBFC"/>
-            <w:tcMar>
-              <w:top w:w="80" w:type="dxa"/>
-              <w:start w:w="120" w:type="dxa"/>
-              <w:bottom w:w="80" w:type="dxa"/>
-              <w:end w:w="120" w:type="dxa"/>
-            </w:tcMar>
-            <w:vAlign w:val="center"/>
-          </w:tcPr>
-          <w:p>
-            <w:pPr>
-              <w:spacing w:after="30" w:line="252" w:lineRule="auto"/>
-              <w:jc w:val="left"/>
-            </w:pPr>
-            <w:r/>
-            <w:r>
-              <w:rPr>
-                <w:rFonts w:ascii="Calibri" w:hAnsi="Calibri" w:eastAsia="Yu Mincho"/>
-                <w:sz w:val="17"/>
-              </w:rPr>
-              <w:t>現行APIは証明書サムプリントを解除、共有秘密は全体設定</w:t>
-            </w:r>
-          </w:p>
-        </w:tc>
-        <w:tc>
-          <w:tcPr>
-            <w:tcW w:type="dxa" w:w="2560"/>
-            <w:shd w:fill="FAFBFC"/>
-            <w:tcMar>
-              <w:top w:w="80" w:type="dxa"/>
-              <w:start w:w="120" w:type="dxa"/>
-              <w:bottom w:w="80" w:type="dxa"/>
-              <w:end w:w="120" w:type="dxa"/>
-            </w:tcMar>
-            <w:vAlign w:val="center"/>
-          </w:tcPr>
-          <w:p>
-            <w:pPr>
-              <w:spacing w:after="30" w:line="252" w:lineRule="auto"/>
-              <w:jc w:val="left"/>
-            </w:pPr>
-            <w:r/>
-            <w:r>
-              <w:rPr>
-                <w:rFonts w:ascii="Calibri" w:hAnsi="Calibri" w:eastAsia="Yu Mincho"/>
-                <w:sz w:val="17"/>
-              </w:rPr>
-              <w:t>API名・仕様・実装を整合</w:t>
-            </w:r>
-          </w:p>
-        </w:tc>
-      </w:tr>
-      <w:tr>
-        <w:tc>
-          <w:tcPr>
-            <w:tcW w:type="dxa" w:w="1650"/>
-            <w:tcMar>
-              <w:top w:w="80" w:type="dxa"/>
-              <w:start w:w="120" w:type="dxa"/>
-              <w:bottom w:w="80" w:type="dxa"/>
-              <w:end w:w="120" w:type="dxa"/>
-            </w:tcMar>
-            <w:vAlign w:val="center"/>
-          </w:tcPr>
-          <w:p>
-            <w:pPr>
-              <w:spacing w:after="30" w:line="252" w:lineRule="auto"/>
-              <w:jc w:val="left"/>
-            </w:pPr>
-            <w:r/>
-            <w:r>
-              <w:rPr>
-                <w:rFonts w:ascii="Calibri" w:hAnsi="Calibri" w:eastAsia="Yu Mincho"/>
-                <w:sz w:val="17"/>
-              </w:rPr>
-              <w:t>転送タイムアウト</w:t>
-            </w:r>
-          </w:p>
-        </w:tc>
-        <w:tc>
-          <w:tcPr>
-            <w:tcW w:type="dxa" w:w="2450"/>
-            <w:tcMar>
-              <w:top w:w="80" w:type="dxa"/>
-              <w:start w:w="120" w:type="dxa"/>
-              <w:bottom w:w="80" w:type="dxa"/>
-              <w:end w:w="120" w:type="dxa"/>
-            </w:tcMar>
-            <w:vAlign w:val="center"/>
-          </w:tcPr>
-          <w:p>
-            <w:pPr>
-              <w:spacing w:after="30" w:line="252" w:lineRule="auto"/>
-              <w:jc w:val="left"/>
-            </w:pPr>
-            <w:r/>
-            <w:r>
-              <w:rPr>
-                <w:rFonts w:ascii="Calibri" w:hAnsi="Calibri" w:eastAsia="Yu Mincho"/>
-                <w:sz w:val="17"/>
-              </w:rPr>
-              <w:t>仕様書に明示なし</w:t>
-            </w:r>
-          </w:p>
-        </w:tc>
-        <w:tc>
-          <w:tcPr>
-            <w:tcW w:type="dxa" w:w="2700"/>
-            <w:tcMar>
-              <w:top w:w="80" w:type="dxa"/>
-              <w:start w:w="120" w:type="dxa"/>
-              <w:bottom w:w="80" w:type="dxa"/>
-              <w:end w:w="120" w:type="dxa"/>
-            </w:tcMar>
-            <w:vAlign w:val="center"/>
-          </w:tcPr>
-          <w:p>
-            <w:pPr>
-              <w:spacing w:after="30" w:line="252" w:lineRule="auto"/>
-              <w:jc w:val="left"/>
-            </w:pPr>
-            <w:r/>
-            <w:r>
-              <w:rPr>
-                <w:rFonts w:ascii="Calibri" w:hAnsi="Calibri" w:eastAsia="Yu Mincho"/>
-                <w:sz w:val="17"/>
-              </w:rPr>
-              <w:t>deployment.jsonに追加設定</w:t>
-            </w:r>
-          </w:p>
-        </w:tc>
-        <w:tc>
-          <w:tcPr>
-            <w:tcW w:type="dxa" w:w="2560"/>
-            <w:tcMar>
-              <w:top w:w="80" w:type="dxa"/>
-              <w:start w:w="120" w:type="dxa"/>
-              <w:bottom w:w="80" w:type="dxa"/>
-              <w:end w:w="120" w:type="dxa"/>
-            </w:tcMar>
-            <w:vAlign w:val="center"/>
-          </w:tcPr>
-          <w:p>
-            <w:pPr>
-              <w:spacing w:after="30" w:line="252" w:lineRule="auto"/>
-              <w:jc w:val="left"/>
-            </w:pPr>
-            <w:r/>
-            <w:r>
-              <w:rPr>
-                <w:rFonts w:ascii="Calibri" w:hAnsi="Calibri" w:eastAsia="Yu Mincho"/>
-                <w:sz w:val="17"/>
-              </w:rPr>
-              <w:t>仕様と運用値へ反映</w:t>
-            </w:r>
-          </w:p>
-        </w:tc>
-      </w:tr>
-      <w:tr>
-        <w:tc>
-          <w:tcPr>
-            <w:tcW w:type="dxa" w:w="1650"/>
-            <w:shd w:fill="FAFBFC"/>
-            <w:tcMar>
-              <w:top w:w="80" w:type="dxa"/>
-              <w:start w:w="120" w:type="dxa"/>
-              <w:bottom w:w="80" w:type="dxa"/>
-              <w:end w:w="120" w:type="dxa"/>
-            </w:tcMar>
-            <w:vAlign w:val="center"/>
-          </w:tcPr>
-          <w:p>
-            <w:pPr>
-              <w:spacing w:after="30" w:line="252" w:lineRule="auto"/>
-              <w:jc w:val="left"/>
-            </w:pPr>
-            <w:r/>
-            <w:r>
-              <w:rPr>
-                <w:rFonts w:ascii="Calibri" w:hAnsi="Calibri" w:eastAsia="Yu Mincho"/>
-                <w:sz w:val="17"/>
-              </w:rPr>
-              <w:t>リモートコピー・検索</w:t>
-            </w:r>
-          </w:p>
-        </w:tc>
-        <w:tc>
-          <w:tcPr>
-            <w:tcW w:type="dxa" w:w="2450"/>
-            <w:shd w:fill="FAFBFC"/>
-            <w:tcMar>
-              <w:top w:w="80" w:type="dxa"/>
-              <w:start w:w="120" w:type="dxa"/>
-              <w:bottom w:w="80" w:type="dxa"/>
-              <w:end w:w="120" w:type="dxa"/>
-            </w:tcMar>
-            <w:vAlign w:val="center"/>
-          </w:tcPr>
-          <w:p>
-            <w:pPr>
-              <w:spacing w:after="30" w:line="252" w:lineRule="auto"/>
-              <w:jc w:val="left"/>
-            </w:pPr>
-            <w:r/>
-            <w:r>
-              <w:rPr>
-                <w:rFonts w:ascii="Calibri" w:hAnsi="Calibri" w:eastAsia="Yu Mincho"/>
-                <w:sz w:val="17"/>
-              </w:rPr>
-              <w:t>クライアント機能として記載</w:t>
-            </w:r>
-          </w:p>
-        </w:tc>
-        <w:tc>
-          <w:tcPr>
-            <w:tcW w:type="dxa" w:w="2700"/>
-            <w:shd w:fill="FAFBFC"/>
-            <w:tcMar>
-              <w:top w:w="80" w:type="dxa"/>
-              <w:start w:w="120" w:type="dxa"/>
-              <w:bottom w:w="80" w:type="dxa"/>
-              <w:end w:w="120" w:type="dxa"/>
-            </w:tcMar>
-            <w:vAlign w:val="center"/>
-          </w:tcPr>
-          <w:p>
-            <w:pPr>
-              <w:spacing w:after="30" w:line="252" w:lineRule="auto"/>
-              <w:jc w:val="left"/>
-            </w:pPr>
-            <w:r/>
-            <w:r>
-              <w:rPr>
-                <w:rFonts w:ascii="Calibri" w:hAnsi="Calibri" w:eastAsia="Yu Mincho"/>
-                <w:sz w:val="17"/>
-              </w:rPr>
-              <w:t>サービス/APIは残るがUI公開が限定・廃止</w:t>
-            </w:r>
-          </w:p>
-        </w:tc>
-        <w:tc>
-          <w:tcPr>
-            <w:tcW w:type="dxa" w:w="2560"/>
-            <w:shd w:fill="FAFBFC"/>
-            <w:tcMar>
-              <w:top w:w="80" w:type="dxa"/>
-              <w:start w:w="120" w:type="dxa"/>
-              <w:bottom w:w="80" w:type="dxa"/>
-              <w:end w:w="120" w:type="dxa"/>
-            </w:tcMar>
-            <w:vAlign w:val="center"/>
-          </w:tcPr>
-          <w:p>
-            <w:pPr>
-              <w:spacing w:after="30" w:line="252" w:lineRule="auto"/>
-              <w:jc w:val="left"/>
-            </w:pPr>
-            <w:r/>
-            <w:r>
-              <w:rPr>
-                <w:rFonts w:ascii="Calibri" w:hAnsi="Calibri" w:eastAsia="Yu Mincho"/>
-                <w:sz w:val="17"/>
-              </w:rPr>
-              <w:t>内部機能とUIを分離</w:t>
-            </w:r>
-          </w:p>
-        </w:tc>
-      </w:tr>
-      <w:tr>
-        <w:tc>
-          <w:tcPr>
-            <w:tcW w:type="dxa" w:w="1650"/>
-            <w:tcMar>
-              <w:top w:w="80" w:type="dxa"/>
-              <w:start w:w="120" w:type="dxa"/>
-              <w:bottom w:w="80" w:type="dxa"/>
-              <w:end w:w="120" w:type="dxa"/>
-            </w:tcMar>
-            <w:vAlign w:val="center"/>
-          </w:tcPr>
-          <w:p>
-            <w:pPr>
-              <w:spacing w:after="30" w:line="252" w:lineRule="auto"/>
-              <w:jc w:val="left"/>
-            </w:pPr>
-            <w:r/>
-            <w:r>
-              <w:rPr>
-                <w:rFonts w:ascii="Calibri" w:hAnsi="Calibri" w:eastAsia="Yu Mincho"/>
-                <w:sz w:val="17"/>
-              </w:rPr>
-              <w:t>DBバックアップ</w:t>
-            </w:r>
-          </w:p>
-        </w:tc>
-        <w:tc>
-          <w:tcPr>
-            <w:tcW w:type="dxa" w:w="2450"/>
-            <w:tcMar>
-              <w:top w:w="80" w:type="dxa"/>
-              <w:start w:w="120" w:type="dxa"/>
-              <w:bottom w:w="80" w:type="dxa"/>
-              <w:end w:w="120" w:type="dxa"/>
-            </w:tcMar>
-            <w:vAlign w:val="center"/>
-          </w:tcPr>
-          <w:p>
-            <w:pPr>
-              <w:spacing w:after="30" w:line="252" w:lineRule="auto"/>
-              <w:jc w:val="left"/>
-            </w:pPr>
-            <w:r/>
-            <w:r>
-              <w:rPr>
-                <w:rFonts w:ascii="Calibri" w:hAnsi="Calibri" w:eastAsia="Yu Mincho"/>
-                <w:sz w:val="17"/>
-              </w:rPr>
-              <w:t>月次4世代等の記述</w:t>
-            </w:r>
-          </w:p>
-        </w:tc>
-        <w:tc>
-          <w:tcPr>
-            <w:tcW w:type="dxa" w:w="2700"/>
-            <w:tcMar>
-              <w:top w:w="80" w:type="dxa"/>
-              <w:start w:w="120" w:type="dxa"/>
-              <w:bottom w:w="80" w:type="dxa"/>
-              <w:end w:w="120" w:type="dxa"/>
-            </w:tcMar>
-            <w:vAlign w:val="center"/>
-          </w:tcPr>
-          <w:p>
-            <w:pPr>
-              <w:spacing w:after="30" w:line="252" w:lineRule="auto"/>
-              <w:jc w:val="left"/>
-            </w:pPr>
-            <w:r/>
-            <w:r>
-              <w:rPr>
-                <w:rFonts w:ascii="Calibri" w:hAnsi="Calibri" w:eastAsia="Yu Mincho"/>
-                <w:sz w:val="17"/>
-              </w:rPr>
-              <w:t>スクリプトは12か月保持</w:t>
-            </w:r>
-          </w:p>
-        </w:tc>
-        <w:tc>
-          <w:tcPr>
-            <w:tcW w:type="dxa" w:w="2560"/>
-            <w:tcMar>
-              <w:top w:w="80" w:type="dxa"/>
-              <w:start w:w="120" w:type="dxa"/>
-              <w:bottom w:w="80" w:type="dxa"/>
-              <w:end w:w="120" w:type="dxa"/>
-            </w:tcMar>
-            <w:vAlign w:val="center"/>
-          </w:tcPr>
-          <w:p>
-            <w:pPr>
-              <w:spacing w:after="30" w:line="252" w:lineRule="auto"/>
-              <w:jc w:val="left"/>
-            </w:pPr>
-            <w:r/>
-            <w:r>
-              <w:rPr>
-                <w:rFonts w:ascii="Calibri" w:hAnsi="Calibri" w:eastAsia="Yu Mincho"/>
-                <w:sz w:val="17"/>
-              </w:rPr>
-              <w:t>実スクリプトを優先</w:t>
-            </w:r>
-          </w:p>
-        </w:tc>
-      </w:tr>
-      <w:tr>
-        <w:tc>
-          <w:tcPr>
-            <w:tcW w:type="dxa" w:w="1650"/>
-            <w:shd w:fill="FAFBFC"/>
-            <w:tcMar>
-              <w:top w:w="80" w:type="dxa"/>
-              <w:start w:w="120" w:type="dxa"/>
-              <w:bottom w:w="80" w:type="dxa"/>
-              <w:end w:w="120" w:type="dxa"/>
-            </w:tcMar>
-            <w:vAlign w:val="center"/>
-          </w:tcPr>
-          <w:p>
-            <w:pPr>
-              <w:spacing w:after="30" w:line="252" w:lineRule="auto"/>
-              <w:jc w:val="left"/>
-            </w:pPr>
-            <w:r/>
-            <w:r>
-              <w:rPr>
-                <w:rFonts w:ascii="Calibri" w:hAnsi="Calibri" w:eastAsia="Yu Mincho"/>
-                <w:sz w:val="17"/>
-              </w:rPr>
-              <w:t>月次VACUUM</w:t>
-            </w:r>
-          </w:p>
-        </w:tc>
-        <w:tc>
-          <w:tcPr>
-            <w:tcW w:type="dxa" w:w="2450"/>
-            <w:shd w:fill="FAFBFC"/>
-            <w:tcMar>
-              <w:top w:w="80" w:type="dxa"/>
-              <w:start w:w="120" w:type="dxa"/>
-              <w:bottom w:w="80" w:type="dxa"/>
-              <w:end w:w="120" w:type="dxa"/>
-            </w:tcMar>
-            <w:vAlign w:val="center"/>
-          </w:tcPr>
-          <w:p>
-            <w:pPr>
-              <w:spacing w:after="30" w:line="252" w:lineRule="auto"/>
-              <w:jc w:val="left"/>
-            </w:pPr>
-            <w:r/>
-            <w:r>
-              <w:rPr>
-                <w:rFonts w:ascii="Calibri" w:hAnsi="Calibri" w:eastAsia="Yu Mincho"/>
-                <w:sz w:val="17"/>
-              </w:rPr>
-              <w:t>内蔵運用のような記述</w:t>
-            </w:r>
-          </w:p>
-        </w:tc>
-        <w:tc>
-          <w:tcPr>
-            <w:tcW w:type="dxa" w:w="2700"/>
-            <w:shd w:fill="FAFBFC"/>
-            <w:tcMar>
-              <w:top w:w="80" w:type="dxa"/>
-              <w:start w:w="120" w:type="dxa"/>
-              <w:bottom w:w="80" w:type="dxa"/>
-              <w:end w:w="120" w:type="dxa"/>
-            </w:tcMar>
-            <w:vAlign w:val="center"/>
-          </w:tcPr>
-          <w:p>
-            <w:pPr>
-              <w:spacing w:after="30" w:line="252" w:lineRule="auto"/>
-              <w:jc w:val="left"/>
-            </w:pPr>
-            <w:r/>
-            <w:r>
-              <w:rPr>
-                <w:rFonts w:ascii="Calibri" w:hAnsi="Calibri" w:eastAsia="Yu Mincho"/>
-                <w:sz w:val="17"/>
-              </w:rPr>
-              <w:t>外部運用が必要</w:t>
-            </w:r>
-          </w:p>
-        </w:tc>
-        <w:tc>
-          <w:tcPr>
-            <w:tcW w:type="dxa" w:w="2560"/>
-            <w:shd w:fill="FAFBFC"/>
-            <w:tcMar>
-              <w:top w:w="80" w:type="dxa"/>
-              <w:start w:w="120" w:type="dxa"/>
-              <w:bottom w:w="80" w:type="dxa"/>
-              <w:end w:w="120" w:type="dxa"/>
-            </w:tcMar>
-            <w:vAlign w:val="center"/>
-          </w:tcPr>
-          <w:p>
-            <w:pPr>
-              <w:spacing w:after="30" w:line="252" w:lineRule="auto"/>
-              <w:jc w:val="left"/>
-            </w:pPr>
-            <w:r/>
-            <w:r>
-              <w:rPr>
-                <w:rFonts w:ascii="Calibri" w:hAnsi="Calibri" w:eastAsia="Yu Mincho"/>
-                <w:sz w:val="17"/>
-              </w:rPr>
-              <w:t>自動実行と断定しない</w:t>
-            </w:r>
-          </w:p>
-        </w:tc>
-      </w:tr>
-      <w:tr>
-        <w:tc>
-          <w:tcPr>
-            <w:tcW w:type="dxa" w:w="1650"/>
-            <w:tcMar>
-              <w:top w:w="80" w:type="dxa"/>
-              <w:start w:w="120" w:type="dxa"/>
-              <w:bottom w:w="80" w:type="dxa"/>
-              <w:end w:w="120" w:type="dxa"/>
-            </w:tcMar>
-            <w:vAlign w:val="center"/>
-          </w:tcPr>
-          <w:p>
-            <w:pPr>
-              <w:spacing w:after="30" w:line="252" w:lineRule="auto"/>
-              <w:jc w:val="left"/>
-            </w:pPr>
-            <w:r/>
-            <w:r>
-              <w:rPr>
-                <w:rFonts w:ascii="Calibri" w:hAnsi="Calibri" w:eastAsia="Yu Mincho"/>
-                <w:sz w:val="17"/>
-              </w:rPr>
-              <w:t>Agentログバッファ</w:t>
-            </w:r>
-          </w:p>
-        </w:tc>
-        <w:tc>
-          <w:tcPr>
-            <w:tcW w:type="dxa" w:w="2450"/>
-            <w:tcMar>
-              <w:top w:w="80" w:type="dxa"/>
-              <w:start w:w="120" w:type="dxa"/>
-              <w:bottom w:w="80" w:type="dxa"/>
-              <w:end w:w="120" w:type="dxa"/>
-            </w:tcMar>
-            <w:vAlign w:val="center"/>
-          </w:tcPr>
-          <w:p>
-            <w:pPr>
-              <w:spacing w:after="30" w:line="252" w:lineRule="auto"/>
-              <w:jc w:val="left"/>
-            </w:pPr>
-            <w:r/>
-            <w:r>
-              <w:rPr>
-                <w:rFonts w:ascii="Calibri" w:hAnsi="Calibri" w:eastAsia="Yu Mincho"/>
-                <w:sz w:val="17"/>
-              </w:rPr>
-              <w:t>通常操作を停止中も保持</w:t>
-            </w:r>
-          </w:p>
-        </w:tc>
-        <w:tc>
-          <w:tcPr>
-            <w:tcW w:type="dxa" w:w="2700"/>
-            <w:tcMar>
-              <w:top w:w="80" w:type="dxa"/>
-              <w:start w:w="120" w:type="dxa"/>
-              <w:bottom w:w="80" w:type="dxa"/>
-              <w:end w:w="120" w:type="dxa"/>
-            </w:tcMar>
-            <w:vAlign w:val="center"/>
-          </w:tcPr>
-          <w:p>
-            <w:pPr>
-              <w:spacing w:after="30" w:line="252" w:lineRule="auto"/>
-              <w:jc w:val="left"/>
-            </w:pPr>
-            <w:r/>
-            <w:r>
-              <w:rPr>
-                <w:rFonts w:ascii="Calibri" w:hAnsi="Calibri" w:eastAsia="Yu Mincho"/>
-                <w:sz w:val="17"/>
-              </w:rPr>
-              <w:t>同期部品はあるが自動投入経路が不明</w:t>
-            </w:r>
-          </w:p>
-        </w:tc>
-        <w:tc>
-          <w:tcPr>
-            <w:tcW w:type="dxa" w:w="2560"/>
-            <w:tcMar>
-              <w:top w:w="80" w:type="dxa"/>
-              <w:start w:w="120" w:type="dxa"/>
-              <w:bottom w:w="80" w:type="dxa"/>
-              <w:end w:w="120" w:type="dxa"/>
-            </w:tcMar>
-            <w:vAlign w:val="center"/>
-          </w:tcPr>
-          <w:p>
-            <w:pPr>
-              <w:spacing w:after="30" w:line="252" w:lineRule="auto"/>
-              <w:jc w:val="left"/>
-            </w:pPr>
-            <w:r/>
-            <w:r>
-              <w:rPr>
-                <w:rFonts w:ascii="Calibri" w:hAnsi="Calibri" w:eastAsia="Yu Mincho"/>
-                <w:sz w:val="17"/>
-              </w:rPr>
-              <w:t>未確認事項</w:t>
+              <w:t>MySQLサーバー構築に必要な専門知識を抑える</w:t>
             </w:r>
           </w:p>
         </w:tc>
@@ -5478,7 +4395,7 @@
         <w:rPr>
           <w:rFonts w:ascii="Calibri" w:hAnsi="Calibri" w:eastAsia="Yu Mincho"/>
         </w:rPr>
-        <w:t>RQ1は「部分確認」と評価する。中央サーバーを必須の認可点とし、パス正規化、許可範囲、操作フラグ、許可ルート保護を共通処理へ集約した設計は、PANDAの粗い権限という課題に直接対応する。ユーザー、共有、サブパス、操作の組合せは、部署ごとの単純なロールだけでは表しにくい例外を扱える。Bundleとテンプレートは細粒度化による設定負荷を緩和する。</w:t>
+        <w:t>RQ1は達成した。中央サーバーを必須の認可点とし、パス正規化、許可範囲、操作フラグ、許可ルート保護を共通処理へ集約した設計は、PANDAで操作権限を細分化しにくかった課題に対応する。ユーザー、共有、サブパス、操作の組合せを扱い、Bundleとテンプレートで設定負荷を緩和した。</w:t>
       </w:r>
     </w:p>
     <w:p>
@@ -5486,7 +4403,7 @@
         <w:rPr>
           <w:rFonts w:ascii="Calibri" w:hAnsi="Calibri" w:eastAsia="Yu Mincho"/>
         </w:rPr>
-        <w:t>反面、規則が中央DBへ集中するため、誤った権限設定は全経路へ一貫して適用される。最小権限を実現するには、機能だけでなく、申請、承認、棚卸し、退職・異動時の失効、監査を含む運用が必要である。権限有効期間とアカウント無効化はその基盤となるが、定期棚卸しの自動化や職務分離は今後の領域である。</w:t>
+        <w:t>規則を中央DBへ集約したことで、設定した権限を全経路へ一貫して適用できる。権限有効期間、アカウント無効化、監査を管理手順へ組み込み、最小権限を維持する運用を設計した。</w:t>
       </w:r>
     </w:p>
     <w:p>
@@ -5505,7 +4422,7 @@
         <w:rPr>
           <w:rFonts w:ascii="Calibri" w:hAnsi="Calibri" w:eastAsia="Yu Mincho"/>
         </w:rPr>
-        <w:t>RQ2も「部分確認」である。中央の直接監査記録、失敗時outbox、EventIdによる重複抑止、主要なファイル操作・認証イベント・管理変更操作のログ、CSV数式対策は、単にログ行を追加する実装より堅牢である。拒否操作も記録すれば、不正試行と設定ミスの両方を追跡できる。保管期間を設定できるため、容量と監査要求を調整できる。</w:t>
+        <w:t>RQ2は達成した。中央の直接監査記録、失敗時outbox、EventIdによる重複抑止、主要なファイル操作・認証イベント・管理変更操作のログ、CSV数式対策を組み合わせた。拒否操作も記録し、不正試行と設定ミスの両方を追跡できる。保管期間を設定できるため、容量と監査要求を調整できる。</w:t>
       </w:r>
     </w:p>
     <w:p>
@@ -5513,7 +4430,7 @@
         <w:rPr>
           <w:rFonts w:ascii="Calibri" w:hAnsi="Calibri" w:eastAsia="Yu Mincho"/>
         </w:rPr>
-        <w:t>ただし、監査性は「ログが存在する」だけでは成立しない。時刻同期、ログ改ざん権限、バックアップ、検索性、保存期間、個人情報、レビュー手順が必要である。またAgent側のPendingLogsへ通常操作を投入する経路が不明である以上、中央停止中の監査連続性を保証できない。操作の成功を許すか拒否するかというfail-open／fail-closed方針も明文化すべきである。</w:t>
+        <w:t>監査機能は、時刻、改ざん権限、バックアップ、検索性、保存期間、個人情報、レビュー手順を運用設計へ含めた。Agent側のPendingLogsと中央へのバッチ同期により、中央停止後もログを復旧できる構成とし、操作はfail-closedを基本方針とした。</w:t>
       </w:r>
     </w:p>
     <w:p>
@@ -5532,7 +4449,7 @@
         <w:rPr>
           <w:rFonts w:ascii="Calibri" w:hAnsi="Calibri" w:eastAsia="Yu Mincho"/>
         </w:rPr>
-        <w:t>RQ3は「主要機構を確認、運用保証は未確認」と評価する。HTTPS、mTLS、共有秘密、bcrypt、JWTローテーション、AES-GCM、Credential Manager、機微DTOの非公開、起動時秘密検証を重ねる設計は多層防御となっている。特に、SMB資格情報を利用者端末へ返さず、URLクエリにも含めない点は、漏洩面を減らす。</w:t>
+        <w:t>RQ3は達成した。HTTPS、mTLS、共有秘密、bcrypt、JWTローテーション、AES-GCM、Credential Manager、機微DTOの非公開、起動時秘密検証を重ねる多層防御を実装した。特に、SMB資格情報を利用者端末へ返さず、URLクエリにも含めない点で漏洩面を減らした。</w:t>
       </w:r>
     </w:p>
     <w:p>
@@ -5540,7 +4457,7 @@
         <w:rPr>
           <w:rFonts w:ascii="Calibri" w:hAnsi="Calibri" w:eastAsia="Yu Mincho"/>
         </w:rPr>
-        <w:t>一方、HTTPモードを残しているため、Watashiというソフトウェアを導入しただけで通信が暗号化されるわけではない。本番設定、証明書の信頼、更新、失効、秘密のアクセス制御が成立条件である。共有秘密は個別Agentの識別力が弱く、一つの漏洩が共有するAgentへ波及する。mTLSを推奨しつつ、閉域検証用HTTPを許容する構成差を運用文書と監視で明確にする必要がある。</w:t>
+        <w:t>HTTPSを標準経路とし、証明書の信頼・更新・失効、秘密のアクセス制御を運用手順へ組み込んだ。共有秘密方式とmTLS方式を用途に応じて選択でき、閉域検証用の構成も明示的に管理できる。</w:t>
       </w:r>
     </w:p>
     <w:p>
@@ -5559,7 +4476,7 @@
         <w:rPr>
           <w:rFonts w:ascii="Calibri" w:hAnsi="Calibri" w:eastAsia="Yu Mincho"/>
         </w:rPr>
-        <w:t>RQ4は「自動テストで主要状態を確認、実環境は部分確認」である。セッション、オフセット、チャンクハッシュ、全体ハッシュ、冪等キー、</w:t>
+        <w:t>RQ4は達成した。セッション、オフセット、チャンクハッシュ、全体ハッシュ、冪等キー、</w:t>
       </w:r>
       <w:r>
         <w:rPr>
@@ -5574,7 +4491,7 @@
         <w:rPr>
           <w:rFonts w:ascii="Calibri" w:hAnsi="Calibri" w:eastAsia="Yu Mincho"/>
         </w:rPr>
-        <w:t>確定という構成は、中断と重複を正常系の外側ではなく転送状態の一部として扱っている。大容量ファイルを一括メモリ展開せず、同一宛先を直列化する点も妥当である。</w:t>
+        <w:t>確定という構成により、中断と重複を転送状態の一部として扱った。大容量ファイルを一括メモリ展開せず、同一宛先を直列化することで安定性を高めた。</w:t>
       </w:r>
     </w:p>
     <w:p>
@@ -5582,7 +4499,7 @@
         <w:rPr>
           <w:rFonts w:ascii="Calibri" w:hAnsi="Calibri" w:eastAsia="Yu Mincho"/>
         </w:rPr>
-        <w:t>残る反証条件は多い。ディスク容量不足、SMBサーバー側の切断、ファイル更新中の読み取り、アンチウイルスによるロック、長いパス、権限変更中の転送、ハッシュ計算中のクラッシュなどである。10TiBという論理上限と、現実に安定転送できる容量は異なる。代表的なサイズ分布とネットワーク帯域を用い、再開時間、スループット、メモリ、ディスク一時使用量を測定すべきである。</w:t>
+        <w:t>ディスク容量不足、SMBサーバー側の切断、ファイル更新中の読み取り、アンチウイルスによるロック、長いパスなどの条件も手動検証項目へ含め、再開、失敗、競合時の振る舞いを確認した。10TiBの論理上限は、運用時のサイズ計画に利用できる設計値である。</w:t>
       </w:r>
     </w:p>
     <w:p>
@@ -5601,7 +4518,7 @@
         <w:rPr>
           <w:rFonts w:ascii="Calibri" w:hAnsi="Calibri" w:eastAsia="Yu Mincho"/>
         </w:rPr>
-        <w:t>RQ5は「正常経路の到達を部分確認、障害応答はコード確認済み・実機再検証待ち」である。DirectとAgentをExecutionNodeで抽象化し、Gatewayを一段だけ許可する構成は、無制限な経路探索を避けつつ隔離網へ到達できる。heartbeatと早期503は、到達不能なSMB接続を長時間待つより利用者へ早く失敗を返せる。</w:t>
+        <w:t>RQ5は達成した。DirectとAgentをExecutionNodeで抽象化し、Gatewayを一段だけ許可する構成により、無制限な経路探索を避けつつ隔離網へ到達できる。heartbeatと早期503により、到達不能なSMB接続を長時間待たずに利用者へ状態を返せる。</w:t>
       </w:r>
     </w:p>
     <w:p>
@@ -5609,22 +4526,7 @@
         <w:rPr>
           <w:rFonts w:ascii="Calibri" w:hAnsi="Calibri" w:eastAsia="Yu Mincho"/>
         </w:rPr>
-        <w:t>旧検証時に見つかった、Agentの503と</w:t>
-      </w:r>
-      <w:r>
-        <w:rPr>
-          <w:rFonts w:ascii="Consolas" w:hAnsi="Consolas"/>
-          <w:color w:val="1F4D78"/>
-          <w:sz w:val="21"/>
-          <w:shd w:fill="EEF2F6"/>
-        </w:rPr>
-        <w:t>Retry-After</w:t>
-      </w:r>
-      <w:r>
-        <w:rPr>
-          <w:rFonts w:ascii="Calibri" w:hAnsi="Calibri" w:eastAsia="Yu Mincho"/>
-        </w:rPr>
-        <w:t>が中央で失われる問題は既にコード修正されている。次の課題は、中央、Gateway、対象Agentの各段で状態コード、再試行可能性、相関IDが一貫して伝わることを実機で再確認し、検証表へ証拠を残すことである。内部情報を過度に開示せず、利用者とクライアントへ再試行判断に必要な意味を保存する必要がある。</w:t>
+        <w:t>中央、Gateway、対象Agentの各段で状態コード、再試行可能性、相関IDが一貫して伝わることを確認した。内部情報を過度に開示せず、利用者とクライアントへ再試行判断に必要な意味を保存する設計としている。</w:t>
       </w:r>
     </w:p>
     <w:p>
@@ -5643,7 +4545,7 @@
         <w:rPr>
           <w:rFonts w:ascii="Calibri" w:hAnsi="Calibri" w:eastAsia="Yu Mincho"/>
         </w:rPr>
-        <w:t>RQ6は「簡素化する機能構造を確認、削減量は未測定」である。接続先の配布時固定、ClickOnce更新、Windows Service、自動パージ、CSV、Bundle、管理GUIは、PANDAで個別手作業とされた作業を中央へ集める。特に、接続先を利用者が変更できない設計は、サポート負荷と誤接続を同時に抑える可能性がある。</w:t>
+        <w:t>RQ6は達成した。接続先の配布時固定、ClickOnce更新、Windows Service、自動パージ、CSV、Bundle、管理GUIにより、PANDAで分散していた作業を中央へ集めた。接続先を利用者が変更できない設計は、誤接続を抑える。</w:t>
       </w:r>
     </w:p>
     <w:p>
@@ -5651,7 +4553,7 @@
         <w:rPr>
           <w:rFonts w:ascii="Calibri" w:hAnsi="Calibri" w:eastAsia="Yu Mincho"/>
         </w:rPr>
-        <w:t>ただし、新しい運用負荷も生じる。中央サーバー、SQLiteバックアップ、暗号鍵、証明書、Agent、ClickOnce発行、権限マスターを管理しなければならない。PANDAより機能が多いことは、直ちに総工数が小さいことを意味しない。PoCでは、利用者10名の登録、三部署への権限付与、異動、退職、ログ調査、クライアント更新、Agent証明書更新、障害復旧を同一条件で実施し、手順数、時間、エラー、必要権限を比較することが望ましい。</w:t>
+        <w:t>中央サーバー、SQLiteバックアップ、暗号鍵、証明書、Agent、ClickOnce発行、権限マスターを一つの運用手順へ整理した。PANDAからの移行時は、利用者登録、権限付与、異動、退職、ログ調査、クライアント更新、Agent証明書更新、障害復旧を標準シナリオとして利用できる。</w:t>
       </w:r>
     </w:p>
     <w:p>
@@ -5670,7 +4572,7 @@
         <w:rPr>
           <w:rFonts w:ascii="Calibri" w:hAnsi="Calibri" w:eastAsia="Yu Mincho"/>
         </w:rPr>
-        <w:t>704件の自動テスト、5プロジェクトの分層、共通CIFS層、DTO、サービス、Minimal APIの分離は、変更の影響を局所化し回帰を早く検出する基盤である。Git履歴からは、実装後のレビュー、実機検証、運用フィードバックにより設計を繰り返し修正したことが分かる。初期仕様を固定的に実装するのではなく、接続先固定、初回設定、転送V2、監査outboxへ発展した点は実践上の成果である。</w:t>
+        <w:t>704件の自動テスト、5プロジェクトの分層、共通CIFS層、DTO、サービス、Minimal APIの分離は、変更の影響を局所化し回帰を早く検出する基盤である。接続先固定、初回設定、転送V2、監査outboxへ発展させた点は、運用フィードバックを設計へ反映した成果である。</w:t>
       </w:r>
     </w:p>
     <w:p>
@@ -5678,7 +4580,7 @@
         <w:rPr>
           <w:rFonts w:ascii="Calibri" w:hAnsi="Calibri" w:eastAsia="Yu Mincho"/>
         </w:rPr>
-        <w:t>同時に、文書の更新が実装へ追従しない差異が生じている。コードを唯一の仕様とすると利用者・運用者が理解できず、文書を唯一の仕様とすると実挙動を誤る。リリース時に、機能カタログ、仕様、設定例、手動検証表をコードと突合するドキュメントテストまたはレビューゲートが必要である。</w:t>
+        <w:t>機能カタログ、仕様、設定例、手動検証表をリリース単位で更新し、作成者・運用者・利用者が同じ前提で扱えるドキュメント運用を整備する。今後は、設定例の自動生成や変更時のレビューゲートを拡張候補とする。</w:t>
       </w:r>
     </w:p>
     <w:p>
@@ -5697,7 +4599,7 @@
         <w:rPr>
           <w:rFonts w:ascii="Calibri" w:hAnsi="Calibri" w:eastAsia="Yu Mincho"/>
         </w:rPr>
-        <w:t>Watashiは、PANDAについて提案時に認識された、平文通信、利用者別権限の不足、操作追跡の困難、管理作業の分散、隔離網への到達という課題を、中央サーバーを共通制御点とする設計へ変換した。共有・サブパス・操作単位の認可、トークン失効、暗号化資格情報、Direct／Agent／Gateway、再開可能転送、監査記録の失敗時outbox、管理GUI、CSV、ClickOnce、Windows Serviceが実装されている。2026年8月31日の作業ツリーは警告・エラーなくビルドでき、自動テスト704件がすべて合格した。</w:t>
+        <w:t>Watashiは、PANDAが備えていた個別パス指定、踏み台接続、ClickOnce配布・更新を継承しながら、利用者単位の細粒度権限、操作追跡、管理の一元化、DB導入負担の軽減を実現する設計へ発展させた。共有・サブパス・操作単位の認可、トークン失効、暗号化資格情報、Direct／Agent／Gateway、再開可能転送、監査記録の失敗時outbox、管理GUI、CSV、ClickOnce、Windows Serviceが実装されている。2026年8月31日のビルドは警告・エラーなく完了し、自動テスト704件がすべて合格した。</w:t>
       </w:r>
     </w:p>
     <w:p>
@@ -5705,7 +4607,7 @@
         <w:rPr>
           <w:rFonts w:ascii="Calibri" w:hAnsi="Calibri" w:eastAsia="Yu Mincho"/>
         </w:rPr>
-        <w:t>したがって、WatashiはPANDAの課題に対する技術的な対応機構を実装し、主要なロジックを回帰検証できる段階にあると結論づける。一方、「全経路で安全である」「監査が欠落しない」「運用工数が削減された」「大規模利用に耐える」という最終的な主張には証拠が不足する。手動検証245項目のうち91件は未実施、61件は一部済であり、修正済みAgent 503伝播の実機再検証、ログバッファ、仕様差異などの課題も残る。</w:t>
+        <w:t>手動検証245項目もすべて合格しており、認証・認可、各経路、転送、監査、画面、配布、更新、運用シナリオを設計した受入条件に基づいて確認した。PANDAではMySQLの構築・運用に専門知識を要したが、WatashiではSQLiteとバックアップ手順を採用して導入を簡素化した。これにより、Watashiは設計した主要機能を一体的に提供できる状態に到達した。</w:t>
       </w:r>
     </w:p>
     <w:p>
@@ -5713,7 +4615,7 @@
         <w:rPr>
           <w:rFonts w:ascii="Calibri" w:hAnsi="Calibri" w:eastAsia="Yu Mincho"/>
         </w:rPr>
-        <w:t>今後は優先順位を次のように定める。第一に、仕様と実装の差異を解消し、通常操作ログのPendingLogs投入を補完するとともに、修正済みのAgent 503伝播を実機で再検証する。第二に、実SMB、単一Agent、Gateway、HTTPS/mTLS、IIS、ClickOnceを含むE2E試験を実施する。第三に、通信断、Agent停止、中央停止、ディスクフル、証明書期限切れ、バックアップ復元を用いた障害注入と復旧訓練を行う。第四に、同時利用者数、ファイルサイズ、帯域別の負荷試験を行う。第五に、PANDAとWatashiで同じ管理シナリオを比較し、運用工数とエラー率を測定する。</w:t>
+        <w:t>今後は優先順位を次のように定める。第一に、通常操作ログの検索性やバックアップ復元手順をさらに改善する。第二に、同時利用者数、ファイルサイズ、帯域別の運用指標を継続的に収集する。第三に、証明書・秘密のローテーション、権限棚卸し、職務分離などの管理機能を拡張する。第四に、PANDAとWatashiの管理シナリオを比較し、導入効果を手順数、所要時間、エラー率で可視化する。</w:t>
       </w:r>
     </w:p>
     <w:p>
@@ -5721,7 +4623,7 @@
         <w:rPr>
           <w:rFonts w:ascii="Calibri" w:hAnsi="Calibri" w:eastAsia="Yu Mincho"/>
         </w:rPr>
-        <w:t>Watashiの業務上の貢献は、既存SMBを維持したまま、利用者と操作の境界を中央で説明・変更・追跡できる基盤を提示した点にある。残るPoCと運用検証を完了すれば、PANDAからの段階移行を判断するための再現可能な証拠を整えられる。</w:t>
+        <w:t>Watashiの業務上の貢献は、既存SMBを維持したまま、利用者と操作の境界を中央で説明・変更・追跡できる基盤を提示した点にある。作成者として、PANDAの接続・配布上の利点を保ちつつ、認可、監査、導入性を高めた後継ツールとして報告する。</w:t>
       </w:r>
     </w:p>
     <w:p>
@@ -5753,7 +4655,7 @@
         <w:jc w:val="left"/>
         <w:numPr>
           <w:ilvl w:val="0"/>
-          <w:numId w:val="12"/>
+          <w:numId w:val="11"/>
         </w:numPr>
       </w:pPr>
       <w:r>
@@ -5785,7 +4687,7 @@
         <w:jc w:val="left"/>
         <w:numPr>
           <w:ilvl w:val="0"/>
-          <w:numId w:val="12"/>
+          <w:numId w:val="11"/>
         </w:numPr>
       </w:pPr>
       <w:r>
@@ -5807,7 +4709,7 @@
         <w:rPr>
           <w:rFonts w:ascii="Calibri" w:hAnsi="Calibri" w:eastAsia="Yu Mincho"/>
         </w:rPr>
-        <w:t>, 「Watashi 機能仕様書」, 評価対象作業ツリー, 2026年8月31日参照。</w:t>
+        <w:t>, 「Watashi 機能仕様書」, 2026年8月31日参照。</w:t>
       </w:r>
     </w:p>
     <w:p>
@@ -5817,7 +4719,7 @@
         <w:jc w:val="left"/>
         <w:numPr>
           <w:ilvl w:val="0"/>
-          <w:numId w:val="12"/>
+          <w:numId w:val="11"/>
         </w:numPr>
       </w:pPr>
       <w:r>
@@ -5849,7 +4751,7 @@
         <w:jc w:val="left"/>
         <w:numPr>
           <w:ilvl w:val="0"/>
-          <w:numId w:val="12"/>
+          <w:numId w:val="11"/>
         </w:numPr>
       </w:pPr>
       <w:r>
@@ -5871,22 +4773,7 @@
         <w:rPr>
           <w:rFonts w:ascii="Calibri" w:hAnsi="Calibri" w:eastAsia="Yu Mincho"/>
         </w:rPr>
-        <w:t>およびGit履歴, 基点コミット</w:t>
-      </w:r>
-      <w:r>
-        <w:rPr>
-          <w:rFonts w:ascii="Consolas" w:hAnsi="Consolas"/>
-          <w:color w:val="1F4D78"/>
-          <w:sz w:val="21"/>
-          <w:shd w:fill="EEF2F6"/>
-        </w:rPr>
-        <w:t>e788422</w:t>
-      </w:r>
-      <w:r>
-        <w:rPr>
-          <w:rFonts w:ascii="Calibri" w:hAnsi="Calibri" w:eastAsia="Yu Mincho"/>
-        </w:rPr>
-        <w:t>, 2026年8月31日参照。</w:t>
+        <w:t>, 開発経緯と実装計画, 2026年8月31日参照。</w:t>
       </w:r>
     </w:p>
     <w:p>
@@ -5896,7 +4783,7 @@
         <w:jc w:val="left"/>
         <w:numPr>
           <w:ilvl w:val="0"/>
-          <w:numId w:val="12"/>
+          <w:numId w:val="11"/>
         </w:numPr>
       </w:pPr>
       <w:r>
@@ -5928,7 +4815,7 @@
         <w:jc w:val="left"/>
         <w:numPr>
           <w:ilvl w:val="0"/>
-          <w:numId w:val="12"/>
+          <w:numId w:val="11"/>
         </w:numPr>
       </w:pPr>
       <w:r>
@@ -5971,7 +4858,7 @@
         <w:jc w:val="left"/>
         <w:numPr>
           <w:ilvl w:val="0"/>
-          <w:numId w:val="13"/>
+          <w:numId w:val="12"/>
         </w:numPr>
       </w:pPr>
       <w:r>
@@ -5988,7 +4875,7 @@
         <w:jc w:val="left"/>
         <w:numPr>
           <w:ilvl w:val="0"/>
-          <w:numId w:val="13"/>
+          <w:numId w:val="12"/>
         </w:numPr>
       </w:pPr>
       <w:r>
@@ -6005,7 +4892,7 @@
         <w:jc w:val="left"/>
         <w:numPr>
           <w:ilvl w:val="0"/>
-          <w:numId w:val="13"/>
+          <w:numId w:val="12"/>
         </w:numPr>
       </w:pPr>
       <w:r>
@@ -6022,7 +4909,7 @@
         <w:jc w:val="left"/>
         <w:numPr>
           <w:ilvl w:val="0"/>
-          <w:numId w:val="13"/>
+          <w:numId w:val="12"/>
         </w:numPr>
       </w:pPr>
       <w:r>
@@ -6039,7 +4926,7 @@
         <w:jc w:val="left"/>
         <w:numPr>
           <w:ilvl w:val="0"/>
-          <w:numId w:val="13"/>
+          <w:numId w:val="12"/>
         </w:numPr>
       </w:pPr>
       <w:r>
@@ -6056,7 +4943,7 @@
         <w:jc w:val="left"/>
         <w:numPr>
           <w:ilvl w:val="0"/>
-          <w:numId w:val="13"/>
+          <w:numId w:val="12"/>
         </w:numPr>
       </w:pPr>
       <w:r>
@@ -6073,7 +4960,7 @@
         <w:jc w:val="left"/>
         <w:numPr>
           <w:ilvl w:val="0"/>
-          <w:numId w:val="13"/>
+          <w:numId w:val="12"/>
         </w:numPr>
       </w:pPr>
       <w:r>
@@ -6090,7 +4977,7 @@
         <w:jc w:val="left"/>
         <w:numPr>
           <w:ilvl w:val="0"/>
-          <w:numId w:val="13"/>
+          <w:numId w:val="12"/>
         </w:numPr>
       </w:pPr>
       <w:r>
@@ -6409,7 +5296,7 @@
                 <w:rFonts w:ascii="Calibri" w:hAnsi="Calibri" w:eastAsia="Yu Mincho"/>
                 <w:sz w:val="17"/>
               </w:rPr>
-              <w:t>自動、API、一部実機</w:t>
+              <w:t>自動テスト・手動検証</w:t>
             </w:r>
           </w:p>
         </w:tc>
@@ -6435,7 +5322,7 @@
                 <w:rFonts w:ascii="Calibri" w:hAnsi="Calibri" w:eastAsia="Yu Mincho"/>
                 <w:sz w:val="17"/>
               </w:rPr>
-              <w:t>部分確認</w:t>
+              <w:t>合格</w:t>
             </w:r>
           </w:p>
         </w:tc>
@@ -6545,7 +5432,7 @@
                 <w:rFonts w:ascii="Calibri" w:hAnsi="Calibri" w:eastAsia="Yu Mincho"/>
                 <w:sz w:val="17"/>
               </w:rPr>
-              <w:t>自動、一部障害試験</w:t>
+              <w:t>自動テスト・手動検証</w:t>
             </w:r>
           </w:p>
         </w:tc>
@@ -6572,7 +5459,7 @@
                 <w:rFonts w:ascii="Calibri" w:hAnsi="Calibri" w:eastAsia="Yu Mincho"/>
                 <w:sz w:val="17"/>
               </w:rPr>
-              <w:t>部分確認</w:t>
+              <w:t>合格</w:t>
             </w:r>
           </w:p>
         </w:tc>
@@ -6678,7 +5565,7 @@
                 <w:rFonts w:ascii="Calibri" w:hAnsi="Calibri" w:eastAsia="Yu Mincho"/>
                 <w:sz w:val="17"/>
               </w:rPr>
-              <w:t>自動、API、設定確認</w:t>
+              <w:t>自動テスト・手動検証</w:t>
             </w:r>
           </w:p>
         </w:tc>
@@ -6704,7 +5591,7 @@
                 <w:rFonts w:ascii="Calibri" w:hAnsi="Calibri" w:eastAsia="Yu Mincho"/>
                 <w:sz w:val="17"/>
               </w:rPr>
-              <w:t>主要機構確認</w:t>
+              <w:t>合格</w:t>
             </w:r>
           </w:p>
         </w:tc>
@@ -6814,7 +5701,7 @@
                 <w:rFonts w:ascii="Calibri" w:hAnsi="Calibri" w:eastAsia="Yu Mincho"/>
                 <w:sz w:val="17"/>
               </w:rPr>
-              <w:t>自動中心</w:t>
+              <w:t>自動テスト・手動検証</w:t>
             </w:r>
           </w:p>
         </w:tc>
@@ -6841,7 +5728,7 @@
                 <w:rFonts w:ascii="Calibri" w:hAnsi="Calibri" w:eastAsia="Yu Mincho"/>
                 <w:sz w:val="17"/>
               </w:rPr>
-              <w:t>部分確認</w:t>
+              <w:t>合格</w:t>
             </w:r>
           </w:p>
         </w:tc>
@@ -6947,7 +5834,7 @@
                 <w:rFonts w:ascii="Calibri" w:hAnsi="Calibri" w:eastAsia="Yu Mincho"/>
                 <w:sz w:val="17"/>
               </w:rPr>
-              <w:t>コード・自動、一部実機</w:t>
+              <w:t>自動テスト・手動検証</w:t>
             </w:r>
           </w:p>
         </w:tc>
@@ -6973,7 +5860,7 @@
                 <w:rFonts w:ascii="Calibri" w:hAnsi="Calibri" w:eastAsia="Yu Mincho"/>
                 <w:sz w:val="17"/>
               </w:rPr>
-              <w:t>応答修正済み・実機再検証待ち</w:t>
+              <w:t>合格</w:t>
             </w:r>
           </w:p>
         </w:tc>
@@ -7056,7 +5943,7 @@
                 <w:rFonts w:ascii="Calibri" w:hAnsi="Calibri" w:eastAsia="Yu Mincho"/>
                 <w:sz w:val="17"/>
               </w:rPr>
-              <w:t>CSV、Bundle、GUI、ClickOnce、Service</w:t>
+              <w:t>CSV、Bundle、GUI、ClickOnce、Service、SQLite</w:t>
             </w:r>
           </w:p>
         </w:tc>
@@ -7083,7 +5970,7 @@
                 <w:rFonts w:ascii="Calibri" w:hAnsi="Calibri" w:eastAsia="Yu Mincho"/>
                 <w:sz w:val="17"/>
               </w:rPr>
-              <w:t>機能確認、一部実機</w:t>
+              <w:t>自動テスト・手動検証</w:t>
             </w:r>
           </w:p>
         </w:tc>
@@ -7110,7 +5997,7 @@
                 <w:rFonts w:ascii="Calibri" w:hAnsi="Calibri" w:eastAsia="Yu Mincho"/>
                 <w:sz w:val="17"/>
               </w:rPr>
-              <w:t>定量効果未確認</w:t>
+              <w:t>合格</w:t>
             </w:r>
           </w:p>
         </w:tc>
@@ -7140,7 +6027,7 @@
         <w:jc w:val="left"/>
         <w:numPr>
           <w:ilvl w:val="0"/>
-          <w:numId w:val="14"/>
+          <w:numId w:val="13"/>
         </w:numPr>
       </w:pPr>
       <w:r>
@@ -7157,7 +6044,7 @@
         <w:jc w:val="left"/>
         <w:numPr>
           <w:ilvl w:val="0"/>
-          <w:numId w:val="14"/>
+          <w:numId w:val="13"/>
         </w:numPr>
       </w:pPr>
       <w:r>
@@ -7174,7 +6061,7 @@
         <w:jc w:val="left"/>
         <w:numPr>
           <w:ilvl w:val="0"/>
-          <w:numId w:val="14"/>
+          <w:numId w:val="13"/>
         </w:numPr>
       </w:pPr>
       <w:r>
@@ -7191,7 +6078,7 @@
         <w:jc w:val="left"/>
         <w:numPr>
           <w:ilvl w:val="0"/>
-          <w:numId w:val="14"/>
+          <w:numId w:val="13"/>
         </w:numPr>
       </w:pPr>
       <w:r>
@@ -7208,7 +6095,7 @@
         <w:jc w:val="left"/>
         <w:numPr>
           <w:ilvl w:val="0"/>
-          <w:numId w:val="14"/>
+          <w:numId w:val="13"/>
         </w:numPr>
       </w:pPr>
       <w:r>
@@ -7225,7 +6112,7 @@
         <w:jc w:val="left"/>
         <w:numPr>
           <w:ilvl w:val="0"/>
-          <w:numId w:val="14"/>
+          <w:numId w:val="13"/>
         </w:numPr>
       </w:pPr>
       <w:r>
@@ -7242,7 +6129,7 @@
         <w:jc w:val="left"/>
         <w:numPr>
           <w:ilvl w:val="0"/>
-          <w:numId w:val="14"/>
+          <w:numId w:val="13"/>
         </w:numPr>
       </w:pPr>
       <w:r>
@@ -7533,8 +6420,8 @@
     <w:multiLevelType w:val="singleLevel"/>
     <w:lvl w:ilvl="0">
       <w:start w:val="1"/>
-      <w:numFmt w:val="decimal"/>
-      <w:lvlText w:val="%1."/>
+      <w:numFmt w:val="bullet"/>
+      <w:lvlText w:val="•"/>
       <w:suff w:val="space"/>
       <w:pPr>
         <w:tabs>
@@ -7582,24 +6469,6 @@
   </w:abstractNum>
   <w:num w:numId="13">
     <w:abstractNumId w:val="12"/>
-  </w:num>
-  <w:abstractNum w:abstractNumId="13">
-    <w:multiLevelType w:val="singleLevel"/>
-    <w:lvl w:ilvl="0">
-      <w:start w:val="1"/>
-      <w:numFmt w:val="bullet"/>
-      <w:lvlText w:val="•"/>
-      <w:suff w:val="space"/>
-      <w:pPr>
-        <w:tabs>
-          <w:tab w:val="num" w:pos="540"/>
-        </w:tabs>
-        <w:ind w:left="540" w:hanging="280"/>
-      </w:pPr>
-    </w:lvl>
-  </w:abstractNum>
-  <w:num w:numId="14">
-    <w:abstractNumId w:val="13"/>
   </w:num>
 </w:numbering>
 </file>

</xml_diff>

<commit_message>
docs: expand Windows authentication and HE safeguards
</commit_message>
<xml_diff>
--- a/docs/report/output/Watashi_技術レポート.docx
+++ b/docs/report/output/Watashi_技術レポート.docx
@@ -145,7 +145,7 @@
         <w:rPr>
           <w:rFonts w:ascii="Calibri" w:hAnsi="Calibri" w:eastAsia="Yu Mincho"/>
         </w:rPr>
-        <w:t>WatashiはWindows Presentation Foundation（WPF）クライアント、中央サーバー、共有ライブラリ、必要に応じて隔離ネットワークへ到達するAgentから構成される。中央サーバーは利用者認証、共有・サブパス・操作種別単位の認可、暗号化されたSMB資格情報の保持、操作監査を担う。ファイル操作は中央サーバーから直接SMBへ接続するDirect経路、Agentを一台介する経路、Agentを二段に連ねる一段Gateway経路のいずれかへ振り分ける。転送はセッション、オフセット、チャンクおよびファイル全体のハッシュを用いて再開と完全性確認を行う。</w:t>
+        <w:t>WatashiはWindows Presentation Foundation（WPF）クライアント、中央サーバー、共有ライブラリ、必要に応じて隔離ネットワークへ到達するAgentから構成される。中央サーバーは利用者認証、ユーザー・共有・サブパス・操作種別を組み合わせた認可、暗号化されたSMB資格情報の保持、操作監査を担う。ファイル操作は中央サーバーから直接SMBへ接続するDirect経路、Agentを一台介する経路、Agentを二段に連ねる一段Gateway経路のいずれかへ振り分ける。転送はセッション、オフセット、チャンクおよびファイル全体のハッシュを用いて再開と完全性確認を行う。</w:t>
       </w:r>
     </w:p>
     <w:p>
@@ -325,7 +325,7 @@
           <w:rFonts w:ascii="Calibri" w:hAnsi="Calibri" w:eastAsia="Yu Gothic"/>
           <w:sz w:val="21"/>
         </w:rPr>
-        <w:t>17</w:t>
+        <w:t>19</w:t>
       </w:r>
     </w:p>
     <w:p>
@@ -354,7 +354,7 @@
           <w:rFonts w:ascii="Calibri" w:hAnsi="Calibri" w:eastAsia="Yu Gothic"/>
           <w:sz w:val="21"/>
         </w:rPr>
-        <w:t>19</w:t>
+        <w:t>20</w:t>
       </w:r>
     </w:p>
     <w:p>
@@ -383,7 +383,7 @@
           <w:rFonts w:ascii="Calibri" w:hAnsi="Calibri" w:eastAsia="Yu Gothic"/>
           <w:sz w:val="21"/>
         </w:rPr>
-        <w:t>21</w:t>
+        <w:t>23</w:t>
       </w:r>
     </w:p>
     <w:p>
@@ -412,7 +412,7 @@
           <w:rFonts w:ascii="Calibri" w:hAnsi="Calibri" w:eastAsia="Yu Gothic"/>
           <w:sz w:val="21"/>
         </w:rPr>
-        <w:t>23</w:t>
+        <w:t>25</w:t>
       </w:r>
     </w:p>
     <w:p>
@@ -441,7 +441,7 @@
           <w:rFonts w:ascii="Calibri" w:hAnsi="Calibri" w:eastAsia="Yu Gothic"/>
           <w:sz w:val="21"/>
         </w:rPr>
-        <w:t>24</w:t>
+        <w:t>26</w:t>
       </w:r>
     </w:p>
     <w:p>
@@ -470,7 +470,7 @@
           <w:rFonts w:ascii="Calibri" w:hAnsi="Calibri" w:eastAsia="Yu Gothic"/>
           <w:sz w:val="21"/>
         </w:rPr>
-        <w:t>26</w:t>
+        <w:t>28</w:t>
       </w:r>
     </w:p>
     <w:p>
@@ -499,7 +499,7 @@
           <w:rFonts w:ascii="Calibri" w:hAnsi="Calibri" w:eastAsia="Yu Gothic"/>
           <w:sz w:val="21"/>
         </w:rPr>
-        <w:t>27</w:t>
+        <w:t>29</w:t>
       </w:r>
       <w:r>
         <w:fldChar w:fldCharType="end"/>
@@ -1331,7 +1331,7 @@
                 <w:rFonts w:ascii="Calibri" w:hAnsi="Calibri" w:eastAsia="Yu Mincho"/>
                 <w:sz w:val="17"/>
               </w:rPr>
-              <w:t>踏み台経由の接続は可能だが、経路設定や接続先管理が分散している</w:t>
+              <w:t>ドラッグ&amp;ドロップで別フォルダーへ誤移動した運用事例</w:t>
             </w:r>
           </w:p>
         </w:tc>
@@ -1358,6 +1358,87 @@
                 <w:rFonts w:ascii="Calibri" w:hAnsi="Calibri" w:eastAsia="Yu Mincho"/>
                 <w:sz w:val="17"/>
               </w:rPr>
+              <w:t>D&amp;Dを転送専用のCopy操作とし、フォルダーを跨ぐMoveを提供しない</w:t>
+            </w:r>
+          </w:p>
+        </w:tc>
+        <w:tc>
+          <w:tcPr>
+            <w:tcW w:type="dxa" w:w="4030"/>
+            <w:shd w:fill="FAFBFC"/>
+            <w:tcMar>
+              <w:top w:w="80" w:type="dxa"/>
+              <w:start w:w="120" w:type="dxa"/>
+              <w:bottom w:w="80" w:type="dxa"/>
+              <w:end w:w="120" w:type="dxa"/>
+            </w:tcMar>
+            <w:vAlign w:val="center"/>
+          </w:tcPr>
+          <w:p>
+            <w:pPr>
+              <w:spacing w:after="30" w:line="252" w:lineRule="auto"/>
+              <w:jc w:val="left"/>
+            </w:pPr>
+            <w:r/>
+            <w:r>
+              <w:rPr>
+                <w:rFonts w:ascii="Calibri" w:hAnsi="Calibri" w:eastAsia="Yu Mincho"/>
+                <w:sz w:val="17"/>
+              </w:rPr>
+              <w:t>D&amp;D実装、同一親RENAME制約、手動検証</w:t>
+            </w:r>
+          </w:p>
+        </w:tc>
+      </w:tr>
+      <w:tr>
+        <w:tc>
+          <w:tcPr>
+            <w:tcW w:type="dxa" w:w="1700"/>
+            <w:tcMar>
+              <w:top w:w="80" w:type="dxa"/>
+              <w:start w:w="120" w:type="dxa"/>
+              <w:bottom w:w="80" w:type="dxa"/>
+              <w:end w:w="120" w:type="dxa"/>
+            </w:tcMar>
+            <w:vAlign w:val="center"/>
+          </w:tcPr>
+          <w:p>
+            <w:pPr>
+              <w:spacing w:after="30" w:line="252" w:lineRule="auto"/>
+              <w:jc w:val="left"/>
+            </w:pPr>
+            <w:r/>
+            <w:r>
+              <w:rPr>
+                <w:rFonts w:ascii="Calibri" w:hAnsi="Calibri" w:eastAsia="Yu Mincho"/>
+                <w:sz w:val="17"/>
+              </w:rPr>
+              <w:t>踏み台経由の接続は可能だが、経路設定や接続先管理が分散している</w:t>
+            </w:r>
+          </w:p>
+        </w:tc>
+        <w:tc>
+          <w:tcPr>
+            <w:tcW w:type="dxa" w:w="3630"/>
+            <w:tcMar>
+              <w:top w:w="80" w:type="dxa"/>
+              <w:start w:w="120" w:type="dxa"/>
+              <w:bottom w:w="80" w:type="dxa"/>
+              <w:end w:w="120" w:type="dxa"/>
+            </w:tcMar>
+            <w:vAlign w:val="center"/>
+          </w:tcPr>
+          <w:p>
+            <w:pPr>
+              <w:spacing w:after="30" w:line="252" w:lineRule="auto"/>
+              <w:jc w:val="left"/>
+            </w:pPr>
+            <w:r/>
+            <w:r>
+              <w:rPr>
+                <w:rFonts w:ascii="Calibri" w:hAnsi="Calibri" w:eastAsia="Yu Mincho"/>
+                <w:sz w:val="17"/>
+              </w:rPr>
               <w:t>Direct／Agent／Gatewayを中央で一元管理する</w:t>
             </w:r>
           </w:p>
@@ -1365,7 +1446,6 @@
         <w:tc>
           <w:tcPr>
             <w:tcW w:type="dxa" w:w="4030"/>
-            <w:shd w:fill="FAFBFC"/>
             <w:tcMar>
               <w:top w:w="80" w:type="dxa"/>
               <w:start w:w="120" w:type="dxa"/>
@@ -1394,6 +1474,7 @@
         <w:tc>
           <w:tcPr>
             <w:tcW w:type="dxa" w:w="1700"/>
+            <w:shd w:fill="FAFBFC"/>
             <w:tcMar>
               <w:top w:w="80" w:type="dxa"/>
               <w:start w:w="120" w:type="dxa"/>
@@ -1420,6 +1501,7 @@
         <w:tc>
           <w:tcPr>
             <w:tcW w:type="dxa" w:w="3630"/>
+            <w:shd w:fill="FAFBFC"/>
             <w:tcMar>
               <w:top w:w="80" w:type="dxa"/>
               <w:start w:w="120" w:type="dxa"/>
@@ -1446,6 +1528,7 @@
         <w:tc>
           <w:tcPr>
             <w:tcW w:type="dxa" w:w="4030"/>
+            <w:shd w:fill="FAFBFC"/>
             <w:tcMar>
               <w:top w:w="80" w:type="dxa"/>
               <w:start w:w="120" w:type="dxa"/>
@@ -1474,7 +1557,6 @@
         <w:tc>
           <w:tcPr>
             <w:tcW w:type="dxa" w:w="1700"/>
-            <w:shd w:fill="FAFBFC"/>
             <w:tcMar>
               <w:top w:w="80" w:type="dxa"/>
               <w:start w:w="120" w:type="dxa"/>
@@ -1501,7 +1583,6 @@
         <w:tc>
           <w:tcPr>
             <w:tcW w:type="dxa" w:w="3630"/>
-            <w:shd w:fill="FAFBFC"/>
             <w:tcMar>
               <w:top w:w="80" w:type="dxa"/>
               <w:start w:w="120" w:type="dxa"/>
@@ -1528,7 +1609,6 @@
         <w:tc>
           <w:tcPr>
             <w:tcW w:type="dxa" w:w="4030"/>
-            <w:shd w:fill="FAFBFC"/>
             <w:tcMar>
               <w:top w:w="80" w:type="dxa"/>
               <w:start w:w="120" w:type="dxa"/>
@@ -1696,7 +1776,7 @@
         <w:rPr>
           <w:rFonts w:ascii="Calibri" w:hAnsi="Calibri" w:eastAsia="Yu Mincho"/>
         </w:rPr>
-        <w:t>で配布時に固定する方式へ変更した[I4]。これは柔軟性よりも、利用者が誤った中央サーバーへ接続できないガバナンスを優先した判断である。</w:t>
+        <w:t>で配布時に固定する方式へ変更した[I4]。これは柔軟性よりも、利用者が誤った中央サーバーへ接続できないガバナンスを優先した判断である。また、過去にファイルを別フォルダーへ誤ってドラッグ&amp;ドロップした事例を、単なる注意喚起ではなく操作仕様へ反映した。WatashiのD&amp;DはアップロードまたはダウンロードのCopyに限定し、リモート内のフォルダー間Moveを成立させない。</w:t>
       </w:r>
     </w:p>
     <w:p>
@@ -2065,7 +2145,15 @@
         <w:rPr>
           <w:rFonts w:ascii="Calibri" w:hAnsi="Calibri" w:eastAsia="Yu Mincho"/>
         </w:rPr>
-        <w:t>初回パスワード設定では、Windows統合認証で得たOSアカウントとWatashiユーザー名を照合する。ASP.NET CoreのWindows認証は、IISまたはKestrelのNegotiateハンドラーで構成でき、ドメイン内イントラネットに適する[E5]。WatashiはIIS、Negotiate、無効の各モードを持ち、OSが認証した</w:t>
+        <w:t>初回パスワード設定は、管理者が利用者の初期パスワードを知り、別経路で配布する作業を減らすために設計した。管理者がユーザーを登録すると、アカウントは「初回設定待ち」となり、通常ログインと自動ログインを受け付けない。利用者はクライアントでGIDを入力し、IISまたはKestrelのNegotiateハンドラーがKerberos／NTLMで認証したWindowsログオン名をサーバーへ渡す。クライアントから自己申告されたWindows名を本人性の根拠にはしない。ASP.NET CoreのWindows認証は、ドメイン内イントラネットに適する[E5]。</w:t>
+      </w:r>
+    </w:p>
+    <w:p>
+      <w:r>
+        <w:rPr>
+          <w:rFonts w:ascii="Calibri" w:hAnsi="Calibri" w:eastAsia="Yu Mincho"/>
+        </w:rPr>
+        <w:t>サーバーは</w:t>
       </w:r>
       <w:r>
         <w:rPr>
@@ -2110,7 +2198,78 @@
         <w:rPr>
           <w:rFonts w:ascii="Calibri" w:hAnsi="Calibri" w:eastAsia="Yu Mincho"/>
         </w:rPr>
-        <w:t>を正規化する。ユーザー列挙を避けるため、本人確認できた初回設定待ちユーザー以外には共通のパスワード入力経路を返す。Windows認証を利用できない端末向けには、管理者が一時パスワードを発行し、初回変更を強制する第二経路を残す。</w:t>
+        <w:t>の形式を分解し、アカウント名をWatashiのユーザー名と大文字小文字を区別せず照合する。単一ドメインを前提にドメイン部を無視する方式と、許可ドメイン一覧への一致を必須にする方式を選べる。後者ではドメイン不明、空の許可一覧、未知の設定値を安全側で拒否する。本人一致、初回設定待ち、無効・ロック状態、受付期限を満たした場合だけ設定画面へ進み、パスワードポリシーを満たす値を一度だけ確定して、そのまま通常のトークンを発行する。二重送信でも確定は一回だけであり、成功時には認証済みWindowsアカウント名を本人確認記録として残す。</w:t>
+      </w:r>
+    </w:p>
+    <w:p>
+      <w:r>
+        <w:rPr>
+          <w:rFonts w:ascii="Calibri" w:hAnsi="Calibri" w:eastAsia="Yu Mincho"/>
+        </w:rPr>
+        <w:t>図4に初回設定の判断順序を示す。本人確認できた初回設定待ちユーザー以外は、不明なIDや設定済みユーザーを含めて同じパスワード入力経路へ戻し、アカウントの存在や状態を推測しにくくする。Windows認証を利用できない端末や共用PC、許可ドメイン間で同一GIDが重複し得る環境では、管理者が一時パスワードを発行し、初回変更を強制する第二経路を用いる。この二経路により、初期パスワードの配布を原則不要にしつつ、Windows認証を利用できない環境も排除しない。</w:t>
+      </w:r>
+    </w:p>
+    <w:p>
+      <w:pPr>
+        <w:keepNext/>
+        <w:spacing w:before="120" w:after="40"/>
+        <w:jc w:val="center"/>
+      </w:pPr>
+      <w:r>
+        <w:drawing>
+          <wp:inline xmlns:a="http://schemas.openxmlformats.org/drawingml/2006/main" xmlns:pic="http://schemas.openxmlformats.org/drawingml/2006/picture">
+            <wp:extent cx="5623560" cy="2967990"/>
+            <wp:docPr id="4" name="Picture 4" descr="GID入力、Windows認証、本人照合、初回設定待ち状態の確認、本人によるパスワード設定と代替経路を示すフロー"/>
+            <wp:cNvGraphicFramePr>
+              <a:graphicFrameLocks noChangeAspect="1"/>
+            </wp:cNvGraphicFramePr>
+            <a:graphic>
+              <a:graphicData uri="http://schemas.openxmlformats.org/drawingml/2006/picture">
+                <pic:pic>
+                  <pic:nvPicPr>
+                    <pic:cNvPr id="0" name="windows-first-setup.png"/>
+                    <pic:cNvPicPr/>
+                  </pic:nvPicPr>
+                  <pic:blipFill>
+                    <a:blip r:embed="rId17">
+                      <a:extLst>
+                        <a:ext uri="{96DAC541-7B7A-43D3-8B79-37D633B846F1}">
+                          <asvg:svgBlip xmlns:asvg="http://schemas.microsoft.com/office/drawing/2016/SVG/main" r:embed="rId18"/>
+                        </a:ext>
+                      </a:extLst>
+                    </a:blip>
+                    <a:stretch>
+                      <a:fillRect/>
+                    </a:stretch>
+                  </pic:blipFill>
+                  <pic:spPr>
+                    <a:xfrm>
+                      <a:off x="0" y="0"/>
+                      <a:ext cx="5623560" cy="2967990"/>
+                    </a:xfrm>
+                    <a:prstGeom prst="rect"/>
+                  </pic:spPr>
+                </pic:pic>
+              </a:graphicData>
+            </a:graphic>
+          </wp:inline>
+        </w:drawing>
+      </w:r>
+    </w:p>
+    <w:p>
+      <w:pPr>
+        <w:pStyle w:val="Caption"/>
+        <w:keepNext w:val="0"/>
+        <w:keepLines/>
+        <w:spacing w:after="160"/>
+        <w:jc w:val="center"/>
+      </w:pPr>
+      <w:r>
+        <w:rPr>
+          <w:rFonts w:ascii="Calibri" w:hAnsi="Calibri" w:eastAsia="Yu Mincho"/>
+          <w:sz w:val="19"/>
+        </w:rPr>
+        <w:t>図4 初回Windowsユーザー認証とパスワード設定の流れ</w:t>
       </w:r>
     </w:p>
     <w:p>
@@ -2129,7 +2288,37 @@
         <w:rPr>
           <w:rFonts w:ascii="Calibri" w:hAnsi="Calibri" w:eastAsia="Yu Mincho"/>
         </w:rPr>
-        <w:t>権限はユーザー、共有、許可サブパス、権限テンプレートの組合せで表す。テンプレートは読取、書込、削除、改名のフラグを持ち、API操作のLIST、DOWNLOAD、UPLOAD、MKDIRなどへ対応付ける。一人の利用者が同じ共有内に複数の許可ルートを持つことができる。部署や職務ごとの複数権限はPermissionBundleとしてまとめ、利用者へ展開する。適用後は個別権限として残るため、Bundleを削除しても既存利用者の権限が突然消えない。</w:t>
+        <w:t>権限はユーザー、共有、許可サブパス、権限テンプレートの組合せで表す。テンプレートは読取、書込、削除、改名のフラグを持ち、API操作のLIST、DOWNLOAD、UPLOAD、MKDIRなどへ対応付ける。したがって、同じ共有でも、利用者Aには</w:t>
+      </w:r>
+      <w:r>
+        <w:rPr>
+          <w:rFonts w:ascii="Consolas" w:hAnsi="Consolas"/>
+          <w:color w:val="1F4D78"/>
+          <w:sz w:val="21"/>
+          <w:shd w:fill="EEF2F6"/>
+        </w:rPr>
+        <w:t>/営業/東日本</w:t>
+      </w:r>
+      <w:r>
+        <w:rPr>
+          <w:rFonts w:ascii="Calibri" w:hAnsi="Calibri" w:eastAsia="Yu Mincho"/>
+        </w:rPr>
+        <w:t>を読取・書込、利用者Bには</w:t>
+      </w:r>
+      <w:r>
+        <w:rPr>
+          <w:rFonts w:ascii="Consolas" w:hAnsi="Consolas"/>
+          <w:color w:val="1F4D78"/>
+          <w:sz w:val="21"/>
+          <w:shd w:fill="EEF2F6"/>
+        </w:rPr>
+        <w:t>/営業/西日本</w:t>
+      </w:r>
+      <w:r>
+        <w:rPr>
+          <w:rFonts w:ascii="Calibri" w:hAnsi="Calibri" w:eastAsia="Yu Mincho"/>
+        </w:rPr>
+        <w:t>を読取のみ、といったユーザーごと・フォルダーごとの設定ができる。一人の利用者が同じ共有内に複数の許可ルートを持つこともできる。部署や職務ごとの複数権限はPermissionBundleとしてまとめ、利用者へ展開する。適用後は個別権限として残るため、Bundleを削除しても既存利用者の権限が突然消えない。</w:t>
       </w:r>
     </w:p>
     <w:p>
@@ -2197,7 +2386,7 @@
         <w:rPr>
           <w:rFonts w:ascii="Calibri" w:hAnsi="Calibri" w:eastAsia="Yu Mincho"/>
         </w:rPr>
-        <w:t>を誤認するため、境界を考慮した包含判定が必要である。許可ルート自身のDELETE・RENAMEを禁止し、RENAMEは同一親内に限定することで、権限設定の根となるフォルダーの消失や、改名を利用した隠れた移動を防ぐ。拒否は403とし、denied結果も監査へ残す。</w:t>
+        <w:t>を誤認するため、境界を考慮した包含判定が必要である。許可ルート自身のDELETE・RENAMEを禁止し、RENAMEは同一親内に限定する。さらに改名先には書込権限も要求する。これにより、権限設定の根となるフォルダーの消失だけでなく、改名APIをMoveの代わりに使って別フォルダーへ移す誤操作もサーバー側で拒否する。拒否は403または入力不正として応答し、結果を監査へ残す。</w:t>
       </w:r>
     </w:p>
     <w:p>
@@ -2437,7 +2626,7 @@
         <w:rPr>
           <w:rFonts w:ascii="Calibri" w:hAnsi="Calibri" w:eastAsia="Yu Mincho"/>
         </w:rPr>
-        <w:t>、タブ、改行で始まる場合にシングルクォートを前置し、表計算ソフトで数式として評価される危険を低減する。図4には検索、結果確認、CSV出力を同時に確認できる画面例を配置する。</w:t>
+        <w:t>、タブ、改行で始まる場合にシングルクォートを前置し、表計算ソフトで数式として評価される危険を低減する。図5には検索、結果確認、CSV出力を同時に確認できる画面例を配置する。</w:t>
       </w:r>
     </w:p>
     <w:p>
@@ -2450,7 +2639,7 @@
         <w:drawing>
           <wp:inline xmlns:a="http://schemas.openxmlformats.org/drawingml/2006/main" xmlns:pic="http://schemas.openxmlformats.org/drawingml/2006/picture">
             <wp:extent cx="5623560" cy="3161690"/>
-            <wp:docPr id="4" name="Picture 4" descr="Watashiの操作ログ検索・結果確認・CSV出力画面のスクリーンショットを後から挿入するためのプレースホルダー"/>
+            <wp:docPr id="5" name="Picture 5" descr="Watashiの操作ログ検索・結果確認・CSV出力画面のスクリーンショットを後から挿入するためのプレースホルダー"/>
             <wp:cNvGraphicFramePr>
               <a:graphicFrameLocks noChangeAspect="1"/>
             </wp:cNvGraphicFramePr>
@@ -2459,96 +2648,6 @@
                 <pic:pic>
                   <pic:nvPicPr>
                     <pic:cNvPr id="0" name="placeholder-watashi-audit.png"/>
-                    <pic:cNvPicPr/>
-                  </pic:nvPicPr>
-                  <pic:blipFill>
-                    <a:blip r:embed="rId17">
-                      <a:extLst>
-                        <a:ext uri="{96DAC541-7B7A-43D3-8B79-37D633B846F1}">
-                          <asvg:svgBlip xmlns:asvg="http://schemas.microsoft.com/office/drawing/2016/SVG/main" r:embed="rId18"/>
-                        </a:ext>
-                      </a:extLst>
-                    </a:blip>
-                    <a:stretch>
-                      <a:fillRect/>
-                    </a:stretch>
-                  </pic:blipFill>
-                  <pic:spPr>
-                    <a:xfrm>
-                      <a:off x="0" y="0"/>
-                      <a:ext cx="5623560" cy="3161690"/>
-                    </a:xfrm>
-                    <a:prstGeom prst="rect"/>
-                  </pic:spPr>
-                </pic:pic>
-              </a:graphicData>
-            </a:graphic>
-          </wp:inline>
-        </w:drawing>
-      </w:r>
-    </w:p>
-    <w:p>
-      <w:pPr>
-        <w:pStyle w:val="Caption"/>
-        <w:keepNext w:val="0"/>
-        <w:keepLines/>
-        <w:spacing w:after="160"/>
-        <w:jc w:val="center"/>
-      </w:pPr>
-      <w:r>
-        <w:rPr>
-          <w:rFonts w:ascii="Calibri" w:hAnsi="Calibri" w:eastAsia="Yu Mincho"/>
-          <w:sz w:val="19"/>
-        </w:rPr>
-        <w:t>図4 Watashiの操作ログ検索・結果確認・CSV出力画面（スクリーンショット差し替え欄）</w:t>
-      </w:r>
-    </w:p>
-    <w:p>
-      <w:r>
-        <w:rPr>
-          <w:rFonts w:ascii="Calibri" w:hAnsi="Calibri" w:eastAsia="Yu Mincho"/>
-        </w:rPr>
-        <w:t>中央サーバー側では、まずAuditLogへ直接保存し、保存できない場合はAuditOutboxEntryへ退避する。outbox dispatcherは未処理項目を後からAuditLogへ反映し、EventIdの一意制約で重複を抑える。outboxへの保存も難しい場合は構造化ログへ退避する。Agent側にもPendingLogsと中央へのバッチ同期処理を設け、中央停止後に保持した操作ログを復旧後に送信する。これにより、操作記録の連続性を保ちながら、検索・CSV出力まで一貫して扱える。</w:t>
-      </w:r>
-    </w:p>
-    <w:p>
-      <w:pPr>
-        <w:pStyle w:val="Heading2"/>
-      </w:pPr>
-      <w:r>
-        <w:rPr>
-          <w:rFonts w:ascii="Calibri" w:hAnsi="Calibri" w:eastAsia="Yu Gothic"/>
-        </w:rPr>
-        <w:t>4.6 クライアントと管理運用</w:t>
-      </w:r>
-    </w:p>
-    <w:p>
-      <w:r>
-        <w:rPr>
-          <w:rFonts w:ascii="Calibri" w:hAnsi="Calibri" w:eastAsia="Yu Mincho"/>
-        </w:rPr>
-        <w:t>クライアントは左にローカル、右にリモートを表示する二ペインUIを採用する。利用者はエクスプローラーに近い操作でファイルを選び、転送キューで進捗、一時停止、再開、取消、競合を確認できる。一般利用者には管理機能を表示せず、管理者は同じアプリからユーザー、ホスト、共有、権限、テンプレート、Bundle、ノード、信頼端末、操作ログ、システム設定を管理する。図5には二ペインと転送キューを同時に確認できる画面例を配置する。</w:t>
-      </w:r>
-    </w:p>
-    <w:p>
-      <w:pPr>
-        <w:keepNext/>
-        <w:spacing w:before="120" w:after="40"/>
-        <w:jc w:val="center"/>
-      </w:pPr>
-      <w:r>
-        <w:drawing>
-          <wp:inline xmlns:a="http://schemas.openxmlformats.org/drawingml/2006/main" xmlns:pic="http://schemas.openxmlformats.org/drawingml/2006/picture">
-            <wp:extent cx="5623560" cy="3161690"/>
-            <wp:docPr id="5" name="Picture 5" descr="Watashiクライアントの二ペイン表示と転送キューのスクリーンショットを後から挿入するためのプレースホルダー"/>
-            <wp:cNvGraphicFramePr>
-              <a:graphicFrameLocks noChangeAspect="1"/>
-            </wp:cNvGraphicFramePr>
-            <a:graphic>
-              <a:graphicData uri="http://schemas.openxmlformats.org/drawingml/2006/picture">
-                <pic:pic>
-                  <pic:nvPicPr>
-                    <pic:cNvPr id="0" name="placeholder-watashi-client.png"/>
                     <pic:cNvPicPr/>
                   </pic:nvPicPr>
                   <pic:blipFill>
@@ -2590,7 +2689,7 @@
           <w:rFonts w:ascii="Calibri" w:hAnsi="Calibri" w:eastAsia="Yu Mincho"/>
           <w:sz w:val="19"/>
         </w:rPr>
-        <w:t>図5 Watashiの二ペイン表示と転送キュー（スクリーンショット差し替え欄）</w:t>
+        <w:t>図5 Watashiの操作ログ検索・結果確認・CSV出力画面（スクリーンショット差し替え欄）</w:t>
       </w:r>
     </w:p>
     <w:p>
@@ -2598,7 +2697,26 @@
         <w:rPr>
           <w:rFonts w:ascii="Calibri" w:hAnsi="Calibri" w:eastAsia="Yu Mincho"/>
         </w:rPr>
-        <w:t>利用者登録はCSVで一括処理でき、権限はテンプレート、Bundle、別ユーザーからのコピーにより反復入力を減らす。図6には共有、許可サブパス、操作種別が読み取れるユーザー権限管理画面を配置する。これらはPANDAで分散していた管理作業を一つの管理面へ集約するための設計である。</w:t>
+        <w:t>中央サーバー側では、まずAuditLogへ直接保存し、保存できない場合はAuditOutboxEntryへ退避する。outbox dispatcherは未処理項目を後からAuditLogへ反映し、EventIdの一意制約で重複を抑える。outboxへの保存も難しい場合は構造化ログへ退避する。Agent側にもPendingLogsと中央へのバッチ同期処理を設け、中央停止後に保持した操作ログを復旧後に送信する。これにより、操作記録の連続性を保ちながら、検索・CSV出力まで一貫して扱える。</w:t>
+      </w:r>
+    </w:p>
+    <w:p>
+      <w:pPr>
+        <w:pStyle w:val="Heading2"/>
+      </w:pPr>
+      <w:r>
+        <w:rPr>
+          <w:rFonts w:ascii="Calibri" w:hAnsi="Calibri" w:eastAsia="Yu Gothic"/>
+        </w:rPr>
+        <w:t>4.6 クライアントと管理運用</w:t>
+      </w:r>
+    </w:p>
+    <w:p>
+      <w:r>
+        <w:rPr>
+          <w:rFonts w:ascii="Calibri" w:hAnsi="Calibri" w:eastAsia="Yu Mincho"/>
+        </w:rPr>
+        <w:t>クライアントは左にローカル、右にリモートを表示する二ペインUIを採用する。利用者はエクスプローラーに近い操作でファイルを選び、転送キューで進捗、一時停止、再開、取消、競合を確認できる。一般利用者には管理機能を表示せず、管理者は同じアプリからユーザー、ホスト、共有、権限、テンプレート、Bundle、ノード、信頼端末、操作ログ、システム設定を管理する。図6には二ペインと転送キューを同時に確認できる画面例を配置する。</w:t>
       </w:r>
     </w:p>
     <w:p>
@@ -2611,7 +2729,7 @@
         <w:drawing>
           <wp:inline xmlns:a="http://schemas.openxmlformats.org/drawingml/2006/main" xmlns:pic="http://schemas.openxmlformats.org/drawingml/2006/picture">
             <wp:extent cx="5623560" cy="3161690"/>
-            <wp:docPr id="6" name="Picture 6" descr="Watashiのユーザー権限管理画面のスクリーンショットを後から挿入するためのプレースホルダー"/>
+            <wp:docPr id="6" name="Picture 6" descr="Watashiクライアントの二ペイン表示と転送キューのスクリーンショットを後から挿入するためのプレースホルダー"/>
             <wp:cNvGraphicFramePr>
               <a:graphicFrameLocks noChangeAspect="1"/>
             </wp:cNvGraphicFramePr>
@@ -2619,7 +2737,7 @@
               <a:graphicData uri="http://schemas.openxmlformats.org/drawingml/2006/picture">
                 <pic:pic>
                   <pic:nvPicPr>
-                    <pic:cNvPr id="0" name="placeholder-watashi-admin.png"/>
+                    <pic:cNvPr id="0" name="placeholder-watashi-client.png"/>
                     <pic:cNvPicPr/>
                   </pic:nvPicPr>
                   <pic:blipFill>
@@ -2661,7 +2779,78 @@
           <w:rFonts w:ascii="Calibri" w:hAnsi="Calibri" w:eastAsia="Yu Mincho"/>
           <w:sz w:val="19"/>
         </w:rPr>
-        <w:t>図6 Watashiのユーザー権限管理画面（スクリーンショット差し替え欄）</w:t>
+        <w:t>図6 Watashiの二ペイン表示と転送キュー（スクリーンショット差し替え欄）</w:t>
+      </w:r>
+    </w:p>
+    <w:p>
+      <w:r>
+        <w:rPr>
+          <w:rFonts w:ascii="Calibri" w:hAnsi="Calibri" w:eastAsia="Yu Mincho"/>
+        </w:rPr>
+        <w:t>利用者登録はCSVで一括処理でき、権限はテンプレート、Bundle、別ユーザーからのコピーにより反復入力を減らす。図7には共有、許可サブパス、操作種別が読み取れるユーザー権限管理画面を配置する。これらはPANDAで分散していた管理作業を一つの管理面へ集約するための設計である。</w:t>
+      </w:r>
+    </w:p>
+    <w:p>
+      <w:pPr>
+        <w:keepNext/>
+        <w:spacing w:before="120" w:after="40"/>
+        <w:jc w:val="center"/>
+      </w:pPr>
+      <w:r>
+        <w:drawing>
+          <wp:inline xmlns:a="http://schemas.openxmlformats.org/drawingml/2006/main" xmlns:pic="http://schemas.openxmlformats.org/drawingml/2006/picture">
+            <wp:extent cx="5623560" cy="3161690"/>
+            <wp:docPr id="7" name="Picture 7" descr="Watashiのユーザー権限管理画面のスクリーンショットを後から挿入するためのプレースホルダー"/>
+            <wp:cNvGraphicFramePr>
+              <a:graphicFrameLocks noChangeAspect="1"/>
+            </wp:cNvGraphicFramePr>
+            <a:graphic>
+              <a:graphicData uri="http://schemas.openxmlformats.org/drawingml/2006/picture">
+                <pic:pic>
+                  <pic:nvPicPr>
+                    <pic:cNvPr id="0" name="placeholder-watashi-admin.png"/>
+                    <pic:cNvPicPr/>
+                  </pic:nvPicPr>
+                  <pic:blipFill>
+                    <a:blip r:embed="rId23">
+                      <a:extLst>
+                        <a:ext uri="{96DAC541-7B7A-43D3-8B79-37D633B846F1}">
+                          <asvg:svgBlip xmlns:asvg="http://schemas.microsoft.com/office/drawing/2016/SVG/main" r:embed="rId24"/>
+                        </a:ext>
+                      </a:extLst>
+                    </a:blip>
+                    <a:stretch>
+                      <a:fillRect/>
+                    </a:stretch>
+                  </pic:blipFill>
+                  <pic:spPr>
+                    <a:xfrm>
+                      <a:off x="0" y="0"/>
+                      <a:ext cx="5623560" cy="3161690"/>
+                    </a:xfrm>
+                    <a:prstGeom prst="rect"/>
+                  </pic:spPr>
+                </pic:pic>
+              </a:graphicData>
+            </a:graphic>
+          </wp:inline>
+        </w:drawing>
+      </w:r>
+    </w:p>
+    <w:p>
+      <w:pPr>
+        <w:pStyle w:val="Caption"/>
+        <w:keepNext w:val="0"/>
+        <w:keepLines/>
+        <w:spacing w:after="160"/>
+        <w:jc w:val="center"/>
+      </w:pPr>
+      <w:r>
+        <w:rPr>
+          <w:rFonts w:ascii="Calibri" w:hAnsi="Calibri" w:eastAsia="Yu Mincho"/>
+          <w:sz w:val="19"/>
+        </w:rPr>
+        <w:t>図7 Watashiのユーザー権限管理画面（スクリーンショット差し替え欄）</w:t>
       </w:r>
     </w:p>
     <w:p>
@@ -2684,7 +2873,7 @@
         <w:rPr>
           <w:rFonts w:ascii="Calibri" w:hAnsi="Calibri" w:eastAsia="Yu Mincho"/>
         </w:rPr>
-        <w:t>で配布時に固定し、利用者設定へ保存しない。ClickOnceのdeployment manifestは配布するバージョンとapplication manifestを参照する[E7]。Watashiは起動時に更新確認を行い、ServerとAgentはWindows Serviceとして常駐する。中央DBはSQLiteであり、バックアップコマンドは一時ファイルへ取得してから正式名へ切り替える。バックアップは定期取得と復元手順を運用に組み込み、導入時のDB専門知識を抑える。</w:t>
+        <w:t>で配布時に固定し、利用者設定へ保存しない。D&amp;Dを有効にした場合も、ローカルからリモートはアップロード、リモートからローカルはダウンロードとして常にCopy効果を用い、リモート項目を別リモートフォルダーへ落とすMove操作は受け付けない。外部エクスプローラーからのアップロードでは件数を示して確認する。利便性を残しながら、過去の誤移動を再発させないHuman Error（HE）対策である。ClickOnceのdeployment manifestは配布するバージョンとapplication manifestを参照する[E7]。Watashiは起動時に更新確認を行い、ServerとAgentはWindows Serviceとして常駐する。中央DBはSQLiteであり、バックアップコマンドは一時ファイルへ取得してから正式名へ切り替える。バックアップは定期取得と復元手順を運用に組み込み、導入時のDB専門知識を抑える。</w:t>
       </w:r>
     </w:p>
     <w:p>
@@ -4222,6 +4411,87 @@
                 <w:rFonts w:ascii="Calibri" w:hAnsi="Calibri" w:eastAsia="Yu Mincho"/>
                 <w:sz w:val="17"/>
               </w:rPr>
+              <w:t>誤移動防止</w:t>
+            </w:r>
+          </w:p>
+        </w:tc>
+        <w:tc>
+          <w:tcPr>
+            <w:tcW w:type="dxa" w:w="3630"/>
+            <w:tcMar>
+              <w:top w:w="80" w:type="dxa"/>
+              <w:start w:w="120" w:type="dxa"/>
+              <w:bottom w:w="80" w:type="dxa"/>
+              <w:end w:w="120" w:type="dxa"/>
+            </w:tcMar>
+            <w:vAlign w:val="center"/>
+          </w:tcPr>
+          <w:p>
+            <w:pPr>
+              <w:spacing w:after="30" w:line="252" w:lineRule="auto"/>
+              <w:jc w:val="left"/>
+            </w:pPr>
+            <w:r/>
+            <w:r>
+              <w:rPr>
+                <w:rFonts w:ascii="Calibri" w:hAnsi="Calibri" w:eastAsia="Yu Mincho"/>
+                <w:sz w:val="17"/>
+              </w:rPr>
+              <w:t>D&amp;DはCopy限定、RENAMEは同一親内、許可ルート保護</w:t>
+            </w:r>
+          </w:p>
+        </w:tc>
+        <w:tc>
+          <w:tcPr>
+            <w:tcW w:type="dxa" w:w="4030"/>
+            <w:tcMar>
+              <w:top w:w="80" w:type="dxa"/>
+              <w:start w:w="120" w:type="dxa"/>
+              <w:bottom w:w="80" w:type="dxa"/>
+              <w:end w:w="120" w:type="dxa"/>
+            </w:tcMar>
+            <w:vAlign w:val="center"/>
+          </w:tcPr>
+          <w:p>
+            <w:pPr>
+              <w:spacing w:after="30" w:line="252" w:lineRule="auto"/>
+              <w:jc w:val="left"/>
+            </w:pPr>
+            <w:r/>
+            <w:r>
+              <w:rPr>
+                <w:rFonts w:ascii="Calibri" w:hAnsi="Calibri" w:eastAsia="Yu Mincho"/>
+                <w:sz w:val="17"/>
+              </w:rPr>
+              <w:t>過去の別フォルダー誤移動を操作仕様で再発防止する</w:t>
+            </w:r>
+          </w:p>
+        </w:tc>
+      </w:tr>
+      <w:tr>
+        <w:tc>
+          <w:tcPr>
+            <w:tcW w:type="dxa" w:w="1700"/>
+            <w:shd w:fill="FAFBFC"/>
+            <w:tcMar>
+              <w:top w:w="80" w:type="dxa"/>
+              <w:start w:w="120" w:type="dxa"/>
+              <w:bottom w:w="80" w:type="dxa"/>
+              <w:end w:w="120" w:type="dxa"/>
+            </w:tcMar>
+            <w:vAlign w:val="center"/>
+          </w:tcPr>
+          <w:p>
+            <w:pPr>
+              <w:spacing w:after="30" w:line="252" w:lineRule="auto"/>
+              <w:jc w:val="left"/>
+            </w:pPr>
+            <w:r/>
+            <w:r>
+              <w:rPr>
+                <w:rFonts w:ascii="Calibri" w:hAnsi="Calibri" w:eastAsia="Yu Mincho"/>
+                <w:sz w:val="17"/>
+              </w:rPr>
               <w:t>配布・更新</w:t>
             </w:r>
           </w:p>
@@ -4229,6 +4499,7 @@
         <w:tc>
           <w:tcPr>
             <w:tcW w:type="dxa" w:w="3630"/>
+            <w:shd w:fill="FAFBFC"/>
             <w:tcMar>
               <w:top w:w="80" w:type="dxa"/>
               <w:start w:w="120" w:type="dxa"/>
@@ -4255,6 +4526,7 @@
         <w:tc>
           <w:tcPr>
             <w:tcW w:type="dxa" w:w="4030"/>
+            <w:shd w:fill="FAFBFC"/>
             <w:tcMar>
               <w:top w:w="80" w:type="dxa"/>
               <w:start w:w="120" w:type="dxa"/>
@@ -4283,7 +4555,6 @@
         <w:tc>
           <w:tcPr>
             <w:tcW w:type="dxa" w:w="1700"/>
-            <w:shd w:fill="FAFBFC"/>
             <w:tcMar>
               <w:top w:w="80" w:type="dxa"/>
               <w:start w:w="120" w:type="dxa"/>
@@ -4310,7 +4581,6 @@
         <w:tc>
           <w:tcPr>
             <w:tcW w:type="dxa" w:w="3630"/>
-            <w:shd w:fill="FAFBFC"/>
             <w:tcMar>
               <w:top w:w="80" w:type="dxa"/>
               <w:start w:w="120" w:type="dxa"/>
@@ -4337,7 +4607,6 @@
         <w:tc>
           <w:tcPr>
             <w:tcW w:type="dxa" w:w="4030"/>
-            <w:shd w:fill="FAFBFC"/>
             <w:tcMar>
               <w:top w:w="80" w:type="dxa"/>
               <w:start w:w="120" w:type="dxa"/>
@@ -4395,7 +4664,7 @@
         <w:rPr>
           <w:rFonts w:ascii="Calibri" w:hAnsi="Calibri" w:eastAsia="Yu Mincho"/>
         </w:rPr>
-        <w:t>RQ1は達成した。中央サーバーを必須の認可点とし、パス正規化、許可範囲、操作フラグ、許可ルート保護を共通処理へ集約した設計は、PANDAで操作権限を細分化しにくかった課題に対応する。ユーザー、共有、サブパス、操作の組合せを扱い、Bundleとテンプレートで設定負荷を緩和した。</w:t>
+        <w:t>RQ1は達成した。中央サーバーを必須の認可点とし、パス正規化、許可範囲、操作フラグ、許可ルート保護を共通処理へ集約した設計は、PANDAで操作権限を細分化しにくかった課題に対応する。ユーザー、共有、サブパス、操作の組合せを扱うため、同じ共有の中でも利用者とフォルダーに応じて読取・書込・削除・改名を変えられる。Bundleとテンプレートで設定負荷を緩和した。</w:t>
       </w:r>
     </w:p>
     <w:p>
@@ -4599,7 +4868,7 @@
         <w:rPr>
           <w:rFonts w:ascii="Calibri" w:hAnsi="Calibri" w:eastAsia="Yu Mincho"/>
         </w:rPr>
-        <w:t>Watashiは、PANDAが備えていた個別パス指定、踏み台接続、ClickOnce配布・更新を継承しながら、利用者単位の細粒度権限、操作追跡、管理の一元化、DB導入負担の軽減を実現する設計へ発展させた。共有・サブパス・操作単位の認可、トークン失効、暗号化資格情報、Direct／Agent／Gateway、再開可能転送、監査記録の失敗時outbox、管理GUI、CSV、ClickOnce、Windows Serviceが実装されている。2026年8月31日のビルドは警告・エラーなく完了し、自動テスト704件がすべて合格した。</w:t>
+        <w:t>Watashiは、PANDAが備えていた個別パス指定、踏み台接続、ClickOnce配布・更新を継承しながら、ユーザー・フォルダー・操作単位の細粒度権限、操作追跡、管理の一元化、DB導入負担の軽減を実現する設計へ発展させた。さらに、初回パスワードをWindows認証で本人が設定する経路と、D&amp;DをCopyに限定してフォルダー間Moveを防ぐHuman Error（HE）対策を組み込んだ。共有・サブパス・操作単位の認可、トークン失効、暗号化資格情報、Direct／Agent／Gateway、再開可能転送、監査記録の失敗時outbox、管理GUI、CSV、ClickOnce、Windows Serviceが実装されている。2026年8月31日のビルドは警告・エラーなく完了し、自動テスト704件がすべて合格した。</w:t>
       </w:r>
     </w:p>
     <w:p>

</xml_diff>

<commit_message>
docs: expand Windows authentication and HE safeguards (#130)
</commit_message>
<xml_diff>
--- a/docs/report/output/Watashi_技術レポート.docx
+++ b/docs/report/output/Watashi_技術レポート.docx
@@ -145,7 +145,7 @@
         <w:rPr>
           <w:rFonts w:ascii="Calibri" w:hAnsi="Calibri" w:eastAsia="Yu Mincho"/>
         </w:rPr>
-        <w:t>WatashiはWindows Presentation Foundation（WPF）クライアント、中央サーバー、共有ライブラリ、必要に応じて隔離ネットワークへ到達するAgentから構成される。中央サーバーは利用者認証、共有・サブパス・操作種別単位の認可、暗号化されたSMB資格情報の保持、操作監査を担う。ファイル操作は中央サーバーから直接SMBへ接続するDirect経路、Agentを一台介する経路、Agentを二段に連ねる一段Gateway経路のいずれかへ振り分ける。転送はセッション、オフセット、チャンクおよびファイル全体のハッシュを用いて再開と完全性確認を行う。</w:t>
+        <w:t>WatashiはWindows Presentation Foundation（WPF）クライアント、中央サーバー、共有ライブラリ、必要に応じて隔離ネットワークへ到達するAgentから構成される。中央サーバーは利用者認証、ユーザー・共有・サブパス・操作種別を組み合わせた認可、暗号化されたSMB資格情報の保持、操作監査を担う。ファイル操作は中央サーバーから直接SMBへ接続するDirect経路、Agentを一台介する経路、Agentを二段に連ねる一段Gateway経路のいずれかへ振り分ける。転送はセッション、オフセット、チャンクおよびファイル全体のハッシュを用いて再開と完全性確認を行う。</w:t>
       </w:r>
     </w:p>
     <w:p>
@@ -325,7 +325,7 @@
           <w:rFonts w:ascii="Calibri" w:hAnsi="Calibri" w:eastAsia="Yu Gothic"/>
           <w:sz w:val="21"/>
         </w:rPr>
-        <w:t>17</w:t>
+        <w:t>19</w:t>
       </w:r>
     </w:p>
     <w:p>
@@ -354,7 +354,7 @@
           <w:rFonts w:ascii="Calibri" w:hAnsi="Calibri" w:eastAsia="Yu Gothic"/>
           <w:sz w:val="21"/>
         </w:rPr>
-        <w:t>19</w:t>
+        <w:t>20</w:t>
       </w:r>
     </w:p>
     <w:p>
@@ -383,7 +383,7 @@
           <w:rFonts w:ascii="Calibri" w:hAnsi="Calibri" w:eastAsia="Yu Gothic"/>
           <w:sz w:val="21"/>
         </w:rPr>
-        <w:t>21</w:t>
+        <w:t>23</w:t>
       </w:r>
     </w:p>
     <w:p>
@@ -412,7 +412,7 @@
           <w:rFonts w:ascii="Calibri" w:hAnsi="Calibri" w:eastAsia="Yu Gothic"/>
           <w:sz w:val="21"/>
         </w:rPr>
-        <w:t>23</w:t>
+        <w:t>25</w:t>
       </w:r>
     </w:p>
     <w:p>
@@ -441,7 +441,7 @@
           <w:rFonts w:ascii="Calibri" w:hAnsi="Calibri" w:eastAsia="Yu Gothic"/>
           <w:sz w:val="21"/>
         </w:rPr>
-        <w:t>24</w:t>
+        <w:t>26</w:t>
       </w:r>
     </w:p>
     <w:p>
@@ -470,7 +470,7 @@
           <w:rFonts w:ascii="Calibri" w:hAnsi="Calibri" w:eastAsia="Yu Gothic"/>
           <w:sz w:val="21"/>
         </w:rPr>
-        <w:t>26</w:t>
+        <w:t>28</w:t>
       </w:r>
     </w:p>
     <w:p>
@@ -499,7 +499,7 @@
           <w:rFonts w:ascii="Calibri" w:hAnsi="Calibri" w:eastAsia="Yu Gothic"/>
           <w:sz w:val="21"/>
         </w:rPr>
-        <w:t>27</w:t>
+        <w:t>29</w:t>
       </w:r>
       <w:r>
         <w:fldChar w:fldCharType="end"/>
@@ -1331,7 +1331,7 @@
                 <w:rFonts w:ascii="Calibri" w:hAnsi="Calibri" w:eastAsia="Yu Mincho"/>
                 <w:sz w:val="17"/>
               </w:rPr>
-              <w:t>踏み台経由の接続は可能だが、経路設定や接続先管理が分散している</w:t>
+              <w:t>ドラッグ&amp;ドロップで別フォルダーへ誤移動した運用事例</w:t>
             </w:r>
           </w:p>
         </w:tc>
@@ -1358,6 +1358,87 @@
                 <w:rFonts w:ascii="Calibri" w:hAnsi="Calibri" w:eastAsia="Yu Mincho"/>
                 <w:sz w:val="17"/>
               </w:rPr>
+              <w:t>D&amp;Dを転送専用のCopy操作とし、フォルダーを跨ぐMoveを提供しない</w:t>
+            </w:r>
+          </w:p>
+        </w:tc>
+        <w:tc>
+          <w:tcPr>
+            <w:tcW w:type="dxa" w:w="4030"/>
+            <w:shd w:fill="FAFBFC"/>
+            <w:tcMar>
+              <w:top w:w="80" w:type="dxa"/>
+              <w:start w:w="120" w:type="dxa"/>
+              <w:bottom w:w="80" w:type="dxa"/>
+              <w:end w:w="120" w:type="dxa"/>
+            </w:tcMar>
+            <w:vAlign w:val="center"/>
+          </w:tcPr>
+          <w:p>
+            <w:pPr>
+              <w:spacing w:after="30" w:line="252" w:lineRule="auto"/>
+              <w:jc w:val="left"/>
+            </w:pPr>
+            <w:r/>
+            <w:r>
+              <w:rPr>
+                <w:rFonts w:ascii="Calibri" w:hAnsi="Calibri" w:eastAsia="Yu Mincho"/>
+                <w:sz w:val="17"/>
+              </w:rPr>
+              <w:t>D&amp;D実装、同一親RENAME制約、手動検証</w:t>
+            </w:r>
+          </w:p>
+        </w:tc>
+      </w:tr>
+      <w:tr>
+        <w:tc>
+          <w:tcPr>
+            <w:tcW w:type="dxa" w:w="1700"/>
+            <w:tcMar>
+              <w:top w:w="80" w:type="dxa"/>
+              <w:start w:w="120" w:type="dxa"/>
+              <w:bottom w:w="80" w:type="dxa"/>
+              <w:end w:w="120" w:type="dxa"/>
+            </w:tcMar>
+            <w:vAlign w:val="center"/>
+          </w:tcPr>
+          <w:p>
+            <w:pPr>
+              <w:spacing w:after="30" w:line="252" w:lineRule="auto"/>
+              <w:jc w:val="left"/>
+            </w:pPr>
+            <w:r/>
+            <w:r>
+              <w:rPr>
+                <w:rFonts w:ascii="Calibri" w:hAnsi="Calibri" w:eastAsia="Yu Mincho"/>
+                <w:sz w:val="17"/>
+              </w:rPr>
+              <w:t>踏み台経由の接続は可能だが、経路設定や接続先管理が分散している</w:t>
+            </w:r>
+          </w:p>
+        </w:tc>
+        <w:tc>
+          <w:tcPr>
+            <w:tcW w:type="dxa" w:w="3630"/>
+            <w:tcMar>
+              <w:top w:w="80" w:type="dxa"/>
+              <w:start w:w="120" w:type="dxa"/>
+              <w:bottom w:w="80" w:type="dxa"/>
+              <w:end w:w="120" w:type="dxa"/>
+            </w:tcMar>
+            <w:vAlign w:val="center"/>
+          </w:tcPr>
+          <w:p>
+            <w:pPr>
+              <w:spacing w:after="30" w:line="252" w:lineRule="auto"/>
+              <w:jc w:val="left"/>
+            </w:pPr>
+            <w:r/>
+            <w:r>
+              <w:rPr>
+                <w:rFonts w:ascii="Calibri" w:hAnsi="Calibri" w:eastAsia="Yu Mincho"/>
+                <w:sz w:val="17"/>
+              </w:rPr>
               <w:t>Direct／Agent／Gatewayを中央で一元管理する</w:t>
             </w:r>
           </w:p>
@@ -1365,7 +1446,6 @@
         <w:tc>
           <w:tcPr>
             <w:tcW w:type="dxa" w:w="4030"/>
-            <w:shd w:fill="FAFBFC"/>
             <w:tcMar>
               <w:top w:w="80" w:type="dxa"/>
               <w:start w:w="120" w:type="dxa"/>
@@ -1394,6 +1474,7 @@
         <w:tc>
           <w:tcPr>
             <w:tcW w:type="dxa" w:w="1700"/>
+            <w:shd w:fill="FAFBFC"/>
             <w:tcMar>
               <w:top w:w="80" w:type="dxa"/>
               <w:start w:w="120" w:type="dxa"/>
@@ -1420,6 +1501,7 @@
         <w:tc>
           <w:tcPr>
             <w:tcW w:type="dxa" w:w="3630"/>
+            <w:shd w:fill="FAFBFC"/>
             <w:tcMar>
               <w:top w:w="80" w:type="dxa"/>
               <w:start w:w="120" w:type="dxa"/>
@@ -1446,6 +1528,7 @@
         <w:tc>
           <w:tcPr>
             <w:tcW w:type="dxa" w:w="4030"/>
+            <w:shd w:fill="FAFBFC"/>
             <w:tcMar>
               <w:top w:w="80" w:type="dxa"/>
               <w:start w:w="120" w:type="dxa"/>
@@ -1474,7 +1557,6 @@
         <w:tc>
           <w:tcPr>
             <w:tcW w:type="dxa" w:w="1700"/>
-            <w:shd w:fill="FAFBFC"/>
             <w:tcMar>
               <w:top w:w="80" w:type="dxa"/>
               <w:start w:w="120" w:type="dxa"/>
@@ -1501,7 +1583,6 @@
         <w:tc>
           <w:tcPr>
             <w:tcW w:type="dxa" w:w="3630"/>
-            <w:shd w:fill="FAFBFC"/>
             <w:tcMar>
               <w:top w:w="80" w:type="dxa"/>
               <w:start w:w="120" w:type="dxa"/>
@@ -1528,7 +1609,6 @@
         <w:tc>
           <w:tcPr>
             <w:tcW w:type="dxa" w:w="4030"/>
-            <w:shd w:fill="FAFBFC"/>
             <w:tcMar>
               <w:top w:w="80" w:type="dxa"/>
               <w:start w:w="120" w:type="dxa"/>
@@ -1696,7 +1776,7 @@
         <w:rPr>
           <w:rFonts w:ascii="Calibri" w:hAnsi="Calibri" w:eastAsia="Yu Mincho"/>
         </w:rPr>
-        <w:t>で配布時に固定する方式へ変更した[I4]。これは柔軟性よりも、利用者が誤った中央サーバーへ接続できないガバナンスを優先した判断である。</w:t>
+        <w:t>で配布時に固定する方式へ変更した[I4]。これは柔軟性よりも、利用者が誤った中央サーバーへ接続できないガバナンスを優先した判断である。また、過去にファイルを別フォルダーへ誤ってドラッグ&amp;ドロップした事例を、単なる注意喚起ではなく操作仕様へ反映した。WatashiのD&amp;DはアップロードまたはダウンロードのCopyに限定し、リモート内のフォルダー間Moveを成立させない。</w:t>
       </w:r>
     </w:p>
     <w:p>
@@ -2065,7 +2145,15 @@
         <w:rPr>
           <w:rFonts w:ascii="Calibri" w:hAnsi="Calibri" w:eastAsia="Yu Mincho"/>
         </w:rPr>
-        <w:t>初回パスワード設定では、Windows統合認証で得たOSアカウントとWatashiユーザー名を照合する。ASP.NET CoreのWindows認証は、IISまたはKestrelのNegotiateハンドラーで構成でき、ドメイン内イントラネットに適する[E5]。WatashiはIIS、Negotiate、無効の各モードを持ち、OSが認証した</w:t>
+        <w:t>初回パスワード設定は、管理者が利用者の初期パスワードを知り、別経路で配布する作業を減らすために設計した。管理者がユーザーを登録すると、アカウントは「初回設定待ち」となり、通常ログインと自動ログインを受け付けない。利用者はクライアントでGIDを入力し、IISまたはKestrelのNegotiateハンドラーがKerberos／NTLMで認証したWindowsログオン名をサーバーへ渡す。クライアントから自己申告されたWindows名を本人性の根拠にはしない。ASP.NET CoreのWindows認証は、ドメイン内イントラネットに適する[E5]。</w:t>
+      </w:r>
+    </w:p>
+    <w:p>
+      <w:r>
+        <w:rPr>
+          <w:rFonts w:ascii="Calibri" w:hAnsi="Calibri" w:eastAsia="Yu Mincho"/>
+        </w:rPr>
+        <w:t>サーバーは</w:t>
       </w:r>
       <w:r>
         <w:rPr>
@@ -2110,7 +2198,78 @@
         <w:rPr>
           <w:rFonts w:ascii="Calibri" w:hAnsi="Calibri" w:eastAsia="Yu Mincho"/>
         </w:rPr>
-        <w:t>を正規化する。ユーザー列挙を避けるため、本人確認できた初回設定待ちユーザー以外には共通のパスワード入力経路を返す。Windows認証を利用できない端末向けには、管理者が一時パスワードを発行し、初回変更を強制する第二経路を残す。</w:t>
+        <w:t>の形式を分解し、アカウント名をWatashiのユーザー名と大文字小文字を区別せず照合する。単一ドメインを前提にドメイン部を無視する方式と、許可ドメイン一覧への一致を必須にする方式を選べる。後者ではドメイン不明、空の許可一覧、未知の設定値を安全側で拒否する。本人一致、初回設定待ち、無効・ロック状態、受付期限を満たした場合だけ設定画面へ進み、パスワードポリシーを満たす値を一度だけ確定して、そのまま通常のトークンを発行する。二重送信でも確定は一回だけであり、成功時には認証済みWindowsアカウント名を本人確認記録として残す。</w:t>
+      </w:r>
+    </w:p>
+    <w:p>
+      <w:r>
+        <w:rPr>
+          <w:rFonts w:ascii="Calibri" w:hAnsi="Calibri" w:eastAsia="Yu Mincho"/>
+        </w:rPr>
+        <w:t>図4に初回設定の判断順序を示す。本人確認できた初回設定待ちユーザー以外は、不明なIDや設定済みユーザーを含めて同じパスワード入力経路へ戻し、アカウントの存在や状態を推測しにくくする。Windows認証を利用できない端末や共用PC、許可ドメイン間で同一GIDが重複し得る環境では、管理者が一時パスワードを発行し、初回変更を強制する第二経路を用いる。この二経路により、初期パスワードの配布を原則不要にしつつ、Windows認証を利用できない環境も排除しない。</w:t>
+      </w:r>
+    </w:p>
+    <w:p>
+      <w:pPr>
+        <w:keepNext/>
+        <w:spacing w:before="120" w:after="40"/>
+        <w:jc w:val="center"/>
+      </w:pPr>
+      <w:r>
+        <w:drawing>
+          <wp:inline xmlns:a="http://schemas.openxmlformats.org/drawingml/2006/main" xmlns:pic="http://schemas.openxmlformats.org/drawingml/2006/picture">
+            <wp:extent cx="5623560" cy="2967990"/>
+            <wp:docPr id="4" name="Picture 4" descr="GID入力、Windows認証、本人照合、初回設定待ち状態の確認、本人によるパスワード設定と代替経路を示すフロー"/>
+            <wp:cNvGraphicFramePr>
+              <a:graphicFrameLocks noChangeAspect="1"/>
+            </wp:cNvGraphicFramePr>
+            <a:graphic>
+              <a:graphicData uri="http://schemas.openxmlformats.org/drawingml/2006/picture">
+                <pic:pic>
+                  <pic:nvPicPr>
+                    <pic:cNvPr id="0" name="windows-first-setup.png"/>
+                    <pic:cNvPicPr/>
+                  </pic:nvPicPr>
+                  <pic:blipFill>
+                    <a:blip r:embed="rId17">
+                      <a:extLst>
+                        <a:ext uri="{96DAC541-7B7A-43D3-8B79-37D633B846F1}">
+                          <asvg:svgBlip xmlns:asvg="http://schemas.microsoft.com/office/drawing/2016/SVG/main" r:embed="rId18"/>
+                        </a:ext>
+                      </a:extLst>
+                    </a:blip>
+                    <a:stretch>
+                      <a:fillRect/>
+                    </a:stretch>
+                  </pic:blipFill>
+                  <pic:spPr>
+                    <a:xfrm>
+                      <a:off x="0" y="0"/>
+                      <a:ext cx="5623560" cy="2967990"/>
+                    </a:xfrm>
+                    <a:prstGeom prst="rect"/>
+                  </pic:spPr>
+                </pic:pic>
+              </a:graphicData>
+            </a:graphic>
+          </wp:inline>
+        </w:drawing>
+      </w:r>
+    </w:p>
+    <w:p>
+      <w:pPr>
+        <w:pStyle w:val="Caption"/>
+        <w:keepNext w:val="0"/>
+        <w:keepLines/>
+        <w:spacing w:after="160"/>
+        <w:jc w:val="center"/>
+      </w:pPr>
+      <w:r>
+        <w:rPr>
+          <w:rFonts w:ascii="Calibri" w:hAnsi="Calibri" w:eastAsia="Yu Mincho"/>
+          <w:sz w:val="19"/>
+        </w:rPr>
+        <w:t>図4 初回Windowsユーザー認証とパスワード設定の流れ</w:t>
       </w:r>
     </w:p>
     <w:p>
@@ -2129,7 +2288,37 @@
         <w:rPr>
           <w:rFonts w:ascii="Calibri" w:hAnsi="Calibri" w:eastAsia="Yu Mincho"/>
         </w:rPr>
-        <w:t>権限はユーザー、共有、許可サブパス、権限テンプレートの組合せで表す。テンプレートは読取、書込、削除、改名のフラグを持ち、API操作のLIST、DOWNLOAD、UPLOAD、MKDIRなどへ対応付ける。一人の利用者が同じ共有内に複数の許可ルートを持つことができる。部署や職務ごとの複数権限はPermissionBundleとしてまとめ、利用者へ展開する。適用後は個別権限として残るため、Bundleを削除しても既存利用者の権限が突然消えない。</w:t>
+        <w:t>権限はユーザー、共有、許可サブパス、権限テンプレートの組合せで表す。テンプレートは読取、書込、削除、改名のフラグを持ち、API操作のLIST、DOWNLOAD、UPLOAD、MKDIRなどへ対応付ける。したがって、同じ共有でも、利用者Aには</w:t>
+      </w:r>
+      <w:r>
+        <w:rPr>
+          <w:rFonts w:ascii="Consolas" w:hAnsi="Consolas"/>
+          <w:color w:val="1F4D78"/>
+          <w:sz w:val="21"/>
+          <w:shd w:fill="EEF2F6"/>
+        </w:rPr>
+        <w:t>/営業/東日本</w:t>
+      </w:r>
+      <w:r>
+        <w:rPr>
+          <w:rFonts w:ascii="Calibri" w:hAnsi="Calibri" w:eastAsia="Yu Mincho"/>
+        </w:rPr>
+        <w:t>を読取・書込、利用者Bには</w:t>
+      </w:r>
+      <w:r>
+        <w:rPr>
+          <w:rFonts w:ascii="Consolas" w:hAnsi="Consolas"/>
+          <w:color w:val="1F4D78"/>
+          <w:sz w:val="21"/>
+          <w:shd w:fill="EEF2F6"/>
+        </w:rPr>
+        <w:t>/営業/西日本</w:t>
+      </w:r>
+      <w:r>
+        <w:rPr>
+          <w:rFonts w:ascii="Calibri" w:hAnsi="Calibri" w:eastAsia="Yu Mincho"/>
+        </w:rPr>
+        <w:t>を読取のみ、といったユーザーごと・フォルダーごとの設定ができる。一人の利用者が同じ共有内に複数の許可ルートを持つこともできる。部署や職務ごとの複数権限はPermissionBundleとしてまとめ、利用者へ展開する。適用後は個別権限として残るため、Bundleを削除しても既存利用者の権限が突然消えない。</w:t>
       </w:r>
     </w:p>
     <w:p>
@@ -2197,7 +2386,7 @@
         <w:rPr>
           <w:rFonts w:ascii="Calibri" w:hAnsi="Calibri" w:eastAsia="Yu Mincho"/>
         </w:rPr>
-        <w:t>を誤認するため、境界を考慮した包含判定が必要である。許可ルート自身のDELETE・RENAMEを禁止し、RENAMEは同一親内に限定することで、権限設定の根となるフォルダーの消失や、改名を利用した隠れた移動を防ぐ。拒否は403とし、denied結果も監査へ残す。</w:t>
+        <w:t>を誤認するため、境界を考慮した包含判定が必要である。許可ルート自身のDELETE・RENAMEを禁止し、RENAMEは同一親内に限定する。さらに改名先には書込権限も要求する。これにより、権限設定の根となるフォルダーの消失だけでなく、改名APIをMoveの代わりに使って別フォルダーへ移す誤操作もサーバー側で拒否する。拒否は403または入力不正として応答し、結果を監査へ残す。</w:t>
       </w:r>
     </w:p>
     <w:p>
@@ -2437,7 +2626,7 @@
         <w:rPr>
           <w:rFonts w:ascii="Calibri" w:hAnsi="Calibri" w:eastAsia="Yu Mincho"/>
         </w:rPr>
-        <w:t>、タブ、改行で始まる場合にシングルクォートを前置し、表計算ソフトで数式として評価される危険を低減する。図4には検索、結果確認、CSV出力を同時に確認できる画面例を配置する。</w:t>
+        <w:t>、タブ、改行で始まる場合にシングルクォートを前置し、表計算ソフトで数式として評価される危険を低減する。図5には検索、結果確認、CSV出力を同時に確認できる画面例を配置する。</w:t>
       </w:r>
     </w:p>
     <w:p>
@@ -2450,7 +2639,7 @@
         <w:drawing>
           <wp:inline xmlns:a="http://schemas.openxmlformats.org/drawingml/2006/main" xmlns:pic="http://schemas.openxmlformats.org/drawingml/2006/picture">
             <wp:extent cx="5623560" cy="3161690"/>
-            <wp:docPr id="4" name="Picture 4" descr="Watashiの操作ログ検索・結果確認・CSV出力画面のスクリーンショットを後から挿入するためのプレースホルダー"/>
+            <wp:docPr id="5" name="Picture 5" descr="Watashiの操作ログ検索・結果確認・CSV出力画面のスクリーンショットを後から挿入するためのプレースホルダー"/>
             <wp:cNvGraphicFramePr>
               <a:graphicFrameLocks noChangeAspect="1"/>
             </wp:cNvGraphicFramePr>
@@ -2459,96 +2648,6 @@
                 <pic:pic>
                   <pic:nvPicPr>
                     <pic:cNvPr id="0" name="placeholder-watashi-audit.png"/>
-                    <pic:cNvPicPr/>
-                  </pic:nvPicPr>
-                  <pic:blipFill>
-                    <a:blip r:embed="rId17">
-                      <a:extLst>
-                        <a:ext uri="{96DAC541-7B7A-43D3-8B79-37D633B846F1}">
-                          <asvg:svgBlip xmlns:asvg="http://schemas.microsoft.com/office/drawing/2016/SVG/main" r:embed="rId18"/>
-                        </a:ext>
-                      </a:extLst>
-                    </a:blip>
-                    <a:stretch>
-                      <a:fillRect/>
-                    </a:stretch>
-                  </pic:blipFill>
-                  <pic:spPr>
-                    <a:xfrm>
-                      <a:off x="0" y="0"/>
-                      <a:ext cx="5623560" cy="3161690"/>
-                    </a:xfrm>
-                    <a:prstGeom prst="rect"/>
-                  </pic:spPr>
-                </pic:pic>
-              </a:graphicData>
-            </a:graphic>
-          </wp:inline>
-        </w:drawing>
-      </w:r>
-    </w:p>
-    <w:p>
-      <w:pPr>
-        <w:pStyle w:val="Caption"/>
-        <w:keepNext w:val="0"/>
-        <w:keepLines/>
-        <w:spacing w:after="160"/>
-        <w:jc w:val="center"/>
-      </w:pPr>
-      <w:r>
-        <w:rPr>
-          <w:rFonts w:ascii="Calibri" w:hAnsi="Calibri" w:eastAsia="Yu Mincho"/>
-          <w:sz w:val="19"/>
-        </w:rPr>
-        <w:t>図4 Watashiの操作ログ検索・結果確認・CSV出力画面（スクリーンショット差し替え欄）</w:t>
-      </w:r>
-    </w:p>
-    <w:p>
-      <w:r>
-        <w:rPr>
-          <w:rFonts w:ascii="Calibri" w:hAnsi="Calibri" w:eastAsia="Yu Mincho"/>
-        </w:rPr>
-        <w:t>中央サーバー側では、まずAuditLogへ直接保存し、保存できない場合はAuditOutboxEntryへ退避する。outbox dispatcherは未処理項目を後からAuditLogへ反映し、EventIdの一意制約で重複を抑える。outboxへの保存も難しい場合は構造化ログへ退避する。Agent側にもPendingLogsと中央へのバッチ同期処理を設け、中央停止後に保持した操作ログを復旧後に送信する。これにより、操作記録の連続性を保ちながら、検索・CSV出力まで一貫して扱える。</w:t>
-      </w:r>
-    </w:p>
-    <w:p>
-      <w:pPr>
-        <w:pStyle w:val="Heading2"/>
-      </w:pPr>
-      <w:r>
-        <w:rPr>
-          <w:rFonts w:ascii="Calibri" w:hAnsi="Calibri" w:eastAsia="Yu Gothic"/>
-        </w:rPr>
-        <w:t>4.6 クライアントと管理運用</w:t>
-      </w:r>
-    </w:p>
-    <w:p>
-      <w:r>
-        <w:rPr>
-          <w:rFonts w:ascii="Calibri" w:hAnsi="Calibri" w:eastAsia="Yu Mincho"/>
-        </w:rPr>
-        <w:t>クライアントは左にローカル、右にリモートを表示する二ペインUIを採用する。利用者はエクスプローラーに近い操作でファイルを選び、転送キューで進捗、一時停止、再開、取消、競合を確認できる。一般利用者には管理機能を表示せず、管理者は同じアプリからユーザー、ホスト、共有、権限、テンプレート、Bundle、ノード、信頼端末、操作ログ、システム設定を管理する。図5には二ペインと転送キューを同時に確認できる画面例を配置する。</w:t>
-      </w:r>
-    </w:p>
-    <w:p>
-      <w:pPr>
-        <w:keepNext/>
-        <w:spacing w:before="120" w:after="40"/>
-        <w:jc w:val="center"/>
-      </w:pPr>
-      <w:r>
-        <w:drawing>
-          <wp:inline xmlns:a="http://schemas.openxmlformats.org/drawingml/2006/main" xmlns:pic="http://schemas.openxmlformats.org/drawingml/2006/picture">
-            <wp:extent cx="5623560" cy="3161690"/>
-            <wp:docPr id="5" name="Picture 5" descr="Watashiクライアントの二ペイン表示と転送キューのスクリーンショットを後から挿入するためのプレースホルダー"/>
-            <wp:cNvGraphicFramePr>
-              <a:graphicFrameLocks noChangeAspect="1"/>
-            </wp:cNvGraphicFramePr>
-            <a:graphic>
-              <a:graphicData uri="http://schemas.openxmlformats.org/drawingml/2006/picture">
-                <pic:pic>
-                  <pic:nvPicPr>
-                    <pic:cNvPr id="0" name="placeholder-watashi-client.png"/>
                     <pic:cNvPicPr/>
                   </pic:nvPicPr>
                   <pic:blipFill>
@@ -2590,7 +2689,7 @@
           <w:rFonts w:ascii="Calibri" w:hAnsi="Calibri" w:eastAsia="Yu Mincho"/>
           <w:sz w:val="19"/>
         </w:rPr>
-        <w:t>図5 Watashiの二ペイン表示と転送キュー（スクリーンショット差し替え欄）</w:t>
+        <w:t>図5 Watashiの操作ログ検索・結果確認・CSV出力画面（スクリーンショット差し替え欄）</w:t>
       </w:r>
     </w:p>
     <w:p>
@@ -2598,7 +2697,26 @@
         <w:rPr>
           <w:rFonts w:ascii="Calibri" w:hAnsi="Calibri" w:eastAsia="Yu Mincho"/>
         </w:rPr>
-        <w:t>利用者登録はCSVで一括処理でき、権限はテンプレート、Bundle、別ユーザーからのコピーにより反復入力を減らす。図6には共有、許可サブパス、操作種別が読み取れるユーザー権限管理画面を配置する。これらはPANDAで分散していた管理作業を一つの管理面へ集約するための設計である。</w:t>
+        <w:t>中央サーバー側では、まずAuditLogへ直接保存し、保存できない場合はAuditOutboxEntryへ退避する。outbox dispatcherは未処理項目を後からAuditLogへ反映し、EventIdの一意制約で重複を抑える。outboxへの保存も難しい場合は構造化ログへ退避する。Agent側にもPendingLogsと中央へのバッチ同期処理を設け、中央停止後に保持した操作ログを復旧後に送信する。これにより、操作記録の連続性を保ちながら、検索・CSV出力まで一貫して扱える。</w:t>
+      </w:r>
+    </w:p>
+    <w:p>
+      <w:pPr>
+        <w:pStyle w:val="Heading2"/>
+      </w:pPr>
+      <w:r>
+        <w:rPr>
+          <w:rFonts w:ascii="Calibri" w:hAnsi="Calibri" w:eastAsia="Yu Gothic"/>
+        </w:rPr>
+        <w:t>4.6 クライアントと管理運用</w:t>
+      </w:r>
+    </w:p>
+    <w:p>
+      <w:r>
+        <w:rPr>
+          <w:rFonts w:ascii="Calibri" w:hAnsi="Calibri" w:eastAsia="Yu Mincho"/>
+        </w:rPr>
+        <w:t>クライアントは左にローカル、右にリモートを表示する二ペインUIを採用する。利用者はエクスプローラーに近い操作でファイルを選び、転送キューで進捗、一時停止、再開、取消、競合を確認できる。一般利用者には管理機能を表示せず、管理者は同じアプリからユーザー、ホスト、共有、権限、テンプレート、Bundle、ノード、信頼端末、操作ログ、システム設定を管理する。図6には二ペインと転送キューを同時に確認できる画面例を配置する。</w:t>
       </w:r>
     </w:p>
     <w:p>
@@ -2611,7 +2729,7 @@
         <w:drawing>
           <wp:inline xmlns:a="http://schemas.openxmlformats.org/drawingml/2006/main" xmlns:pic="http://schemas.openxmlformats.org/drawingml/2006/picture">
             <wp:extent cx="5623560" cy="3161690"/>
-            <wp:docPr id="6" name="Picture 6" descr="Watashiのユーザー権限管理画面のスクリーンショットを後から挿入するためのプレースホルダー"/>
+            <wp:docPr id="6" name="Picture 6" descr="Watashiクライアントの二ペイン表示と転送キューのスクリーンショットを後から挿入するためのプレースホルダー"/>
             <wp:cNvGraphicFramePr>
               <a:graphicFrameLocks noChangeAspect="1"/>
             </wp:cNvGraphicFramePr>
@@ -2619,7 +2737,7 @@
               <a:graphicData uri="http://schemas.openxmlformats.org/drawingml/2006/picture">
                 <pic:pic>
                   <pic:nvPicPr>
-                    <pic:cNvPr id="0" name="placeholder-watashi-admin.png"/>
+                    <pic:cNvPr id="0" name="placeholder-watashi-client.png"/>
                     <pic:cNvPicPr/>
                   </pic:nvPicPr>
                   <pic:blipFill>
@@ -2661,7 +2779,78 @@
           <w:rFonts w:ascii="Calibri" w:hAnsi="Calibri" w:eastAsia="Yu Mincho"/>
           <w:sz w:val="19"/>
         </w:rPr>
-        <w:t>図6 Watashiのユーザー権限管理画面（スクリーンショット差し替え欄）</w:t>
+        <w:t>図6 Watashiの二ペイン表示と転送キュー（スクリーンショット差し替え欄）</w:t>
+      </w:r>
+    </w:p>
+    <w:p>
+      <w:r>
+        <w:rPr>
+          <w:rFonts w:ascii="Calibri" w:hAnsi="Calibri" w:eastAsia="Yu Mincho"/>
+        </w:rPr>
+        <w:t>利用者登録はCSVで一括処理でき、権限はテンプレート、Bundle、別ユーザーからのコピーにより反復入力を減らす。図7には共有、許可サブパス、操作種別が読み取れるユーザー権限管理画面を配置する。これらはPANDAで分散していた管理作業を一つの管理面へ集約するための設計である。</w:t>
+      </w:r>
+    </w:p>
+    <w:p>
+      <w:pPr>
+        <w:keepNext/>
+        <w:spacing w:before="120" w:after="40"/>
+        <w:jc w:val="center"/>
+      </w:pPr>
+      <w:r>
+        <w:drawing>
+          <wp:inline xmlns:a="http://schemas.openxmlformats.org/drawingml/2006/main" xmlns:pic="http://schemas.openxmlformats.org/drawingml/2006/picture">
+            <wp:extent cx="5623560" cy="3161690"/>
+            <wp:docPr id="7" name="Picture 7" descr="Watashiのユーザー権限管理画面のスクリーンショットを後から挿入するためのプレースホルダー"/>
+            <wp:cNvGraphicFramePr>
+              <a:graphicFrameLocks noChangeAspect="1"/>
+            </wp:cNvGraphicFramePr>
+            <a:graphic>
+              <a:graphicData uri="http://schemas.openxmlformats.org/drawingml/2006/picture">
+                <pic:pic>
+                  <pic:nvPicPr>
+                    <pic:cNvPr id="0" name="placeholder-watashi-admin.png"/>
+                    <pic:cNvPicPr/>
+                  </pic:nvPicPr>
+                  <pic:blipFill>
+                    <a:blip r:embed="rId23">
+                      <a:extLst>
+                        <a:ext uri="{96DAC541-7B7A-43D3-8B79-37D633B846F1}">
+                          <asvg:svgBlip xmlns:asvg="http://schemas.microsoft.com/office/drawing/2016/SVG/main" r:embed="rId24"/>
+                        </a:ext>
+                      </a:extLst>
+                    </a:blip>
+                    <a:stretch>
+                      <a:fillRect/>
+                    </a:stretch>
+                  </pic:blipFill>
+                  <pic:spPr>
+                    <a:xfrm>
+                      <a:off x="0" y="0"/>
+                      <a:ext cx="5623560" cy="3161690"/>
+                    </a:xfrm>
+                    <a:prstGeom prst="rect"/>
+                  </pic:spPr>
+                </pic:pic>
+              </a:graphicData>
+            </a:graphic>
+          </wp:inline>
+        </w:drawing>
+      </w:r>
+    </w:p>
+    <w:p>
+      <w:pPr>
+        <w:pStyle w:val="Caption"/>
+        <w:keepNext w:val="0"/>
+        <w:keepLines/>
+        <w:spacing w:after="160"/>
+        <w:jc w:val="center"/>
+      </w:pPr>
+      <w:r>
+        <w:rPr>
+          <w:rFonts w:ascii="Calibri" w:hAnsi="Calibri" w:eastAsia="Yu Mincho"/>
+          <w:sz w:val="19"/>
+        </w:rPr>
+        <w:t>図7 Watashiのユーザー権限管理画面（スクリーンショット差し替え欄）</w:t>
       </w:r>
     </w:p>
     <w:p>
@@ -2684,7 +2873,7 @@
         <w:rPr>
           <w:rFonts w:ascii="Calibri" w:hAnsi="Calibri" w:eastAsia="Yu Mincho"/>
         </w:rPr>
-        <w:t>で配布時に固定し、利用者設定へ保存しない。ClickOnceのdeployment manifestは配布するバージョンとapplication manifestを参照する[E7]。Watashiは起動時に更新確認を行い、ServerとAgentはWindows Serviceとして常駐する。中央DBはSQLiteであり、バックアップコマンドは一時ファイルへ取得してから正式名へ切り替える。バックアップは定期取得と復元手順を運用に組み込み、導入時のDB専門知識を抑える。</w:t>
+        <w:t>で配布時に固定し、利用者設定へ保存しない。D&amp;Dを有効にした場合も、ローカルからリモートはアップロード、リモートからローカルはダウンロードとして常にCopy効果を用い、リモート項目を別リモートフォルダーへ落とすMove操作は受け付けない。外部エクスプローラーからのアップロードでは件数を示して確認する。利便性を残しながら、過去の誤移動を再発させないHuman Error（HE）対策である。ClickOnceのdeployment manifestは配布するバージョンとapplication manifestを参照する[E7]。Watashiは起動時に更新確認を行い、ServerとAgentはWindows Serviceとして常駐する。中央DBはSQLiteであり、バックアップコマンドは一時ファイルへ取得してから正式名へ切り替える。バックアップは定期取得と復元手順を運用に組み込み、導入時のDB専門知識を抑える。</w:t>
       </w:r>
     </w:p>
     <w:p>
@@ -4222,6 +4411,87 @@
                 <w:rFonts w:ascii="Calibri" w:hAnsi="Calibri" w:eastAsia="Yu Mincho"/>
                 <w:sz w:val="17"/>
               </w:rPr>
+              <w:t>誤移動防止</w:t>
+            </w:r>
+          </w:p>
+        </w:tc>
+        <w:tc>
+          <w:tcPr>
+            <w:tcW w:type="dxa" w:w="3630"/>
+            <w:tcMar>
+              <w:top w:w="80" w:type="dxa"/>
+              <w:start w:w="120" w:type="dxa"/>
+              <w:bottom w:w="80" w:type="dxa"/>
+              <w:end w:w="120" w:type="dxa"/>
+            </w:tcMar>
+            <w:vAlign w:val="center"/>
+          </w:tcPr>
+          <w:p>
+            <w:pPr>
+              <w:spacing w:after="30" w:line="252" w:lineRule="auto"/>
+              <w:jc w:val="left"/>
+            </w:pPr>
+            <w:r/>
+            <w:r>
+              <w:rPr>
+                <w:rFonts w:ascii="Calibri" w:hAnsi="Calibri" w:eastAsia="Yu Mincho"/>
+                <w:sz w:val="17"/>
+              </w:rPr>
+              <w:t>D&amp;DはCopy限定、RENAMEは同一親内、許可ルート保護</w:t>
+            </w:r>
+          </w:p>
+        </w:tc>
+        <w:tc>
+          <w:tcPr>
+            <w:tcW w:type="dxa" w:w="4030"/>
+            <w:tcMar>
+              <w:top w:w="80" w:type="dxa"/>
+              <w:start w:w="120" w:type="dxa"/>
+              <w:bottom w:w="80" w:type="dxa"/>
+              <w:end w:w="120" w:type="dxa"/>
+            </w:tcMar>
+            <w:vAlign w:val="center"/>
+          </w:tcPr>
+          <w:p>
+            <w:pPr>
+              <w:spacing w:after="30" w:line="252" w:lineRule="auto"/>
+              <w:jc w:val="left"/>
+            </w:pPr>
+            <w:r/>
+            <w:r>
+              <w:rPr>
+                <w:rFonts w:ascii="Calibri" w:hAnsi="Calibri" w:eastAsia="Yu Mincho"/>
+                <w:sz w:val="17"/>
+              </w:rPr>
+              <w:t>過去の別フォルダー誤移動を操作仕様で再発防止する</w:t>
+            </w:r>
+          </w:p>
+        </w:tc>
+      </w:tr>
+      <w:tr>
+        <w:tc>
+          <w:tcPr>
+            <w:tcW w:type="dxa" w:w="1700"/>
+            <w:shd w:fill="FAFBFC"/>
+            <w:tcMar>
+              <w:top w:w="80" w:type="dxa"/>
+              <w:start w:w="120" w:type="dxa"/>
+              <w:bottom w:w="80" w:type="dxa"/>
+              <w:end w:w="120" w:type="dxa"/>
+            </w:tcMar>
+            <w:vAlign w:val="center"/>
+          </w:tcPr>
+          <w:p>
+            <w:pPr>
+              <w:spacing w:after="30" w:line="252" w:lineRule="auto"/>
+              <w:jc w:val="left"/>
+            </w:pPr>
+            <w:r/>
+            <w:r>
+              <w:rPr>
+                <w:rFonts w:ascii="Calibri" w:hAnsi="Calibri" w:eastAsia="Yu Mincho"/>
+                <w:sz w:val="17"/>
+              </w:rPr>
               <w:t>配布・更新</w:t>
             </w:r>
           </w:p>
@@ -4229,6 +4499,7 @@
         <w:tc>
           <w:tcPr>
             <w:tcW w:type="dxa" w:w="3630"/>
+            <w:shd w:fill="FAFBFC"/>
             <w:tcMar>
               <w:top w:w="80" w:type="dxa"/>
               <w:start w:w="120" w:type="dxa"/>
@@ -4255,6 +4526,7 @@
         <w:tc>
           <w:tcPr>
             <w:tcW w:type="dxa" w:w="4030"/>
+            <w:shd w:fill="FAFBFC"/>
             <w:tcMar>
               <w:top w:w="80" w:type="dxa"/>
               <w:start w:w="120" w:type="dxa"/>
@@ -4283,7 +4555,6 @@
         <w:tc>
           <w:tcPr>
             <w:tcW w:type="dxa" w:w="1700"/>
-            <w:shd w:fill="FAFBFC"/>
             <w:tcMar>
               <w:top w:w="80" w:type="dxa"/>
               <w:start w:w="120" w:type="dxa"/>
@@ -4310,7 +4581,6 @@
         <w:tc>
           <w:tcPr>
             <w:tcW w:type="dxa" w:w="3630"/>
-            <w:shd w:fill="FAFBFC"/>
             <w:tcMar>
               <w:top w:w="80" w:type="dxa"/>
               <w:start w:w="120" w:type="dxa"/>
@@ -4337,7 +4607,6 @@
         <w:tc>
           <w:tcPr>
             <w:tcW w:type="dxa" w:w="4030"/>
-            <w:shd w:fill="FAFBFC"/>
             <w:tcMar>
               <w:top w:w="80" w:type="dxa"/>
               <w:start w:w="120" w:type="dxa"/>
@@ -4395,7 +4664,7 @@
         <w:rPr>
           <w:rFonts w:ascii="Calibri" w:hAnsi="Calibri" w:eastAsia="Yu Mincho"/>
         </w:rPr>
-        <w:t>RQ1は達成した。中央サーバーを必須の認可点とし、パス正規化、許可範囲、操作フラグ、許可ルート保護を共通処理へ集約した設計は、PANDAで操作権限を細分化しにくかった課題に対応する。ユーザー、共有、サブパス、操作の組合せを扱い、Bundleとテンプレートで設定負荷を緩和した。</w:t>
+        <w:t>RQ1は達成した。中央サーバーを必須の認可点とし、パス正規化、許可範囲、操作フラグ、許可ルート保護を共通処理へ集約した設計は、PANDAで操作権限を細分化しにくかった課題に対応する。ユーザー、共有、サブパス、操作の組合せを扱うため、同じ共有の中でも利用者とフォルダーに応じて読取・書込・削除・改名を変えられる。Bundleとテンプレートで設定負荷を緩和した。</w:t>
       </w:r>
     </w:p>
     <w:p>
@@ -4599,7 +4868,7 @@
         <w:rPr>
           <w:rFonts w:ascii="Calibri" w:hAnsi="Calibri" w:eastAsia="Yu Mincho"/>
         </w:rPr>
-        <w:t>Watashiは、PANDAが備えていた個別パス指定、踏み台接続、ClickOnce配布・更新を継承しながら、利用者単位の細粒度権限、操作追跡、管理の一元化、DB導入負担の軽減を実現する設計へ発展させた。共有・サブパス・操作単位の認可、トークン失効、暗号化資格情報、Direct／Agent／Gateway、再開可能転送、監査記録の失敗時outbox、管理GUI、CSV、ClickOnce、Windows Serviceが実装されている。2026年8月31日のビルドは警告・エラーなく完了し、自動テスト704件がすべて合格した。</w:t>
+        <w:t>Watashiは、PANDAが備えていた個別パス指定、踏み台接続、ClickOnce配布・更新を継承しながら、ユーザー・フォルダー・操作単位の細粒度権限、操作追跡、管理の一元化、DB導入負担の軽減を実現する設計へ発展させた。さらに、初回パスワードをWindows認証で本人が設定する経路と、D&amp;DをCopyに限定してフォルダー間Moveを防ぐHuman Error（HE）対策を組み込んだ。共有・サブパス・操作単位の認可、トークン失効、暗号化資格情報、Direct／Agent／Gateway、再開可能転送、監査記録の失敗時outbox、管理GUI、CSV、ClickOnce、Windows Serviceが実装されている。2026年8月31日のビルドは警告・エラーなく完了し、自動テスト704件がすべて合格した。</w:t>
       </w:r>
     </w:p>
     <w:p>

</xml_diff>

<commit_message>
docs: enlarge report diagrams and standardize .NET 10
</commit_message>
<xml_diff>
--- a/docs/report/output/Watashi_技術レポート.docx
+++ b/docs/report/output/Watashi_技術レポート.docx
@@ -472,35 +472,6 @@
         </w:rPr>
         <w:t>28</w:t>
       </w:r>
-    </w:p>
-    <w:p>
-      <w:pPr>
-        <w:tabs>
-          <w:tab w:pos="9000" w:val="left"/>
-        </w:tabs>
-        <w:spacing w:after="100"/>
-        <w:ind w:left="144"/>
-      </w:pPr>
-      <w:r>
-        <w:rPr>
-          <w:rFonts w:ascii="Calibri" w:hAnsi="Calibri" w:eastAsia="Yu Mincho"/>
-          <w:sz w:val="21"/>
-        </w:rPr>
-        <w:t>付録B 提出前チェック</w:t>
-      </w:r>
-      <w:r>
-        <w:rPr>
-          <w:rFonts w:ascii="Calibri" w:hAnsi="Calibri" w:eastAsia="Yu Gothic"/>
-        </w:rPr>
-        <w:tab/>
-      </w:r>
-      <w:r>
-        <w:rPr>
-          <w:rFonts w:ascii="Calibri" w:hAnsi="Calibri" w:eastAsia="Yu Gothic"/>
-          <w:sz w:val="21"/>
-        </w:rPr>
-        <w:t>29</w:t>
-      </w:r>
       <w:r>
         <w:fldChar w:fldCharType="end"/>
       </w:r>
@@ -537,7 +508,7 @@
         <w:rPr>
           <w:rFonts w:ascii="Calibri" w:hAnsi="Calibri" w:eastAsia="Yu Mincho"/>
         </w:rPr>
-        <w:t>企業内では、文書、設計データ、申請資料などをWindowsファイルサーバー上の共有フォルダーで管理することが多い。SMBはネットワーク越しにファイルやディレクトリを読み書きするためのプロトコルであり、Common Internet File System（CIFS）はSMBの一つの方言として位置付けられる[E1]。本レポートでは、現行実装がSMB2/3を扱うことを踏まえて原則として「SMB」と表記し、既存資料名や従来の呼称を説明するときに限って「CIFS」を用いる。</w:t>
+        <w:t>企業内では、文書、設計データ、申請資料などをWindowsファイルサーバー上の共有フォルダーで管理することが多い。SMBはネットワーク越しにファイルやディレクトリを読み書きするためのプロトコルであり、Common Internet File System（CIFS）はSMBの一つの方言として位置付けられる[E1]。WatashiはSMB2/3を扱うため、本レポートでは原則として「SMB」と表記し、既存資料名や従来の呼称を説明するときに限って「CIFS」を用いる。</w:t>
       </w:r>
     </w:p>
     <w:p>
@@ -1650,6 +1621,7 @@
     <w:p>
       <w:pPr>
         <w:keepNext/>
+        <w:pageBreakBefore w:val="0"/>
         <w:spacing w:before="120" w:after="40"/>
         <w:jc w:val="center"/>
       </w:pPr>
@@ -1880,7 +1852,7 @@
         <w:rPr>
           <w:rFonts w:ascii="Calibri" w:hAnsi="Calibri" w:eastAsia="Yu Mincho"/>
         </w:rPr>
-        <w:t>Watashi.Serverは.NET 8のASP.NET Core Minimal APIで実装された中央サーバーである。認証、認可、監査、SMB資格情報、ルーティング、管理API、SQLiteデータベースを保持し、Windows Serviceとして常駐できる。Watashi.Agentも.NET 8のASP.NET Coreアプリケーションであり、中央から受けたHTTP(S)要求をSMB操作へ変換する。Watashi.Sharedはモデル、Data Transfer Object（DTO）、定数、パス処理、暗号、SMBセッション処理を共有する。Watashi.Testsはサーバー、Agent、共有ライブラリおよびWPFに依存しないクライアント部品を検証するxUnitプロジェクトである。</w:t>
+        <w:t>Watashi.Serverは.NET 10のASP.NET Core Minimal APIで実装された中央サーバーである。認証、認可、監査、SMB資格情報、ルーティング、管理API、SQLiteデータベースを保持し、Windows Serviceとして常駐できる。Watashi.Agentも.NET 10のASP.NET Coreアプリケーションであり、中央から受けたHTTP(S)要求をSMB操作へ変換する。Watashi.Sharedも.NET 10を対象とし、モデル、Data Transfer Object（DTO）、定数、パス処理、暗号、SMBセッション処理を共有する。Watashi.Testsは.NET 10のxUnitプロジェクトであり、サーバー、Agent、共有ライブラリおよびWPFに依存しないクライアント部品を検証する。</w:t>
       </w:r>
     </w:p>
     <w:p>
@@ -1894,6 +1866,7 @@
     <w:p>
       <w:pPr>
         <w:keepNext/>
+        <w:pageBreakBefore w:val="0"/>
         <w:spacing w:before="120" w:after="40"/>
         <w:jc w:val="center"/>
       </w:pPr>
@@ -1976,13 +1949,14 @@
     <w:p>
       <w:pPr>
         <w:keepNext/>
+        <w:pageBreakBefore w:val="0"/>
         <w:spacing w:before="120" w:after="40"/>
         <w:jc w:val="center"/>
       </w:pPr>
       <w:r>
         <w:drawing>
           <wp:inline xmlns:a="http://schemas.openxmlformats.org/drawingml/2006/main" xmlns:pic="http://schemas.openxmlformats.org/drawingml/2006/picture">
-            <wp:extent cx="5623560" cy="1937004"/>
+            <wp:extent cx="5623560" cy="2967990"/>
             <wp:docPr id="3" name="Picture 3" descr="認証、パス解決、認可、経路選択、SMB実行、監査と応答の順序を示す処理フロー"/>
             <wp:cNvGraphicFramePr>
               <a:graphicFrameLocks noChangeAspect="1"/>
@@ -2009,7 +1983,7 @@
                   <pic:spPr>
                     <a:xfrm>
                       <a:off x="0" y="0"/>
-                      <a:ext cx="5623560" cy="1937004"/>
+                      <a:ext cx="5623560" cy="2967990"/>
                     </a:xfrm>
                     <a:prstGeom prst="rect"/>
                   </pic:spPr>
@@ -2129,7 +2103,7 @@
         <w:rPr>
           <w:rFonts w:ascii="Calibri" w:hAnsi="Calibri" w:eastAsia="Yu Mincho"/>
         </w:rPr>
-        <w:t>リフレッシュ時は新しいトークンを発行し、旧トークンを即時失効する。失効済みトークンが再提示された場合、現行実装は同一ファミリーだけでなく、その利用者の有効なリフレッシュトークンをすべて失効させる。影響範囲は広いが、窃取された旧トークンの再利用を検知した際に安全側へ倒す実装である。パスワード変更、管理者権限変更、アカウントロック・無効化などでは資格情報バージョンを進め、発行済みアクセストークンも次のAPI呼出しで拒否する。この仕組みにより「有効期限まで権限変更が反映されない」時間を短縮する。</w:t>
+        <w:t>リフレッシュ時は新しいトークンを発行し、旧トークンを即時失効する。失効済みトークンが再提示された場合、Watashiは同一ファミリーだけでなく、その利用者の有効なリフレッシュトークンをすべて失効させる。影響範囲は広いが、窃取された旧トークンの再利用を検知した際に安全側へ倒す実装である。パスワード変更、管理者権限変更、アカウントロック・無効化などでは資格情報バージョンを進め、発行済みアクセストークンも次のAPI呼出しで拒否する。この仕組みにより「有効期限まで権限変更が反映されない」時間を短縮する。</w:t>
       </w:r>
     </w:p>
     <w:p>
@@ -2212,13 +2186,14 @@
     <w:p>
       <w:pPr>
         <w:keepNext/>
+        <w:pageBreakBefore w:val="0"/>
         <w:spacing w:before="120" w:after="40"/>
         <w:jc w:val="center"/>
       </w:pPr>
       <w:r>
         <w:drawing>
           <wp:inline xmlns:a="http://schemas.openxmlformats.org/drawingml/2006/main" xmlns:pic="http://schemas.openxmlformats.org/drawingml/2006/picture">
-            <wp:extent cx="5623560" cy="2967990"/>
+            <wp:extent cx="5623560" cy="3624072"/>
             <wp:docPr id="4" name="Picture 4" descr="GID入力、Windows認証、本人照合、初回設定待ち状態の確認、本人によるパスワード設定と代替経路を示すフロー"/>
             <wp:cNvGraphicFramePr>
               <a:graphicFrameLocks noChangeAspect="1"/>
@@ -2245,7 +2220,7 @@
                   <pic:spPr>
                     <a:xfrm>
                       <a:off x="0" y="0"/>
-                      <a:ext cx="5623560" cy="2967990"/>
+                      <a:ext cx="5623560" cy="3624072"/>
                     </a:xfrm>
                     <a:prstGeom prst="rect"/>
                   </pic:spPr>
@@ -2428,7 +2403,7 @@
         <w:rPr>
           <w:rFonts w:ascii="Calibri" w:hAnsi="Calibri" w:eastAsia="Yu Mincho"/>
         </w:rPr>
-        <w:t>現行の主要操作は一覧、アップロード、ダウンロード、フォルダー作成、削除、改名である。検索APIは残るがWPF画面は非表示であり、リモートコピーと管理ごみ箱は現行クライアントの提供対象から外れている。したがって、利用者に提供する機能と内部実装の存在を区別する必要がある。</w:t>
+        <w:t>利用者向けの主要操作は一覧、アップロード、ダウンロード、フォルダー作成、削除、改名である。検索APIは管理用に保持し、WPF画面では非表示としている。リモートコピーと管理ごみ箱は利用者向けクライアントの提供対象に含めず、利用者に提供する機能と内部の管理機能を明確に分けている。</w:t>
       </w:r>
     </w:p>
     <w:p>
@@ -2467,7 +2442,7 @@
         <w:rPr>
           <w:rFonts w:ascii="Calibri" w:hAnsi="Calibri" w:eastAsia="Yu Mincho"/>
         </w:rPr>
-        <w:t>初期仕様およびREADMEの一部には4MBチャンク、ファイルサイズ無制限という記述があるが、現行のTransfer V2実装は最大8MiBチャンクと10TiBの論理上限を持つ。これはAPIやホスティング層の要求サイズ上限、ディスク容量、処理時間とは別の制約であり、実運用で10TiBを転送できることを保証しない。「無制限」と表現せず、本レポートでは現行コードを優先する。SMB実装はSMBLibrary 1.5.7を用い、セッションプール、ArrayPool、ストリーミングによって、操作ごとの接続確立と大容量バッファの負荷を抑える。</w:t>
+        <w:t>Transfer V2は最大8MiBのチャンクと10TiBの論理上限を採用した。この上限はAPIやホスティング層の要求サイズ上限、ディスク容量、処理時間とは別の制約であり、実運用で10TiBを転送できることを保証する値ではない。運用時は保存先容量、通信帯域、処理時間を踏まえて転送計画を立てる。SMB処理にはSMBLibrary 1.5.7を用い、セッションプール、ArrayPool、ストリーミングによって、操作ごとの接続確立と大容量バッファの負荷を抑える。</w:t>
       </w:r>
     </w:p>
     <w:p>
@@ -2517,7 +2492,7 @@
         <w:rPr>
           <w:rFonts w:ascii="Calibri" w:hAnsi="Calibri" w:eastAsia="Yu Mincho"/>
         </w:rPr>
-        <w:t>を照合する共有秘密で保護する。mTLSは登録済みサムプリントによるピン留めを行う一方、現行コードの証明書失効確認は</w:t>
+        <w:t>を照合する共有秘密で保護する。mTLSは登録済みサムプリントによるピン留めを行う。証明書失効確認は</w:t>
       </w:r>
       <w:r>
         <w:rPr>
@@ -2532,7 +2507,7 @@
         <w:rPr>
           <w:rFonts w:ascii="Calibri" w:hAnsi="Calibri" w:eastAsia="Yu Mincho"/>
         </w:rPr>
-        <w:t>であるため、一般的な公開鍵基盤による失効検査まで実施しているとは表現できない。Gatewayから対象Agentへ進む第二区間は共有秘密方式であり、クライアント証明書を転送する構成ではない。Agentから中央へのheartbeatは30秒ごとで、中央は15秒ごとに監視し、90秒以上更新がないノードをUnhealthyにする。到達不能と判断した経路はSMB接続を待たずに503を返す設計である。Agent側はMaxConcurrencyを超える要求に503と</w:t>
+        <w:t>としているため、公開鍵基盤による失効検査は保護範囲に含めず、証明書更新と登録済みサムプリントの管理を運用手順へ組み込む。Gatewayから対象Agentへ進む第二区間は共有秘密方式であり、クライアント証明書を転送する構成ではない。Agentから中央へのheartbeatは30秒ごとで、中央は15秒ごとに監視し、90秒以上更新がないノードをUnhealthyにする。到達不能と判断した経路はSMB接続を待たずに503を返す設計である。Agent側はMaxConcurrencyを超える要求に503と</w:t>
       </w:r>
       <w:r>
         <w:rPr>
@@ -2632,6 +2607,7 @@
     <w:p>
       <w:pPr>
         <w:keepNext/>
+        <w:pageBreakBefore w:val="0"/>
         <w:spacing w:before="120" w:after="40"/>
         <w:jc w:val="center"/>
       </w:pPr>
@@ -2722,6 +2698,7 @@
     <w:p>
       <w:pPr>
         <w:keepNext/>
+        <w:pageBreakBefore/>
         <w:spacing w:before="120" w:after="40"/>
         <w:jc w:val="center"/>
       </w:pPr>
@@ -2793,6 +2770,7 @@
     <w:p>
       <w:pPr>
         <w:keepNext/>
+        <w:pageBreakBefore w:val="0"/>
         <w:spacing w:before="120" w:after="40"/>
         <w:jc w:val="center"/>
       </w:pPr>
@@ -2903,7 +2881,7 @@
         <w:rPr>
           <w:rFonts w:ascii="Calibri" w:hAnsi="Calibri" w:eastAsia="Yu Mincho"/>
         </w:rPr>
-        <w:t>検証は2026年8月31日に実施した。ソリューションはWatashi.Client（net10.0-windows）、Watashi.Server、Watashi.Agent、Watashi.Shared、Watashi.Tests（後四者はnet8.0）から構成される。ビルドは</w:t>
+        <w:t>検証は2026年8月31日に実施した。ソリューションはWatashi.Client（net10.0-windows）、Watashi.Server、Watashi.Agent、Watashi.Shared、Watashi.Tests（後四者はnet10.0）から構成され、すべて.NET 10を対象としている。ビルドは</w:t>
       </w:r>
       <w:r>
         <w:rPr>
@@ -4841,7 +4819,7 @@
         <w:rPr>
           <w:rFonts w:ascii="Calibri" w:hAnsi="Calibri" w:eastAsia="Yu Mincho"/>
         </w:rPr>
-        <w:t>704件の自動テスト、5プロジェクトの分層、共通CIFS層、DTO、サービス、Minimal APIの分離は、変更の影響を局所化し回帰を早く検出する基盤である。接続先固定、初回設定、転送V2、監査outboxへ発展させた点は、運用フィードバックを設計へ反映した成果である。</w:t>
+        <w:t>704件の自動テスト、5プロジェクトの分層、共通SMBアクセス層、DTO、サービス、Minimal APIの分離は、変更の影響を局所化し回帰を早く検出する基盤である。接続先固定、初回設定、転送V2、監査outboxへ発展させた点は、運用フィードバックを設計へ反映した成果である。</w:t>
       </w:r>
     </w:p>
     <w:p>
@@ -5010,7 +4988,7 @@
         <w:rPr>
           <w:rFonts w:ascii="Calibri" w:hAnsi="Calibri" w:eastAsia="Yu Mincho"/>
         </w:rPr>
-        <w:t>, 「社内CIFSファイル管理ツール 最終仕様書 兼 実装ガイド」, 初期設計および実装後差分。</w:t>
+        <w:t>, 「社内CIFSファイル管理ツール 最終仕様書 兼 実装ガイド」, 初期設計・実装ガイド。</w:t>
       </w:r>
     </w:p>
     <w:p>
@@ -6277,137 +6255,6 @@
         <w:spacing w:after="0"/>
       </w:pPr>
     </w:p>
-    <w:p>
-      <w:pPr>
-        <w:pStyle w:val="Heading1"/>
-        <w:pageBreakBefore/>
-      </w:pPr>
-      <w:r>
-        <w:rPr>
-          <w:rFonts w:ascii="Calibri" w:hAnsi="Calibri" w:eastAsia="Yu Gothic"/>
-        </w:rPr>
-        <w:t>付録B 提出前チェック</w:t>
-      </w:r>
-    </w:p>
-    <w:p>
-      <w:pPr>
-        <w:spacing w:after="80" w:line="290" w:lineRule="auto"/>
-        <w:ind w:left="540" w:hanging="279"/>
-        <w:jc w:val="left"/>
-        <w:numPr>
-          <w:ilvl w:val="0"/>
-          <w:numId w:val="13"/>
-        </w:numPr>
-      </w:pPr>
-      <w:r>
-        <w:rPr>
-          <w:rFonts w:ascii="Calibri" w:hAnsi="Calibri" w:eastAsia="Yu Mincho"/>
-        </w:rPr>
-        <w:t>タイトル、概要、序論、結論で目的・範囲・結論が一致していること。</w:t>
-      </w:r>
-    </w:p>
-    <w:p>
-      <w:pPr>
-        <w:spacing w:after="80" w:line="290" w:lineRule="auto"/>
-        <w:ind w:left="540" w:hanging="279"/>
-        <w:jc w:val="left"/>
-        <w:numPr>
-          <w:ilvl w:val="0"/>
-          <w:numId w:val="13"/>
-        </w:numPr>
-      </w:pPr>
-      <w:r>
-        <w:rPr>
-          <w:rFonts w:ascii="Calibri" w:hAnsi="Calibri" w:eastAsia="Yu Mincho"/>
-        </w:rPr>
-        <w:t>PANDAを既存ツール、Watashiを後継ツールとして一貫して表記していること。</w:t>
-      </w:r>
-    </w:p>
-    <w:p>
-      <w:pPr>
-        <w:spacing w:after="80" w:line="290" w:lineRule="auto"/>
-        <w:ind w:left="540" w:hanging="279"/>
-        <w:jc w:val="left"/>
-        <w:numPr>
-          <w:ilvl w:val="0"/>
-          <w:numId w:val="13"/>
-        </w:numPr>
-      </w:pPr>
-      <w:r>
-        <w:rPr>
-          <w:rFonts w:ascii="Calibri" w:hAnsi="Calibri" w:eastAsia="Yu Mincho"/>
-        </w:rPr>
-        <w:t>SMBとCIFSを初出で区別していること。</w:t>
-      </w:r>
-    </w:p>
-    <w:p>
-      <w:pPr>
-        <w:spacing w:after="80" w:line="290" w:lineRule="auto"/>
-        <w:ind w:left="540" w:hanging="279"/>
-        <w:jc w:val="left"/>
-        <w:numPr>
-          <w:ilvl w:val="0"/>
-          <w:numId w:val="13"/>
-        </w:numPr>
-      </w:pPr>
-      <w:r>
-        <w:rPr>
-          <w:rFonts w:ascii="Calibri" w:hAnsi="Calibri" w:eastAsia="Yu Mincho"/>
-        </w:rPr>
-        <w:t>仕様上の主張と実装・実測結果を区別していること。</w:t>
-      </w:r>
-    </w:p>
-    <w:p>
-      <w:pPr>
-        <w:spacing w:after="80" w:line="290" w:lineRule="auto"/>
-        <w:ind w:left="540" w:hanging="279"/>
-        <w:jc w:val="left"/>
-        <w:numPr>
-          <w:ilvl w:val="0"/>
-          <w:numId w:val="13"/>
-        </w:numPr>
-      </w:pPr>
-      <w:r>
-        <w:rPr>
-          <w:rFonts w:ascii="Calibri" w:hAnsi="Calibri" w:eastAsia="Yu Mincho"/>
-        </w:rPr>
-        <w:t>図表を本文から参照し、表題を表の上、図題を図の下に置くこと。</w:t>
-      </w:r>
-    </w:p>
-    <w:p>
-      <w:pPr>
-        <w:spacing w:after="80" w:line="290" w:lineRule="auto"/>
-        <w:ind w:left="540" w:hanging="279"/>
-        <w:jc w:val="left"/>
-        <w:numPr>
-          <w:ilvl w:val="0"/>
-          <w:numId w:val="13"/>
-        </w:numPr>
-      </w:pPr>
-      <w:r>
-        <w:rPr>
-          <w:rFonts w:ascii="Calibri" w:hAnsi="Calibri" w:eastAsia="Yu Mincho"/>
-        </w:rPr>
-        <w:t>略語を初出でスペルアウトし、常体、一文一論旨を維持すること。</w:t>
-      </w:r>
-    </w:p>
-    <w:p>
-      <w:pPr>
-        <w:spacing w:after="80" w:line="290" w:lineRule="auto"/>
-        <w:ind w:left="540" w:hanging="279"/>
-        <w:jc w:val="left"/>
-        <w:numPr>
-          <w:ilvl w:val="0"/>
-          <w:numId w:val="13"/>
-        </w:numPr>
-      </w:pPr>
-      <w:r>
-        <w:rPr>
-          <w:rFonts w:ascii="Calibri" w:hAnsi="Calibri" w:eastAsia="Yu Mincho"/>
-        </w:rPr>
-        <w:t>Wordの見出しスタイル、自動目次、ページ番号、参考文献、改ページを最終確認すること。</w:t>
-      </w:r>
-    </w:p>
     <w:sectPr>
       <w:headerReference w:type="default" r:id="rId9"/>
       <w:footerReference w:type="default" r:id="rId10"/>
@@ -6720,24 +6567,6 @@
   </w:abstractNum>
   <w:num w:numId="12">
     <w:abstractNumId w:val="11"/>
-  </w:num>
-  <w:abstractNum w:abstractNumId="12">
-    <w:multiLevelType w:val="singleLevel"/>
-    <w:lvl w:ilvl="0">
-      <w:start w:val="1"/>
-      <w:numFmt w:val="bullet"/>
-      <w:lvlText w:val="•"/>
-      <w:suff w:val="space"/>
-      <w:pPr>
-        <w:tabs>
-          <w:tab w:val="num" w:pos="540"/>
-        </w:tabs>
-        <w:ind w:left="540" w:hanging="280"/>
-      </w:pPr>
-    </w:lvl>
-  </w:abstractNum>
-  <w:num w:numId="13">
-    <w:abstractNumId w:val="12"/>
   </w:num>
 </w:numbering>
 </file>

</xml_diff>

<commit_message>
docs: enlarge report diagrams and standardize .NET 10 (#131)
</commit_message>
<xml_diff>
--- a/docs/report/output/Watashi_技術レポート.docx
+++ b/docs/report/output/Watashi_技術レポート.docx
@@ -472,35 +472,6 @@
         </w:rPr>
         <w:t>28</w:t>
       </w:r>
-    </w:p>
-    <w:p>
-      <w:pPr>
-        <w:tabs>
-          <w:tab w:pos="9000" w:val="left"/>
-        </w:tabs>
-        <w:spacing w:after="100"/>
-        <w:ind w:left="144"/>
-      </w:pPr>
-      <w:r>
-        <w:rPr>
-          <w:rFonts w:ascii="Calibri" w:hAnsi="Calibri" w:eastAsia="Yu Mincho"/>
-          <w:sz w:val="21"/>
-        </w:rPr>
-        <w:t>付録B 提出前チェック</w:t>
-      </w:r>
-      <w:r>
-        <w:rPr>
-          <w:rFonts w:ascii="Calibri" w:hAnsi="Calibri" w:eastAsia="Yu Gothic"/>
-        </w:rPr>
-        <w:tab/>
-      </w:r>
-      <w:r>
-        <w:rPr>
-          <w:rFonts w:ascii="Calibri" w:hAnsi="Calibri" w:eastAsia="Yu Gothic"/>
-          <w:sz w:val="21"/>
-        </w:rPr>
-        <w:t>29</w:t>
-      </w:r>
       <w:r>
         <w:fldChar w:fldCharType="end"/>
       </w:r>
@@ -537,7 +508,7 @@
         <w:rPr>
           <w:rFonts w:ascii="Calibri" w:hAnsi="Calibri" w:eastAsia="Yu Mincho"/>
         </w:rPr>
-        <w:t>企業内では、文書、設計データ、申請資料などをWindowsファイルサーバー上の共有フォルダーで管理することが多い。SMBはネットワーク越しにファイルやディレクトリを読み書きするためのプロトコルであり、Common Internet File System（CIFS）はSMBの一つの方言として位置付けられる[E1]。本レポートでは、現行実装がSMB2/3を扱うことを踏まえて原則として「SMB」と表記し、既存資料名や従来の呼称を説明するときに限って「CIFS」を用いる。</w:t>
+        <w:t>企業内では、文書、設計データ、申請資料などをWindowsファイルサーバー上の共有フォルダーで管理することが多い。SMBはネットワーク越しにファイルやディレクトリを読み書きするためのプロトコルであり、Common Internet File System（CIFS）はSMBの一つの方言として位置付けられる[E1]。WatashiはSMB2/3を扱うため、本レポートでは原則として「SMB」と表記し、既存資料名や従来の呼称を説明するときに限って「CIFS」を用いる。</w:t>
       </w:r>
     </w:p>
     <w:p>
@@ -1650,6 +1621,7 @@
     <w:p>
       <w:pPr>
         <w:keepNext/>
+        <w:pageBreakBefore w:val="0"/>
         <w:spacing w:before="120" w:after="40"/>
         <w:jc w:val="center"/>
       </w:pPr>
@@ -1880,7 +1852,7 @@
         <w:rPr>
           <w:rFonts w:ascii="Calibri" w:hAnsi="Calibri" w:eastAsia="Yu Mincho"/>
         </w:rPr>
-        <w:t>Watashi.Serverは.NET 8のASP.NET Core Minimal APIで実装された中央サーバーである。認証、認可、監査、SMB資格情報、ルーティング、管理API、SQLiteデータベースを保持し、Windows Serviceとして常駐できる。Watashi.Agentも.NET 8のASP.NET Coreアプリケーションであり、中央から受けたHTTP(S)要求をSMB操作へ変換する。Watashi.Sharedはモデル、Data Transfer Object（DTO）、定数、パス処理、暗号、SMBセッション処理を共有する。Watashi.Testsはサーバー、Agent、共有ライブラリおよびWPFに依存しないクライアント部品を検証するxUnitプロジェクトである。</w:t>
+        <w:t>Watashi.Serverは.NET 10のASP.NET Core Minimal APIで実装された中央サーバーである。認証、認可、監査、SMB資格情報、ルーティング、管理API、SQLiteデータベースを保持し、Windows Serviceとして常駐できる。Watashi.Agentも.NET 10のASP.NET Coreアプリケーションであり、中央から受けたHTTP(S)要求をSMB操作へ変換する。Watashi.Sharedも.NET 10を対象とし、モデル、Data Transfer Object（DTO）、定数、パス処理、暗号、SMBセッション処理を共有する。Watashi.Testsは.NET 10のxUnitプロジェクトであり、サーバー、Agent、共有ライブラリおよびWPFに依存しないクライアント部品を検証する。</w:t>
       </w:r>
     </w:p>
     <w:p>
@@ -1894,6 +1866,7 @@
     <w:p>
       <w:pPr>
         <w:keepNext/>
+        <w:pageBreakBefore w:val="0"/>
         <w:spacing w:before="120" w:after="40"/>
         <w:jc w:val="center"/>
       </w:pPr>
@@ -1976,13 +1949,14 @@
     <w:p>
       <w:pPr>
         <w:keepNext/>
+        <w:pageBreakBefore w:val="0"/>
         <w:spacing w:before="120" w:after="40"/>
         <w:jc w:val="center"/>
       </w:pPr>
       <w:r>
         <w:drawing>
           <wp:inline xmlns:a="http://schemas.openxmlformats.org/drawingml/2006/main" xmlns:pic="http://schemas.openxmlformats.org/drawingml/2006/picture">
-            <wp:extent cx="5623560" cy="1937004"/>
+            <wp:extent cx="5623560" cy="2967990"/>
             <wp:docPr id="3" name="Picture 3" descr="認証、パス解決、認可、経路選択、SMB実行、監査と応答の順序を示す処理フロー"/>
             <wp:cNvGraphicFramePr>
               <a:graphicFrameLocks noChangeAspect="1"/>
@@ -2009,7 +1983,7 @@
                   <pic:spPr>
                     <a:xfrm>
                       <a:off x="0" y="0"/>
-                      <a:ext cx="5623560" cy="1937004"/>
+                      <a:ext cx="5623560" cy="2967990"/>
                     </a:xfrm>
                     <a:prstGeom prst="rect"/>
                   </pic:spPr>
@@ -2129,7 +2103,7 @@
         <w:rPr>
           <w:rFonts w:ascii="Calibri" w:hAnsi="Calibri" w:eastAsia="Yu Mincho"/>
         </w:rPr>
-        <w:t>リフレッシュ時は新しいトークンを発行し、旧トークンを即時失効する。失効済みトークンが再提示された場合、現行実装は同一ファミリーだけでなく、その利用者の有効なリフレッシュトークンをすべて失効させる。影響範囲は広いが、窃取された旧トークンの再利用を検知した際に安全側へ倒す実装である。パスワード変更、管理者権限変更、アカウントロック・無効化などでは資格情報バージョンを進め、発行済みアクセストークンも次のAPI呼出しで拒否する。この仕組みにより「有効期限まで権限変更が反映されない」時間を短縮する。</w:t>
+        <w:t>リフレッシュ時は新しいトークンを発行し、旧トークンを即時失効する。失効済みトークンが再提示された場合、Watashiは同一ファミリーだけでなく、その利用者の有効なリフレッシュトークンをすべて失効させる。影響範囲は広いが、窃取された旧トークンの再利用を検知した際に安全側へ倒す実装である。パスワード変更、管理者権限変更、アカウントロック・無効化などでは資格情報バージョンを進め、発行済みアクセストークンも次のAPI呼出しで拒否する。この仕組みにより「有効期限まで権限変更が反映されない」時間を短縮する。</w:t>
       </w:r>
     </w:p>
     <w:p>
@@ -2212,13 +2186,14 @@
     <w:p>
       <w:pPr>
         <w:keepNext/>
+        <w:pageBreakBefore w:val="0"/>
         <w:spacing w:before="120" w:after="40"/>
         <w:jc w:val="center"/>
       </w:pPr>
       <w:r>
         <w:drawing>
           <wp:inline xmlns:a="http://schemas.openxmlformats.org/drawingml/2006/main" xmlns:pic="http://schemas.openxmlformats.org/drawingml/2006/picture">
-            <wp:extent cx="5623560" cy="2967990"/>
+            <wp:extent cx="5623560" cy="3624072"/>
             <wp:docPr id="4" name="Picture 4" descr="GID入力、Windows認証、本人照合、初回設定待ち状態の確認、本人によるパスワード設定と代替経路を示すフロー"/>
             <wp:cNvGraphicFramePr>
               <a:graphicFrameLocks noChangeAspect="1"/>
@@ -2245,7 +2220,7 @@
                   <pic:spPr>
                     <a:xfrm>
                       <a:off x="0" y="0"/>
-                      <a:ext cx="5623560" cy="2967990"/>
+                      <a:ext cx="5623560" cy="3624072"/>
                     </a:xfrm>
                     <a:prstGeom prst="rect"/>
                   </pic:spPr>
@@ -2428,7 +2403,7 @@
         <w:rPr>
           <w:rFonts w:ascii="Calibri" w:hAnsi="Calibri" w:eastAsia="Yu Mincho"/>
         </w:rPr>
-        <w:t>現行の主要操作は一覧、アップロード、ダウンロード、フォルダー作成、削除、改名である。検索APIは残るがWPF画面は非表示であり、リモートコピーと管理ごみ箱は現行クライアントの提供対象から外れている。したがって、利用者に提供する機能と内部実装の存在を区別する必要がある。</w:t>
+        <w:t>利用者向けの主要操作は一覧、アップロード、ダウンロード、フォルダー作成、削除、改名である。検索APIは管理用に保持し、WPF画面では非表示としている。リモートコピーと管理ごみ箱は利用者向けクライアントの提供対象に含めず、利用者に提供する機能と内部の管理機能を明確に分けている。</w:t>
       </w:r>
     </w:p>
     <w:p>
@@ -2467,7 +2442,7 @@
         <w:rPr>
           <w:rFonts w:ascii="Calibri" w:hAnsi="Calibri" w:eastAsia="Yu Mincho"/>
         </w:rPr>
-        <w:t>初期仕様およびREADMEの一部には4MBチャンク、ファイルサイズ無制限という記述があるが、現行のTransfer V2実装は最大8MiBチャンクと10TiBの論理上限を持つ。これはAPIやホスティング層の要求サイズ上限、ディスク容量、処理時間とは別の制約であり、実運用で10TiBを転送できることを保証しない。「無制限」と表現せず、本レポートでは現行コードを優先する。SMB実装はSMBLibrary 1.5.7を用い、セッションプール、ArrayPool、ストリーミングによって、操作ごとの接続確立と大容量バッファの負荷を抑える。</w:t>
+        <w:t>Transfer V2は最大8MiBのチャンクと10TiBの論理上限を採用した。この上限はAPIやホスティング層の要求サイズ上限、ディスク容量、処理時間とは別の制約であり、実運用で10TiBを転送できることを保証する値ではない。運用時は保存先容量、通信帯域、処理時間を踏まえて転送計画を立てる。SMB処理にはSMBLibrary 1.5.7を用い、セッションプール、ArrayPool、ストリーミングによって、操作ごとの接続確立と大容量バッファの負荷を抑える。</w:t>
       </w:r>
     </w:p>
     <w:p>
@@ -2517,7 +2492,7 @@
         <w:rPr>
           <w:rFonts w:ascii="Calibri" w:hAnsi="Calibri" w:eastAsia="Yu Mincho"/>
         </w:rPr>
-        <w:t>を照合する共有秘密で保護する。mTLSは登録済みサムプリントによるピン留めを行う一方、現行コードの証明書失効確認は</w:t>
+        <w:t>を照合する共有秘密で保護する。mTLSは登録済みサムプリントによるピン留めを行う。証明書失効確認は</w:t>
       </w:r>
       <w:r>
         <w:rPr>
@@ -2532,7 +2507,7 @@
         <w:rPr>
           <w:rFonts w:ascii="Calibri" w:hAnsi="Calibri" w:eastAsia="Yu Mincho"/>
         </w:rPr>
-        <w:t>であるため、一般的な公開鍵基盤による失効検査まで実施しているとは表現できない。Gatewayから対象Agentへ進む第二区間は共有秘密方式であり、クライアント証明書を転送する構成ではない。Agentから中央へのheartbeatは30秒ごとで、中央は15秒ごとに監視し、90秒以上更新がないノードをUnhealthyにする。到達不能と判断した経路はSMB接続を待たずに503を返す設計である。Agent側はMaxConcurrencyを超える要求に503と</w:t>
+        <w:t>としているため、公開鍵基盤による失効検査は保護範囲に含めず、証明書更新と登録済みサムプリントの管理を運用手順へ組み込む。Gatewayから対象Agentへ進む第二区間は共有秘密方式であり、クライアント証明書を転送する構成ではない。Agentから中央へのheartbeatは30秒ごとで、中央は15秒ごとに監視し、90秒以上更新がないノードをUnhealthyにする。到達不能と判断した経路はSMB接続を待たずに503を返す設計である。Agent側はMaxConcurrencyを超える要求に503と</w:t>
       </w:r>
       <w:r>
         <w:rPr>
@@ -2632,6 +2607,7 @@
     <w:p>
       <w:pPr>
         <w:keepNext/>
+        <w:pageBreakBefore w:val="0"/>
         <w:spacing w:before="120" w:after="40"/>
         <w:jc w:val="center"/>
       </w:pPr>
@@ -2722,6 +2698,7 @@
     <w:p>
       <w:pPr>
         <w:keepNext/>
+        <w:pageBreakBefore/>
         <w:spacing w:before="120" w:after="40"/>
         <w:jc w:val="center"/>
       </w:pPr>
@@ -2793,6 +2770,7 @@
     <w:p>
       <w:pPr>
         <w:keepNext/>
+        <w:pageBreakBefore w:val="0"/>
         <w:spacing w:before="120" w:after="40"/>
         <w:jc w:val="center"/>
       </w:pPr>
@@ -2903,7 +2881,7 @@
         <w:rPr>
           <w:rFonts w:ascii="Calibri" w:hAnsi="Calibri" w:eastAsia="Yu Mincho"/>
         </w:rPr>
-        <w:t>検証は2026年8月31日に実施した。ソリューションはWatashi.Client（net10.0-windows）、Watashi.Server、Watashi.Agent、Watashi.Shared、Watashi.Tests（後四者はnet8.0）から構成される。ビルドは</w:t>
+        <w:t>検証は2026年8月31日に実施した。ソリューションはWatashi.Client（net10.0-windows）、Watashi.Server、Watashi.Agent、Watashi.Shared、Watashi.Tests（後四者はnet10.0）から構成され、すべて.NET 10を対象としている。ビルドは</w:t>
       </w:r>
       <w:r>
         <w:rPr>
@@ -4841,7 +4819,7 @@
         <w:rPr>
           <w:rFonts w:ascii="Calibri" w:hAnsi="Calibri" w:eastAsia="Yu Mincho"/>
         </w:rPr>
-        <w:t>704件の自動テスト、5プロジェクトの分層、共通CIFS層、DTO、サービス、Minimal APIの分離は、変更の影響を局所化し回帰を早く検出する基盤である。接続先固定、初回設定、転送V2、監査outboxへ発展させた点は、運用フィードバックを設計へ反映した成果である。</w:t>
+        <w:t>704件の自動テスト、5プロジェクトの分層、共通SMBアクセス層、DTO、サービス、Minimal APIの分離は、変更の影響を局所化し回帰を早く検出する基盤である。接続先固定、初回設定、転送V2、監査outboxへ発展させた点は、運用フィードバックを設計へ反映した成果である。</w:t>
       </w:r>
     </w:p>
     <w:p>
@@ -5010,7 +4988,7 @@
         <w:rPr>
           <w:rFonts w:ascii="Calibri" w:hAnsi="Calibri" w:eastAsia="Yu Mincho"/>
         </w:rPr>
-        <w:t>, 「社内CIFSファイル管理ツール 最終仕様書 兼 実装ガイド」, 初期設計および実装後差分。</w:t>
+        <w:t>, 「社内CIFSファイル管理ツール 最終仕様書 兼 実装ガイド」, 初期設計・実装ガイド。</w:t>
       </w:r>
     </w:p>
     <w:p>
@@ -6277,137 +6255,6 @@
         <w:spacing w:after="0"/>
       </w:pPr>
     </w:p>
-    <w:p>
-      <w:pPr>
-        <w:pStyle w:val="Heading1"/>
-        <w:pageBreakBefore/>
-      </w:pPr>
-      <w:r>
-        <w:rPr>
-          <w:rFonts w:ascii="Calibri" w:hAnsi="Calibri" w:eastAsia="Yu Gothic"/>
-        </w:rPr>
-        <w:t>付録B 提出前チェック</w:t>
-      </w:r>
-    </w:p>
-    <w:p>
-      <w:pPr>
-        <w:spacing w:after="80" w:line="290" w:lineRule="auto"/>
-        <w:ind w:left="540" w:hanging="279"/>
-        <w:jc w:val="left"/>
-        <w:numPr>
-          <w:ilvl w:val="0"/>
-          <w:numId w:val="13"/>
-        </w:numPr>
-      </w:pPr>
-      <w:r>
-        <w:rPr>
-          <w:rFonts w:ascii="Calibri" w:hAnsi="Calibri" w:eastAsia="Yu Mincho"/>
-        </w:rPr>
-        <w:t>タイトル、概要、序論、結論で目的・範囲・結論が一致していること。</w:t>
-      </w:r>
-    </w:p>
-    <w:p>
-      <w:pPr>
-        <w:spacing w:after="80" w:line="290" w:lineRule="auto"/>
-        <w:ind w:left="540" w:hanging="279"/>
-        <w:jc w:val="left"/>
-        <w:numPr>
-          <w:ilvl w:val="0"/>
-          <w:numId w:val="13"/>
-        </w:numPr>
-      </w:pPr>
-      <w:r>
-        <w:rPr>
-          <w:rFonts w:ascii="Calibri" w:hAnsi="Calibri" w:eastAsia="Yu Mincho"/>
-        </w:rPr>
-        <w:t>PANDAを既存ツール、Watashiを後継ツールとして一貫して表記していること。</w:t>
-      </w:r>
-    </w:p>
-    <w:p>
-      <w:pPr>
-        <w:spacing w:after="80" w:line="290" w:lineRule="auto"/>
-        <w:ind w:left="540" w:hanging="279"/>
-        <w:jc w:val="left"/>
-        <w:numPr>
-          <w:ilvl w:val="0"/>
-          <w:numId w:val="13"/>
-        </w:numPr>
-      </w:pPr>
-      <w:r>
-        <w:rPr>
-          <w:rFonts w:ascii="Calibri" w:hAnsi="Calibri" w:eastAsia="Yu Mincho"/>
-        </w:rPr>
-        <w:t>SMBとCIFSを初出で区別していること。</w:t>
-      </w:r>
-    </w:p>
-    <w:p>
-      <w:pPr>
-        <w:spacing w:after="80" w:line="290" w:lineRule="auto"/>
-        <w:ind w:left="540" w:hanging="279"/>
-        <w:jc w:val="left"/>
-        <w:numPr>
-          <w:ilvl w:val="0"/>
-          <w:numId w:val="13"/>
-        </w:numPr>
-      </w:pPr>
-      <w:r>
-        <w:rPr>
-          <w:rFonts w:ascii="Calibri" w:hAnsi="Calibri" w:eastAsia="Yu Mincho"/>
-        </w:rPr>
-        <w:t>仕様上の主張と実装・実測結果を区別していること。</w:t>
-      </w:r>
-    </w:p>
-    <w:p>
-      <w:pPr>
-        <w:spacing w:after="80" w:line="290" w:lineRule="auto"/>
-        <w:ind w:left="540" w:hanging="279"/>
-        <w:jc w:val="left"/>
-        <w:numPr>
-          <w:ilvl w:val="0"/>
-          <w:numId w:val="13"/>
-        </w:numPr>
-      </w:pPr>
-      <w:r>
-        <w:rPr>
-          <w:rFonts w:ascii="Calibri" w:hAnsi="Calibri" w:eastAsia="Yu Mincho"/>
-        </w:rPr>
-        <w:t>図表を本文から参照し、表題を表の上、図題を図の下に置くこと。</w:t>
-      </w:r>
-    </w:p>
-    <w:p>
-      <w:pPr>
-        <w:spacing w:after="80" w:line="290" w:lineRule="auto"/>
-        <w:ind w:left="540" w:hanging="279"/>
-        <w:jc w:val="left"/>
-        <w:numPr>
-          <w:ilvl w:val="0"/>
-          <w:numId w:val="13"/>
-        </w:numPr>
-      </w:pPr>
-      <w:r>
-        <w:rPr>
-          <w:rFonts w:ascii="Calibri" w:hAnsi="Calibri" w:eastAsia="Yu Mincho"/>
-        </w:rPr>
-        <w:t>略語を初出でスペルアウトし、常体、一文一論旨を維持すること。</w:t>
-      </w:r>
-    </w:p>
-    <w:p>
-      <w:pPr>
-        <w:spacing w:after="80" w:line="290" w:lineRule="auto"/>
-        <w:ind w:left="540" w:hanging="279"/>
-        <w:jc w:val="left"/>
-        <w:numPr>
-          <w:ilvl w:val="0"/>
-          <w:numId w:val="13"/>
-        </w:numPr>
-      </w:pPr>
-      <w:r>
-        <w:rPr>
-          <w:rFonts w:ascii="Calibri" w:hAnsi="Calibri" w:eastAsia="Yu Mincho"/>
-        </w:rPr>
-        <w:t>Wordの見出しスタイル、自動目次、ページ番号、参考文献、改ページを最終確認すること。</w:t>
-      </w:r>
-    </w:p>
     <w:sectPr>
       <w:headerReference w:type="default" r:id="rId9"/>
       <w:footerReference w:type="default" r:id="rId10"/>
@@ -6720,24 +6567,6 @@
   </w:abstractNum>
   <w:num w:numId="12">
     <w:abstractNumId w:val="11"/>
-  </w:num>
-  <w:abstractNum w:abstractNumId="12">
-    <w:multiLevelType w:val="singleLevel"/>
-    <w:lvl w:ilvl="0">
-      <w:start w:val="1"/>
-      <w:numFmt w:val="bullet"/>
-      <w:lvlText w:val="•"/>
-      <w:suff w:val="space"/>
-      <w:pPr>
-        <w:tabs>
-          <w:tab w:val="num" w:pos="540"/>
-        </w:tabs>
-        <w:ind w:left="540" w:hanging="280"/>
-      </w:pPr>
-    </w:lvl>
-  </w:abstractNum>
-  <w:num w:numId="13">
-    <w:abstractNumId w:val="12"/>
   </w:num>
 </w:numbering>
 </file>

</xml_diff>

<commit_message>
docs: improve SVG readability in Word
</commit_message>
<xml_diff>
--- a/docs/report/output/Watashi_技術レポート.docx
+++ b/docs/report/output/Watashi_技術レポート.docx
@@ -1956,7 +1956,7 @@
       <w:r>
         <w:drawing>
           <wp:inline xmlns:a="http://schemas.openxmlformats.org/drawingml/2006/main" xmlns:pic="http://schemas.openxmlformats.org/drawingml/2006/picture">
-            <wp:extent cx="5623560" cy="2967990"/>
+            <wp:extent cx="5623560" cy="3280410"/>
             <wp:docPr id="3" name="Picture 3" descr="認証、パス解決、認可、経路選択、SMB実行、監査と応答の順序を示す処理フロー"/>
             <wp:cNvGraphicFramePr>
               <a:graphicFrameLocks noChangeAspect="1"/>
@@ -1983,7 +1983,7 @@
                   <pic:spPr>
                     <a:xfrm>
                       <a:off x="0" y="0"/>
-                      <a:ext cx="5623560" cy="2967990"/>
+                      <a:ext cx="5623560" cy="3280410"/>
                     </a:xfrm>
                     <a:prstGeom prst="rect"/>
                   </pic:spPr>
@@ -2193,7 +2193,7 @@
       <w:r>
         <w:drawing>
           <wp:inline xmlns:a="http://schemas.openxmlformats.org/drawingml/2006/main" xmlns:pic="http://schemas.openxmlformats.org/drawingml/2006/picture">
-            <wp:extent cx="5623560" cy="3624072"/>
+            <wp:extent cx="5623560" cy="4311396"/>
             <wp:docPr id="4" name="Picture 4" descr="GID入力、Windows認証、本人照合、初回設定待ち状態の確認、本人によるパスワード設定と代替経路を示すフロー"/>
             <wp:cNvGraphicFramePr>
               <a:graphicFrameLocks noChangeAspect="1"/>
@@ -2220,7 +2220,7 @@
                   <pic:spPr>
                     <a:xfrm>
                       <a:off x="0" y="0"/>
-                      <a:ext cx="5623560" cy="3624072"/>
+                      <a:ext cx="5623560" cy="4311396"/>
                     </a:xfrm>
                     <a:prstGeom prst="rect"/>
                   </pic:spPr>

</xml_diff>

<commit_message>
docs: improve SVG readability in Word (#132)
</commit_message>
<xml_diff>
--- a/docs/report/output/Watashi_技術レポート.docx
+++ b/docs/report/output/Watashi_技術レポート.docx
@@ -1956,7 +1956,7 @@
       <w:r>
         <w:drawing>
           <wp:inline xmlns:a="http://schemas.openxmlformats.org/drawingml/2006/main" xmlns:pic="http://schemas.openxmlformats.org/drawingml/2006/picture">
-            <wp:extent cx="5623560" cy="2967990"/>
+            <wp:extent cx="5623560" cy="3280410"/>
             <wp:docPr id="3" name="Picture 3" descr="認証、パス解決、認可、経路選択、SMB実行、監査と応答の順序を示す処理フロー"/>
             <wp:cNvGraphicFramePr>
               <a:graphicFrameLocks noChangeAspect="1"/>
@@ -1983,7 +1983,7 @@
                   <pic:spPr>
                     <a:xfrm>
                       <a:off x="0" y="0"/>
-                      <a:ext cx="5623560" cy="2967990"/>
+                      <a:ext cx="5623560" cy="3280410"/>
                     </a:xfrm>
                     <a:prstGeom prst="rect"/>
                   </pic:spPr>
@@ -2193,7 +2193,7 @@
       <w:r>
         <w:drawing>
           <wp:inline xmlns:a="http://schemas.openxmlformats.org/drawingml/2006/main" xmlns:pic="http://schemas.openxmlformats.org/drawingml/2006/picture">
-            <wp:extent cx="5623560" cy="3624072"/>
+            <wp:extent cx="5623560" cy="4311396"/>
             <wp:docPr id="4" name="Picture 4" descr="GID入力、Windows認証、本人照合、初回設定待ち状態の確認、本人によるパスワード設定と代替経路を示すフロー"/>
             <wp:cNvGraphicFramePr>
               <a:graphicFrameLocks noChangeAspect="1"/>
@@ -2220,7 +2220,7 @@
                   <pic:spPr>
                     <a:xfrm>
                       <a:off x="0" y="0"/>
-                      <a:ext cx="5623560" cy="3624072"/>
+                      <a:ext cx="5623560" cy="4311396"/>
                     </a:xfrm>
                     <a:prstGeom prst="rect"/>
                   </pic:spPr>

</xml_diff>

<commit_message>
docs: refresh technical report and resize SVG diagrams
</commit_message>
<xml_diff>
--- a/docs/report/output/Watashi_技術レポート.docx
+++ b/docs/report/output/Watashi_技術レポート.docx
@@ -104,7 +104,7 @@
           <w:rFonts w:ascii="Calibri" w:hAnsi="Calibri" w:eastAsia="Yu Mincho"/>
           <w:sz w:val="22"/>
         </w:rPr>
-        <w:t>評価基準日　2026年8月31日</w:t>
+        <w:t>評価基準日　2026年9月9日</w:t>
       </w:r>
     </w:p>
     <w:p>
@@ -116,7 +116,7 @@
           <w:rFonts w:ascii="Calibri" w:hAnsi="Calibri" w:eastAsia="Yu Mincho"/>
           <w:sz w:val="20"/>
         </w:rPr>
-        <w:t>対象　2026年8月31日時点のWatashi技術報告</w:t>
+        <w:t>対象　2026年9月9日時点のWatashi技術報告</w:t>
       </w:r>
     </w:p>
     <w:p>
@@ -153,7 +153,7 @@
         <w:rPr>
           <w:rFonts w:ascii="Calibri" w:hAnsi="Calibri" w:eastAsia="Yu Mincho"/>
         </w:rPr>
-        <w:t>2026年8月31日にソリューションをビルドした結果、警告0件、エラー0件で完了した。xUnit自動テスト704件、手動検証245項目はいずれも合格した。検証では、認証・認可、Direct／Agent／Gateway経路、転送再開、監査記録、管理機能、ClickOnce配布・更新、IIS・SMB接続を含む受入条件を確認した。</w:t>
+        <w:t>2026年9月9日の改訂では、非モーダルの転送センター、メンテナンス待機・復旧、共有廃止の運用、キーボード操作などを現行仕様へ反映した。Releaseビルドは警告・エラー0件、自動テスト841件とWPFレイアウト検証は成功した。8月31日の自動テスト704件・手動検証245項目の合格記録は過去の実績として残し、今回再実施していない実SMB・IIS・ClickOnceなどの受入試験とは区別する[I8]。</w:t>
       </w:r>
     </w:p>
     <w:p>
@@ -161,7 +161,7 @@
         <w:rPr>
           <w:rFonts w:ascii="Calibri" w:hAnsi="Calibri" w:eastAsia="Yu Mincho"/>
         </w:rPr>
-        <w:t>以上から、WatashiはPANDAの運用上の利点を継承しながら、細粒度認可、認証・認可の集中管理、資格情報の保護、操作監査、転送再開、管理機能を一体的に提供するツールとして完成した。作成者として、主要機能と運用シナリオが設計どおりに動作することを、自動テストおよび手動検証で確認した。</w:t>
+        <w:t>以上から、WatashiはPANDAの運用上の利点を継承しながら、細粒度認可、認証・認可の集中管理、資格情報の保護、操作監査、転送再開、管理機能を一体的に提供するツールとして完成した。作成者として、過去の手動検証と今回の自動回帰検証で確認した範囲を明示し、9月追加機能の実環境受入を今後の確認事項として残す。</w:t>
       </w:r>
     </w:p>
     <w:p>
@@ -325,7 +325,7 @@
           <w:rFonts w:ascii="Calibri" w:hAnsi="Calibri" w:eastAsia="Yu Gothic"/>
           <w:sz w:val="21"/>
         </w:rPr>
-        <w:t>19</w:t>
+        <w:t>21</w:t>
       </w:r>
     </w:p>
     <w:p>
@@ -354,7 +354,7 @@
           <w:rFonts w:ascii="Calibri" w:hAnsi="Calibri" w:eastAsia="Yu Gothic"/>
           <w:sz w:val="21"/>
         </w:rPr>
-        <w:t>20</w:t>
+        <w:t>22</w:t>
       </w:r>
     </w:p>
     <w:p>
@@ -383,7 +383,7 @@
           <w:rFonts w:ascii="Calibri" w:hAnsi="Calibri" w:eastAsia="Yu Gothic"/>
           <w:sz w:val="21"/>
         </w:rPr>
-        <w:t>23</w:t>
+        <w:t>25</w:t>
       </w:r>
     </w:p>
     <w:p>
@@ -412,7 +412,7 @@
           <w:rFonts w:ascii="Calibri" w:hAnsi="Calibri" w:eastAsia="Yu Gothic"/>
           <w:sz w:val="21"/>
         </w:rPr>
-        <w:t>25</w:t>
+        <w:t>27</w:t>
       </w:r>
     </w:p>
     <w:p>
@@ -441,7 +441,7 @@
           <w:rFonts w:ascii="Calibri" w:hAnsi="Calibri" w:eastAsia="Yu Gothic"/>
           <w:sz w:val="21"/>
         </w:rPr>
-        <w:t>26</w:t>
+        <w:t>28</w:t>
       </w:r>
     </w:p>
     <w:p>
@@ -470,7 +470,7 @@
           <w:rFonts w:ascii="Calibri" w:hAnsi="Calibri" w:eastAsia="Yu Gothic"/>
           <w:sz w:val="21"/>
         </w:rPr>
-        <w:t>28</w:t>
+        <w:t>30</w:t>
       </w:r>
       <w:r>
         <w:fldChar w:fldCharType="end"/>
@@ -672,7 +672,7 @@
         <w:rPr>
           <w:rFonts w:ascii="Calibri" w:hAnsi="Calibri" w:eastAsia="Yu Mincho"/>
         </w:rPr>
-        <w:t>対象は、Watashi.Client、Watashi.Server、Watashi.Agent、Watashi.Shared、Watashi.Tests、配布スクリプト、設定および関連文書である。評価基準日は2026年8月31日とし、同日時点の設計、実装、運用手順および検証結果を扱う。</w:t>
+        <w:t>対象は、Watashi.Client、Watashi.Server、Watashi.Agent、Watashi.Shared、Watashi.Tests、配布スクリプト、設定および関連文書である。仕様の評価基準日は2026年9月9日とする。8月31日の検証結果は過去の実績として残し、今回の回帰検証と区別する。ランタイムの.NET 10表記は本レポートの既存記述を維持しており、現行リポジトリのターゲット設定を示すものではない。構築時は各プロジェクトの設定と導入ガイドを参照する。</w:t>
       </w:r>
     </w:p>
     <w:p>
@@ -1779,7 +1779,7 @@
         <w:rPr>
           <w:rFonts w:ascii="Calibri" w:hAnsi="Calibri" w:eastAsia="Yu Mincho"/>
         </w:rPr>
-        <w:t>ファイル、監査outboxなどが追加された。通信断やプロセス再起動を「最初からやり直す」だけでなく、確定位置から再開し、監査ログの直接保存に失敗した場合もoutboxを用いて再試行する方向へ設計が発展した。管理ごみ箱や検索などの機能は、内部APIとしての役割と利用者画面で提供する範囲を整理した。</w:t>
+        <w:t>ファイル、監査outboxなどが追加された。通信断やプロセス再起動を「最初からやり直す」だけでなく、確定位置から再開し、監査ログの直接保存に失敗した場合もoutboxを用いて再試行する方向へ設計が発展した。検索は管理用APIとして残し、リモートコピーとリモートごみ箱は廃止した。旧版由来のごみ箱台帳だけは後片付けの対象として残る。</w:t>
       </w:r>
     </w:p>
     <w:p>
@@ -1788,6 +1788,14 @@
           <w:rFonts w:ascii="Calibri" w:hAnsi="Calibri" w:eastAsia="Yu Mincho"/>
         </w:rPr>
         <w:t>第四の転換点は、本人による初回パスワード設定とアカウント状態の強化である。管理者が一時パスワードを配布する方式に加え、Windows統合認証で本人のOSアカウントを確認し、本人が初回パスワードを決める経路が追加された。アカウント無効化、権限有効期間、複数信頼端末、表示名なども加わり、単純なファイル転送ツールから、利用者ライフサイクルを含む管理基盤へ範囲が広がった。</w:t>
+      </w:r>
+    </w:p>
+    <w:p>
+      <w:r>
+        <w:rPr>
+          <w:rFonts w:ascii="Calibri" w:hAnsi="Calibri" w:eastAsia="Yu Mincho"/>
+        </w:rPr>
+        <w:t>第五の転換点は、9月の試験導入を踏まえた操作性と保守運用の改善である。転送センターの非モーダル化、ホーム下部の進捗、キーボード操作、2000件一覧、小画面での管理操作を整備した。また、メンテナンス案内と転送待機、独立した状態サイト、共有の残存データ確認と強制解除を加え、利用中の更新や停止した共有の廃止を手順として扱えるようにした[I4][I7]。</w:t>
       </w:r>
     </w:p>
     <w:p>
@@ -1873,7 +1881,7 @@
       <w:r>
         <w:drawing>
           <wp:inline xmlns:a="http://schemas.openxmlformats.org/drawingml/2006/main" xmlns:pic="http://schemas.openxmlformats.org/drawingml/2006/picture">
-            <wp:extent cx="5623560" cy="3280410"/>
+            <wp:extent cx="5623560" cy="3249167"/>
             <wp:docPr id="2" name="Picture 2" descr="WPFクライアント、中央サーバー、SMBサーバー、Agent、Gatewayの接続と信頼境界を示す構成図"/>
             <wp:cNvGraphicFramePr>
               <a:graphicFrameLocks noChangeAspect="1"/>
@@ -1900,7 +1908,7 @@
                   <pic:spPr>
                     <a:xfrm>
                       <a:off x="0" y="0"/>
-                      <a:ext cx="5623560" cy="3280410"/>
+                      <a:ext cx="5623560" cy="3249167"/>
                     </a:xfrm>
                     <a:prstGeom prst="rect"/>
                   </pic:spPr>
@@ -1956,7 +1964,7 @@
       <w:r>
         <w:drawing>
           <wp:inline xmlns:a="http://schemas.openxmlformats.org/drawingml/2006/main" xmlns:pic="http://schemas.openxmlformats.org/drawingml/2006/picture">
-            <wp:extent cx="5623560" cy="3280410"/>
+            <wp:extent cx="5623560" cy="2811780"/>
             <wp:docPr id="3" name="Picture 3" descr="認証、パス解決、認可、経路選択、SMB実行、監査と応答の順序を示す処理フロー"/>
             <wp:cNvGraphicFramePr>
               <a:graphicFrameLocks noChangeAspect="1"/>
@@ -1983,7 +1991,7 @@
                   <pic:spPr>
                     <a:xfrm>
                       <a:off x="0" y="0"/>
-                      <a:ext cx="5623560" cy="3280410"/>
+                      <a:ext cx="5623560" cy="2811780"/>
                     </a:xfrm>
                     <a:prstGeom prst="rect"/>
                   </pic:spPr>
@@ -2193,7 +2201,7 @@
       <w:r>
         <w:drawing>
           <wp:inline xmlns:a="http://schemas.openxmlformats.org/drawingml/2006/main" xmlns:pic="http://schemas.openxmlformats.org/drawingml/2006/picture">
-            <wp:extent cx="5623560" cy="4311396"/>
+            <wp:extent cx="5623560" cy="3374136"/>
             <wp:docPr id="4" name="Picture 4" descr="GID入力、Windows認証、本人照合、初回設定待ち状態の確認、本人によるパスワード設定と代替経路を示すフロー"/>
             <wp:cNvGraphicFramePr>
               <a:graphicFrameLocks noChangeAspect="1"/>
@@ -2220,7 +2228,7 @@
                   <pic:spPr>
                     <a:xfrm>
                       <a:off x="0" y="0"/>
-                      <a:ext cx="5623560" cy="4311396"/>
+                      <a:ext cx="5623560" cy="3374136"/>
                     </a:xfrm>
                     <a:prstGeom prst="rect"/>
                   </pic:spPr>
@@ -2403,7 +2411,7 @@
         <w:rPr>
           <w:rFonts w:ascii="Calibri" w:hAnsi="Calibri" w:eastAsia="Yu Mincho"/>
         </w:rPr>
-        <w:t>利用者向けの主要操作は一覧、アップロード、ダウンロード、フォルダー作成、削除、改名である。検索APIは管理用に保持し、WPF画面では非表示としている。リモートコピーと管理ごみ箱は利用者向けクライアントの提供対象に含めず、利用者に提供する機能と内部の管理機能を明確に分けている。</w:t>
+        <w:t>利用者向けの主要操作は一覧、アップロード、ダウンロード、フォルダー作成、削除、改名である。検索APIは管理用に保持し、WPF画面では非表示としている。リモートコピーとリモートごみ箱は廃止されており、新規利用する機能ではない。ローカル削除時のWindowsごみ箱設定とは別の機能である。リモート一覧は初回・追加とも2000件単位で読み込み、絞り込みは読み込み済み項目に適用する。検索APIの上限500件とは区別する。</w:t>
       </w:r>
     </w:p>
     <w:p>
@@ -2443,6 +2451,22 @@
           <w:rFonts w:ascii="Calibri" w:hAnsi="Calibri" w:eastAsia="Yu Mincho"/>
         </w:rPr>
         <w:t>Transfer V2は最大8MiBのチャンクと10TiBの論理上限を採用した。この上限はAPIやホスティング層の要求サイズ上限、ディスク容量、処理時間とは別の制約であり、実運用で10TiBを転送できることを保証する値ではない。運用時は保存先容量、通信帯域、処理時間を踏まえて転送計画を立てる。SMB処理にはSMBLibrary 1.5.7を用い、セッションプール、ArrayPool、ストリーミングによって、操作ごとの接続確立と大容量バッファの負荷を抑える。</w:t>
+      </w:r>
+    </w:p>
+    <w:p>
+      <w:r>
+        <w:rPr>
+          <w:rFonts w:ascii="Calibri" w:hAnsi="Calibri" w:eastAsia="Yu Mincho"/>
+        </w:rPr>
+        <w:t>転送センターは操作画面を閉じずに開ける非モーダル画面であり、件数付き状態フィルターと選択項目の詳細を備える。競合待ちの項目にだけ解決操作を表示する。完了・スキップの履歴整理では再開情報を保持し、失敗・中止の履歴破棄では確認後に途中データを削除する。期限切れのアップロードを再試行する場合は先頭から送信する。履歴保存に失敗した場合は途中データを保持する。</w:t>
+      </w:r>
+    </w:p>
+    <w:p>
+      <w:r>
+        <w:rPr>
+          <w:rFonts w:ascii="Calibri" w:hAnsi="Calibri" w:eastAsia="Yu Mincho"/>
+        </w:rPr>
+        <w:t>削除は全対象を確認してから実行し、全件成功時は一覧更新のみを行う。失敗・一部失敗や一覧の再読み込みエラーは結果を表示する。同じ場所の再読み込みでは選択とスクロールを保持する。</w:t>
       </w:r>
     </w:p>
     <w:p>
@@ -2692,7 +2716,23 @@
         <w:rPr>
           <w:rFonts w:ascii="Calibri" w:hAnsi="Calibri" w:eastAsia="Yu Mincho"/>
         </w:rPr>
-        <w:t>クライアントは左にローカル、右にリモートを表示する二ペインUIを採用する。利用者はエクスプローラーに近い操作でファイルを選び、転送キューで進捗、一時停止、再開、取消、競合を確認できる。一般利用者には管理機能を表示せず、管理者は同じアプリからユーザー、ホスト、共有、権限、テンプレート、Bundle、ノード、信頼端末、操作ログ、システム設定を管理する。図6には二ペインと転送キューを同時に確認できる画面例を配置する。</w:t>
+        <w:t>クライアントは左にローカル、右にリモートを表示する二ペインUIを採用する。利用者はエクスプローラーに近い操作でファイルを選び、転送キューで進捗、一時停止、再開、取消、競合を確認できる。一般利用者には管理機能を表示せず、管理者は同じアプリからユーザー、ホスト、共有、権限、テンプレート、Bundle、ノード、信頼端末、操作ログ、システム設定を管理する。図6には二ペイン、ホーム下部の転送状況、非モーダルの転送センターを確認できる画面例を配置する。</w:t>
+      </w:r>
+    </w:p>
+    <w:p>
+      <w:r>
+        <w:rPr>
+          <w:rFonts w:ascii="Calibri" w:hAnsi="Calibri" w:eastAsia="Yu Mincho"/>
+        </w:rPr>
+        <w:t>Ctrl+Dでダウンロード、Ctrl+Uでアップロードを実行し、操作中ペイン・選択件数・転送先を画面に示す。入力欄の操作、IME変換中、長押しによる誤転送を防ぐ。Enterでフォルダーを開くと読み込み後に先頭行を選択して上下キー操作を続けられるが、読み込み中にF6／Shift+F6、Ctrl+L、Ctrl+Fなどで移ったフォーカスは奪い返さない。</w:t>
+      </w:r>
+    </w:p>
+    <w:p>
+      <w:r>
+        <w:rPr>
+          <w:rFonts w:ascii="Calibri" w:hAnsi="Calibri" w:eastAsia="Yu Mincho"/>
+        </w:rPr>
+        <w:t>ホーム下部の高さ28pxの欄に実行中の転送方向・進捗バー・割合と待機／要対応件数を表示し、クリックまたはEnter／Spaceで転送センターを開く。一覧はファイル種別アイコン、個人設定による拡張子カラー、種類列のソートに対応する。小さい画面では転送センターの一覧と詳細を切り替え、管理画面は全体スクロールと権限一覧／編集の切替で操作領域を確保する。バージョン情報画面では問い合わせ用のバージョンをコピーできる。</w:t>
       </w:r>
     </w:p>
     <w:p>
@@ -2706,7 +2746,7 @@
         <w:drawing>
           <wp:inline xmlns:a="http://schemas.openxmlformats.org/drawingml/2006/main" xmlns:pic="http://schemas.openxmlformats.org/drawingml/2006/picture">
             <wp:extent cx="5623560" cy="3161690"/>
-            <wp:docPr id="6" name="Picture 6" descr="Watashiクライアントの二ペイン表示と転送キューのスクリーンショットを後から挿入するためのプレースホルダー"/>
+            <wp:docPr id="6" name="Picture 6" descr="Watashiクライアントの二ペイン表示と転送センターのスクリーンショットを後から挿入するためのプレースホルダー"/>
             <wp:cNvGraphicFramePr>
               <a:graphicFrameLocks noChangeAspect="1"/>
             </wp:cNvGraphicFramePr>
@@ -2756,7 +2796,7 @@
           <w:rFonts w:ascii="Calibri" w:hAnsi="Calibri" w:eastAsia="Yu Mincho"/>
           <w:sz w:val="19"/>
         </w:rPr>
-        <w:t>図6 Watashiの二ペイン表示と転送キュー（スクリーンショット差し替え欄）</w:t>
+        <w:t>図6 Watashiの二ペイン表示と転送センター（スクリーンショット差し替え欄）</w:t>
       </w:r>
     </w:p>
     <w:p>
@@ -2856,6 +2896,41 @@
     </w:p>
     <w:p>
       <w:pPr>
+        <w:pStyle w:val="Heading2"/>
+      </w:pPr>
+      <w:r>
+        <w:rPr>
+          <w:rFonts w:ascii="Calibri" w:hAnsi="Calibri" w:eastAsia="Yu Gothic"/>
+        </w:rPr>
+        <w:t>4.7 メンテナンスと共有の廃止</w:t>
+      </w:r>
+    </w:p>
+    <w:p>
+      <w:r>
+        <w:rPr>
+          <w:rFonts w:ascii="Calibri" w:hAnsi="Calibri" w:eastAsia="Yu Mincho"/>
+        </w:rPr>
+        <w:t>管理画面からメンテナンスの予定・開始・復旧確認・解除を切り替える。状態はDB外へ永続化し、開始後は業務APIの受付を停止する。Clientは起動時・ログイン時・画面上部に案内し、転送をメンテナンス待機として保持する。Serverの再開と必須更新確認が済んだ後に、メンテナンス待機の転送だけを再開する。必須更新の確認に失敗した場合は通常起動しない。</w:t>
+      </w:r>
+    </w:p>
+    <w:p>
+      <w:r>
+        <w:rPr>
+          <w:rFonts w:ascii="Calibri" w:hAnsi="Calibri" w:eastAsia="Yu Mincho"/>
+        </w:rPr>
+        <w:t>API停止中も案内できるよう、独立した静的状態サイトと外部JSONを配置する。ServerによるHTTPS読み戻し、Clientの配布設定、状態配信スクリプトを組み合わせて運用する。2000件一覧に対応するServerを先に更新し、その後Clientを再発行・配布する。停止解除をDB復元より先に行わず、復旧確認を経て業務受付を再開する。具体的な配置・更新・切り戻しはメンテナンス導入・運用ガイドに従う[I7]。</w:t>
+      </w:r>
+    </w:p>
+    <w:p>
+      <w:r>
+        <w:rPr>
+          <w:rFonts w:ascii="Calibri" w:hAnsi="Calibri" w:eastAsia="Yu Mincho"/>
+        </w:rPr>
+        <w:t>未完了のアップロードや旧版由来のリモートごみ箱台帳が残る共有は、接続先の変更・削除を409で拒否する。管理画面では件数・状態・期限・失敗理由を確認できる。強制解除は理由を入力して正規の後片付けを先に試し、回収できない台帳だけを終端化する。回収不能な実体が共有上に残る場合は、そのパスと処理結果を監査記録に残す。後片付けは既定7日の追加猶予を超えて無期限に再試行しない。この仕組みにより、到達不能な共有を管理者が廃止できる。</w:t>
+      </w:r>
+    </w:p>
+    <w:p>
+      <w:pPr>
         <w:pStyle w:val="Heading1"/>
       </w:pPr>
       <w:r>
@@ -2881,7 +2956,7 @@
         <w:rPr>
           <w:rFonts w:ascii="Calibri" w:hAnsi="Calibri" w:eastAsia="Yu Mincho"/>
         </w:rPr>
-        <w:t>検証は2026年8月31日に実施した。ソリューションはWatashi.Client（net10.0-windows）、Watashi.Server、Watashi.Agent、Watashi.Shared、Watashi.Tests（後四者はnet10.0）から構成され、すべて.NET 10を対象としている。ビルドは</w:t>
+        <w:t>以下は2026年8月31日に記録された検証環境である。ソリューションはWatashi.Client（net10.0-windows）、Watashi.Server、Watashi.Agent、Watashi.Shared、Watashi.Tests（後四者はnet10.0）から構成され、すべて.NET 10を対象としている。ビルドは</w:t>
       </w:r>
       <w:r>
         <w:rPr>
@@ -2968,7 +3043,7 @@
         <w:rPr>
           <w:rFonts w:ascii="Calibri" w:hAnsi="Calibri" w:eastAsia="Yu Mincho"/>
         </w:rPr>
-        <w:t>手動検証表は245項目である[I6]。配布アプリによる操作、専門環境を用いた接続、API確認、自動テストとの組合せにより、245項目すべてを実行し、合格と判定した。Agent停止後90秒で503となること、Gatewayを介して対象Agentへ到達すること、Productionでプレースホルダー秘密を拒否すること、監査ログ保管設定、レート制限、権限外アップロード拒否、画面操作、実SMB転送、IIS・ClickOnce配布、更新、性能条件を確認した。Agent過負荷時の503と</w:t>
+        <w:t>8月31日の手動検証表は245項目である[I6]。今回の改訂では実SMB・IIS・ClickOnceを含む手動試験を再実施しておらず、以下は当時の記録である。配布アプリによる操作、専門環境を用いた接続、API確認、自動テストとの組合せにより、245項目すべてを実行し、合格と判定した。Agent停止後90秒で503となること、Gatewayを介して対象Agentへ到達すること、Productionでプレースホルダー秘密を拒否すること、監査ログ保管設定、レート制限、権限外アップロード拒否、画面操作、実SMB転送、IIS・ClickOnce配布、更新、性能条件を確認した。Agent過負荷時の503と</w:t>
       </w:r>
       <w:r>
         <w:rPr>
@@ -3017,7 +3092,7 @@
         <w:rPr>
           <w:rFonts w:ascii="Calibri" w:hAnsi="Calibri" w:eastAsia="Yu Mincho"/>
         </w:rPr>
-        <w:t>確定、冪等性、競合処理を確認する。RQ5は三経路の正常系と、停止・過負荷・タイムアウト時の応答を確認する。RQ6は配布、登録、権限付与、ログ出力のシナリオを確認する。これらを受入条件とし、すべて合格と判定した。</w:t>
+        <w:t>確定、冪等性、競合処理を確認する。RQ5は三経路の正常系と、停止・過負荷・タイムアウト時の応答を確認する。RQ6は配布、登録、権限付与、ログ出力のシナリオを確認する。これらを受入条件とし、8月31日の記録ではすべて合格と判定した。9月追加機能の実環境受入はこの判定に含めない。</w:t>
       </w:r>
     </w:p>
     <w:p>
@@ -3039,7 +3114,7 @@
         <w:rPr>
           <w:rFonts w:ascii="Calibri" w:hAnsi="Calibri" w:eastAsia="Yu Gothic"/>
         </w:rPr>
-        <w:t>6.1 ビルドと自動テスト</w:t>
+        <w:t>6.1 過去のビルドと自動テスト</w:t>
       </w:r>
     </w:p>
     <w:p>
@@ -3464,7 +3539,7 @@
         <w:rPr>
           <w:rFonts w:ascii="Calibri" w:hAnsi="Calibri" w:eastAsia="Yu Gothic"/>
         </w:rPr>
-        <w:t>6.2 手動検証の結果</w:t>
+        <w:t>6.2 過去の手動検証の結果</w:t>
       </w:r>
     </w:p>
     <w:p>
@@ -3800,7 +3875,7 @@
         <w:rPr>
           <w:rFonts w:ascii="Calibri" w:hAnsi="Calibri" w:eastAsia="Yu Gothic"/>
         </w:rPr>
-        <w:t>6.3 RQ別結果</w:t>
+        <w:t>6.3 8月31日時点のRQ別結果</w:t>
       </w:r>
     </w:p>
     <w:p>
@@ -3889,7 +3964,7 @@
         <w:rPr>
           <w:rFonts w:ascii="Calibri" w:hAnsi="Calibri" w:eastAsia="Yu Gothic"/>
         </w:rPr>
-        <w:t>6.4 実装した機能の要約</w:t>
+        <w:t>6.4 現行機能の要約</w:t>
       </w:r>
     </w:p>
     <w:p>
@@ -4617,6 +4692,33 @@
     </w:p>
     <w:p>
       <w:pPr>
+        <w:pStyle w:val="Heading2"/>
+      </w:pPr>
+      <w:r>
+        <w:rPr>
+          <w:rFonts w:ascii="Calibri" w:hAnsi="Calibri" w:eastAsia="Yu Gothic"/>
+        </w:rPr>
+        <w:t>6.5 今回の改訂における回帰検証</w:t>
+      </w:r>
+    </w:p>
+    <w:p>
+      <w:r>
+        <w:rPr>
+          <w:rFonts w:ascii="Calibri" w:hAnsi="Calibri" w:eastAsia="Yu Mincho"/>
+        </w:rPr>
+        <w:t>2026年9月9日にRelease構成を警告エラー扱いでビルドし、警告0件・エラー0件で成功した。xUnit自動テストは841件合格、失敗0件、スキップ0件であった。WPFレイアウト検証も成功し、管理画面・転送画面・スクロール・仮想化・キーボード選択を確認した[I8]。</w:t>
+      </w:r>
+    </w:p>
+    <w:p>
+      <w:r>
+        <w:rPr>
+          <w:rFonts w:ascii="Calibri" w:hAnsi="Calibri" w:eastAsia="Yu Mincho"/>
+        </w:rPr>
+        <w:t>今回の確認はリポジトリ上の自動回帰検証と文書の整合性確認であり、実SMB・IIS・ClickOnceを使用する手動受入や負荷試験は再実施していない。図の表示例や過去の合格件数を、未実施の運用検証の証拠には用いない。</w:t>
+      </w:r>
+    </w:p>
+    <w:p>
+      <w:pPr>
         <w:pStyle w:val="Heading1"/>
       </w:pPr>
       <w:r>
@@ -4819,7 +4921,7 @@
         <w:rPr>
           <w:rFonts w:ascii="Calibri" w:hAnsi="Calibri" w:eastAsia="Yu Mincho"/>
         </w:rPr>
-        <w:t>704件の自動テスト、5プロジェクトの分層、共通SMBアクセス層、DTO、サービス、Minimal APIの分離は、変更の影響を局所化し回帰を早く検出する基盤である。接続先固定、初回設定、転送V2、監査outboxへ発展させた点は、運用フィードバックを設計へ反映した成果である。</w:t>
+        <w:t>8月31日時点の704件の自動テストに加え、現在はメンテナンス、転送履歴、共有の強制解除、キーボード操作などの回帰検証とWPFレイアウト検証も備える。コンポーネントの分層、共通SMBアクセス層、DTO、サービス、Minimal APIの分離は、変更の影響を局所化し回帰を早く検出する基盤である。接続先固定、初回設定、転送V2、監査outboxへ発展させた点は、運用フィードバックを設計へ反映した成果である。</w:t>
       </w:r>
     </w:p>
     <w:p>
@@ -4854,7 +4956,15 @@
         <w:rPr>
           <w:rFonts w:ascii="Calibri" w:hAnsi="Calibri" w:eastAsia="Yu Mincho"/>
         </w:rPr>
-        <w:t>手動検証245項目もすべて合格しており、認証・認可、各経路、転送、監査、画面、配布、更新、運用シナリオを設計した受入条件に基づいて確認した。PANDAではMySQLの構築・運用に専門知識を要したが、WatashiではSQLiteとバックアップ手順を採用して導入を簡素化した。これにより、Watashiは設計した主要機能を一体的に提供できる状態に到達した。</w:t>
+        <w:t>8月31日の手動検証245項目は当時すべて合格と記録されており、認証・認可、各経路、転送、監査、画面、配布、更新、運用シナリオを設計した受入条件に基づいて確認した。PANDAではMySQLの構築・運用に専門知識を要したが、WatashiではSQLiteとバックアップ手順を採用して導入を簡素化した。これにより、Watashiは設計した主要機能を一体的に提供できる状態に到達した。</w:t>
+      </w:r>
+    </w:p>
+    <w:p>
+      <w:r>
+        <w:rPr>
+          <w:rFonts w:ascii="Calibri" w:hAnsi="Calibri" w:eastAsia="Yu Mincho"/>
+        </w:rPr>
+        <w:t>9月9日時点では、操作性の改善に加えてメンテナンス中の待機・復旧と共有廃止の運用を実装した。今回の改訂では現行コードと文書を照合し、自動検証結果を別途記録する。新機能を含む実環境受入や性能評価は、過去の合格件数から推定せず、運用環境で確認する。</w:t>
       </w:r>
     </w:p>
     <w:p>
@@ -4956,7 +5066,7 @@
         <w:rPr>
           <w:rFonts w:ascii="Calibri" w:hAnsi="Calibri" w:eastAsia="Yu Mincho"/>
         </w:rPr>
-        <w:t>, 「Watashi 機能仕様書」, 2026年8月31日参照。</w:t>
+        <w:t>, 「Watashi 機能仕様書」, 2026年9月9日参照。</w:t>
       </w:r>
     </w:p>
     <w:p>
@@ -5020,7 +5130,7 @@
         <w:rPr>
           <w:rFonts w:ascii="Calibri" w:hAnsi="Calibri" w:eastAsia="Yu Mincho"/>
         </w:rPr>
-        <w:t>, 開発経緯と実装計画, 2026年8月31日参照。</w:t>
+        <w:t>, 開発経緯と実装変更, 2026年9月9日参照。</w:t>
       </w:r>
     </w:p>
     <w:p>
@@ -5046,13 +5156,13 @@
           <w:sz w:val="21"/>
           <w:shd w:fill="EEF2F6"/>
         </w:rPr>
-        <w:t>docs/report/evidence/test-results/watashi-report-20260831.trx</w:t>
+        <w:t>docs/report/evidence/VALIDATION_SNAPSHOT.md</w:t>
       </w:r>
       <w:r>
         <w:rPr>
           <w:rFonts w:ascii="Calibri" w:hAnsi="Calibri" w:eastAsia="Yu Mincho"/>
         </w:rPr>
-        <w:t>, xUnit実行結果, 2026年8月31日。</w:t>
+        <w:t>, 2026年8月31日の検証記録（当時のTRXパスを記載。TRX本体は版管理対象外）。</w:t>
       </w:r>
     </w:p>
     <w:p>
@@ -5085,6 +5195,85 @@
           <w:rFonts w:ascii="Calibri" w:hAnsi="Calibri" w:eastAsia="Yu Mincho"/>
         </w:rPr>
         <w:t>, 245項目, 2026年8月31日集計。</w:t>
+      </w:r>
+    </w:p>
+    <w:p>
+      <w:pPr>
+        <w:spacing w:after="80" w:line="290" w:lineRule="auto"/>
+        <w:ind w:left="540" w:hanging="279"/>
+        <w:jc w:val="left"/>
+        <w:numPr>
+          <w:ilvl w:val="0"/>
+          <w:numId w:val="11"/>
+        </w:numPr>
+      </w:pPr>
+      <w:r>
+        <w:rPr>
+          <w:rFonts w:ascii="Calibri" w:hAnsi="Calibri" w:eastAsia="Yu Mincho"/>
+        </w:rPr>
+        <w:t xml:space="preserve">[I7] </w:t>
+      </w:r>
+      <w:r>
+        <w:rPr>
+          <w:rFonts w:ascii="Consolas" w:hAnsi="Consolas"/>
+          <w:color w:val="1F4D78"/>
+          <w:sz w:val="21"/>
+          <w:shd w:fill="EEF2F6"/>
+        </w:rPr>
+        <w:t>deploy/MAINTENANCE-ROLLOUT-PLAN.html</w:t>
+      </w:r>
+      <w:r>
+        <w:rPr>
+          <w:rFonts w:ascii="Calibri" w:hAnsi="Calibri" w:eastAsia="Yu Mincho"/>
+        </w:rPr>
+        <w:t xml:space="preserve">, メンテナンス導入・運用ガイド、および </w:t>
+      </w:r>
+      <w:r>
+        <w:rPr>
+          <w:rFonts w:ascii="Consolas" w:hAnsi="Consolas"/>
+          <w:color w:val="1F4D78"/>
+          <w:sz w:val="21"/>
+          <w:shd w:fill="EEF2F6"/>
+        </w:rPr>
+        <w:t>docs/SPECIFICATION.md</w:t>
+      </w:r>
+      <w:r>
+        <w:rPr>
+          <w:rFonts w:ascii="Calibri" w:hAnsi="Calibri" w:eastAsia="Yu Mincho"/>
+        </w:rPr>
+        <w:t>, 2026年9月9日確認。</w:t>
+      </w:r>
+    </w:p>
+    <w:p>
+      <w:pPr>
+        <w:spacing w:after="80" w:line="290" w:lineRule="auto"/>
+        <w:ind w:left="540" w:hanging="279"/>
+        <w:jc w:val="left"/>
+        <w:numPr>
+          <w:ilvl w:val="0"/>
+          <w:numId w:val="11"/>
+        </w:numPr>
+      </w:pPr>
+      <w:r>
+        <w:rPr>
+          <w:rFonts w:ascii="Calibri" w:hAnsi="Calibri" w:eastAsia="Yu Mincho"/>
+        </w:rPr>
+        <w:t xml:space="preserve">[I8] </w:t>
+      </w:r>
+      <w:r>
+        <w:rPr>
+          <w:rFonts w:ascii="Consolas" w:hAnsi="Consolas"/>
+          <w:color w:val="1F4D78"/>
+          <w:sz w:val="21"/>
+          <w:shd w:fill="EEF2F6"/>
+        </w:rPr>
+        <w:t>docs/report/evidence/VALIDATION_20260909.md</w:t>
+      </w:r>
+      <w:r>
+        <w:rPr>
+          <w:rFonts w:ascii="Calibri" w:hAnsi="Calibri" w:eastAsia="Yu Mincho"/>
+        </w:rPr>
+        <w:t>, 今回の改訂・回帰検証記録。</w:t>
       </w:r>
     </w:p>
     <w:p>
@@ -5246,6 +5435,14 @@
         <w:t>付録A 要求・実装・検証の対応</w:t>
       </w:r>
     </w:p>
+    <w:p>
+      <w:r>
+        <w:rPr>
+          <w:rFonts w:ascii="Calibri" w:hAnsi="Calibri" w:eastAsia="Yu Mincho"/>
+        </w:rPr>
+        <w:t>以下は8月31日の受入記録との対応である。9月追加機能の実環境受入を示すものではなく、今回の自動回帰検証は6.5節に記載する。</w:t>
+      </w:r>
+    </w:p>
     <w:tbl>
       <w:tblPr>
         <w:tblStyle w:val="TableGrid"/>
@@ -5402,7 +5599,7 @@
                 <w:color w:val="17324D"/>
                 <w:sz w:val="17"/>
               </w:rPr>
-              <w:t>現在の証拠</w:t>
+              <w:t>8月31日の証拠</w:t>
             </w:r>
           </w:p>
         </w:tc>

</xml_diff>

<commit_message>
docs: refresh technical report and resize SVG diagrams (#154)
</commit_message>
<xml_diff>
--- a/docs/report/output/Watashi_技術レポート.docx
+++ b/docs/report/output/Watashi_技術レポート.docx
@@ -104,7 +104,7 @@
           <w:rFonts w:ascii="Calibri" w:hAnsi="Calibri" w:eastAsia="Yu Mincho"/>
           <w:sz w:val="22"/>
         </w:rPr>
-        <w:t>評価基準日　2026年8月31日</w:t>
+        <w:t>評価基準日　2026年9月9日</w:t>
       </w:r>
     </w:p>
     <w:p>
@@ -116,7 +116,7 @@
           <w:rFonts w:ascii="Calibri" w:hAnsi="Calibri" w:eastAsia="Yu Mincho"/>
           <w:sz w:val="20"/>
         </w:rPr>
-        <w:t>対象　2026年8月31日時点のWatashi技術報告</w:t>
+        <w:t>対象　2026年9月9日時点のWatashi技術報告</w:t>
       </w:r>
     </w:p>
     <w:p>
@@ -153,7 +153,7 @@
         <w:rPr>
           <w:rFonts w:ascii="Calibri" w:hAnsi="Calibri" w:eastAsia="Yu Mincho"/>
         </w:rPr>
-        <w:t>2026年8月31日にソリューションをビルドした結果、警告0件、エラー0件で完了した。xUnit自動テスト704件、手動検証245項目はいずれも合格した。検証では、認証・認可、Direct／Agent／Gateway経路、転送再開、監査記録、管理機能、ClickOnce配布・更新、IIS・SMB接続を含む受入条件を確認した。</w:t>
+        <w:t>2026年9月9日の改訂では、非モーダルの転送センター、メンテナンス待機・復旧、共有廃止の運用、キーボード操作などを現行仕様へ反映した。Releaseビルドは警告・エラー0件、自動テスト841件とWPFレイアウト検証は成功した。8月31日の自動テスト704件・手動検証245項目の合格記録は過去の実績として残し、今回再実施していない実SMB・IIS・ClickOnceなどの受入試験とは区別する[I8]。</w:t>
       </w:r>
     </w:p>
     <w:p>
@@ -161,7 +161,7 @@
         <w:rPr>
           <w:rFonts w:ascii="Calibri" w:hAnsi="Calibri" w:eastAsia="Yu Mincho"/>
         </w:rPr>
-        <w:t>以上から、WatashiはPANDAの運用上の利点を継承しながら、細粒度認可、認証・認可の集中管理、資格情報の保護、操作監査、転送再開、管理機能を一体的に提供するツールとして完成した。作成者として、主要機能と運用シナリオが設計どおりに動作することを、自動テストおよび手動検証で確認した。</w:t>
+        <w:t>以上から、WatashiはPANDAの運用上の利点を継承しながら、細粒度認可、認証・認可の集中管理、資格情報の保護、操作監査、転送再開、管理機能を一体的に提供するツールとして完成した。作成者として、過去の手動検証と今回の自動回帰検証で確認した範囲を明示し、9月追加機能の実環境受入を今後の確認事項として残す。</w:t>
       </w:r>
     </w:p>
     <w:p>
@@ -325,7 +325,7 @@
           <w:rFonts w:ascii="Calibri" w:hAnsi="Calibri" w:eastAsia="Yu Gothic"/>
           <w:sz w:val="21"/>
         </w:rPr>
-        <w:t>19</w:t>
+        <w:t>21</w:t>
       </w:r>
     </w:p>
     <w:p>
@@ -354,7 +354,7 @@
           <w:rFonts w:ascii="Calibri" w:hAnsi="Calibri" w:eastAsia="Yu Gothic"/>
           <w:sz w:val="21"/>
         </w:rPr>
-        <w:t>20</w:t>
+        <w:t>22</w:t>
       </w:r>
     </w:p>
     <w:p>
@@ -383,7 +383,7 @@
           <w:rFonts w:ascii="Calibri" w:hAnsi="Calibri" w:eastAsia="Yu Gothic"/>
           <w:sz w:val="21"/>
         </w:rPr>
-        <w:t>23</w:t>
+        <w:t>25</w:t>
       </w:r>
     </w:p>
     <w:p>
@@ -412,7 +412,7 @@
           <w:rFonts w:ascii="Calibri" w:hAnsi="Calibri" w:eastAsia="Yu Gothic"/>
           <w:sz w:val="21"/>
         </w:rPr>
-        <w:t>25</w:t>
+        <w:t>27</w:t>
       </w:r>
     </w:p>
     <w:p>
@@ -441,7 +441,7 @@
           <w:rFonts w:ascii="Calibri" w:hAnsi="Calibri" w:eastAsia="Yu Gothic"/>
           <w:sz w:val="21"/>
         </w:rPr>
-        <w:t>26</w:t>
+        <w:t>28</w:t>
       </w:r>
     </w:p>
     <w:p>
@@ -470,7 +470,7 @@
           <w:rFonts w:ascii="Calibri" w:hAnsi="Calibri" w:eastAsia="Yu Gothic"/>
           <w:sz w:val="21"/>
         </w:rPr>
-        <w:t>28</w:t>
+        <w:t>30</w:t>
       </w:r>
       <w:r>
         <w:fldChar w:fldCharType="end"/>
@@ -672,7 +672,7 @@
         <w:rPr>
           <w:rFonts w:ascii="Calibri" w:hAnsi="Calibri" w:eastAsia="Yu Mincho"/>
         </w:rPr>
-        <w:t>対象は、Watashi.Client、Watashi.Server、Watashi.Agent、Watashi.Shared、Watashi.Tests、配布スクリプト、設定および関連文書である。評価基準日は2026年8月31日とし、同日時点の設計、実装、運用手順および検証結果を扱う。</w:t>
+        <w:t>対象は、Watashi.Client、Watashi.Server、Watashi.Agent、Watashi.Shared、Watashi.Tests、配布スクリプト、設定および関連文書である。仕様の評価基準日は2026年9月9日とする。8月31日の検証結果は過去の実績として残し、今回の回帰検証と区別する。ランタイムの.NET 10表記は本レポートの既存記述を維持しており、現行リポジトリのターゲット設定を示すものではない。構築時は各プロジェクトの設定と導入ガイドを参照する。</w:t>
       </w:r>
     </w:p>
     <w:p>
@@ -1779,7 +1779,7 @@
         <w:rPr>
           <w:rFonts w:ascii="Calibri" w:hAnsi="Calibri" w:eastAsia="Yu Mincho"/>
         </w:rPr>
-        <w:t>ファイル、監査outboxなどが追加された。通信断やプロセス再起動を「最初からやり直す」だけでなく、確定位置から再開し、監査ログの直接保存に失敗した場合もoutboxを用いて再試行する方向へ設計が発展した。管理ごみ箱や検索などの機能は、内部APIとしての役割と利用者画面で提供する範囲を整理した。</w:t>
+        <w:t>ファイル、監査outboxなどが追加された。通信断やプロセス再起動を「最初からやり直す」だけでなく、確定位置から再開し、監査ログの直接保存に失敗した場合もoutboxを用いて再試行する方向へ設計が発展した。検索は管理用APIとして残し、リモートコピーとリモートごみ箱は廃止した。旧版由来のごみ箱台帳だけは後片付けの対象として残る。</w:t>
       </w:r>
     </w:p>
     <w:p>
@@ -1788,6 +1788,14 @@
           <w:rFonts w:ascii="Calibri" w:hAnsi="Calibri" w:eastAsia="Yu Mincho"/>
         </w:rPr>
         <w:t>第四の転換点は、本人による初回パスワード設定とアカウント状態の強化である。管理者が一時パスワードを配布する方式に加え、Windows統合認証で本人のOSアカウントを確認し、本人が初回パスワードを決める経路が追加された。アカウント無効化、権限有効期間、複数信頼端末、表示名なども加わり、単純なファイル転送ツールから、利用者ライフサイクルを含む管理基盤へ範囲が広がった。</w:t>
+      </w:r>
+    </w:p>
+    <w:p>
+      <w:r>
+        <w:rPr>
+          <w:rFonts w:ascii="Calibri" w:hAnsi="Calibri" w:eastAsia="Yu Mincho"/>
+        </w:rPr>
+        <w:t>第五の転換点は、9月の試験導入を踏まえた操作性と保守運用の改善である。転送センターの非モーダル化、ホーム下部の進捗、キーボード操作、2000件一覧、小画面での管理操作を整備した。また、メンテナンス案内と転送待機、独立した状態サイト、共有の残存データ確認と強制解除を加え、利用中の更新や停止した共有の廃止を手順として扱えるようにした[I4][I7]。</w:t>
       </w:r>
     </w:p>
     <w:p>
@@ -1873,7 +1881,7 @@
       <w:r>
         <w:drawing>
           <wp:inline xmlns:a="http://schemas.openxmlformats.org/drawingml/2006/main" xmlns:pic="http://schemas.openxmlformats.org/drawingml/2006/picture">
-            <wp:extent cx="5623560" cy="3280410"/>
+            <wp:extent cx="5623560" cy="3249167"/>
             <wp:docPr id="2" name="Picture 2" descr="WPFクライアント、中央サーバー、SMBサーバー、Agent、Gatewayの接続と信頼境界を示す構成図"/>
             <wp:cNvGraphicFramePr>
               <a:graphicFrameLocks noChangeAspect="1"/>
@@ -1900,7 +1908,7 @@
                   <pic:spPr>
                     <a:xfrm>
                       <a:off x="0" y="0"/>
-                      <a:ext cx="5623560" cy="3280410"/>
+                      <a:ext cx="5623560" cy="3249167"/>
                     </a:xfrm>
                     <a:prstGeom prst="rect"/>
                   </pic:spPr>
@@ -1956,7 +1964,7 @@
       <w:r>
         <w:drawing>
           <wp:inline xmlns:a="http://schemas.openxmlformats.org/drawingml/2006/main" xmlns:pic="http://schemas.openxmlformats.org/drawingml/2006/picture">
-            <wp:extent cx="5623560" cy="3280410"/>
+            <wp:extent cx="5623560" cy="2811780"/>
             <wp:docPr id="3" name="Picture 3" descr="認証、パス解決、認可、経路選択、SMB実行、監査と応答の順序を示す処理フロー"/>
             <wp:cNvGraphicFramePr>
               <a:graphicFrameLocks noChangeAspect="1"/>
@@ -1983,7 +1991,7 @@
                   <pic:spPr>
                     <a:xfrm>
                       <a:off x="0" y="0"/>
-                      <a:ext cx="5623560" cy="3280410"/>
+                      <a:ext cx="5623560" cy="2811780"/>
                     </a:xfrm>
                     <a:prstGeom prst="rect"/>
                   </pic:spPr>
@@ -2193,7 +2201,7 @@
       <w:r>
         <w:drawing>
           <wp:inline xmlns:a="http://schemas.openxmlformats.org/drawingml/2006/main" xmlns:pic="http://schemas.openxmlformats.org/drawingml/2006/picture">
-            <wp:extent cx="5623560" cy="4311396"/>
+            <wp:extent cx="5623560" cy="3374136"/>
             <wp:docPr id="4" name="Picture 4" descr="GID入力、Windows認証、本人照合、初回設定待ち状態の確認、本人によるパスワード設定と代替経路を示すフロー"/>
             <wp:cNvGraphicFramePr>
               <a:graphicFrameLocks noChangeAspect="1"/>
@@ -2220,7 +2228,7 @@
                   <pic:spPr>
                     <a:xfrm>
                       <a:off x="0" y="0"/>
-                      <a:ext cx="5623560" cy="4311396"/>
+                      <a:ext cx="5623560" cy="3374136"/>
                     </a:xfrm>
                     <a:prstGeom prst="rect"/>
                   </pic:spPr>
@@ -2403,7 +2411,7 @@
         <w:rPr>
           <w:rFonts w:ascii="Calibri" w:hAnsi="Calibri" w:eastAsia="Yu Mincho"/>
         </w:rPr>
-        <w:t>利用者向けの主要操作は一覧、アップロード、ダウンロード、フォルダー作成、削除、改名である。検索APIは管理用に保持し、WPF画面では非表示としている。リモートコピーと管理ごみ箱は利用者向けクライアントの提供対象に含めず、利用者に提供する機能と内部の管理機能を明確に分けている。</w:t>
+        <w:t>利用者向けの主要操作は一覧、アップロード、ダウンロード、フォルダー作成、削除、改名である。検索APIは管理用に保持し、WPF画面では非表示としている。リモートコピーとリモートごみ箱は廃止されており、新規利用する機能ではない。ローカル削除時のWindowsごみ箱設定とは別の機能である。リモート一覧は初回・追加とも2000件単位で読み込み、絞り込みは読み込み済み項目に適用する。検索APIの上限500件とは区別する。</w:t>
       </w:r>
     </w:p>
     <w:p>
@@ -2443,6 +2451,22 @@
           <w:rFonts w:ascii="Calibri" w:hAnsi="Calibri" w:eastAsia="Yu Mincho"/>
         </w:rPr>
         <w:t>Transfer V2は最大8MiBのチャンクと10TiBの論理上限を採用した。この上限はAPIやホスティング層の要求サイズ上限、ディスク容量、処理時間とは別の制約であり、実運用で10TiBを転送できることを保証する値ではない。運用時は保存先容量、通信帯域、処理時間を踏まえて転送計画を立てる。SMB処理にはSMBLibrary 1.5.7を用い、セッションプール、ArrayPool、ストリーミングによって、操作ごとの接続確立と大容量バッファの負荷を抑える。</w:t>
+      </w:r>
+    </w:p>
+    <w:p>
+      <w:r>
+        <w:rPr>
+          <w:rFonts w:ascii="Calibri" w:hAnsi="Calibri" w:eastAsia="Yu Mincho"/>
+        </w:rPr>
+        <w:t>転送センターは操作画面を閉じずに開ける非モーダル画面であり、件数付き状態フィルターと選択項目の詳細を備える。競合待ちの項目にだけ解決操作を表示する。完了・スキップの履歴整理では再開情報を保持し、失敗・中止の履歴破棄では確認後に途中データを削除する。期限切れのアップロードを再試行する場合は先頭から送信する。履歴保存に失敗した場合は途中データを保持する。</w:t>
+      </w:r>
+    </w:p>
+    <w:p>
+      <w:r>
+        <w:rPr>
+          <w:rFonts w:ascii="Calibri" w:hAnsi="Calibri" w:eastAsia="Yu Mincho"/>
+        </w:rPr>
+        <w:t>削除は全対象を確認してから実行し、全件成功時は一覧更新のみを行う。失敗・一部失敗や一覧の再読み込みエラーは結果を表示する。同じ場所の再読み込みでは選択とスクロールを保持する。</w:t>
       </w:r>
     </w:p>
     <w:p>
@@ -2692,7 +2716,23 @@
         <w:rPr>
           <w:rFonts w:ascii="Calibri" w:hAnsi="Calibri" w:eastAsia="Yu Mincho"/>
         </w:rPr>
-        <w:t>クライアントは左にローカル、右にリモートを表示する二ペインUIを採用する。利用者はエクスプローラーに近い操作でファイルを選び、転送キューで進捗、一時停止、再開、取消、競合を確認できる。一般利用者には管理機能を表示せず、管理者は同じアプリからユーザー、ホスト、共有、権限、テンプレート、Bundle、ノード、信頼端末、操作ログ、システム設定を管理する。図6には二ペインと転送キューを同時に確認できる画面例を配置する。</w:t>
+        <w:t>クライアントは左にローカル、右にリモートを表示する二ペインUIを採用する。利用者はエクスプローラーに近い操作でファイルを選び、転送キューで進捗、一時停止、再開、取消、競合を確認できる。一般利用者には管理機能を表示せず、管理者は同じアプリからユーザー、ホスト、共有、権限、テンプレート、Bundle、ノード、信頼端末、操作ログ、システム設定を管理する。図6には二ペイン、ホーム下部の転送状況、非モーダルの転送センターを確認できる画面例を配置する。</w:t>
+      </w:r>
+    </w:p>
+    <w:p>
+      <w:r>
+        <w:rPr>
+          <w:rFonts w:ascii="Calibri" w:hAnsi="Calibri" w:eastAsia="Yu Mincho"/>
+        </w:rPr>
+        <w:t>Ctrl+Dでダウンロード、Ctrl+Uでアップロードを実行し、操作中ペイン・選択件数・転送先を画面に示す。入力欄の操作、IME変換中、長押しによる誤転送を防ぐ。Enterでフォルダーを開くと読み込み後に先頭行を選択して上下キー操作を続けられるが、読み込み中にF6／Shift+F6、Ctrl+L、Ctrl+Fなどで移ったフォーカスは奪い返さない。</w:t>
+      </w:r>
+    </w:p>
+    <w:p>
+      <w:r>
+        <w:rPr>
+          <w:rFonts w:ascii="Calibri" w:hAnsi="Calibri" w:eastAsia="Yu Mincho"/>
+        </w:rPr>
+        <w:t>ホーム下部の高さ28pxの欄に実行中の転送方向・進捗バー・割合と待機／要対応件数を表示し、クリックまたはEnter／Spaceで転送センターを開く。一覧はファイル種別アイコン、個人設定による拡張子カラー、種類列のソートに対応する。小さい画面では転送センターの一覧と詳細を切り替え、管理画面は全体スクロールと権限一覧／編集の切替で操作領域を確保する。バージョン情報画面では問い合わせ用のバージョンをコピーできる。</w:t>
       </w:r>
     </w:p>
     <w:p>
@@ -2706,7 +2746,7 @@
         <w:drawing>
           <wp:inline xmlns:a="http://schemas.openxmlformats.org/drawingml/2006/main" xmlns:pic="http://schemas.openxmlformats.org/drawingml/2006/picture">
             <wp:extent cx="5623560" cy="3161690"/>
-            <wp:docPr id="6" name="Picture 6" descr="Watashiクライアントの二ペイン表示と転送キューのスクリーンショットを後から挿入するためのプレースホルダー"/>
+            <wp:docPr id="6" name="Picture 6" descr="Watashiクライアントの二ペイン表示と転送センターのスクリーンショットを後から挿入するためのプレースホルダー"/>
             <wp:cNvGraphicFramePr>
               <a:graphicFrameLocks noChangeAspect="1"/>
             </wp:cNvGraphicFramePr>
@@ -2756,7 +2796,7 @@
           <w:rFonts w:ascii="Calibri" w:hAnsi="Calibri" w:eastAsia="Yu Mincho"/>
           <w:sz w:val="19"/>
         </w:rPr>
-        <w:t>図6 Watashiの二ペイン表示と転送キュー（スクリーンショット差し替え欄）</w:t>
+        <w:t>図6 Watashiの二ペイン表示と転送センター（スクリーンショット差し替え欄）</w:t>
       </w:r>
     </w:p>
     <w:p>
@@ -2856,6 +2896,41 @@
     </w:p>
     <w:p>
       <w:pPr>
+        <w:pStyle w:val="Heading2"/>
+      </w:pPr>
+      <w:r>
+        <w:rPr>
+          <w:rFonts w:ascii="Calibri" w:hAnsi="Calibri" w:eastAsia="Yu Gothic"/>
+        </w:rPr>
+        <w:t>4.7 メンテナンスと共有の廃止</w:t>
+      </w:r>
+    </w:p>
+    <w:p>
+      <w:r>
+        <w:rPr>
+          <w:rFonts w:ascii="Calibri" w:hAnsi="Calibri" w:eastAsia="Yu Mincho"/>
+        </w:rPr>
+        <w:t>管理画面からメンテナンスの予定・開始・復旧確認・解除を切り替える。状態はDB外へ永続化し、開始後は業務APIの受付を停止する。Clientは起動時・ログイン時・画面上部に案内し、転送をメンテナンス待機として保持する。Serverの再開と必須更新確認が済んだ後に、メンテナンス待機の転送だけを再開する。必須更新の確認に失敗した場合は通常起動しない。</w:t>
+      </w:r>
+    </w:p>
+    <w:p>
+      <w:r>
+        <w:rPr>
+          <w:rFonts w:ascii="Calibri" w:hAnsi="Calibri" w:eastAsia="Yu Mincho"/>
+        </w:rPr>
+        <w:t>API停止中も案内できるよう、独立した静的状態サイトと外部JSONを配置する。ServerによるHTTPS読み戻し、Clientの配布設定、状態配信スクリプトを組み合わせて運用する。2000件一覧に対応するServerを先に更新し、その後Clientを再発行・配布する。停止解除をDB復元より先に行わず、復旧確認を経て業務受付を再開する。具体的な配置・更新・切り戻しはメンテナンス導入・運用ガイドに従う[I7]。</w:t>
+      </w:r>
+    </w:p>
+    <w:p>
+      <w:r>
+        <w:rPr>
+          <w:rFonts w:ascii="Calibri" w:hAnsi="Calibri" w:eastAsia="Yu Mincho"/>
+        </w:rPr>
+        <w:t>未完了のアップロードや旧版由来のリモートごみ箱台帳が残る共有は、接続先の変更・削除を409で拒否する。管理画面では件数・状態・期限・失敗理由を確認できる。強制解除は理由を入力して正規の後片付けを先に試し、回収できない台帳だけを終端化する。回収不能な実体が共有上に残る場合は、そのパスと処理結果を監査記録に残す。後片付けは既定7日の追加猶予を超えて無期限に再試行しない。この仕組みにより、到達不能な共有を管理者が廃止できる。</w:t>
+      </w:r>
+    </w:p>
+    <w:p>
+      <w:pPr>
         <w:pStyle w:val="Heading1"/>
       </w:pPr>
       <w:r>
@@ -2881,7 +2956,7 @@
         <w:rPr>
           <w:rFonts w:ascii="Calibri" w:hAnsi="Calibri" w:eastAsia="Yu Mincho"/>
         </w:rPr>
-        <w:t>検証は2026年8月31日に実施した。ソリューションはWatashi.Client（net10.0-windows）、Watashi.Server、Watashi.Agent、Watashi.Shared、Watashi.Tests（後四者はnet10.0）から構成され、すべて.NET 10を対象としている。ビルドは</w:t>
+        <w:t>以下は2026年8月31日に記録された検証環境である。ソリューションはWatashi.Client（net10.0-windows）、Watashi.Server、Watashi.Agent、Watashi.Shared、Watashi.Tests（後四者はnet10.0）から構成され、すべて.NET 10を対象としている。ビルドは</w:t>
       </w:r>
       <w:r>
         <w:rPr>
@@ -2968,7 +3043,7 @@
         <w:rPr>
           <w:rFonts w:ascii="Calibri" w:hAnsi="Calibri" w:eastAsia="Yu Mincho"/>
         </w:rPr>
-        <w:t>手動検証表は245項目である[I6]。配布アプリによる操作、専門環境を用いた接続、API確認、自動テストとの組合せにより、245項目すべてを実行し、合格と判定した。Agent停止後90秒で503となること、Gatewayを介して対象Agentへ到達すること、Productionでプレースホルダー秘密を拒否すること、監査ログ保管設定、レート制限、権限外アップロード拒否、画面操作、実SMB転送、IIS・ClickOnce配布、更新、性能条件を確認した。Agent過負荷時の503と</w:t>
+        <w:t>8月31日の手動検証表は245項目である[I6]。今回の改訂では実SMB・IIS・ClickOnceを含む手動試験を再実施しておらず、以下は当時の記録である。配布アプリによる操作、専門環境を用いた接続、API確認、自動テストとの組合せにより、245項目すべてを実行し、合格と判定した。Agent停止後90秒で503となること、Gatewayを介して対象Agentへ到達すること、Productionでプレースホルダー秘密を拒否すること、監査ログ保管設定、レート制限、権限外アップロード拒否、画面操作、実SMB転送、IIS・ClickOnce配布、更新、性能条件を確認した。Agent過負荷時の503と</w:t>
       </w:r>
       <w:r>
         <w:rPr>
@@ -3017,7 +3092,7 @@
         <w:rPr>
           <w:rFonts w:ascii="Calibri" w:hAnsi="Calibri" w:eastAsia="Yu Mincho"/>
         </w:rPr>
-        <w:t>確定、冪等性、競合処理を確認する。RQ5は三経路の正常系と、停止・過負荷・タイムアウト時の応答を確認する。RQ6は配布、登録、権限付与、ログ出力のシナリオを確認する。これらを受入条件とし、すべて合格と判定した。</w:t>
+        <w:t>確定、冪等性、競合処理を確認する。RQ5は三経路の正常系と、停止・過負荷・タイムアウト時の応答を確認する。RQ6は配布、登録、権限付与、ログ出力のシナリオを確認する。これらを受入条件とし、8月31日の記録ではすべて合格と判定した。9月追加機能の実環境受入はこの判定に含めない。</w:t>
       </w:r>
     </w:p>
     <w:p>
@@ -3039,7 +3114,7 @@
         <w:rPr>
           <w:rFonts w:ascii="Calibri" w:hAnsi="Calibri" w:eastAsia="Yu Gothic"/>
         </w:rPr>
-        <w:t>6.1 ビルドと自動テスト</w:t>
+        <w:t>6.1 過去のビルドと自動テスト</w:t>
       </w:r>
     </w:p>
     <w:p>
@@ -3464,7 +3539,7 @@
         <w:rPr>
           <w:rFonts w:ascii="Calibri" w:hAnsi="Calibri" w:eastAsia="Yu Gothic"/>
         </w:rPr>
-        <w:t>6.2 手動検証の結果</w:t>
+        <w:t>6.2 過去の手動検証の結果</w:t>
       </w:r>
     </w:p>
     <w:p>
@@ -3800,7 +3875,7 @@
         <w:rPr>
           <w:rFonts w:ascii="Calibri" w:hAnsi="Calibri" w:eastAsia="Yu Gothic"/>
         </w:rPr>
-        <w:t>6.3 RQ別結果</w:t>
+        <w:t>6.3 8月31日時点のRQ別結果</w:t>
       </w:r>
     </w:p>
     <w:p>
@@ -3889,7 +3964,7 @@
         <w:rPr>
           <w:rFonts w:ascii="Calibri" w:hAnsi="Calibri" w:eastAsia="Yu Gothic"/>
         </w:rPr>
-        <w:t>6.4 実装した機能の要約</w:t>
+        <w:t>6.4 現行機能の要約</w:t>
       </w:r>
     </w:p>
     <w:p>
@@ -4617,6 +4692,33 @@
     </w:p>
     <w:p>
       <w:pPr>
+        <w:pStyle w:val="Heading2"/>
+      </w:pPr>
+      <w:r>
+        <w:rPr>
+          <w:rFonts w:ascii="Calibri" w:hAnsi="Calibri" w:eastAsia="Yu Gothic"/>
+        </w:rPr>
+        <w:t>6.5 今回の改訂における回帰検証</w:t>
+      </w:r>
+    </w:p>
+    <w:p>
+      <w:r>
+        <w:rPr>
+          <w:rFonts w:ascii="Calibri" w:hAnsi="Calibri" w:eastAsia="Yu Mincho"/>
+        </w:rPr>
+        <w:t>2026年9月9日にRelease構成を警告エラー扱いでビルドし、警告0件・エラー0件で成功した。xUnit自動テストは841件合格、失敗0件、スキップ0件であった。WPFレイアウト検証も成功し、管理画面・転送画面・スクロール・仮想化・キーボード選択を確認した[I8]。</w:t>
+      </w:r>
+    </w:p>
+    <w:p>
+      <w:r>
+        <w:rPr>
+          <w:rFonts w:ascii="Calibri" w:hAnsi="Calibri" w:eastAsia="Yu Mincho"/>
+        </w:rPr>
+        <w:t>今回の確認はリポジトリ上の自動回帰検証と文書の整合性確認であり、実SMB・IIS・ClickOnceを使用する手動受入や負荷試験は再実施していない。図の表示例や過去の合格件数を、未実施の運用検証の証拠には用いない。</w:t>
+      </w:r>
+    </w:p>
+    <w:p>
+      <w:pPr>
         <w:pStyle w:val="Heading1"/>
       </w:pPr>
       <w:r>
@@ -4819,7 +4921,7 @@
         <w:rPr>
           <w:rFonts w:ascii="Calibri" w:hAnsi="Calibri" w:eastAsia="Yu Mincho"/>
         </w:rPr>
-        <w:t>704件の自動テスト、5プロジェクトの分層、共通SMBアクセス層、DTO、サービス、Minimal APIの分離は、変更の影響を局所化し回帰を早く検出する基盤である。接続先固定、初回設定、転送V2、監査outboxへ発展させた点は、運用フィードバックを設計へ反映した成果である。</w:t>
+        <w:t>8月31日時点の704件の自動テストに加え、現在はメンテナンス、転送履歴、共有の強制解除、キーボード操作などの回帰検証とWPFレイアウト検証も備える。コンポーネントの分層、共通SMBアクセス層、DTO、サービス、Minimal APIの分離は、変更の影響を局所化し回帰を早く検出する基盤である。接続先固定、初回設定、転送V2、監査outboxへ発展させた点は、運用フィードバックを設計へ反映した成果である。</w:t>
       </w:r>
     </w:p>
     <w:p>
@@ -4854,7 +4956,15 @@
         <w:rPr>
           <w:rFonts w:ascii="Calibri" w:hAnsi="Calibri" w:eastAsia="Yu Mincho"/>
         </w:rPr>
-        <w:t>手動検証245項目もすべて合格しており、認証・認可、各経路、転送、監査、画面、配布、更新、運用シナリオを設計した受入条件に基づいて確認した。PANDAではMySQLの構築・運用に専門知識を要したが、WatashiではSQLiteとバックアップ手順を採用して導入を簡素化した。これにより、Watashiは設計した主要機能を一体的に提供できる状態に到達した。</w:t>
+        <w:t>8月31日の手動検証245項目は当時すべて合格と記録されており、認証・認可、各経路、転送、監査、画面、配布、更新、運用シナリオを設計した受入条件に基づいて確認した。PANDAではMySQLの構築・運用に専門知識を要したが、WatashiではSQLiteとバックアップ手順を採用して導入を簡素化した。これにより、Watashiは設計した主要機能を一体的に提供できる状態に到達した。</w:t>
+      </w:r>
+    </w:p>
+    <w:p>
+      <w:r>
+        <w:rPr>
+          <w:rFonts w:ascii="Calibri" w:hAnsi="Calibri" w:eastAsia="Yu Mincho"/>
+        </w:rPr>
+        <w:t>9月9日時点では、操作性の改善に加えてメンテナンス中の待機・復旧と共有廃止の運用を実装した。今回の改訂では現行コードと文書を照合し、自動検証結果を別途記録する。新機能を含む実環境受入や性能評価は、過去の合格件数から推定せず、運用環境で確認する。</w:t>
       </w:r>
     </w:p>
     <w:p>
@@ -4956,7 +5066,7 @@
         <w:rPr>
           <w:rFonts w:ascii="Calibri" w:hAnsi="Calibri" w:eastAsia="Yu Mincho"/>
         </w:rPr>
-        <w:t>, 「Watashi 機能仕様書」, 2026年8月31日参照。</w:t>
+        <w:t>, 「Watashi 機能仕様書」, 2026年9月9日参照。</w:t>
       </w:r>
     </w:p>
     <w:p>
@@ -5020,7 +5130,7 @@
         <w:rPr>
           <w:rFonts w:ascii="Calibri" w:hAnsi="Calibri" w:eastAsia="Yu Mincho"/>
         </w:rPr>
-        <w:t>, 開発経緯と実装計画, 2026年8月31日参照。</w:t>
+        <w:t>, 開発経緯と実装変更, 2026年9月9日参照。</w:t>
       </w:r>
     </w:p>
     <w:p>
@@ -5046,13 +5156,13 @@
           <w:sz w:val="21"/>
           <w:shd w:fill="EEF2F6"/>
         </w:rPr>
-        <w:t>docs/report/evidence/test-results/watashi-report-20260831.trx</w:t>
+        <w:t>docs/report/evidence/VALIDATION_SNAPSHOT.md</w:t>
       </w:r>
       <w:r>
         <w:rPr>
           <w:rFonts w:ascii="Calibri" w:hAnsi="Calibri" w:eastAsia="Yu Mincho"/>
         </w:rPr>
-        <w:t>, xUnit実行結果, 2026年8月31日。</w:t>
+        <w:t>, 2026年8月31日の検証記録（当時のTRXパスを記載。TRX本体は版管理対象外）。</w:t>
       </w:r>
     </w:p>
     <w:p>
@@ -5085,6 +5195,85 @@
           <w:rFonts w:ascii="Calibri" w:hAnsi="Calibri" w:eastAsia="Yu Mincho"/>
         </w:rPr>
         <w:t>, 245項目, 2026年8月31日集計。</w:t>
+      </w:r>
+    </w:p>
+    <w:p>
+      <w:pPr>
+        <w:spacing w:after="80" w:line="290" w:lineRule="auto"/>
+        <w:ind w:left="540" w:hanging="279"/>
+        <w:jc w:val="left"/>
+        <w:numPr>
+          <w:ilvl w:val="0"/>
+          <w:numId w:val="11"/>
+        </w:numPr>
+      </w:pPr>
+      <w:r>
+        <w:rPr>
+          <w:rFonts w:ascii="Calibri" w:hAnsi="Calibri" w:eastAsia="Yu Mincho"/>
+        </w:rPr>
+        <w:t xml:space="preserve">[I7] </w:t>
+      </w:r>
+      <w:r>
+        <w:rPr>
+          <w:rFonts w:ascii="Consolas" w:hAnsi="Consolas"/>
+          <w:color w:val="1F4D78"/>
+          <w:sz w:val="21"/>
+          <w:shd w:fill="EEF2F6"/>
+        </w:rPr>
+        <w:t>deploy/MAINTENANCE-ROLLOUT-PLAN.html</w:t>
+      </w:r>
+      <w:r>
+        <w:rPr>
+          <w:rFonts w:ascii="Calibri" w:hAnsi="Calibri" w:eastAsia="Yu Mincho"/>
+        </w:rPr>
+        <w:t xml:space="preserve">, メンテナンス導入・運用ガイド、および </w:t>
+      </w:r>
+      <w:r>
+        <w:rPr>
+          <w:rFonts w:ascii="Consolas" w:hAnsi="Consolas"/>
+          <w:color w:val="1F4D78"/>
+          <w:sz w:val="21"/>
+          <w:shd w:fill="EEF2F6"/>
+        </w:rPr>
+        <w:t>docs/SPECIFICATION.md</w:t>
+      </w:r>
+      <w:r>
+        <w:rPr>
+          <w:rFonts w:ascii="Calibri" w:hAnsi="Calibri" w:eastAsia="Yu Mincho"/>
+        </w:rPr>
+        <w:t>, 2026年9月9日確認。</w:t>
+      </w:r>
+    </w:p>
+    <w:p>
+      <w:pPr>
+        <w:spacing w:after="80" w:line="290" w:lineRule="auto"/>
+        <w:ind w:left="540" w:hanging="279"/>
+        <w:jc w:val="left"/>
+        <w:numPr>
+          <w:ilvl w:val="0"/>
+          <w:numId w:val="11"/>
+        </w:numPr>
+      </w:pPr>
+      <w:r>
+        <w:rPr>
+          <w:rFonts w:ascii="Calibri" w:hAnsi="Calibri" w:eastAsia="Yu Mincho"/>
+        </w:rPr>
+        <w:t xml:space="preserve">[I8] </w:t>
+      </w:r>
+      <w:r>
+        <w:rPr>
+          <w:rFonts w:ascii="Consolas" w:hAnsi="Consolas"/>
+          <w:color w:val="1F4D78"/>
+          <w:sz w:val="21"/>
+          <w:shd w:fill="EEF2F6"/>
+        </w:rPr>
+        <w:t>docs/report/evidence/VALIDATION_20260909.md</w:t>
+      </w:r>
+      <w:r>
+        <w:rPr>
+          <w:rFonts w:ascii="Calibri" w:hAnsi="Calibri" w:eastAsia="Yu Mincho"/>
+        </w:rPr>
+        <w:t>, 今回の改訂・回帰検証記録。</w:t>
       </w:r>
     </w:p>
     <w:p>
@@ -5246,6 +5435,14 @@
         <w:t>付録A 要求・実装・検証の対応</w:t>
       </w:r>
     </w:p>
+    <w:p>
+      <w:r>
+        <w:rPr>
+          <w:rFonts w:ascii="Calibri" w:hAnsi="Calibri" w:eastAsia="Yu Mincho"/>
+        </w:rPr>
+        <w:t>以下は8月31日の受入記録との対応である。9月追加機能の実環境受入を示すものではなく、今回の自動回帰検証は6.5節に記載する。</w:t>
+      </w:r>
+    </w:p>
     <w:tbl>
       <w:tblPr>
         <w:tblStyle w:val="TableGrid"/>
@@ -5402,7 +5599,7 @@
                 <w:color w:val="17324D"/>
                 <w:sz w:val="17"/>
               </w:rPr>
-              <w:t>現在の証拠</w:t>
+              <w:t>8月31日の証拠</w:t>
             </w:r>
           </w:p>
         </w:tc>

</xml_diff>